<commit_message>
agregue la funcion que realiza el parrafo 2 de actividades previas
</commit_message>
<xml_diff>
--- a/crear_documentos/services/doc_101/plantilla.docx
+++ b/crear_documentos/services/doc_101/plantilla.docx
@@ -6885,7 +6885,19 @@
         <w:rPr>
           <w:szCs w:val="22"/>
         </w:rPr>
-        <w:t>en esta sección se describe la arquitectura las sondas oceanográficas</w:t>
+        <w:t xml:space="preserve">en esta sección se describe la arquitectura </w:t>
+      </w:r>
+      <w:r>
+        <w:rPr>
+          <w:szCs w:val="22"/>
+        </w:rPr>
+        <w:t xml:space="preserve">de </w:t>
+      </w:r>
+      <w:r>
+        <w:rPr>
+          <w:szCs w:val="22"/>
+        </w:rPr>
+        <w:t>las sondas oceanográficas</w:t>
       </w:r>
       <w:r>
         <w:rPr>
@@ -7463,13 +7475,11 @@
         <w:jc w:val="center"/>
       </w:pPr>
       <w:r>
-        <w:t>&lt;&lt;</w:t>
-      </w:r>
-      <w:proofErr w:type="spellStart"/>
-      <w:r>
-        <w:t>fig_descripcion_arquitectura</w:t>
-      </w:r>
-      <w:proofErr w:type="spellEnd"/>
+        <w:t>&lt;&lt;fig_descripcion_arquitectura</w:t>
+      </w:r>
+      <w:r>
+        <w:t>_1</w:t>
+      </w:r>
       <w:r>
         <w:t>&gt;&gt;</w:t>
       </w:r>
@@ -7485,39 +7495,24 @@
       <w:r>
         <w:t xml:space="preserve">Figura </w:t>
       </w:r>
-      <w:r>
-        <w:fldChar w:fldCharType="begin"/>
-      </w:r>
-      <w:r>
-        <w:instrText xml:space="preserve"> SEQ Figura \* ARABIC </w:instrText>
-      </w:r>
-      <w:r>
-        <w:fldChar w:fldCharType="separate"/>
-      </w:r>
-      <w:r>
-        <w:rPr>
-          <w:noProof/>
-        </w:rPr>
-        <w:t>1</w:t>
-      </w:r>
-      <w:r>
-        <w:rPr>
-          <w:noProof/>
-        </w:rPr>
-        <w:fldChar w:fldCharType="end"/>
-      </w:r>
+      <w:fldSimple w:instr=" SEQ Figura \* ARABIC ">
+        <w:r>
+          <w:rPr>
+            <w:noProof/>
+          </w:rPr>
+          <w:t>1</w:t>
+        </w:r>
+      </w:fldSimple>
       <w:bookmarkEnd w:id="69"/>
       <w:r>
         <w:t xml:space="preserve">. </w:t>
       </w:r>
       <w:r>
-        <w:t>&lt;&lt;</w:t>
-      </w:r>
-      <w:proofErr w:type="spellStart"/>
-      <w:r>
-        <w:t>pie_descripcion_arquitectura</w:t>
-      </w:r>
-      <w:proofErr w:type="spellEnd"/>
+        <w:t>&lt;&lt;pie_descripcion_arquitectura</w:t>
+      </w:r>
+      <w:r>
+        <w:t>_1</w:t>
+      </w:r>
       <w:r>
         <w:t>&gt;&gt;</w:t>
       </w:r>
@@ -7784,27 +7779,14 @@
       <w:r>
         <w:t xml:space="preserve">Figura </w:t>
       </w:r>
-      <w:r>
-        <w:fldChar w:fldCharType="begin"/>
-      </w:r>
-      <w:r>
-        <w:instrText xml:space="preserve"> SEQ Figura \* ARABIC </w:instrText>
-      </w:r>
-      <w:r>
-        <w:fldChar w:fldCharType="separate"/>
-      </w:r>
-      <w:r>
-        <w:rPr>
-          <w:noProof/>
-        </w:rPr>
-        <w:t>2</w:t>
-      </w:r>
-      <w:r>
-        <w:rPr>
-          <w:noProof/>
-        </w:rPr>
-        <w:fldChar w:fldCharType="end"/>
-      </w:r>
+      <w:fldSimple w:instr=" SEQ Figura \* ARABIC ">
+        <w:r>
+          <w:rPr>
+            <w:noProof/>
+          </w:rPr>
+          <w:t>2</w:t>
+        </w:r>
+      </w:fldSimple>
       <w:bookmarkEnd w:id="71"/>
       <w:bookmarkEnd w:id="73"/>
       <w:r>
@@ -8006,27 +7988,14 @@
       <w:r>
         <w:t xml:space="preserve">Figura </w:t>
       </w:r>
-      <w:r>
-        <w:fldChar w:fldCharType="begin"/>
-      </w:r>
-      <w:r>
-        <w:instrText xml:space="preserve"> SEQ Figura \* ARABIC </w:instrText>
-      </w:r>
-      <w:r>
-        <w:fldChar w:fldCharType="separate"/>
-      </w:r>
-      <w:r>
-        <w:rPr>
-          <w:noProof/>
-        </w:rPr>
-        <w:t>3</w:t>
-      </w:r>
-      <w:r>
-        <w:rPr>
-          <w:noProof/>
-        </w:rPr>
-        <w:fldChar w:fldCharType="end"/>
-      </w:r>
+      <w:fldSimple w:instr=" SEQ Figura \* ARABIC ">
+        <w:r>
+          <w:rPr>
+            <w:noProof/>
+          </w:rPr>
+          <w:t>3</w:t>
+        </w:r>
+      </w:fldSimple>
       <w:bookmarkEnd w:id="75"/>
       <w:r>
         <w:t>.</w:t>
@@ -8207,27 +8176,14 @@
       <w:r>
         <w:t xml:space="preserve">Figura </w:t>
       </w:r>
-      <w:r>
-        <w:fldChar w:fldCharType="begin"/>
-      </w:r>
-      <w:r>
-        <w:instrText xml:space="preserve"> SEQ Figura \* ARABIC </w:instrText>
-      </w:r>
-      <w:r>
-        <w:fldChar w:fldCharType="separate"/>
-      </w:r>
-      <w:r>
-        <w:rPr>
-          <w:noProof/>
-        </w:rPr>
-        <w:t>4</w:t>
-      </w:r>
-      <w:r>
-        <w:rPr>
-          <w:noProof/>
-        </w:rPr>
-        <w:fldChar w:fldCharType="end"/>
-      </w:r>
+      <w:fldSimple w:instr=" SEQ Figura \* ARABIC ">
+        <w:r>
+          <w:rPr>
+            <w:noProof/>
+          </w:rPr>
+          <w:t>4</w:t>
+        </w:r>
+      </w:fldSimple>
       <w:bookmarkEnd w:id="77"/>
       <w:r>
         <w:t xml:space="preserve">. </w:t>
@@ -8364,27 +8320,14 @@
       <w:r>
         <w:t xml:space="preserve">Figura </w:t>
       </w:r>
-      <w:r>
-        <w:fldChar w:fldCharType="begin"/>
-      </w:r>
-      <w:r>
-        <w:instrText xml:space="preserve"> SEQ Figura \* ARABIC </w:instrText>
-      </w:r>
-      <w:r>
-        <w:fldChar w:fldCharType="separate"/>
-      </w:r>
-      <w:r>
-        <w:rPr>
-          <w:noProof/>
-        </w:rPr>
-        <w:t>5</w:t>
-      </w:r>
-      <w:r>
-        <w:rPr>
-          <w:noProof/>
-        </w:rPr>
-        <w:fldChar w:fldCharType="end"/>
-      </w:r>
+      <w:fldSimple w:instr=" SEQ Figura \* ARABIC ">
+        <w:r>
+          <w:rPr>
+            <w:noProof/>
+          </w:rPr>
+          <w:t>5</w:t>
+        </w:r>
+      </w:fldSimple>
       <w:bookmarkEnd w:id="79"/>
       <w:r>
         <w:t xml:space="preserve">. </w:t>
@@ -8637,27 +8580,14 @@
       <w:r>
         <w:t xml:space="preserve">Figura </w:t>
       </w:r>
-      <w:r>
-        <w:fldChar w:fldCharType="begin"/>
-      </w:r>
-      <w:r>
-        <w:instrText xml:space="preserve"> SEQ Figura \* ARABIC </w:instrText>
-      </w:r>
-      <w:r>
-        <w:fldChar w:fldCharType="separate"/>
-      </w:r>
-      <w:r>
-        <w:rPr>
-          <w:noProof/>
-        </w:rPr>
-        <w:t>6</w:t>
-      </w:r>
-      <w:r>
-        <w:rPr>
-          <w:noProof/>
-        </w:rPr>
-        <w:fldChar w:fldCharType="end"/>
-      </w:r>
+      <w:fldSimple w:instr=" SEQ Figura \* ARABIC ">
+        <w:r>
+          <w:rPr>
+            <w:noProof/>
+          </w:rPr>
+          <w:t>6</w:t>
+        </w:r>
+      </w:fldSimple>
       <w:bookmarkEnd w:id="81"/>
       <w:r>
         <w:t xml:space="preserve">. </w:t>
@@ -8835,27 +8765,14 @@
       <w:r>
         <w:t xml:space="preserve">Tabla </w:t>
       </w:r>
-      <w:r>
-        <w:fldChar w:fldCharType="begin"/>
-      </w:r>
-      <w:r>
-        <w:instrText xml:space="preserve"> SEQ Tabla \* ARABIC </w:instrText>
-      </w:r>
-      <w:r>
-        <w:fldChar w:fldCharType="separate"/>
-      </w:r>
-      <w:r>
-        <w:rPr>
-          <w:noProof/>
-        </w:rPr>
-        <w:t>1</w:t>
-      </w:r>
-      <w:r>
-        <w:rPr>
-          <w:noProof/>
-        </w:rPr>
-        <w:fldChar w:fldCharType="end"/>
-      </w:r>
+      <w:fldSimple w:instr=" SEQ Tabla \* ARABIC ">
+        <w:r>
+          <w:rPr>
+            <w:noProof/>
+          </w:rPr>
+          <w:t>1</w:t>
+        </w:r>
+      </w:fldSimple>
       <w:bookmarkEnd w:id="83"/>
       <w:r>
         <w:t>. Información de los parámetros que miden las sondas.</w:t>
@@ -9832,27 +9749,14 @@
       <w:r>
         <w:t xml:space="preserve">Figura </w:t>
       </w:r>
-      <w:r>
-        <w:fldChar w:fldCharType="begin"/>
-      </w:r>
-      <w:r>
-        <w:instrText xml:space="preserve"> SEQ Figura \* ARABIC </w:instrText>
-      </w:r>
-      <w:r>
-        <w:fldChar w:fldCharType="separate"/>
-      </w:r>
-      <w:r>
-        <w:rPr>
-          <w:noProof/>
-        </w:rPr>
-        <w:t>7</w:t>
-      </w:r>
-      <w:r>
-        <w:rPr>
-          <w:noProof/>
-        </w:rPr>
-        <w:fldChar w:fldCharType="end"/>
-      </w:r>
+      <w:fldSimple w:instr=" SEQ Figura \* ARABIC ">
+        <w:r>
+          <w:rPr>
+            <w:noProof/>
+          </w:rPr>
+          <w:t>7</w:t>
+        </w:r>
+      </w:fldSimple>
       <w:bookmarkEnd w:id="88"/>
       <w:r>
         <w:t xml:space="preserve">. </w:t>
@@ -10928,27 +10832,14 @@
       <w:r>
         <w:t xml:space="preserve">Figura </w:t>
       </w:r>
-      <w:r>
-        <w:fldChar w:fldCharType="begin"/>
-      </w:r>
-      <w:r>
-        <w:instrText xml:space="preserve"> SEQ Figura \* ARABIC </w:instrText>
-      </w:r>
-      <w:r>
-        <w:fldChar w:fldCharType="separate"/>
-      </w:r>
-      <w:r>
-        <w:rPr>
-          <w:noProof/>
-        </w:rPr>
-        <w:t>8</w:t>
-      </w:r>
-      <w:r>
-        <w:rPr>
-          <w:noProof/>
-        </w:rPr>
-        <w:fldChar w:fldCharType="end"/>
-      </w:r>
+      <w:fldSimple w:instr=" SEQ Figura \* ARABIC ">
+        <w:r>
+          <w:rPr>
+            <w:noProof/>
+          </w:rPr>
+          <w:t>8</w:t>
+        </w:r>
+      </w:fldSimple>
       <w:bookmarkEnd w:id="100"/>
       <w:r>
         <w:t xml:space="preserve">. </w:t>
@@ -10958,10 +10849,7 @@
       </w:r>
       <w:proofErr w:type="spellStart"/>
       <w:r>
-        <w:t>pie</w:t>
-      </w:r>
-      <w:r>
-        <w:t>_mapa_de_despliegue</w:t>
+        <w:t>pie_mapa_de_despliegue</w:t>
       </w:r>
       <w:proofErr w:type="spellEnd"/>
       <w:r>
@@ -11173,27 +11061,14 @@
       <w:r>
         <w:t xml:space="preserve">Figura </w:t>
       </w:r>
-      <w:r>
-        <w:fldChar w:fldCharType="begin"/>
-      </w:r>
-      <w:r>
-        <w:instrText xml:space="preserve"> SEQ Figura \* ARABIC </w:instrText>
-      </w:r>
-      <w:r>
-        <w:fldChar w:fldCharType="separate"/>
-      </w:r>
-      <w:r>
-        <w:rPr>
-          <w:noProof/>
-        </w:rPr>
-        <w:t>10</w:t>
-      </w:r>
-      <w:r>
-        <w:rPr>
-          <w:noProof/>
-        </w:rPr>
-        <w:fldChar w:fldCharType="end"/>
-      </w:r>
+      <w:fldSimple w:instr=" SEQ Figura \* ARABIC ">
+        <w:r>
+          <w:rPr>
+            <w:noProof/>
+          </w:rPr>
+          <w:t>10</w:t>
+        </w:r>
+      </w:fldSimple>
       <w:bookmarkEnd w:id="102"/>
       <w:r>
         <w:t>.</w:t>
@@ -11206,15 +11081,7 @@
           <w:sz w:val="20"/>
           <w:szCs w:val="22"/>
         </w:rPr>
-        <w:t xml:space="preserve"> </w:t>
-      </w:r>
-      <w:r>
-        <w:rPr>
-          <w:rFonts w:cs="Microsoft Sans Serif"/>
-          <w:sz w:val="20"/>
-          <w:szCs w:val="22"/>
-        </w:rPr>
-        <w:t>&lt;&lt;</w:t>
+        <w:t xml:space="preserve"> &lt;&lt;</w:t>
       </w:r>
       <w:proofErr w:type="spellStart"/>
       <w:r>
@@ -11332,27 +11199,14 @@
       <w:r>
         <w:t xml:space="preserve">Tabla </w:t>
       </w:r>
-      <w:r>
-        <w:fldChar w:fldCharType="begin"/>
-      </w:r>
-      <w:r>
-        <w:instrText xml:space="preserve"> SEQ Tabla \* ARABIC </w:instrText>
-      </w:r>
-      <w:r>
-        <w:fldChar w:fldCharType="separate"/>
-      </w:r>
-      <w:r>
-        <w:rPr>
-          <w:noProof/>
-        </w:rPr>
-        <w:t>2</w:t>
-      </w:r>
-      <w:r>
-        <w:rPr>
-          <w:noProof/>
-        </w:rPr>
-        <w:fldChar w:fldCharType="end"/>
-      </w:r>
+      <w:fldSimple w:instr=" SEQ Tabla \* ARABIC ">
+        <w:r>
+          <w:rPr>
+            <w:noProof/>
+          </w:rPr>
+          <w:t>2</w:t>
+        </w:r>
+      </w:fldSimple>
       <w:bookmarkEnd w:id="105"/>
       <w:r>
         <w:t xml:space="preserve">. Coordenadas geográficas de </w:t>
@@ -11813,15 +11667,7 @@
                 <w:sz w:val="20"/>
                 <w:szCs w:val="20"/>
               </w:rPr>
-              <w:t>lat_</w:t>
-            </w:r>
-            <w:r>
-              <w:rPr>
-                <w:rFonts w:cs="Microsoft Sans Serif"/>
-                <w:sz w:val="20"/>
-                <w:szCs w:val="20"/>
-              </w:rPr>
-              <w:t>plan</w:t>
+              <w:t>lat_plan</w:t>
             </w:r>
             <w:proofErr w:type="spellEnd"/>
             <w:r>
@@ -11866,15 +11712,7 @@
                 <w:sz w:val="20"/>
                 <w:szCs w:val="20"/>
               </w:rPr>
-              <w:t>lon_</w:t>
-            </w:r>
-            <w:r>
-              <w:rPr>
-                <w:rFonts w:cs="Microsoft Sans Serif"/>
-                <w:sz w:val="20"/>
-                <w:szCs w:val="20"/>
-              </w:rPr>
-              <w:t>plan</w:t>
+              <w:t>lon_plan</w:t>
             </w:r>
             <w:proofErr w:type="spellEnd"/>
             <w:r>
@@ -12008,27 +11846,14 @@
       <w:r>
         <w:t xml:space="preserve">Tabla </w:t>
       </w:r>
-      <w:r>
-        <w:fldChar w:fldCharType="begin"/>
-      </w:r>
-      <w:r>
-        <w:instrText xml:space="preserve"> SEQ Tabla \* ARABIC </w:instrText>
-      </w:r>
-      <w:r>
-        <w:fldChar w:fldCharType="separate"/>
-      </w:r>
-      <w:r>
-        <w:rPr>
-          <w:noProof/>
-        </w:rPr>
-        <w:t>3</w:t>
-      </w:r>
-      <w:r>
-        <w:rPr>
-          <w:noProof/>
-        </w:rPr>
-        <w:fldChar w:fldCharType="end"/>
-      </w:r>
+      <w:fldSimple w:instr=" SEQ Tabla \* ARABIC ">
+        <w:r>
+          <w:rPr>
+            <w:noProof/>
+          </w:rPr>
+          <w:t>3</w:t>
+        </w:r>
+      </w:fldSimple>
       <w:bookmarkEnd w:id="112"/>
       <w:r>
         <w:t xml:space="preserve">. </w:t>
@@ -12660,27 +12485,14 @@
       <w:r>
         <w:t xml:space="preserve">Tabla </w:t>
       </w:r>
-      <w:r>
-        <w:fldChar w:fldCharType="begin"/>
-      </w:r>
-      <w:r>
-        <w:instrText xml:space="preserve"> SEQ Tabla \* ARABIC </w:instrText>
-      </w:r>
-      <w:r>
-        <w:fldChar w:fldCharType="separate"/>
-      </w:r>
-      <w:r>
-        <w:rPr>
-          <w:noProof/>
-        </w:rPr>
-        <w:t>4</w:t>
-      </w:r>
-      <w:r>
-        <w:rPr>
-          <w:noProof/>
-        </w:rPr>
-        <w:fldChar w:fldCharType="end"/>
-      </w:r>
+      <w:fldSimple w:instr=" SEQ Tabla \* ARABIC ">
+        <w:r>
+          <w:rPr>
+            <w:noProof/>
+          </w:rPr>
+          <w:t>4</w:t>
+        </w:r>
+      </w:fldSimple>
       <w:bookmarkEnd w:id="114"/>
       <w:bookmarkEnd w:id="115"/>
       <w:r>
@@ -13945,27 +13757,14 @@
       <w:r>
         <w:t xml:space="preserve">Figura </w:t>
       </w:r>
-      <w:r>
-        <w:fldChar w:fldCharType="begin"/>
-      </w:r>
-      <w:r>
-        <w:instrText xml:space="preserve"> SEQ Figura \* ARABIC </w:instrText>
-      </w:r>
-      <w:r>
-        <w:fldChar w:fldCharType="separate"/>
-      </w:r>
-      <w:r>
-        <w:rPr>
-          <w:noProof/>
-        </w:rPr>
-        <w:t>17</w:t>
-      </w:r>
-      <w:r>
-        <w:rPr>
-          <w:noProof/>
-        </w:rPr>
-        <w:fldChar w:fldCharType="end"/>
-      </w:r>
+      <w:fldSimple w:instr=" SEQ Figura \* ARABIC ">
+        <w:r>
+          <w:rPr>
+            <w:noProof/>
+          </w:rPr>
+          <w:t>17</w:t>
+        </w:r>
+      </w:fldSimple>
       <w:bookmarkEnd w:id="124"/>
       <w:bookmarkEnd w:id="125"/>
       <w:r>
@@ -13976,10 +13775,7 @@
       </w:r>
       <w:proofErr w:type="spellStart"/>
       <w:r>
-        <w:t>pie_despliegue_</w:t>
-      </w:r>
-      <w:r>
-        <w:t>de_sonda_oceanografica</w:t>
+        <w:t>pie_despliegue_de_sonda_oceanografica</w:t>
       </w:r>
       <w:proofErr w:type="spellEnd"/>
       <w:r>
@@ -14688,27 +14484,14 @@
       <w:r>
         <w:t xml:space="preserve">Figura </w:t>
       </w:r>
-      <w:r>
-        <w:fldChar w:fldCharType="begin"/>
-      </w:r>
-      <w:r>
-        <w:instrText xml:space="preserve"> SEQ Figura \* ARABIC </w:instrText>
-      </w:r>
-      <w:r>
-        <w:fldChar w:fldCharType="separate"/>
-      </w:r>
-      <w:r>
-        <w:rPr>
-          <w:noProof/>
-        </w:rPr>
-        <w:t>24</w:t>
-      </w:r>
-      <w:r>
-        <w:rPr>
-          <w:noProof/>
-        </w:rPr>
-        <w:fldChar w:fldCharType="end"/>
-      </w:r>
+      <w:fldSimple w:instr=" SEQ Figura \* ARABIC ">
+        <w:r>
+          <w:rPr>
+            <w:noProof/>
+          </w:rPr>
+          <w:t>24</w:t>
+        </w:r>
+      </w:fldSimple>
       <w:bookmarkEnd w:id="131"/>
       <w:r>
         <w:t xml:space="preserve">. </w:t>
@@ -14773,27 +14556,14 @@
       <w:r>
         <w:t xml:space="preserve">Figura </w:t>
       </w:r>
-      <w:r>
-        <w:fldChar w:fldCharType="begin"/>
-      </w:r>
-      <w:r>
-        <w:instrText xml:space="preserve"> SEQ Figura \* ARABIC </w:instrText>
-      </w:r>
-      <w:r>
-        <w:fldChar w:fldCharType="separate"/>
-      </w:r>
-      <w:r>
-        <w:rPr>
-          <w:noProof/>
-        </w:rPr>
-        <w:t>26</w:t>
-      </w:r>
-      <w:r>
-        <w:rPr>
-          <w:noProof/>
-        </w:rPr>
-        <w:fldChar w:fldCharType="end"/>
-      </w:r>
+      <w:fldSimple w:instr=" SEQ Figura \* ARABIC ">
+        <w:r>
+          <w:rPr>
+            <w:noProof/>
+          </w:rPr>
+          <w:t>26</w:t>
+        </w:r>
+      </w:fldSimple>
       <w:bookmarkEnd w:id="133"/>
       <w:r>
         <w:t>.</w:t>
@@ -15123,11 +14893,19 @@
         </w:rPr>
         <w:t xml:space="preserve">durante el despliegue en el mar. </w:t>
       </w:r>
+      <w:proofErr w:type="gramStart"/>
       <w:r>
         <w:rPr>
           <w:szCs w:val="22"/>
         </w:rPr>
-        <w:t>Asimismo se anexó una copia del plan de crucero el cual fue entregado con antelación a PEMEX.</w:t>
+        <w:t>Asimismo</w:t>
+      </w:r>
+      <w:proofErr w:type="gramEnd"/>
+      <w:r>
+        <w:rPr>
+          <w:szCs w:val="22"/>
+        </w:rPr>
+        <w:t xml:space="preserve"> se anexó una copia del plan de crucero el cual fue entregado con antelación a PEMEX.</w:t>
       </w:r>
     </w:p>
     <w:p>
@@ -16115,7 +15893,25 @@
           <w:rFonts w:ascii="Microsoft Sans Serif" w:hAnsi="Microsoft Sans Serif" w:cs="Microsoft Sans Serif"/>
           <w:vertAlign w:val="baseline"/>
         </w:rPr>
-        <w:t>YYYY-MM-DD-THH:mm:ss.sssz</w:t>
+        <w:t>YYYY-MM-DD-THH:</w:t>
+      </w:r>
+      <w:proofErr w:type="gramStart"/>
+      <w:r>
+        <w:rPr>
+          <w:rStyle w:val="Caracteresdenotaalpie"/>
+          <w:rFonts w:ascii="Microsoft Sans Serif" w:hAnsi="Microsoft Sans Serif" w:cs="Microsoft Sans Serif"/>
+          <w:vertAlign w:val="baseline"/>
+        </w:rPr>
+        <w:t>mm:ss</w:t>
+      </w:r>
+      <w:proofErr w:type="gramEnd"/>
+      <w:r>
+        <w:rPr>
+          <w:rStyle w:val="Caracteresdenotaalpie"/>
+          <w:rFonts w:ascii="Microsoft Sans Serif" w:hAnsi="Microsoft Sans Serif" w:cs="Microsoft Sans Serif"/>
+          <w:vertAlign w:val="baseline"/>
+        </w:rPr>
+        <w:t>.sssz</w:t>
       </w:r>
       <w:proofErr w:type="spellEnd"/>
       <w:r>

</xml_diff>

<commit_message>
Se crearon todas las funciones para completar el texto del word. Estan pendientes de edicion para los casos singular y plural
</commit_message>
<xml_diff>
--- a/crear_documentos/services/doc_101/plantilla.docx
+++ b/crear_documentos/services/doc_101/plantilla.docx
@@ -9495,55 +9495,22 @@
         </w:rPr>
       </w:pPr>
       <w:r>
-        <w:t>Las actividades previas a la</w:t>
-      </w:r>
-      <w:r>
-        <w:t>s</w:t>
-      </w:r>
-      <w:r>
-        <w:t xml:space="preserve"> campaña</w:t>
-      </w:r>
-      <w:r>
-        <w:t>s</w:t>
-      </w:r>
-      <w:r>
-        <w:t xml:space="preserve"> de </w:t>
-      </w:r>
-      <w:r>
-        <w:t>liberación</w:t>
-      </w:r>
-      <w:r>
-        <w:t xml:space="preserve">, comenzaron una vez que PEMEX proporcionó al personal de ASM-CICESE las coordenadas para el despliegue de las </w:t>
-      </w:r>
-      <w:r>
-        <w:t>siete</w:t>
-      </w:r>
-      <w:r>
-        <w:t xml:space="preserve"> sondas oceanográficas, </w:t>
-      </w:r>
-      <w:r>
-        <w:t>diseñadas</w:t>
-      </w:r>
-      <w:r>
-        <w:t xml:space="preserve"> conforme a las necesidades específicas de PEMEX. </w:t>
-      </w:r>
-      <w:r>
-        <w:rPr>
-          <w:rFonts w:cs="Arial"/>
-        </w:rPr>
-        <w:t>Previo al despliegue de las sondas se realizaron las actividades determinadas de acuerdo al plan de trabajo del personal y, en la medida de lo posible, se consideraron los tiempos programados en el Plan de Campaña</w:t>
-      </w:r>
-      <w:r>
-        <w:rPr>
-          <w:rFonts w:cs="Arial"/>
-        </w:rPr>
-        <w:t xml:space="preserve"> de cada despliegue</w:t>
-      </w:r>
-      <w:r>
-        <w:rPr>
-          <w:rFonts w:cs="Arial"/>
-        </w:rPr>
-        <w:t xml:space="preserve">. </w:t>
+        <w:rPr>
+          <w:rFonts w:cs="Arial"/>
+        </w:rPr>
+        <w:t>&lt;&lt;descripción_actividades_previas_parrafo</w:t>
+      </w:r>
+      <w:r>
+        <w:rPr>
+          <w:rFonts w:cs="Arial"/>
+        </w:rPr>
+        <w:t>2</w:t>
+      </w:r>
+      <w:r>
+        <w:rPr>
+          <w:rFonts w:cs="Arial"/>
+        </w:rPr>
+        <w:t>&gt;&gt;</w:t>
       </w:r>
     </w:p>
     <w:p>
@@ -9559,7 +9526,13 @@
         <w:ind w:firstLine="360"/>
       </w:pPr>
       <w:r>
-        <w:t>&lt;&lt;descrpcion_actividades_previas_parrafo2&gt;&gt;</w:t>
+        <w:t>&lt;&lt;descrpcion_actividades_previas_parrafo</w:t>
+      </w:r>
+      <w:r>
+        <w:t>3</w:t>
+      </w:r>
+      <w:r>
+        <w:t>&gt;&gt;</w:t>
       </w:r>
     </w:p>
     <w:p>
@@ -9581,19 +9554,7 @@
         <w:t xml:space="preserve">de </w:t>
       </w:r>
       <w:r>
-        <w:t>campaña</w:t>
-      </w:r>
-      <w:r>
-        <w:t xml:space="preserve"> d</w:t>
-      </w:r>
-      <w:r>
-        <w:t>urante</w:t>
-      </w:r>
-      <w:r>
-        <w:t xml:space="preserve"> ambas etapas</w:t>
-      </w:r>
-      <w:r>
-        <w:t>,</w:t>
+        <w:t>campaña,</w:t>
       </w:r>
       <w:r>
         <w:t xml:space="preserve"> </w:t>
@@ -9736,13 +9697,38 @@
         <w:spacing w:line="240" w:lineRule="auto"/>
         <w:jc w:val="center"/>
         <w:rPr>
-          <w:rFonts w:ascii="Times New Roman" w:hAnsi="Times New Roman"/>
-        </w:rPr>
-      </w:pPr>
+          <w:rFonts w:cs="Microsoft Sans Serif"/>
+        </w:rPr>
+      </w:pPr>
+      <w:r>
+        <w:rPr>
+          <w:rFonts w:cs="Microsoft Sans Serif"/>
+        </w:rPr>
+        <w:t>&lt;&lt;</w:t>
+      </w:r>
+      <w:proofErr w:type="spellStart"/>
+      <w:r>
+        <w:rPr>
+          <w:rFonts w:cs="Microsoft Sans Serif"/>
+        </w:rPr>
+        <w:t>fig_actividades_previas</w:t>
+      </w:r>
+      <w:proofErr w:type="spellEnd"/>
+      <w:r>
+        <w:rPr>
+          <w:rFonts w:cs="Microsoft Sans Serif"/>
+        </w:rPr>
+        <w:t>&gt;&gt;</w:t>
+      </w:r>
     </w:p>
     <w:p>
       <w:pPr>
-        <w:pStyle w:val="Descripcin"/>
+        <w:suppressAutoHyphens w:val="0"/>
+        <w:spacing w:line="240" w:lineRule="auto"/>
+        <w:jc w:val="center"/>
+        <w:rPr>
+          <w:rFonts w:cs="Microsoft Sans Serif"/>
+        </w:rPr>
       </w:pPr>
       <w:bookmarkStart w:id="88" w:name="_Ref217389348"/>
       <w:bookmarkStart w:id="89" w:name="_Toc229049291"/>
@@ -9761,27 +9747,37 @@
       <w:r>
         <w:t xml:space="preserve">. </w:t>
       </w:r>
-      <w:r>
-        <w:t xml:space="preserve">Proceso de sellado de la boya, </w:t>
-      </w:r>
-      <w:r>
-        <w:t>limpieza de</w:t>
-      </w:r>
-      <w:r>
-        <w:t xml:space="preserve"> la orilla antes de aplicar el pegamento</w:t>
-      </w:r>
-      <w:r>
-        <w:t xml:space="preserve"> que une el domo con la base</w:t>
-      </w:r>
-      <w:r>
-        <w:t>.</w:t>
-      </w:r>
       <w:bookmarkEnd w:id="89"/>
+      <w:r>
+        <w:rPr>
+          <w:rFonts w:cs="Microsoft Sans Serif"/>
+        </w:rPr>
+        <w:t>&lt;&lt;</w:t>
+      </w:r>
+      <w:proofErr w:type="spellStart"/>
+      <w:r>
+        <w:rPr>
+          <w:rFonts w:cs="Microsoft Sans Serif"/>
+        </w:rPr>
+        <w:t>pie</w:t>
+      </w:r>
+      <w:r>
+        <w:rPr>
+          <w:rFonts w:cs="Microsoft Sans Serif"/>
+        </w:rPr>
+        <w:t>_actividades_previas</w:t>
+      </w:r>
+      <w:proofErr w:type="spellEnd"/>
+      <w:r>
+        <w:rPr>
+          <w:rFonts w:cs="Microsoft Sans Serif"/>
+        </w:rPr>
+        <w:t>&gt;&gt;</w:t>
+      </w:r>
     </w:p>
     <w:p>
       <w:pPr>
         <w:spacing w:before="240"/>
-        <w:ind w:firstLine="360"/>
       </w:pPr>
     </w:p>
     <w:p>
@@ -9835,11 +9831,7 @@
         <w:t>dañado</w:t>
       </w:r>
       <w:r>
-        <w:t xml:space="preserve"> durante el sellado. Las pruebas de </w:t>
-      </w:r>
-      <w:r>
-        <w:lastRenderedPageBreak/>
-        <w:t xml:space="preserve">transmisión se </w:t>
+        <w:t xml:space="preserve"> durante el sellado. Las pruebas de transmisión se </w:t>
       </w:r>
       <w:r>
         <w:t>hicieron</w:t>
@@ -9874,7 +9866,13 @@
         <w:ind w:firstLine="360"/>
       </w:pPr>
       <w:r>
-        <w:t>&lt;&lt;descripcion_actividades_previas_parrafo3&gt;&gt;</w:t>
+        <w:t>&lt;&lt;descripcion_actividades_previas_parrafo</w:t>
+      </w:r>
+      <w:r>
+        <w:t>4</w:t>
+      </w:r>
+      <w:r>
+        <w:t>&gt;&gt;</w:t>
       </w:r>
       <w:r>
         <w:t xml:space="preserve"> </w:t>
@@ -9915,6 +9913,7 @@
         <w:t xml:space="preserve">. La documentación correspondiente a las pruebas de funcionamiento se muestra en el </w:t>
       </w:r>
       <w:r>
+        <w:lastRenderedPageBreak/>
         <w:fldChar w:fldCharType="begin"/>
       </w:r>
       <w:r>
@@ -10144,7 +10143,11 @@
       </w:r>
       <w:proofErr w:type="spellEnd"/>
       <w:r>
-        <w:t>, basada en una constelación de satélites en órbita baja (LEO) que operan en banda L. Mediante servicios simplex de bajo consumo energético, se transmiten paquetes periódicos de información desde zonas remotas, lo que permite una comunicación confiable y con tiempos de transmisión reducidos. Este sistema resultó adecuado para plataformas autónomas y funcionó de manera exitosa durante las pruebas de 24 horas realizadas en el centro de operaciones del consorcio ASM-CICESE, donde los datos fueron recibidos de forma continua.</w:t>
+        <w:t xml:space="preserve">, basada en una constelación de satélites en órbita baja (LEO) que operan en banda L. Mediante servicios simplex de bajo consumo energético, se transmiten paquetes periódicos de información desde zonas remotas, lo que permite una comunicación confiable y con tiempos de transmisión reducidos. Este sistema resultó adecuado para plataformas autónomas y funcionó de manera exitosa durante las </w:t>
+      </w:r>
+      <w:r>
+        <w:lastRenderedPageBreak/>
+        <w:t>pruebas de 24 horas realizadas en el centro de operaciones del consorcio ASM-CICESE, donde los datos fueron recibidos de forma continua.</w:t>
       </w:r>
     </w:p>
     <w:p>
@@ -10262,21 +10265,7 @@
           <w:rFonts w:ascii="Microsoft Sans Serif" w:eastAsia="Times New Roman" w:hAnsi="Microsoft Sans Serif" w:cs="Times New Roman"/>
           <w:color w:val="auto"/>
         </w:rPr>
-        <w:t xml:space="preserve">. De acuerdo a lo anterior, </w:t>
-      </w:r>
-      <w:r>
-        <w:rPr>
-          <w:rFonts w:ascii="Microsoft Sans Serif" w:eastAsia="Times New Roman" w:hAnsi="Microsoft Sans Serif" w:cs="Times New Roman"/>
-          <w:color w:val="auto"/>
-        </w:rPr>
-        <w:t>la ejecución de las campañas de liberación siguió</w:t>
-      </w:r>
-      <w:r>
-        <w:rPr>
-          <w:rFonts w:ascii="Microsoft Sans Serif" w:eastAsia="Times New Roman" w:hAnsi="Microsoft Sans Serif" w:cs="Times New Roman"/>
-          <w:color w:val="auto"/>
-        </w:rPr>
-        <w:t xml:space="preserve"> un procedimiento seguro en todas las actividades que involucran la travesía y las maniobras del despliegue. </w:t>
+        <w:t xml:space="preserve">. </w:t>
       </w:r>
     </w:p>
     <w:p>
@@ -10292,207 +10281,84 @@
     </w:p>
     <w:p>
       <w:pPr>
-        <w:ind w:firstLine="360"/>
+        <w:pStyle w:val="Normal1"/>
+        <w:spacing w:line="360" w:lineRule="auto"/>
+        <w:ind w:firstLine="432"/>
+        <w:jc w:val="both"/>
+        <w:rPr>
+          <w:rFonts w:ascii="Microsoft Sans Serif" w:eastAsia="Times New Roman" w:hAnsi="Microsoft Sans Serif" w:cs="Times New Roman"/>
+          <w:color w:val="auto"/>
+        </w:rPr>
+      </w:pPr>
+      <w:r>
+        <w:rPr>
+          <w:rFonts w:ascii="Microsoft Sans Serif" w:eastAsia="Times New Roman" w:hAnsi="Microsoft Sans Serif" w:cs="Times New Roman"/>
+          <w:color w:val="auto"/>
+        </w:rPr>
+        <w:t>&lt;&lt;ejecucion_de_la_campania_parrafo</w:t>
+      </w:r>
+      <w:r>
+        <w:rPr>
+          <w:rFonts w:ascii="Microsoft Sans Serif" w:eastAsia="Times New Roman" w:hAnsi="Microsoft Sans Serif" w:cs="Times New Roman"/>
+          <w:color w:val="auto"/>
+        </w:rPr>
+        <w:t>2</w:t>
+      </w:r>
+      <w:r>
+        <w:rPr>
+          <w:rFonts w:ascii="Microsoft Sans Serif" w:eastAsia="Times New Roman" w:hAnsi="Microsoft Sans Serif" w:cs="Times New Roman"/>
+          <w:color w:val="auto"/>
+        </w:rPr>
+        <w:t>&gt;&gt;</w:t>
+      </w:r>
+      <w:bookmarkEnd w:id="98"/>
+      <w:r>
+        <w:t xml:space="preserve"> (ver </w:t>
+      </w:r>
+      <w:r>
+        <w:fldChar w:fldCharType="begin"/>
+      </w:r>
+      <w:r>
+        <w:instrText xml:space="preserve"> REF _Ref219907034 \h </w:instrText>
+      </w:r>
+      <w:r>
+        <w:instrText xml:space="preserve"> \* MERGEFORMAT </w:instrText>
+      </w:r>
+      <w:r>
+        <w:fldChar w:fldCharType="separate"/>
+      </w:r>
+      <w:r>
+        <w:rPr>
+          <w:rStyle w:val="Title1"/>
+        </w:rPr>
+        <w:t>ANEXO 3: PLAN DE CRUCERO</w:t>
+      </w:r>
+      <w:r>
+        <w:fldChar w:fldCharType="end"/>
+      </w:r>
+      <w:r>
+        <w:t>).</w:t>
+      </w:r>
+      <w:r>
+        <w:t xml:space="preserve"> </w:t>
+      </w:r>
+      <w:r>
+        <w:t>&lt;&lt;ejecución_de_la_campania_parrafo</w:t>
+      </w:r>
+      <w:r>
+        <w:t>3</w:t>
+      </w:r>
+      <w:r>
+        <w:t xml:space="preserve">&gt;&gt;. </w:t>
+      </w:r>
+      <w:r>
+        <w:t>&lt;&lt;ejecucion_de_la_campania_parrafo4&gt;&gt;</w:t>
+      </w:r>
+      <w:r>
         <w:rPr>
           <w:szCs w:val="22"/>
         </w:rPr>
-      </w:pPr>
-      <w:r>
-        <w:t>La ejecuci</w:t>
-      </w:r>
-      <w:r>
-        <w:t>ó</w:t>
-      </w:r>
-      <w:r>
-        <w:t>n de la</w:t>
-      </w:r>
-      <w:r>
-        <w:t>s</w:t>
-      </w:r>
-      <w:r>
-        <w:t xml:space="preserve"> campaña</w:t>
-      </w:r>
-      <w:r>
-        <w:t>s</w:t>
-      </w:r>
-      <w:r>
-        <w:t xml:space="preserve"> de </w:t>
-      </w:r>
-      <w:r>
-        <w:t>despliegue</w:t>
-      </w:r>
-      <w:r>
-        <w:t xml:space="preserve"> de las sondas oceanográficas; se efectuó de acuerdo con la planeación de la logística y derrotero de la embarcación</w:t>
-      </w:r>
-      <w:bookmarkEnd w:id="98"/>
-      <w:r>
-        <w:t xml:space="preserve"> (ver </w:t>
-      </w:r>
-      <w:r>
-        <w:fldChar w:fldCharType="begin"/>
-      </w:r>
-      <w:r>
-        <w:instrText xml:space="preserve"> REF _Ref219907034 \h </w:instrText>
-      </w:r>
-      <w:r>
-        <w:instrText xml:space="preserve"> \* MERGEFORMAT </w:instrText>
-      </w:r>
-      <w:r>
-        <w:fldChar w:fldCharType="separate"/>
-      </w:r>
-      <w:r>
-        <w:rPr>
-          <w:rStyle w:val="Title1"/>
-        </w:rPr>
-        <w:t>ANEXO 3: PLAN DE CRUCERO</w:t>
-      </w:r>
-      <w:r>
-        <w:fldChar w:fldCharType="end"/>
-      </w:r>
-      <w:r>
-        <w:t>).</w:t>
-      </w:r>
-      <w:r>
-        <w:t xml:space="preserve"> </w:t>
-      </w:r>
-      <w:r>
-        <w:t>En cada campaña, e</w:t>
-      </w:r>
-      <w:r>
-        <w:t xml:space="preserve">l líder del </w:t>
-      </w:r>
-      <w:r>
-        <w:t>e</w:t>
-      </w:r>
-      <w:r>
-        <w:t>quipo de instalación le informó al personal las actividades que se realizarían durante el despliegue de la</w:t>
-      </w:r>
-      <w:r>
-        <w:t>s</w:t>
-      </w:r>
-      <w:r>
-        <w:t xml:space="preserve"> sonda</w:t>
-      </w:r>
-      <w:r>
-        <w:t>s</w:t>
-      </w:r>
-      <w:r>
-        <w:t xml:space="preserve"> con el fin de que cada miembro del equipo conociera los detalles de la operación, propiciando la integridad del personal y de los equipos de dicha</w:t>
-      </w:r>
-      <w:r>
-        <w:t>s</w:t>
-      </w:r>
-      <w:r>
-        <w:t xml:space="preserve"> sonda</w:t>
-      </w:r>
-      <w:r>
-        <w:t>s</w:t>
-      </w:r>
-      <w:r>
-        <w:t xml:space="preserve">; asimismo se siguieron los procedimientos de seguridad durante </w:t>
-      </w:r>
-      <w:r>
-        <w:t>todas las campañas</w:t>
-      </w:r>
-      <w:r>
-        <w:t xml:space="preserve"> de despliegue de las sondas oceanográficas. </w:t>
-      </w:r>
-      <w:r>
-        <w:t xml:space="preserve">&lt;&lt;ejecución_de_la_campania_parrafo2&gt;&gt;. </w:t>
-      </w:r>
-      <w:r>
-        <w:rPr>
-          <w:szCs w:val="22"/>
-        </w:rPr>
-        <w:t xml:space="preserve">La </w:t>
-      </w:r>
-      <w:r>
-        <w:rPr>
-          <w:szCs w:val="22"/>
-        </w:rPr>
-        <w:fldChar w:fldCharType="begin"/>
-      </w:r>
-      <w:r>
-        <w:rPr>
-          <w:szCs w:val="22"/>
-        </w:rPr>
-        <w:instrText xml:space="preserve"> REF _Ref217465608 \h </w:instrText>
-      </w:r>
-      <w:r>
-        <w:rPr>
-          <w:szCs w:val="22"/>
-        </w:rPr>
-      </w:r>
-      <w:r>
-        <w:rPr>
-          <w:szCs w:val="22"/>
-        </w:rPr>
-        <w:fldChar w:fldCharType="separate"/>
-      </w:r>
-      <w:r>
-        <w:t xml:space="preserve">Figura </w:t>
-      </w:r>
-      <w:r>
-        <w:rPr>
-          <w:noProof/>
-        </w:rPr>
-        <w:t>8</w:t>
-      </w:r>
-      <w:r>
-        <w:rPr>
-          <w:szCs w:val="22"/>
-        </w:rPr>
-        <w:fldChar w:fldCharType="end"/>
-      </w:r>
-      <w:r>
-        <w:rPr>
-          <w:szCs w:val="22"/>
-        </w:rPr>
-        <w:t xml:space="preserve"> y </w:t>
-      </w:r>
-      <w:r>
-        <w:rPr>
-          <w:szCs w:val="22"/>
-        </w:rPr>
-        <w:fldChar w:fldCharType="begin"/>
-      </w:r>
-      <w:r>
-        <w:rPr>
-          <w:szCs w:val="22"/>
-        </w:rPr>
-        <w:instrText xml:space="preserve"> REF _Ref228975474 \h </w:instrText>
-      </w:r>
-      <w:r>
-        <w:rPr>
-          <w:szCs w:val="22"/>
-        </w:rPr>
-      </w:r>
-      <w:r>
-        <w:rPr>
-          <w:szCs w:val="22"/>
-        </w:rPr>
-        <w:fldChar w:fldCharType="separate"/>
-      </w:r>
-      <w:r>
-        <w:t xml:space="preserve">Figura </w:t>
-      </w:r>
-      <w:r>
-        <w:rPr>
-          <w:noProof/>
-        </w:rPr>
-        <w:t>9</w:t>
-      </w:r>
-      <w:r>
-        <w:rPr>
-          <w:szCs w:val="22"/>
-        </w:rPr>
-        <w:fldChar w:fldCharType="end"/>
-      </w:r>
-      <w:r>
-        <w:rPr>
-          <w:szCs w:val="22"/>
-        </w:rPr>
-        <w:t xml:space="preserve"> muestran las localizaciones </w:t>
+        <w:t xml:space="preserve"> las localizaciones </w:t>
       </w:r>
       <w:r>
         <w:rPr>
@@ -10586,7 +10452,6 @@
         <w:rPr>
           <w:szCs w:val="22"/>
         </w:rPr>
-        <w:lastRenderedPageBreak/>
         <w:t>Antes de iniciar las operaciones para el despliegue de la primera sonda, se pusieron en marcha los protocolos de seguridad tanto para el personal como para mantener seguras las sondas oceanográficas. Antes de iniciar las operaciones, se revisaron con el personal las actividades previamente asignadas.</w:t>
       </w:r>
     </w:p>
@@ -10616,7 +10481,19 @@
         <w:rPr>
           <w:szCs w:val="22"/>
         </w:rPr>
-        <w:t>Se corroboraron las coordenadas y el tirante de liberación de la primera sonda con el GPS de la embarcación.</w:t>
+        <w:t>Se corroboraron las coordenadas y el tirante de liberación de la sonda</w:t>
+      </w:r>
+      <w:r>
+        <w:rPr>
+          <w:szCs w:val="22"/>
+        </w:rPr>
+        <w:t xml:space="preserve"> a desplegar</w:t>
+      </w:r>
+      <w:r>
+        <w:rPr>
+          <w:szCs w:val="22"/>
+        </w:rPr>
+        <w:t xml:space="preserve"> con el GPS de la embarcación.</w:t>
       </w:r>
     </w:p>
     <w:p>
@@ -10715,6 +10592,7 @@
         <w:rPr>
           <w:szCs w:val="22"/>
         </w:rPr>
+        <w:lastRenderedPageBreak/>
         <w:t>Posteriormente, el personal liberó la sonda oceanográfica sobre la superficie del mar y se tomó nota de las coordenadas del punto de liberación.</w:t>
       </w:r>
     </w:p>
@@ -10797,7 +10675,7 @@
         <w:rPr>
           <w:szCs w:val="22"/>
         </w:rPr>
-        <w:t xml:space="preserve"> al terminar de liberar todas las sondas se regresó al lugar de zarpe. </w:t>
+        <w:t xml:space="preserve"> al terminar de liberar las sondas se regresó al lugar de zarpe. </w:t>
       </w:r>
     </w:p>
     <w:p/>
@@ -11749,7 +11627,19 @@
         <w:ind w:firstLine="360"/>
       </w:pPr>
       <w:r>
-        <w:t>&lt;&lt;ejecución_de_la_camapnia_parrafo3&gt;&gt;</w:t>
+        <w:t>&lt;&lt;ejecuci</w:t>
+      </w:r>
+      <w:r>
+        <w:t>o</w:t>
+      </w:r>
+      <w:r>
+        <w:t>n_de_la_camapnia_parrafo</w:t>
+      </w:r>
+      <w:r>
+        <w:t>5</w:t>
+      </w:r>
+      <w:r>
+        <w:t>&gt;&gt;</w:t>
       </w:r>
       <w:r>
         <w:t xml:space="preserve"> </w:t>
@@ -11844,6 +11734,7 @@
       <w:bookmarkStart w:id="112" w:name="_Ref217401548"/>
       <w:bookmarkStart w:id="113" w:name="_Toc229049320"/>
       <w:r>
+        <w:lastRenderedPageBreak/>
         <w:t xml:space="preserve">Tabla </w:t>
       </w:r>
       <w:fldSimple w:instr=" SEQ Tabla \* ARABIC ">
@@ -13670,7 +13561,6 @@
         <w:ind w:firstLine="426"/>
       </w:pPr>
       <w:r>
-        <w:lastRenderedPageBreak/>
         <w:t>D</w:t>
       </w:r>
       <w:r>
@@ -14810,7 +14700,13 @@
         </w:rPr>
       </w:pPr>
       <w:r>
-        <w:t>&lt;&lt;conclsuiones_parrafo2&gt;&gt;</w:t>
+        <w:t>&lt;&lt;conclu</w:t>
+      </w:r>
+      <w:r>
+        <w:t>s</w:t>
+      </w:r>
+      <w:r>
+        <w:t>iones_parrafo2&gt;&gt;</w:t>
       </w:r>
     </w:p>
     <w:p>
@@ -14893,14 +14789,12 @@
         </w:rPr>
         <w:t xml:space="preserve">durante el despliegue en el mar. </w:t>
       </w:r>
-      <w:proofErr w:type="gramStart"/>
       <w:r>
         <w:rPr>
           <w:szCs w:val="22"/>
         </w:rPr>
-        <w:t>Asimismo</w:t>
-      </w:r>
-      <w:proofErr w:type="gramEnd"/>
+        <w:t>Asimismo,</w:t>
+      </w:r>
       <w:r>
         <w:rPr>
           <w:szCs w:val="22"/>

</xml_diff>

<commit_message>
Se removio la funcion conclusiones_parrafo1, se renombro la funcion conclusiones_parrafo2 a conclusiones_parrafor1, se renombro la funcion introduccion_parrafo1 a orden_de_servicio
</commit_message>
<xml_diff>
--- a/crear_documentos/services/doc_101/plantilla.docx
+++ b/crear_documentos/services/doc_101/plantilla.docx
@@ -364,11 +364,15 @@
               <w:t>PEMEX-ASM-CICESE-658225821-</w:t>
             </w:r>
             <w:r>
-              <w:rPr>
-                <w:sz w:val="20"/>
-                <w:szCs w:val="20"/>
-              </w:rPr>
-              <w:t>238</w:t>
+              <w:t>&lt;&lt;</w:t>
+            </w:r>
+            <w:proofErr w:type="spellStart"/>
+            <w:r>
+              <w:t>orden_de_servicio</w:t>
+            </w:r>
+            <w:proofErr w:type="spellEnd"/>
+            <w:r>
+              <w:t>&gt;&gt;</w:t>
             </w:r>
           </w:p>
         </w:tc>
@@ -6084,6 +6088,48 @@
         <w:ind w:firstLine="360"/>
       </w:pPr>
       <w:r>
+        <w:t xml:space="preserve">Este reporte describe y enumera las actividades realizadas por el consorcio </w:t>
+      </w:r>
+      <w:proofErr w:type="spellStart"/>
+      <w:r>
+        <w:t>All</w:t>
+      </w:r>
+      <w:proofErr w:type="spellEnd"/>
+      <w:r>
+        <w:t xml:space="preserve"> </w:t>
+      </w:r>
+      <w:proofErr w:type="spellStart"/>
+      <w:r>
+        <w:t>Solutions</w:t>
+      </w:r>
+      <w:proofErr w:type="spellEnd"/>
+      <w:r>
+        <w:t xml:space="preserve"> de México S. A. de C. V. (en lo sucesivo ASM) y el Centro de Investigación Científica y Educación Superior de Ensenada (en lo sucesivo CICESE) para la preparación, movilización y finalmente el</w:t>
+      </w:r>
+      <w:r>
+        <w:t xml:space="preserve"> </w:t>
+      </w:r>
+      <w:r>
+        <w:t>despliegue satisfactorio de sondas oceanográficas; dando cumplimiento así al compromiso establecido en la sección 10.1 del contrato No. 658225821 “Reporte del protocolo de liberación de las sondas oceanográficas y transmisión de datos.” y específicamente a la Orden de Servicio PEMEX-ASM-CICESE-658225821-</w:t>
+      </w:r>
+      <w:r>
+        <w:t>&lt;&lt;</w:t>
+      </w:r>
+      <w:proofErr w:type="spellStart"/>
+      <w:r>
+        <w:t>orden_de_servicio</w:t>
+      </w:r>
+      <w:proofErr w:type="spellEnd"/>
+      <w:r>
+        <w:t>&gt;&gt;</w:t>
+      </w:r>
+    </w:p>
+    <w:p>
+      <w:pPr>
+        <w:ind w:firstLine="360"/>
+      </w:pPr>
+      <w:r>
+        <w:lastRenderedPageBreak/>
         <w:t>&lt;&lt;intro_</w:t>
       </w:r>
       <w:r>
@@ -9498,19 +9544,7 @@
         <w:rPr>
           <w:rFonts w:cs="Arial"/>
         </w:rPr>
-        <w:t>&lt;&lt;descripción_actividades_previas_parrafo</w:t>
-      </w:r>
-      <w:r>
-        <w:rPr>
-          <w:rFonts w:cs="Arial"/>
-        </w:rPr>
-        <w:t>2</w:t>
-      </w:r>
-      <w:r>
-        <w:rPr>
-          <w:rFonts w:cs="Arial"/>
-        </w:rPr>
-        <w:t>&gt;&gt;</w:t>
+        <w:t>&lt;&lt;descripción_actividades_previas_parrafo2&gt;&gt;</w:t>
       </w:r>
     </w:p>
     <w:p>
@@ -10295,21 +10329,7 @@
           <w:rFonts w:ascii="Microsoft Sans Serif" w:eastAsia="Times New Roman" w:hAnsi="Microsoft Sans Serif" w:cs="Times New Roman"/>
           <w:color w:val="auto"/>
         </w:rPr>
-        <w:t>&lt;&lt;ejecucion_de_la_campania_parrafo</w:t>
-      </w:r>
-      <w:r>
-        <w:rPr>
-          <w:rFonts w:ascii="Microsoft Sans Serif" w:eastAsia="Times New Roman" w:hAnsi="Microsoft Sans Serif" w:cs="Times New Roman"/>
-          <w:color w:val="auto"/>
-        </w:rPr>
-        <w:t>2</w:t>
-      </w:r>
-      <w:r>
-        <w:rPr>
-          <w:rFonts w:ascii="Microsoft Sans Serif" w:eastAsia="Times New Roman" w:hAnsi="Microsoft Sans Serif" w:cs="Times New Roman"/>
-          <w:color w:val="auto"/>
-        </w:rPr>
-        <w:t>&gt;&gt;</w:t>
+        <w:t>&lt;&lt;ejecucion_de_la_campania_parrafo2&gt;&gt;</w:t>
       </w:r>
       <w:bookmarkEnd w:id="98"/>
       <w:r>
@@ -10343,15 +10363,30 @@
         <w:t xml:space="preserve"> </w:t>
       </w:r>
       <w:r>
+        <w:rPr>
+          <w:rFonts w:ascii="Microsoft Sans Serif" w:hAnsi="Microsoft Sans Serif" w:cs="Microsoft Sans Serif"/>
+        </w:rPr>
         <w:t>&lt;&lt;ejecución_de_la_campania_parrafo</w:t>
       </w:r>
       <w:r>
+        <w:rPr>
+          <w:rFonts w:ascii="Microsoft Sans Serif" w:hAnsi="Microsoft Sans Serif" w:cs="Microsoft Sans Serif"/>
+        </w:rPr>
         <w:t>3</w:t>
       </w:r>
       <w:r>
-        <w:t xml:space="preserve">&gt;&gt;. </w:t>
-      </w:r>
-      <w:r>
+        <w:rPr>
+          <w:rFonts w:ascii="Microsoft Sans Serif" w:hAnsi="Microsoft Sans Serif" w:cs="Microsoft Sans Serif"/>
+        </w:rPr>
+        <w:t>&gt;&gt;.</w:t>
+      </w:r>
+      <w:r>
+        <w:t xml:space="preserve"> </w:t>
+      </w:r>
+      <w:r>
+        <w:rPr>
+          <w:rFonts w:ascii="Microsoft Sans Serif" w:hAnsi="Microsoft Sans Serif" w:cs="Microsoft Sans Serif"/>
+        </w:rPr>
         <w:t>&lt;&lt;ejecucion_de_la_campania_parrafo4&gt;&gt;</w:t>
       </w:r>
       <w:r>
@@ -14631,7 +14666,41 @@
           <w:bCs/>
           <w:szCs w:val="22"/>
         </w:rPr>
-        <w:t>&lt;&lt;conclusiones_parrafo1&gt;&gt;</w:t>
+        <w:t>PEMEX-ASM-CICESE-658225821-</w:t>
+      </w:r>
+    </w:p>
+    <w:p>
+      <w:pPr>
+        <w:ind w:firstLine="360"/>
+        <w:rPr>
+          <w:szCs w:val="22"/>
+        </w:rPr>
+      </w:pPr>
+      <w:r>
+        <w:rPr>
+          <w:b/>
+          <w:bCs/>
+          <w:szCs w:val="22"/>
+        </w:rPr>
+        <w:t>&lt;&lt;</w:t>
+      </w:r>
+      <w:proofErr w:type="spellStart"/>
+      <w:r>
+        <w:rPr>
+          <w:b/>
+          <w:bCs/>
+          <w:szCs w:val="22"/>
+        </w:rPr>
+        <w:t>orden_de_servicio</w:t>
+      </w:r>
+      <w:proofErr w:type="spellEnd"/>
+      <w:r>
+        <w:rPr>
+          <w:b/>
+          <w:bCs/>
+          <w:szCs w:val="22"/>
+        </w:rPr>
+        <w:t>&gt;&gt;</w:t>
       </w:r>
     </w:p>
     <w:p>
@@ -14706,7 +14775,13 @@
         <w:t>s</w:t>
       </w:r>
       <w:r>
-        <w:t>iones_parrafo2&gt;&gt;</w:t>
+        <w:t>iones_parrafo</w:t>
+      </w:r>
+      <w:r>
+        <w:t>1</w:t>
+      </w:r>
+      <w:r>
+        <w:t>&gt;&gt;</w:t>
       </w:r>
     </w:p>
     <w:p>
@@ -24778,7 +24853,6 @@
   <w:style w:type="character" w:default="1" w:styleId="Fuentedeprrafopredeter">
     <w:name w:val="Default Paragraph Font"/>
     <w:uiPriority w:val="1"/>
-    <w:semiHidden/>
     <w:unhideWhenUsed/>
   </w:style>
   <w:style w:type="table" w:default="1" w:styleId="Tablanormal">

</xml_diff>

<commit_message>
Se construyo la logica de los parrafos para el capitulo ejecucion de la campania.
</commit_message>
<xml_diff>
--- a/crear_documentos/services/doc_101/plantilla.docx
+++ b/crear_documentos/services/doc_101/plantilla.docx
@@ -7516,29 +7516,29 @@
     </w:p>
     <w:p>
       <w:pPr>
+        <w:pStyle w:val="Carjustificado"/>
+        <w:jc w:val="center"/>
+      </w:pPr>
+      <w:r>
+        <w:t>&lt;&lt;fig_descripcion_arquitectura</w:t>
+      </w:r>
+      <w:r>
+        <w:t>_1</w:t>
+      </w:r>
+      <w:r>
+        <w:t>&gt;&gt;</w:t>
+      </w:r>
+    </w:p>
+    <w:p>
+      <w:pPr>
         <w:keepNext/>
         <w:ind w:firstLine="360"/>
         <w:jc w:val="center"/>
       </w:pPr>
-      <w:r>
-        <w:t>&lt;&lt;fig_descripcion_arquitectura</w:t>
-      </w:r>
-      <w:r>
-        <w:t>_1</w:t>
-      </w:r>
-      <w:r>
-        <w:t>&gt;&gt;</w:t>
-      </w:r>
-    </w:p>
-    <w:p>
-      <w:pPr>
-        <w:keepNext/>
-        <w:ind w:firstLine="360"/>
-        <w:jc w:val="center"/>
-      </w:pPr>
       <w:bookmarkStart w:id="69" w:name="_Ref221789083"/>
       <w:bookmarkStart w:id="70" w:name="_Toc229049285"/>
       <w:r>
+        <w:lastRenderedPageBreak/>
         <w:t xml:space="preserve">Figura </w:t>
       </w:r>
       <w:fldSimple w:instr=" SEQ Figura \* ARABIC ">
@@ -8096,6 +8096,7 @@
         <w:rPr>
           <w:rFonts w:cs="Arial"/>
         </w:rPr>
+        <w:lastRenderedPageBreak/>
         <w:t>En la parte superior interna de la boya se instalaron paneles solares de 6.2 V y 1 A</w:t>
       </w:r>
       <w:r>
@@ -8403,7 +8404,6 @@
         <w:rPr>
           <w:rFonts w:cs="Arial"/>
         </w:rPr>
-        <w:lastRenderedPageBreak/>
         <w:t>Dado que la boya se encuentra sellada herméticamente y no es posible su apertura una vez cerrada, se incorpora un interruptor magnético que permite el encendido y apagado de la sonda sin necesidad de contacto físico directo. De igual forma, el sistema integra un módulo de comunicación Bluetooth, el cual permite la programación de la sonda y la descarga de datos una vez concluido el cierre de la estructura esférica.</w:t>
       </w:r>
     </w:p>
@@ -8428,6 +8428,7 @@
           <w:b/>
           <w:bCs/>
         </w:rPr>
+        <w:lastRenderedPageBreak/>
         <w:t>Sistema de telemetría y posicionamiento</w:t>
       </w:r>
     </w:p>
@@ -8965,7 +8966,6 @@
                 <w:sz w:val="20"/>
                 <w:szCs w:val="20"/>
               </w:rPr>
-              <w:lastRenderedPageBreak/>
               <w:t>Temperatura del agua</w:t>
             </w:r>
           </w:p>
@@ -9507,6 +9507,7 @@
         <w:rPr>
           <w:rStyle w:val="Title1"/>
         </w:rPr>
+        <w:lastRenderedPageBreak/>
         <w:t>DESCRIPCIÓN DE LAS ACTIVIDADES PREVIAS A</w:t>
       </w:r>
       <w:bookmarkEnd w:id="86"/>
@@ -9947,7 +9948,6 @@
         <w:t xml:space="preserve">. La documentación correspondiente a las pruebas de funcionamiento se muestra en el </w:t>
       </w:r>
       <w:r>
-        <w:lastRenderedPageBreak/>
         <w:fldChar w:fldCharType="begin"/>
       </w:r>
       <w:r>
@@ -10177,11 +10177,7 @@
       </w:r>
       <w:proofErr w:type="spellEnd"/>
       <w:r>
-        <w:t xml:space="preserve">, basada en una constelación de satélites en órbita baja (LEO) que operan en banda L. Mediante servicios simplex de bajo consumo energético, se transmiten paquetes periódicos de información desde zonas remotas, lo que permite una comunicación confiable y con tiempos de transmisión reducidos. Este sistema resultó adecuado para plataformas autónomas y funcionó de manera exitosa durante las </w:t>
-      </w:r>
-      <w:r>
-        <w:lastRenderedPageBreak/>
-        <w:t>pruebas de 24 horas realizadas en el centro de operaciones del consorcio ASM-CICESE, donde los datos fueron recibidos de forma continua.</w:t>
+        <w:t>, basada en una constelación de satélites en órbita baja (LEO) que operan en banda L. Mediante servicios simplex de bajo consumo energético, se transmiten paquetes periódicos de información desde zonas remotas, lo que permite una comunicación confiable y con tiempos de transmisión reducidos. Este sistema resultó adecuado para plataformas autónomas y funcionó de manera exitosa durante las pruebas de 24 horas realizadas en el centro de operaciones del consorcio ASM-CICESE, donde los datos fueron recibidos de forma continua.</w:t>
       </w:r>
     </w:p>
     <w:p>
@@ -10332,6 +10328,19 @@
         <w:t>&lt;&lt;ejecucion_de_la_campania_parrafo2&gt;&gt;</w:t>
       </w:r>
       <w:bookmarkEnd w:id="98"/>
+      <w:r>
+        <w:rPr>
+          <w:rFonts w:ascii="Microsoft Sans Serif" w:eastAsia="Times New Roman" w:hAnsi="Microsoft Sans Serif" w:cs="Times New Roman"/>
+          <w:color w:val="auto"/>
+        </w:rPr>
+        <w:t xml:space="preserve"> </w:t>
+      </w:r>
+      <w:r>
+        <w:t xml:space="preserve">El </w:t>
+      </w:r>
+      <w:r>
+        <w:t>líder del equipo de instalación le informó al personal las actividades que se realizarían durante el despliegue de las sondas con el fin de que cada miembro del equipo conociera los detalles de la operación, propiciando la integridad del personal y de los equipos de dichas sondas; asimismo se siguieron los procedimientos de seguridad durante todas las campañas de despliegue de las sondas oceanográficas</w:t>
+      </w:r>
       <w:r>
         <w:t xml:space="preserve"> (ver </w:t>
       </w:r>
@@ -10627,7 +10636,6 @@
         <w:rPr>
           <w:szCs w:val="22"/>
         </w:rPr>
-        <w:lastRenderedPageBreak/>
         <w:t>Posteriormente, el personal liberó la sonda oceanográfica sobre la superficie del mar y se tomó nota de las coordenadas del punto de liberación.</w:t>
       </w:r>
     </w:p>
@@ -10657,6 +10665,7 @@
         <w:rPr>
           <w:szCs w:val="22"/>
         </w:rPr>
+        <w:lastRenderedPageBreak/>
         <w:t xml:space="preserve">Una vez liberada la sonda oceanográfica el personal se comunicó mediante telefonía satelital con el personal en tierra para avisar de la maniobra. Posteriormente el personal en tierra realizó el despliegue de la información en el </w:t>
       </w:r>
       <w:r>
@@ -30369,6 +30378,55 @@
       <w:lang w:eastAsia="en-US"/>
     </w:rPr>
   </w:style>
+  <w:style w:type="paragraph" w:customStyle="1" w:styleId="Carcentrado">
+    <w:name w:val="Car_centrado"/>
+    <w:basedOn w:val="Normal"/>
+    <w:next w:val="Normal"/>
+    <w:link w:val="CarcentradoCar"/>
+    <w:qFormat/>
+    <w:rsid w:val="000D0457"/>
+    <w:pPr>
+      <w:keepNext/>
+      <w:ind w:firstLine="360"/>
+      <w:jc w:val="center"/>
+    </w:pPr>
+    <w:rPr>
+      <w:color w:val="000000" w:themeColor="text1"/>
+      <w:sz w:val="20"/>
+    </w:rPr>
+  </w:style>
+  <w:style w:type="character" w:customStyle="1" w:styleId="CarcentradoCar">
+    <w:name w:val="Car_centrado Car"/>
+    <w:basedOn w:val="Fuentedeprrafopredeter"/>
+    <w:link w:val="Carcentrado"/>
+    <w:rsid w:val="000D0457"/>
+    <w:rPr>
+      <w:color w:val="000000" w:themeColor="text1"/>
+      <w:sz w:val="20"/>
+    </w:rPr>
+  </w:style>
+  <w:style w:type="paragraph" w:customStyle="1" w:styleId="Carjustificado">
+    <w:name w:val="Car_justificado"/>
+    <w:basedOn w:val="Normal"/>
+    <w:next w:val="Normal"/>
+    <w:link w:val="CarjustificadoCar"/>
+    <w:qFormat/>
+    <w:rsid w:val="000D0457"/>
+    <w:rPr>
+      <w:color w:val="000000" w:themeColor="text1"/>
+      <w:sz w:val="20"/>
+    </w:rPr>
+  </w:style>
+  <w:style w:type="character" w:customStyle="1" w:styleId="CarjustificadoCar">
+    <w:name w:val="Car_justificado Car"/>
+    <w:basedOn w:val="Fuentedeprrafopredeter"/>
+    <w:link w:val="Carjustificado"/>
+    <w:rsid w:val="000D0457"/>
+    <w:rPr>
+      <w:color w:val="000000" w:themeColor="text1"/>
+      <w:sz w:val="20"/>
+    </w:rPr>
+  </w:style>
 </w:styles>
 </file>
 

</xml_diff>

<commit_message>
Add: cambios en plantilla
</commit_message>
<xml_diff>
--- a/crear_documentos/services/doc_101/plantilla.docx
+++ b/crear_documentos/services/doc_101/plantilla.docx
@@ -7043,125 +7043,94 @@
         <w:rPr>
           <w:rFonts w:cs="Arial"/>
         </w:rPr>
-        <w:fldChar w:fldCharType="begin"/>
+        <w:t>&lt;&lt;ref_</w:t>
+      </w:r>
+      <w:r>
+        <w:t>descripcion_arquitectura_1</w:t>
       </w:r>
       <w:r>
         <w:rPr>
           <w:rFonts w:cs="Arial"/>
         </w:rPr>
-        <w:instrText xml:space="preserve"> REF _Ref221789083 \h </w:instrText>
+        <w:t>&gt;&gt;</w:t>
       </w:r>
       <w:r>
         <w:rPr>
           <w:rFonts w:cs="Arial"/>
         </w:rPr>
-        <w:instrText xml:space="preserve"> \* MERGEFORMAT </w:instrText>
+        <w:t>)</w:t>
       </w:r>
       <w:r>
         <w:rPr>
           <w:rFonts w:cs="Arial"/>
         </w:rPr>
+        <w:t xml:space="preserve"> diseñad</w:t>
       </w:r>
       <w:r>
         <w:rPr>
           <w:rFonts w:cs="Arial"/>
         </w:rPr>
-        <w:fldChar w:fldCharType="separate"/>
+        <w:t>a</w:t>
       </w:r>
       <w:r>
         <w:rPr>
           <w:rFonts w:cs="Arial"/>
         </w:rPr>
-        <w:t>Figura 1</w:t>
+        <w:t xml:space="preserve"> para operar </w:t>
       </w:r>
       <w:r>
         <w:rPr>
           <w:rFonts w:cs="Arial"/>
         </w:rPr>
-        <w:fldChar w:fldCharType="end"/>
+        <w:t>a</w:t>
       </w:r>
       <w:r>
         <w:rPr>
           <w:rFonts w:cs="Arial"/>
         </w:rPr>
+        <w:t xml:space="preserve"> la deriva y una draga de arrastre subsuperficial</w:t>
+      </w:r>
+      <w:r>
+        <w:rPr>
+          <w:rFonts w:cs="Arial"/>
+        </w:rPr>
+        <w:t xml:space="preserve"> </w:t>
+      </w:r>
+      <w:r>
+        <w:rPr>
+          <w:rFonts w:cs="Arial"/>
+        </w:rPr>
+        <w:t>(</w:t>
+      </w:r>
+      <w:r>
+        <w:rPr>
+          <w:rFonts w:cs="Arial"/>
+        </w:rPr>
+        <w:t>&lt;&lt;ref_</w:t>
+      </w:r>
+      <w:r>
+        <w:t>descripcion_arquitectura_</w:t>
+      </w:r>
+      <w:r>
+        <w:t>2</w:t>
+      </w:r>
+      <w:r>
+        <w:rPr>
+          <w:rFonts w:cs="Arial"/>
+        </w:rPr>
+        <w:t>&gt;&gt;</w:t>
+      </w:r>
+      <w:r>
+        <w:rPr>
+          <w:rFonts w:cs="Arial"/>
+        </w:rPr>
         <w:t>)</w:t>
       </w:r>
       <w:r>
         <w:rPr>
           <w:rFonts w:cs="Arial"/>
         </w:rPr>
-        <w:t xml:space="preserve"> diseñad</w:t>
-      </w:r>
-      <w:r>
-        <w:rPr>
-          <w:rFonts w:cs="Arial"/>
-        </w:rPr>
-        <w:t>a</w:t>
-      </w:r>
-      <w:r>
-        <w:rPr>
-          <w:rFonts w:cs="Arial"/>
-        </w:rPr>
-        <w:t xml:space="preserve"> para operar </w:t>
-      </w:r>
-      <w:r>
-        <w:rPr>
-          <w:rFonts w:cs="Arial"/>
-        </w:rPr>
-        <w:t>a</w:t>
-      </w:r>
-      <w:r>
-        <w:rPr>
-          <w:rFonts w:cs="Arial"/>
-        </w:rPr>
-        <w:t xml:space="preserve"> la deriva y una draga de arrastre subsuperficial</w:t>
-      </w:r>
-      <w:r>
-        <w:rPr>
-          <w:rFonts w:cs="Arial"/>
-        </w:rPr>
-        <w:t xml:space="preserve"> (</w:t>
-      </w:r>
-      <w:r>
-        <w:rPr>
-          <w:rFonts w:cs="Arial"/>
-        </w:rPr>
-        <w:fldChar w:fldCharType="begin"/>
-      </w:r>
-      <w:r>
-        <w:rPr>
-          <w:rFonts w:cs="Arial"/>
-        </w:rPr>
-        <w:instrText xml:space="preserve"> REF _Ref224403897 \h  \* MERGEFORMAT </w:instrText>
-      </w:r>
-      <w:r>
-        <w:rPr>
-          <w:rFonts w:cs="Arial"/>
-        </w:rPr>
-      </w:r>
-      <w:r>
-        <w:rPr>
-          <w:rFonts w:cs="Arial"/>
-        </w:rPr>
-        <w:fldChar w:fldCharType="separate"/>
-      </w:r>
-      <w:r>
-        <w:rPr>
-          <w:rFonts w:cs="Arial"/>
-        </w:rPr>
-        <w:t>Figura 2</w:t>
-      </w:r>
-      <w:r>
-        <w:rPr>
-          <w:rFonts w:cs="Arial"/>
-        </w:rPr>
-        <w:fldChar w:fldCharType="end"/>
-      </w:r>
-      <w:r>
-        <w:rPr>
-          <w:rFonts w:cs="Arial"/>
-        </w:rPr>
-        <w:t xml:space="preserve">). </w:t>
+        <w:t xml:space="preserve">. </w:t>
       </w:r>
       <w:r>
         <w:rPr>
@@ -7356,45 +7325,16 @@
         <w:rPr>
           <w:rFonts w:cs="Arial"/>
         </w:rPr>
-        <w:fldChar w:fldCharType="begin"/>
+        <w:t>&lt;&lt;ref_</w:t>
+      </w:r>
+      <w:r>
+        <w:t>descripcion_arquitectura_1</w:t>
       </w:r>
       <w:r>
         <w:rPr>
           <w:rFonts w:cs="Arial"/>
         </w:rPr>
-        <w:instrText xml:space="preserve"> REF _Ref221789083 \h </w:instrText>
-      </w:r>
-      <w:r>
-        <w:rPr>
-          <w:rFonts w:cs="Arial"/>
-        </w:rPr>
-        <w:instrText xml:space="preserve"> \* MERGEFORMAT </w:instrText>
-      </w:r>
-      <w:r>
-        <w:rPr>
-          <w:rFonts w:cs="Arial"/>
-        </w:rPr>
-      </w:r>
-      <w:r>
-        <w:rPr>
-          <w:rFonts w:cs="Arial"/>
-        </w:rPr>
-        <w:fldChar w:fldCharType="separate"/>
-      </w:r>
-      <w:r>
-        <w:t xml:space="preserve">Figura </w:t>
-      </w:r>
-      <w:r>
-        <w:rPr>
-          <w:noProof/>
-        </w:rPr>
-        <w:t>1</w:t>
-      </w:r>
-      <w:r>
-        <w:rPr>
-          <w:rFonts w:cs="Arial"/>
-        </w:rPr>
-        <w:fldChar w:fldCharType="end"/>
+        <w:t>&gt;&gt;</w:t>
       </w:r>
       <w:r>
         <w:rPr>
@@ -7528,48 +7468,6 @@
       <w:r>
         <w:t>&gt;&gt;</w:t>
       </w:r>
-    </w:p>
-    <w:p>
-      <w:pPr>
-        <w:keepNext/>
-        <w:ind w:firstLine="360"/>
-        <w:jc w:val="center"/>
-      </w:pPr>
-      <w:bookmarkStart w:id="69" w:name="_Ref221789083"/>
-      <w:bookmarkStart w:id="70" w:name="_Toc229049285"/>
-      <w:r>
-        <w:lastRenderedPageBreak/>
-        <w:t xml:space="preserve">Figura </w:t>
-      </w:r>
-      <w:fldSimple w:instr=" SEQ Figura \* ARABIC ">
-        <w:r>
-          <w:rPr>
-            <w:noProof/>
-          </w:rPr>
-          <w:t>1</w:t>
-        </w:r>
-      </w:fldSimple>
-      <w:bookmarkEnd w:id="69"/>
-      <w:r>
-        <w:t xml:space="preserve">. </w:t>
-      </w:r>
-      <w:r>
-        <w:t>&lt;&lt;pie_descripcion_arquitectura</w:t>
-      </w:r>
-      <w:r>
-        <w:t>_1</w:t>
-      </w:r>
-      <w:r>
-        <w:t>&gt;&gt;</w:t>
-      </w:r>
-      <w:bookmarkEnd w:id="70"/>
-    </w:p>
-    <w:p>
-      <w:pPr>
-        <w:rPr>
-          <w:rFonts w:cs="Arial"/>
-        </w:rPr>
-      </w:pPr>
     </w:p>
     <w:p>
       <w:pPr>
@@ -7631,36 +7529,13 @@
         <w:rPr>
           <w:rFonts w:cs="Arial"/>
         </w:rPr>
-        <w:fldChar w:fldCharType="begin"/>
-      </w:r>
-      <w:r>
-        <w:rPr>
-          <w:rFonts w:cs="Arial"/>
-        </w:rPr>
-        <w:instrText xml:space="preserve"> REF _Ref224403897 \h  \* MERGEFORMAT </w:instrText>
-      </w:r>
-      <w:r>
-        <w:rPr>
-          <w:rFonts w:cs="Arial"/>
-        </w:rPr>
-      </w:r>
-      <w:r>
-        <w:rPr>
-          <w:rFonts w:cs="Arial"/>
-        </w:rPr>
-        <w:fldChar w:fldCharType="separate"/>
-      </w:r>
-      <w:r>
-        <w:rPr>
-          <w:rFonts w:cs="Arial"/>
-        </w:rPr>
-        <w:t>Figura 2</w:t>
-      </w:r>
-      <w:r>
-        <w:rPr>
-          <w:rFonts w:cs="Arial"/>
-        </w:rPr>
-        <w:fldChar w:fldCharType="end"/>
+        <w:t>&lt;&lt;ref_</w:t>
+      </w:r>
+      <w:r>
+        <w:t>descripcion_arquitectura_</w:t>
+      </w:r>
+      <w:r>
+        <w:t>2&gt;&gt;</w:t>
       </w:r>
       <w:r>
         <w:rPr>
@@ -7801,8 +7676,8 @@
           <w:noProof/>
         </w:rPr>
       </w:pPr>
-      <w:bookmarkStart w:id="71" w:name="_Ref220060808"/>
-      <w:bookmarkStart w:id="72" w:name="_Ref220060798"/>
+      <w:bookmarkStart w:id="69" w:name="_Ref220060808"/>
+      <w:bookmarkStart w:id="70" w:name="_Ref220060798"/>
     </w:p>
     <w:p>
       <w:pPr>
@@ -7814,39 +7689,8 @@
         <w:t>&lt;&lt;fig_descripcion_arquitectura_2&gt;&gt;</w:t>
       </w:r>
     </w:p>
-    <w:p>
-      <w:pPr>
-        <w:keepNext/>
-        <w:ind w:firstLine="360"/>
-        <w:jc w:val="center"/>
-      </w:pPr>
-      <w:bookmarkStart w:id="73" w:name="_Ref224403897"/>
-      <w:bookmarkStart w:id="74" w:name="_Toc229049286"/>
-      <w:r>
-        <w:t xml:space="preserve">Figura </w:t>
-      </w:r>
-      <w:fldSimple w:instr=" SEQ Figura \* ARABIC ">
-        <w:r>
-          <w:rPr>
-            <w:noProof/>
-          </w:rPr>
-          <w:t>2</w:t>
-        </w:r>
-      </w:fldSimple>
-      <w:bookmarkEnd w:id="71"/>
-      <w:bookmarkEnd w:id="73"/>
-      <w:r>
-        <w:t>.</w:t>
-      </w:r>
-      <w:r>
-        <w:t xml:space="preserve"> </w:t>
-      </w:r>
-      <w:r>
-        <w:t>&lt;&lt;pie_descripcion_arquitectura_2&gt;&gt;</w:t>
-      </w:r>
-    </w:p>
-    <w:bookmarkEnd w:id="72"/>
-    <w:bookmarkEnd w:id="74"/>
+    <w:bookmarkEnd w:id="69"/>
+    <w:bookmarkEnd w:id="70"/>
     <w:p/>
     <w:p>
       <w:pPr>
@@ -7908,102 +7752,62 @@
         <w:rPr>
           <w:rFonts w:cs="Arial"/>
         </w:rPr>
-        <w:fldChar w:fldCharType="begin"/>
+        <w:t>&lt;&lt;ref_</w:t>
+      </w:r>
+      <w:r>
+        <w:t>descripcion_arquitectura_</w:t>
+      </w:r>
+      <w:r>
+        <w:t>3&gt;&gt;</w:t>
       </w:r>
       <w:r>
         <w:rPr>
           <w:rFonts w:cs="Arial"/>
         </w:rPr>
-        <w:instrText xml:space="preserve"> REF _Ref224111497 \h </w:instrText>
+        <w:t>)</w:t>
       </w:r>
       <w:r>
         <w:rPr>
           <w:rFonts w:cs="Arial"/>
         </w:rPr>
-        <w:instrText xml:space="preserve"> \* MERGEFORMAT </w:instrText>
+        <w:t>, de frecuencia y fase cerrada con 256 Kb de memoria flash programable y 32 Kb de SRAM</w:t>
       </w:r>
       <w:r>
         <w:rPr>
           <w:rFonts w:cs="Arial"/>
         </w:rPr>
+        <w:t>; el instrumento cuenta con una capacidad de seis comunicaciones seriales (SERCOM) y i²C de 3.4 MHz. Este microcontrolador es la unidad central de control de la sonda, se encarga de la adquisición, procesamiento y gestión de los datos provenientes de los sensores en tiempo real. Sus características permiten comunicaciones confiables y rápidas entre el microprocesador y los sensores</w:t>
       </w:r>
       <w:r>
         <w:rPr>
           <w:rFonts w:cs="Arial"/>
         </w:rPr>
-        <w:fldChar w:fldCharType="separate"/>
-      </w:r>
-      <w:r>
-        <w:t xml:space="preserve">Figura </w:t>
-      </w:r>
-      <w:r>
-        <w:rPr>
-          <w:noProof/>
-        </w:rPr>
-        <w:t>3</w:t>
+        <w:t>, mientras que la arquitectura de 32 bits y velocidad de 48 MHz permite un manejo eficiente de múltiples dispositivos, mientras que su capacidad de memoria y múltiples interfaces de comunicación facilitan la integración y transmisión de datos en tiempo real</w:t>
       </w:r>
       <w:r>
         <w:rPr>
           <w:rFonts w:cs="Arial"/>
         </w:rPr>
-        <w:fldChar w:fldCharType="end"/>
+        <w:t>.</w:t>
       </w:r>
       <w:r>
         <w:rPr>
           <w:rFonts w:cs="Arial"/>
         </w:rPr>
-        <w:t>)</w:t>
+        <w:t xml:space="preserve"> Adicional a lo anterior, la sonda cuenta con tarjeta compact flash de 32 G</w:t>
       </w:r>
       <w:r>
         <w:rPr>
           <w:rFonts w:cs="Arial"/>
         </w:rPr>
-        <w:t>, de frecuencia y fase cerrada con 256 Kb de memoria flash programable y 32 Kb de SRAM</w:t>
+        <w:t>B</w:t>
       </w:r>
       <w:r>
         <w:rPr>
           <w:rFonts w:cs="Arial"/>
         </w:rPr>
-        <w:t>; el instrumento cuenta con una capacidad de seis comunicaciones seriales (SERCOM) y i²C de 3.4 MHz. Este microcontrolador es la unidad central de control de la sonda, se encarga de la adquisición, procesamiento y gestión de los datos provenientes de los sensores en tiempo real. Sus características permiten comunicaciones confiables y rápidas entre el microprocesador y los sensores</w:t>
-      </w:r>
-      <w:r>
-        <w:rPr>
-          <w:rFonts w:cs="Arial"/>
-        </w:rPr>
-        <w:t>, mientras que la arquitectura de 32 bits y velocidad de 48 MHz permite un manejo eficiente de múltiples dispositivos, mientras que su capacidad de memoria y múltiples interfaces de comunicación facilitan la integración y transmisión de datos en tiempo real</w:t>
-      </w:r>
-      <w:r>
-        <w:rPr>
-          <w:rFonts w:cs="Arial"/>
-        </w:rPr>
-        <w:t>.</w:t>
-      </w:r>
-      <w:r>
-        <w:rPr>
-          <w:rFonts w:cs="Arial"/>
-        </w:rPr>
-        <w:t xml:space="preserve"> Adicional a lo anterior, la sonda cuenta con tarjeta compact flash de 32 G</w:t>
-      </w:r>
-      <w:r>
-        <w:rPr>
-          <w:rFonts w:cs="Arial"/>
-        </w:rPr>
-        <w:t>B</w:t>
-      </w:r>
-      <w:r>
-        <w:rPr>
-          <w:rFonts w:cs="Arial"/>
-        </w:rPr>
         <w:t xml:space="preserve"> para el almacenamiento de datos.</w:t>
       </w:r>
-    </w:p>
-    <w:p>
-      <w:pPr>
-        <w:ind w:firstLine="360"/>
-        <w:rPr>
-          <w:rFonts w:cs="Arial"/>
-        </w:rPr>
-      </w:pPr>
     </w:p>
     <w:p>
       <w:pPr>
@@ -8023,37 +7827,6 @@
         <w:t>&lt;&lt;fig_descripcion_arquitectura_3&gt;&gt;</w:t>
       </w:r>
     </w:p>
-    <w:p>
-      <w:pPr>
-        <w:keepNext/>
-        <w:ind w:firstLine="360"/>
-        <w:jc w:val="center"/>
-      </w:pPr>
-      <w:bookmarkStart w:id="75" w:name="_Ref224111497"/>
-      <w:bookmarkStart w:id="76" w:name="_Toc229049287"/>
-      <w:r>
-        <w:t xml:space="preserve">Figura </w:t>
-      </w:r>
-      <w:fldSimple w:instr=" SEQ Figura \* ARABIC ">
-        <w:r>
-          <w:rPr>
-            <w:noProof/>
-          </w:rPr>
-          <w:t>3</w:t>
-        </w:r>
-      </w:fldSimple>
-      <w:bookmarkEnd w:id="75"/>
-      <w:r>
-        <w:t>.</w:t>
-      </w:r>
-      <w:r>
-        <w:t xml:space="preserve"> </w:t>
-      </w:r>
-      <w:r>
-        <w:t>&lt;&lt;pie_descripcion_arquitectura_3&gt;&gt;</w:t>
-      </w:r>
-    </w:p>
-    <w:bookmarkEnd w:id="76"/>
     <w:p>
       <w:pPr>
         <w:ind w:firstLine="360"/>
@@ -8096,70 +7869,47 @@
         <w:rPr>
           <w:rFonts w:cs="Arial"/>
         </w:rPr>
+        <w:t>En la parte superior interna de la boya se instalaron paneles solares de 6.2 V y 1 A</w:t>
+      </w:r>
+      <w:r>
+        <w:rPr>
+          <w:rFonts w:cs="Arial"/>
+        </w:rPr>
+        <w:t xml:space="preserve"> (</w:t>
+      </w:r>
+      <w:r>
+        <w:rPr>
+          <w:rFonts w:cs="Arial"/>
+        </w:rPr>
+        <w:t>&lt;&lt;ref_</w:t>
+      </w:r>
+      <w:r>
+        <w:t>descripcion_arquitectura_</w:t>
+      </w:r>
+      <w:r>
+        <w:t>4</w:t>
+      </w:r>
+      <w:r>
+        <w:t>&gt;&gt;</w:t>
+      </w:r>
+      <w:r>
+        <w:rPr>
+          <w:rFonts w:cs="Arial"/>
+        </w:rPr>
+        <w:t>)</w:t>
+      </w:r>
+      <w:r>
+        <w:rPr>
+          <w:rFonts w:cs="Arial"/>
+        </w:rPr>
+        <w:t xml:space="preserve">, los cuales permiten la recarga de un paquete de baterías de litio de 4.2 V y 18,000 mAh, ubicado en el interior de la esfera. Este sistema proporciona una </w:t>
+      </w:r>
+      <w:r>
+        <w:rPr>
+          <w:rFonts w:cs="Arial"/>
+        </w:rPr>
         <w:lastRenderedPageBreak/>
-        <w:t>En la parte superior interna de la boya se instalaron paneles solares de 6.2 V y 1 A</w:t>
-      </w:r>
-      <w:r>
-        <w:rPr>
-          <w:rFonts w:cs="Arial"/>
-        </w:rPr>
-        <w:t xml:space="preserve"> (</w:t>
-      </w:r>
-      <w:r>
-        <w:rPr>
-          <w:rFonts w:cs="Arial"/>
-        </w:rPr>
-        <w:fldChar w:fldCharType="begin"/>
-      </w:r>
-      <w:r>
-        <w:rPr>
-          <w:rFonts w:cs="Arial"/>
-        </w:rPr>
-        <w:instrText xml:space="preserve"> REF _Ref220060846 \h </w:instrText>
-      </w:r>
-      <w:r>
-        <w:rPr>
-          <w:rFonts w:cs="Arial"/>
-        </w:rPr>
-        <w:instrText xml:space="preserve"> \* MERGEFORMAT </w:instrText>
-      </w:r>
-      <w:r>
-        <w:rPr>
-          <w:rFonts w:cs="Arial"/>
-        </w:rPr>
-      </w:r>
-      <w:r>
-        <w:rPr>
-          <w:rFonts w:cs="Arial"/>
-        </w:rPr>
-        <w:fldChar w:fldCharType="separate"/>
-      </w:r>
-      <w:r>
-        <w:t xml:space="preserve">Figura </w:t>
-      </w:r>
-      <w:r>
-        <w:rPr>
-          <w:noProof/>
-        </w:rPr>
-        <w:t>4</w:t>
-      </w:r>
-      <w:r>
-        <w:rPr>
-          <w:rFonts w:cs="Arial"/>
-        </w:rPr>
-        <w:fldChar w:fldCharType="end"/>
-      </w:r>
-      <w:r>
-        <w:rPr>
-          <w:rFonts w:cs="Arial"/>
-        </w:rPr>
-        <w:t>)</w:t>
-      </w:r>
-      <w:r>
-        <w:rPr>
-          <w:rFonts w:cs="Arial"/>
-        </w:rPr>
-        <w:t xml:space="preserve">, los cuales permiten la recarga de un paquete de baterías de litio de 4.2 V y 18,000 mAh, ubicado en el interior de la esfera. Este sistema proporciona una autonomía energética de hasta tres días de operación continua sin necesidad de recarga externa. Asimismo, </w:t>
+        <w:t xml:space="preserve">autonomía energética de hasta tres días de operación continua sin necesidad de recarga externa. Asimismo, </w:t>
       </w:r>
       <w:r>
         <w:rPr>
@@ -8193,14 +7943,6 @@
         <w:rPr>
           <w:rFonts w:cs="Arial"/>
         </w:rPr>
-      </w:pPr>
-    </w:p>
-    <w:p>
-      <w:pPr>
-        <w:keepNext/>
-        <w:suppressAutoHyphens w:val="0"/>
-        <w:spacing w:before="100" w:beforeAutospacing="1" w:line="240" w:lineRule="auto"/>
-        <w:jc w:val="center"/>
       </w:pPr>
     </w:p>
     <w:p>
@@ -8213,33 +7955,6 @@
         <w:t>&lt;&lt;fig_descripcion_arquitectura_4&gt;&gt;</w:t>
       </w:r>
     </w:p>
-    <w:p>
-      <w:pPr>
-        <w:pStyle w:val="Descripcin"/>
-        <w:jc w:val="center"/>
-      </w:pPr>
-      <w:bookmarkStart w:id="77" w:name="_Ref220060846"/>
-      <w:bookmarkStart w:id="78" w:name="_Toc229049288"/>
-      <w:r>
-        <w:t xml:space="preserve">Figura </w:t>
-      </w:r>
-      <w:fldSimple w:instr=" SEQ Figura \* ARABIC ">
-        <w:r>
-          <w:rPr>
-            <w:noProof/>
-          </w:rPr>
-          <w:t>4</w:t>
-        </w:r>
-      </w:fldSimple>
-      <w:bookmarkEnd w:id="77"/>
-      <w:r>
-        <w:t xml:space="preserve">. </w:t>
-      </w:r>
-      <w:r>
-        <w:t>&lt;&lt;pie_descripcion_arquitectura_4&gt;&gt;</w:t>
-      </w:r>
-    </w:p>
-    <w:bookmarkEnd w:id="78"/>
     <w:p/>
     <w:p>
       <w:pPr>
@@ -8287,45 +8002,16 @@
         <w:rPr>
           <w:rFonts w:cs="Arial"/>
         </w:rPr>
-        <w:fldChar w:fldCharType="begin"/>
-      </w:r>
-      <w:r>
-        <w:rPr>
-          <w:rFonts w:cs="Arial"/>
-        </w:rPr>
-        <w:instrText xml:space="preserve"> REF _Ref224288114 \h </w:instrText>
-      </w:r>
-      <w:r>
-        <w:rPr>
-          <w:rFonts w:cs="Arial"/>
-        </w:rPr>
-        <w:instrText xml:space="preserve"> \* MERGEFORMAT </w:instrText>
-      </w:r>
-      <w:r>
-        <w:rPr>
-          <w:rFonts w:cs="Arial"/>
-        </w:rPr>
-      </w:r>
-      <w:r>
-        <w:rPr>
-          <w:rFonts w:cs="Arial"/>
-        </w:rPr>
-        <w:fldChar w:fldCharType="separate"/>
-      </w:r>
-      <w:r>
-        <w:t xml:space="preserve">Figura </w:t>
-      </w:r>
-      <w:r>
-        <w:rPr>
-          <w:noProof/>
-        </w:rPr>
+        <w:t>&lt;&lt;ref_</w:t>
+      </w:r>
+      <w:r>
+        <w:t>descripcion_arquitectura_</w:t>
+      </w:r>
+      <w:r>
         <w:t>5</w:t>
       </w:r>
       <w:r>
-        <w:rPr>
-          <w:rFonts w:cs="Arial"/>
-        </w:rPr>
-        <w:fldChar w:fldCharType="end"/>
+        <w:t>&gt;&gt;</w:t>
       </w:r>
       <w:r>
         <w:rPr>
@@ -8357,33 +8043,6 @@
         <w:t>&lt;&lt;fig_descripcion_arquitectura_5&gt;&gt;</w:t>
       </w:r>
     </w:p>
-    <w:p>
-      <w:pPr>
-        <w:pStyle w:val="Descripcin"/>
-        <w:jc w:val="center"/>
-      </w:pPr>
-      <w:bookmarkStart w:id="79" w:name="_Ref224288114"/>
-      <w:bookmarkStart w:id="80" w:name="_Toc229049289"/>
-      <w:r>
-        <w:t xml:space="preserve">Figura </w:t>
-      </w:r>
-      <w:fldSimple w:instr=" SEQ Figura \* ARABIC ">
-        <w:r>
-          <w:rPr>
-            <w:noProof/>
-          </w:rPr>
-          <w:t>5</w:t>
-        </w:r>
-      </w:fldSimple>
-      <w:bookmarkEnd w:id="79"/>
-      <w:r>
-        <w:t xml:space="preserve">. </w:t>
-      </w:r>
-      <w:r>
-        <w:t>&lt;&lt;pie_descripcion_arquitectura_5&gt;&gt;</w:t>
-      </w:r>
-    </w:p>
-    <w:bookmarkEnd w:id="80"/>
     <w:p>
       <w:pPr>
         <w:ind w:firstLine="360"/>
@@ -8428,7 +8087,6 @@
           <w:b/>
           <w:bCs/>
         </w:rPr>
-        <w:lastRenderedPageBreak/>
         <w:t>Sistema de telemetría y posicionamiento</w:t>
       </w:r>
     </w:p>
@@ -8469,71 +8127,49 @@
         <w:rPr>
           <w:rFonts w:cs="Arial"/>
         </w:rPr>
-        <w:fldChar w:fldCharType="begin"/>
+        <w:t>&lt;&lt;ref_</w:t>
+      </w:r>
+      <w:r>
+        <w:t>descripcion_arquitectura_</w:t>
+      </w:r>
+      <w:r>
+        <w:t>6</w:t>
+      </w:r>
+      <w:r>
+        <w:t>&gt;&gt;</w:t>
       </w:r>
       <w:r>
         <w:rPr>
           <w:rFonts w:cs="Arial"/>
         </w:rPr>
-        <w:instrText xml:space="preserve"> REF _Ref220061236 \h </w:instrText>
+        <w:t>)</w:t>
       </w:r>
       <w:r>
         <w:rPr>
           <w:rFonts w:cs="Arial"/>
         </w:rPr>
-        <w:instrText xml:space="preserve"> \* MERGEFORMAT </w:instrText>
-      </w:r>
+        <w:t xml:space="preserve">, GLONASS, </w:t>
+      </w:r>
+      <w:proofErr w:type="spellStart"/>
       <w:r>
         <w:rPr>
           <w:rFonts w:cs="Arial"/>
         </w:rPr>
-      </w:r>
+        <w:t>BeiDou</w:t>
+      </w:r>
+      <w:proofErr w:type="spellEnd"/>
       <w:r>
         <w:rPr>
           <w:rFonts w:cs="Arial"/>
         </w:rPr>
-        <w:fldChar w:fldCharType="separate"/>
-      </w:r>
-      <w:r>
-        <w:t xml:space="preserve">Figura </w:t>
-      </w:r>
-      <w:r>
-        <w:rPr>
-          <w:noProof/>
-        </w:rPr>
-        <w:t>6</w:t>
+        <w:t xml:space="preserve"> y Galileo, así como correcciones mediante sistemas SBAS, como WAAS, lo que permite alcanzar una precisión inferior a 3 m el 90 % </w:t>
       </w:r>
       <w:r>
         <w:rPr>
           <w:rFonts w:cs="Arial"/>
         </w:rPr>
-        <w:fldChar w:fldCharType="end"/>
-      </w:r>
-      <w:r>
-        <w:rPr>
-          <w:rFonts w:cs="Arial"/>
-        </w:rPr>
-        <w:t>)</w:t>
-      </w:r>
-      <w:r>
-        <w:rPr>
-          <w:rFonts w:cs="Arial"/>
-        </w:rPr>
-        <w:t xml:space="preserve">, GLONASS, </w:t>
-      </w:r>
-      <w:proofErr w:type="spellStart"/>
-      <w:r>
-        <w:rPr>
-          <w:rFonts w:cs="Arial"/>
-        </w:rPr>
-        <w:t>BeiDou</w:t>
-      </w:r>
-      <w:proofErr w:type="spellEnd"/>
-      <w:r>
-        <w:rPr>
-          <w:rFonts w:cs="Arial"/>
-        </w:rPr>
-        <w:t xml:space="preserve"> y Galileo, así como correcciones mediante sistemas SBAS, como WAAS, lo que permite alcanzar una precisión inferior a 3 m el 90 % del tiempo, con una tasa de muestreo </w:t>
+        <w:lastRenderedPageBreak/>
+        <w:t xml:space="preserve">del tiempo, con una tasa de muestreo </w:t>
       </w:r>
       <w:r>
         <w:rPr>
@@ -8617,33 +8253,6 @@
         <w:t>&lt;&lt;fig_descripcion_arquitectura_6&gt;&gt;</w:t>
       </w:r>
     </w:p>
-    <w:p>
-      <w:pPr>
-        <w:pStyle w:val="Descripcin"/>
-        <w:jc w:val="center"/>
-      </w:pPr>
-      <w:bookmarkStart w:id="81" w:name="_Ref220061236"/>
-      <w:bookmarkStart w:id="82" w:name="_Toc229049290"/>
-      <w:r>
-        <w:t xml:space="preserve">Figura </w:t>
-      </w:r>
-      <w:fldSimple w:instr=" SEQ Figura \* ARABIC ">
-        <w:r>
-          <w:rPr>
-            <w:noProof/>
-          </w:rPr>
-          <w:t>6</w:t>
-        </w:r>
-      </w:fldSimple>
-      <w:bookmarkEnd w:id="81"/>
-      <w:r>
-        <w:t xml:space="preserve">. </w:t>
-      </w:r>
-      <w:r>
-        <w:t>&lt;&lt;pie_descripcion_arquitectura_6&gt;&gt;</w:t>
-      </w:r>
-    </w:p>
-    <w:bookmarkEnd w:id="82"/>
     <w:p>
       <w:pPr>
         <w:ind w:firstLine="360"/>
@@ -8807,8 +8416,8 @@
         <w:pStyle w:val="Descripcin"/>
         <w:jc w:val="center"/>
       </w:pPr>
-      <w:bookmarkStart w:id="83" w:name="_Ref220056477"/>
-      <w:bookmarkStart w:id="84" w:name="_Toc229049318"/>
+      <w:bookmarkStart w:id="71" w:name="_Ref220056477"/>
+      <w:bookmarkStart w:id="72" w:name="_Toc229049318"/>
       <w:r>
         <w:t xml:space="preserve">Tabla </w:t>
       </w:r>
@@ -8820,11 +8429,11 @@
           <w:t>1</w:t>
         </w:r>
       </w:fldSimple>
-      <w:bookmarkEnd w:id="83"/>
+      <w:bookmarkEnd w:id="71"/>
       <w:r>
         <w:t>. Información de los parámetros que miden las sondas.</w:t>
       </w:r>
-      <w:bookmarkEnd w:id="84"/>
+      <w:bookmarkEnd w:id="72"/>
     </w:p>
     <w:tbl>
       <w:tblPr>
@@ -9499,25 +9108,24 @@
           <w:rStyle w:val="Title1"/>
         </w:rPr>
       </w:pPr>
-      <w:bookmarkStart w:id="85" w:name="_Hlk133576791"/>
-      <w:bookmarkStart w:id="86" w:name="_Ref219907209"/>
-      <w:bookmarkStart w:id="87" w:name="_Toc229049274"/>
-      <w:bookmarkEnd w:id="85"/>
+      <w:bookmarkStart w:id="73" w:name="_Hlk133576791"/>
+      <w:bookmarkStart w:id="74" w:name="_Ref219907209"/>
+      <w:bookmarkStart w:id="75" w:name="_Toc229049274"/>
+      <w:bookmarkEnd w:id="73"/>
       <w:r>
         <w:rPr>
           <w:rStyle w:val="Title1"/>
         </w:rPr>
-        <w:lastRenderedPageBreak/>
         <w:t>DESCRIPCIÓN DE LAS ACTIVIDADES PREVIAS A</w:t>
       </w:r>
-      <w:bookmarkEnd w:id="86"/>
+      <w:bookmarkEnd w:id="74"/>
       <w:r>
         <w:rPr>
           <w:rStyle w:val="Title1"/>
         </w:rPr>
         <w:t>L DESPLIEGUE</w:t>
       </w:r>
-      <w:bookmarkEnd w:id="87"/>
+      <w:bookmarkEnd w:id="75"/>
     </w:p>
     <w:p>
       <w:pPr>
@@ -9580,6 +9188,7 @@
         <w:ind w:firstLine="360"/>
       </w:pPr>
       <w:r>
+        <w:lastRenderedPageBreak/>
         <w:t xml:space="preserve">Siguiendo </w:t>
       </w:r>
       <w:r>
@@ -9688,28 +9297,24 @@
         <w:t xml:space="preserve"> (</w:t>
       </w:r>
       <w:r>
-        <w:fldChar w:fldCharType="begin"/>
-      </w:r>
-      <w:r>
-        <w:instrText xml:space="preserve"> REF _Ref217389348 \h </w:instrText>
-      </w:r>
-      <w:r>
-        <w:instrText xml:space="preserve"> \* MERGEFORMAT </w:instrText>
-      </w:r>
-      <w:r>
-        <w:fldChar w:fldCharType="separate"/>
-      </w:r>
-      <w:r>
-        <w:t xml:space="preserve">Figura </w:t>
-      </w:r>
-      <w:r>
-        <w:rPr>
-          <w:noProof/>
-        </w:rPr>
-        <w:t>7</w:t>
-      </w:r>
-      <w:r>
-        <w:fldChar w:fldCharType="end"/>
+        <w:rPr>
+          <w:rFonts w:cs="Arial"/>
+        </w:rPr>
+        <w:t>&lt;&lt;</w:t>
+      </w:r>
+      <w:proofErr w:type="spellStart"/>
+      <w:r>
+        <w:rPr>
+          <w:rFonts w:cs="Arial"/>
+        </w:rPr>
+        <w:t>ref_</w:t>
+      </w:r>
+      <w:r>
+        <w:t>actividades_previas</w:t>
+      </w:r>
+      <w:proofErr w:type="spellEnd"/>
+      <w:r>
+        <w:t>&gt;&gt;</w:t>
       </w:r>
       <w:r>
         <w:t>)</w:t>
@@ -9758,491 +9363,438 @@
     </w:p>
     <w:p>
       <w:pPr>
-        <w:suppressAutoHyphens w:val="0"/>
-        <w:spacing w:line="240" w:lineRule="auto"/>
-        <w:jc w:val="center"/>
-        <w:rPr>
-          <w:rFonts w:cs="Microsoft Sans Serif"/>
-        </w:rPr>
-      </w:pPr>
-      <w:bookmarkStart w:id="88" w:name="_Ref217389348"/>
-      <w:bookmarkStart w:id="89" w:name="_Toc229049291"/>
-      <w:r>
-        <w:t xml:space="preserve">Figura </w:t>
-      </w:r>
-      <w:fldSimple w:instr=" SEQ Figura \* ARABIC ">
-        <w:r>
-          <w:rPr>
-            <w:noProof/>
-          </w:rPr>
-          <w:t>7</w:t>
-        </w:r>
-      </w:fldSimple>
-      <w:bookmarkEnd w:id="88"/>
-      <w:r>
-        <w:t xml:space="preserve">. </w:t>
-      </w:r>
-      <w:bookmarkEnd w:id="89"/>
-      <w:r>
-        <w:rPr>
-          <w:rFonts w:cs="Microsoft Sans Serif"/>
-        </w:rPr>
-        <w:t>&lt;&lt;</w:t>
-      </w:r>
-      <w:proofErr w:type="spellStart"/>
-      <w:r>
-        <w:rPr>
-          <w:rFonts w:cs="Microsoft Sans Serif"/>
-        </w:rPr>
-        <w:t>pie</w:t>
-      </w:r>
-      <w:r>
-        <w:rPr>
-          <w:rFonts w:cs="Microsoft Sans Serif"/>
-        </w:rPr>
-        <w:t>_actividades_previas</w:t>
-      </w:r>
-      <w:proofErr w:type="spellEnd"/>
-      <w:r>
-        <w:rPr>
-          <w:rFonts w:cs="Microsoft Sans Serif"/>
-        </w:rPr>
-        <w:t>&gt;&gt;</w:t>
-      </w:r>
+        <w:spacing w:before="240"/>
+      </w:pPr>
     </w:p>
     <w:p>
       <w:pPr>
-        <w:spacing w:before="240"/>
+        <w:ind w:firstLine="360"/>
+      </w:pPr>
+      <w:bookmarkStart w:id="76" w:name="_Hlk224374835"/>
+      <w:r>
+        <w:t xml:space="preserve">Una vez que las pruebas de </w:t>
+      </w:r>
+      <w:r>
+        <w:t xml:space="preserve">funcionalidad y verificación de las conexiones </w:t>
+      </w:r>
+      <w:r>
+        <w:t xml:space="preserve">se </w:t>
+      </w:r>
+      <w:r>
+        <w:t>terminaron</w:t>
+      </w:r>
+      <w:r>
+        <w:t>,</w:t>
+      </w:r>
+      <w:r>
+        <w:t xml:space="preserve"> se procedió a sellar herméticamente </w:t>
+      </w:r>
+      <w:r>
+        <w:t>cada</w:t>
+      </w:r>
+      <w:r>
+        <w:t xml:space="preserve"> sonda oceanográfica. </w:t>
+      </w:r>
+      <w:r>
+        <w:t>Posteriormente</w:t>
+      </w:r>
+      <w:r>
+        <w:t>, se someti</w:t>
+      </w:r>
+      <w:r>
+        <w:t>eron</w:t>
+      </w:r>
+      <w:r>
+        <w:t xml:space="preserve"> a pruebas de transmisión para verificar que nada fue</w:t>
+      </w:r>
+      <w:r>
+        <w:t>ra</w:t>
+      </w:r>
+      <w:r>
+        <w:t xml:space="preserve"> </w:t>
+      </w:r>
+      <w:r>
+        <w:t>dañado</w:t>
+      </w:r>
+      <w:r>
+        <w:t xml:space="preserve"> durante el sellado. Las pruebas de transmisión se </w:t>
+      </w:r>
+      <w:r>
+        <w:t>hicieron</w:t>
+      </w:r>
+      <w:r>
+        <w:t xml:space="preserve"> junto con las pruebas de energía para verificar que l</w:t>
+      </w:r>
+      <w:r>
+        <w:t xml:space="preserve">as sondas </w:t>
+      </w:r>
+      <w:r>
+        <w:t xml:space="preserve">se </w:t>
+      </w:r>
+      <w:r>
+        <w:t>encontrara</w:t>
+      </w:r>
+      <w:r>
+        <w:t>n</w:t>
+      </w:r>
+      <w:r>
+        <w:t xml:space="preserve"> midiendo, transmitiendo y cargando perfectamente.</w:t>
+      </w:r>
+    </w:p>
+    <w:bookmarkEnd w:id="76"/>
+    <w:p>
+      <w:pPr>
+        <w:ind w:firstLine="360"/>
       </w:pPr>
     </w:p>
     <w:p>
       <w:pPr>
         <w:ind w:firstLine="360"/>
       </w:pPr>
-      <w:bookmarkStart w:id="90" w:name="_Hlk224374835"/>
-      <w:r>
-        <w:t xml:space="preserve">Una vez que las pruebas de </w:t>
-      </w:r>
-      <w:r>
-        <w:t xml:space="preserve">funcionalidad y verificación de las conexiones </w:t>
-      </w:r>
-      <w:r>
-        <w:t xml:space="preserve">se </w:t>
-      </w:r>
-      <w:r>
-        <w:t>terminaron</w:t>
-      </w:r>
-      <w:r>
-        <w:t>,</w:t>
-      </w:r>
-      <w:r>
-        <w:t xml:space="preserve"> se procedió a sellar herméticamente </w:t>
-      </w:r>
-      <w:r>
-        <w:t>cada</w:t>
-      </w:r>
-      <w:r>
-        <w:t xml:space="preserve"> sonda oceanográfica. </w:t>
-      </w:r>
-      <w:r>
-        <w:t>Posteriormente</w:t>
-      </w:r>
-      <w:r>
-        <w:t>, se someti</w:t>
-      </w:r>
-      <w:r>
-        <w:t>eron</w:t>
-      </w:r>
-      <w:r>
-        <w:t xml:space="preserve"> a pruebas de transmisión para verificar que nada fue</w:t>
-      </w:r>
-      <w:r>
-        <w:t>ra</w:t>
+      <w:r>
+        <w:t>&lt;&lt;descripcion_actividades_previas_parrafo</w:t>
+      </w:r>
+      <w:r>
+        <w:t>4</w:t>
+      </w:r>
+      <w:r>
+        <w:t>&gt;&gt;</w:t>
       </w:r>
       <w:r>
         <w:t xml:space="preserve"> </w:t>
       </w:r>
-      <w:r>
-        <w:t>dañado</w:t>
-      </w:r>
-      <w:r>
-        <w:t xml:space="preserve"> durante el sellado. Las pruebas de transmisión se </w:t>
-      </w:r>
-      <w:r>
-        <w:t>hicieron</w:t>
-      </w:r>
-      <w:r>
-        <w:t xml:space="preserve"> junto con las pruebas de energía para verificar que l</w:t>
-      </w:r>
-      <w:r>
-        <w:t xml:space="preserve">as sondas </w:t>
-      </w:r>
-      <w:r>
-        <w:t xml:space="preserve">se </w:t>
-      </w:r>
-      <w:r>
-        <w:t>encontrara</w:t>
-      </w:r>
-      <w:r>
-        <w:t>n</w:t>
-      </w:r>
-      <w:r>
-        <w:t xml:space="preserve"> midiendo, transmitiendo y cargando perfectamente.</w:t>
-      </w:r>
-    </w:p>
-    <w:bookmarkEnd w:id="90"/>
-    <w:p>
-      <w:pPr>
-        <w:ind w:firstLine="360"/>
-      </w:pPr>
+      <w:bookmarkStart w:id="77" w:name="_Hlk224322141"/>
+      <w:r>
+        <w:t>Como parte de las evidencias se presentan los reportes de funcionamiento de cada una de ellas</w:t>
+      </w:r>
+      <w:r>
+        <w:t>, l</w:t>
+      </w:r>
+      <w:r>
+        <w:t>o</w:t>
+      </w:r>
+      <w:r>
+        <w:t xml:space="preserve">s cuales aseguran que los instrumentos </w:t>
+      </w:r>
+      <w:r>
+        <w:t>funcionaron</w:t>
+      </w:r>
+      <w:r>
+        <w:t xml:space="preserve"> de manera correcta y se </w:t>
+      </w:r>
+      <w:r>
+        <w:t>encontraban</w:t>
+      </w:r>
+      <w:r>
+        <w:t xml:space="preserve"> </w:t>
+      </w:r>
+      <w:r>
+        <w:t>operando</w:t>
+      </w:r>
+      <w:r>
+        <w:t xml:space="preserve"> según los estándares de calidad esperados</w:t>
+      </w:r>
+      <w:bookmarkEnd w:id="77"/>
+      <w:r>
+        <w:t xml:space="preserve">. La documentación correspondiente a las pruebas de funcionamiento se muestra en el </w:t>
+      </w:r>
+      <w:r>
+        <w:fldChar w:fldCharType="begin"/>
+      </w:r>
+      <w:r>
+        <w:instrText xml:space="preserve"> REF _Ref221185985 \h </w:instrText>
+      </w:r>
+      <w:r>
+        <w:instrText xml:space="preserve"> \* MERGEFORMAT </w:instrText>
+      </w:r>
+      <w:r>
+        <w:fldChar w:fldCharType="separate"/>
+      </w:r>
+      <w:r>
+        <w:t>ANEXO 2: PRUEBAS DE TRANSMISIÓN PREVIAS AL DESPLIEGUE</w:t>
+      </w:r>
+      <w:r>
+        <w:fldChar w:fldCharType="end"/>
+      </w:r>
+      <w:r>
+        <w:t>, como parte del presente documento.</w:t>
+      </w:r>
     </w:p>
     <w:p>
       <w:pPr>
         <w:ind w:firstLine="360"/>
       </w:pPr>
-      <w:r>
-        <w:t>&lt;&lt;descripcion_actividades_previas_parrafo</w:t>
-      </w:r>
-      <w:r>
-        <w:t>4</w:t>
-      </w:r>
-      <w:r>
-        <w:t>&gt;&gt;</w:t>
-      </w:r>
-      <w:r>
-        <w:t xml:space="preserve"> </w:t>
-      </w:r>
-      <w:bookmarkStart w:id="91" w:name="_Hlk224322141"/>
-      <w:r>
-        <w:t>Como parte de las evidencias se presentan los reportes de funcionamiento de cada una de ellas</w:t>
-      </w:r>
-      <w:r>
-        <w:t>, l</w:t>
-      </w:r>
-      <w:r>
-        <w:t>o</w:t>
-      </w:r>
-      <w:r>
-        <w:t xml:space="preserve">s cuales aseguran que los instrumentos </w:t>
-      </w:r>
-      <w:r>
-        <w:t>funcionaron</w:t>
-      </w:r>
-      <w:r>
-        <w:t xml:space="preserve"> de manera correcta y se </w:t>
-      </w:r>
-      <w:r>
-        <w:t>encontraban</w:t>
-      </w:r>
-      <w:r>
-        <w:t xml:space="preserve"> </w:t>
-      </w:r>
-      <w:r>
-        <w:t>operando</w:t>
-      </w:r>
-      <w:r>
-        <w:t xml:space="preserve"> según los estándares de calidad esperados</w:t>
-      </w:r>
-      <w:bookmarkEnd w:id="91"/>
-      <w:r>
-        <w:t xml:space="preserve">. La documentación correspondiente a las pruebas de funcionamiento se muestra en el </w:t>
-      </w:r>
-      <w:r>
-        <w:fldChar w:fldCharType="begin"/>
-      </w:r>
-      <w:r>
-        <w:instrText xml:space="preserve"> REF _Ref221185985 \h </w:instrText>
-      </w:r>
-      <w:r>
-        <w:instrText xml:space="preserve"> \* MERGEFORMAT </w:instrText>
-      </w:r>
-      <w:r>
-        <w:fldChar w:fldCharType="separate"/>
-      </w:r>
-      <w:r>
-        <w:t>ANEXO 2: PRUEBAS DE TRANSMISIÓN PREVIAS AL DESPLIEGUE</w:t>
-      </w:r>
-      <w:r>
-        <w:fldChar w:fldCharType="end"/>
-      </w:r>
-      <w:r>
-        <w:t>, como parte del presente documento.</w:t>
-      </w:r>
     </w:p>
     <w:p>
       <w:pPr>
         <w:ind w:firstLine="360"/>
       </w:pPr>
+      <w:r>
+        <w:t xml:space="preserve">Finalmente, cuando se comprobó que las </w:t>
+      </w:r>
+      <w:r>
+        <w:t>sondas</w:t>
+      </w:r>
+      <w:r>
+        <w:t xml:space="preserve"> se encontraban en perfecto estado, fueron transportadas a la embarcación junto con todas las herramientas y componentes necesarios para el despliegue. </w:t>
+      </w:r>
     </w:p>
     <w:p>
       <w:pPr>
         <w:ind w:firstLine="360"/>
       </w:pPr>
-      <w:r>
-        <w:t xml:space="preserve">Finalmente, cuando se comprobó que las </w:t>
-      </w:r>
-      <w:r>
-        <w:t>sondas</w:t>
-      </w:r>
-      <w:r>
-        <w:t xml:space="preserve"> se encontraban en perfecto estado, fueron transportadas a la embarcación junto con todas las herramientas y componentes necesarios para el despliegue. </w:t>
-      </w:r>
     </w:p>
     <w:p>
       <w:pPr>
-        <w:ind w:firstLine="360"/>
-      </w:pPr>
+        <w:pStyle w:val="Ttulo1"/>
+        <w:rPr>
+          <w:rStyle w:val="Title1"/>
+        </w:rPr>
+      </w:pPr>
+      <w:bookmarkStart w:id="78" w:name="_Toc221259429"/>
+      <w:bookmarkStart w:id="79" w:name="_Ref219907290"/>
+      <w:bookmarkStart w:id="80" w:name="_Toc229049275"/>
+      <w:bookmarkEnd w:id="78"/>
+      <w:r>
+        <w:rPr>
+          <w:rStyle w:val="Title1"/>
+        </w:rPr>
+        <w:t>PRUEBAS</w:t>
+      </w:r>
+      <w:r>
+        <w:rPr>
+          <w:rStyle w:val="Title1"/>
+        </w:rPr>
+        <w:t xml:space="preserve"> DE FUNCIONAMIENTO DE LAS SONDAS OCEANOGRÁFICAS</w:t>
+      </w:r>
+      <w:r>
+        <w:rPr>
+          <w:rStyle w:val="Title1"/>
+        </w:rPr>
+        <w:t xml:space="preserve"> PREVIAS AL DESPLIEGUE</w:t>
+      </w:r>
+      <w:bookmarkEnd w:id="79"/>
+      <w:bookmarkEnd w:id="80"/>
+      <w:r>
+        <w:rPr>
+          <w:rStyle w:val="Title1"/>
+        </w:rPr>
+        <w:t xml:space="preserve"> </w:t>
+      </w:r>
     </w:p>
     <w:p>
       <w:pPr>
-        <w:pStyle w:val="Ttulo1"/>
-        <w:rPr>
-          <w:rStyle w:val="Title1"/>
-        </w:rPr>
-      </w:pPr>
-      <w:bookmarkStart w:id="92" w:name="_Toc221259429"/>
-      <w:bookmarkStart w:id="93" w:name="_Ref219907290"/>
-      <w:bookmarkStart w:id="94" w:name="_Toc229049275"/>
-      <w:bookmarkEnd w:id="92"/>
-      <w:r>
-        <w:rPr>
-          <w:rStyle w:val="Title1"/>
-        </w:rPr>
-        <w:t>PRUEBAS</w:t>
-      </w:r>
-      <w:r>
-        <w:rPr>
-          <w:rStyle w:val="Title1"/>
-        </w:rPr>
-        <w:t xml:space="preserve"> DE FUNCIONAMIENTO DE LAS SONDAS OCEANOGRÁFICAS</w:t>
-      </w:r>
-      <w:r>
-        <w:rPr>
-          <w:rStyle w:val="Title1"/>
-        </w:rPr>
-        <w:t xml:space="preserve"> PREVIAS AL DESPLIEGUE</w:t>
-      </w:r>
-      <w:bookmarkEnd w:id="93"/>
-      <w:bookmarkEnd w:id="94"/>
-      <w:r>
-        <w:rPr>
-          <w:rStyle w:val="Title1"/>
-        </w:rPr>
-        <w:t xml:space="preserve"> </w:t>
+        <w:ind w:firstLine="360"/>
+      </w:pPr>
+      <w:r>
+        <w:t>Como parte de las pruebas previas al despliegue de las sondas, se verificó el correcto funcionamiento de los sensores instalados, así como de los sistemas de energía, electrónica, posicionamiento y telemetría.</w:t>
       </w:r>
     </w:p>
     <w:p>
       <w:pPr>
         <w:ind w:firstLine="360"/>
       </w:pPr>
-      <w:r>
-        <w:t>Como parte de las pruebas previas al despliegue de las sondas, se verificó el correcto funcionamiento de los sensores instalados, así como de los sistemas de energía, electrónica, posicionamiento y telemetría.</w:t>
-      </w:r>
     </w:p>
     <w:p>
       <w:pPr>
         <w:ind w:firstLine="360"/>
       </w:pPr>
+      <w:r>
+        <w:lastRenderedPageBreak/>
+        <w:t>Una vez</w:t>
+      </w:r>
+      <w:r>
+        <w:t xml:space="preserve"> que estuvieron</w:t>
+      </w:r>
+      <w:r>
+        <w:t xml:space="preserve"> </w:t>
+      </w:r>
+      <w:proofErr w:type="spellStart"/>
+      <w:r>
+        <w:t>pre-armada</w:t>
+      </w:r>
+      <w:r>
+        <w:t>s</w:t>
+      </w:r>
+      <w:proofErr w:type="spellEnd"/>
+      <w:r>
+        <w:t xml:space="preserve"> la</w:t>
+      </w:r>
+      <w:r>
+        <w:t>s</w:t>
+      </w:r>
+      <w:r>
+        <w:t xml:space="preserve"> sonda</w:t>
+      </w:r>
+      <w:r>
+        <w:t>s</w:t>
+      </w:r>
+      <w:r>
+        <w:t xml:space="preserve">, se realizaron pruebas del sistema integral, comenzando con la verificación de las conexiones electrónicas y los sensores de medición. En esta etapa, </w:t>
+      </w:r>
+      <w:r>
+        <w:t xml:space="preserve">se verificó que todos </w:t>
+      </w:r>
+      <w:r>
+        <w:t xml:space="preserve">los sensores </w:t>
+      </w:r>
+      <w:r>
+        <w:t>y</w:t>
+      </w:r>
+      <w:r>
+        <w:t xml:space="preserve"> componentes operaran de manera adecuada y de forma conjunta.</w:t>
+      </w:r>
     </w:p>
     <w:p>
       <w:pPr>
         <w:ind w:firstLine="360"/>
       </w:pPr>
-      <w:r>
-        <w:t>Una vez</w:t>
-      </w:r>
-      <w:r>
-        <w:t xml:space="preserve"> que estuvieron</w:t>
-      </w:r>
-      <w:r>
-        <w:t xml:space="preserve"> </w:t>
-      </w:r>
-      <w:proofErr w:type="spellStart"/>
-      <w:r>
-        <w:t>pre-armada</w:t>
-      </w:r>
-      <w:r>
-        <w:t>s</w:t>
-      </w:r>
-      <w:proofErr w:type="spellEnd"/>
-      <w:r>
-        <w:t xml:space="preserve"> la</w:t>
-      </w:r>
-      <w:r>
-        <w:t>s</w:t>
-      </w:r>
-      <w:r>
-        <w:t xml:space="preserve"> sonda</w:t>
-      </w:r>
-      <w:r>
-        <w:t>s</w:t>
-      </w:r>
-      <w:r>
-        <w:t xml:space="preserve">, se realizaron pruebas del sistema integral, comenzando con la verificación de las conexiones electrónicas y los sensores de medición. En esta etapa, </w:t>
-      </w:r>
-      <w:r>
-        <w:t xml:space="preserve">se verificó que todos </w:t>
-      </w:r>
-      <w:r>
-        <w:t xml:space="preserve">los sensores </w:t>
-      </w:r>
-      <w:r>
-        <w:t>y</w:t>
-      </w:r>
-      <w:r>
-        <w:t xml:space="preserve"> componentes operaran de manera adecuada y de forma conjunta.</w:t>
-      </w:r>
     </w:p>
     <w:p>
       <w:pPr>
         <w:ind w:firstLine="360"/>
       </w:pPr>
+      <w:r>
+        <w:t xml:space="preserve">Posteriormente, se conectó el panel solar al sistema de energía para confirmar la correcta carga de las baterías. </w:t>
+      </w:r>
+      <w:bookmarkStart w:id="81" w:name="_Hlk224323341"/>
+      <w:r>
+        <w:t>La</w:t>
+      </w:r>
+      <w:r>
+        <w:t>s</w:t>
+      </w:r>
+      <w:r>
+        <w:t xml:space="preserve"> sonda</w:t>
+      </w:r>
+      <w:r>
+        <w:t>s</w:t>
+      </w:r>
+      <w:r>
+        <w:t xml:space="preserve"> fue</w:t>
+      </w:r>
+      <w:r>
+        <w:t>ron</w:t>
+      </w:r>
+      <w:r>
+        <w:t xml:space="preserve"> expuesta</w:t>
+      </w:r>
+      <w:r>
+        <w:t>s</w:t>
+      </w:r>
+      <w:r>
+        <w:t xml:space="preserve"> a la radiación solar durante el día y se mantuv</w:t>
+      </w:r>
+      <w:r>
+        <w:t>ieron</w:t>
+      </w:r>
+      <w:r>
+        <w:t xml:space="preserve"> en operación continua, con el fin de evaluar el desempeño de los sistemas de energía y posicionamiento, así como la operatividad de los sensores y la transmisión de datos</w:t>
+      </w:r>
+      <w:bookmarkEnd w:id="81"/>
+      <w:r>
+        <w:t>. Todos los sistemas respondieron satisfactoriamente durante este periodo.</w:t>
+      </w:r>
+      <w:r>
+        <w:t xml:space="preserve"> Una vez terminadas las pruebas de funcionamiento las </w:t>
+      </w:r>
+      <w:r>
+        <w:t>sondas</w:t>
+      </w:r>
+      <w:r>
+        <w:t xml:space="preserve"> fueron selladas y expuestas al sol durante 24 horas más mientras se revisaba la transmisión de la información y se verificaba </w:t>
+      </w:r>
+      <w:r>
+        <w:t xml:space="preserve">nuevamente </w:t>
+      </w:r>
+      <w:r>
+        <w:t xml:space="preserve">la carga de las baterías. </w:t>
+      </w:r>
     </w:p>
     <w:p>
       <w:pPr>
         <w:ind w:firstLine="360"/>
       </w:pPr>
-      <w:r>
-        <w:t xml:space="preserve">Posteriormente, se conectó el panel solar al sistema de energía para confirmar la correcta carga de las baterías. </w:t>
-      </w:r>
-      <w:bookmarkStart w:id="95" w:name="_Hlk224323341"/>
-      <w:r>
-        <w:t>La</w:t>
-      </w:r>
-      <w:r>
-        <w:t>s</w:t>
-      </w:r>
-      <w:r>
-        <w:t xml:space="preserve"> sonda</w:t>
-      </w:r>
-      <w:r>
-        <w:t>s</w:t>
-      </w:r>
-      <w:r>
-        <w:t xml:space="preserve"> fue</w:t>
-      </w:r>
-      <w:r>
-        <w:t>ron</w:t>
-      </w:r>
-      <w:r>
-        <w:t xml:space="preserve"> expuesta</w:t>
-      </w:r>
-      <w:r>
-        <w:t>s</w:t>
-      </w:r>
-      <w:r>
-        <w:t xml:space="preserve"> a la radiación solar durante el día y se mantuv</w:t>
-      </w:r>
-      <w:r>
-        <w:t>ieron</w:t>
-      </w:r>
-      <w:r>
-        <w:t xml:space="preserve"> en operación continua, con el fin de evaluar el desempeño de los sistemas de energía y posicionamiento, así como la operatividad de los sensores y la transmisión de datos</w:t>
-      </w:r>
-      <w:bookmarkEnd w:id="95"/>
-      <w:r>
-        <w:t>. Todos los sistemas respondieron satisfactoriamente durante este periodo.</w:t>
-      </w:r>
-      <w:r>
-        <w:t xml:space="preserve"> Una vez terminadas las pruebas de funcionamiento las </w:t>
-      </w:r>
-      <w:r>
-        <w:t>sondas</w:t>
-      </w:r>
-      <w:r>
-        <w:t xml:space="preserve"> fueron selladas y expuestas al sol durante 24 horas más mientras se revisaba la transmisión de la información y se verificaba </w:t>
-      </w:r>
-      <w:r>
-        <w:t xml:space="preserve">nuevamente </w:t>
-      </w:r>
-      <w:r>
-        <w:t xml:space="preserve">la carga de las baterías. </w:t>
-      </w:r>
     </w:p>
     <w:p>
       <w:pPr>
         <w:ind w:firstLine="360"/>
       </w:pPr>
+      <w:r>
+        <w:t xml:space="preserve">En cuanto al sistema de telemetría, la sonda emplea tecnología satelital </w:t>
+      </w:r>
+      <w:proofErr w:type="spellStart"/>
+      <w:r>
+        <w:t>Globalstar</w:t>
+      </w:r>
+      <w:proofErr w:type="spellEnd"/>
+      <w:r>
+        <w:t>, basada en una constelación de satélites en órbita baja (LEO) que operan en banda L. Mediante servicios simplex de bajo consumo energético, se transmiten paquetes periódicos de información desde zonas remotas, lo que permite una comunicación confiable y con tiempos de transmisión reducidos. Este sistema resultó adecuado para plataformas autónomas y funcionó de manera exitosa durante las pruebas de 24 horas realizadas en el centro de operaciones del consorcio ASM-CICESE, donde los datos fueron recibidos de forma continua.</w:t>
+      </w:r>
     </w:p>
     <w:p>
       <w:pPr>
         <w:ind w:firstLine="360"/>
       </w:pPr>
-      <w:r>
-        <w:t xml:space="preserve">En cuanto al sistema de telemetría, la sonda emplea tecnología satelital </w:t>
-      </w:r>
-      <w:proofErr w:type="spellStart"/>
-      <w:r>
-        <w:t>Globalstar</w:t>
-      </w:r>
-      <w:proofErr w:type="spellEnd"/>
-      <w:r>
-        <w:t>, basada en una constelación de satélites en órbita baja (LEO) que operan en banda L. Mediante servicios simplex de bajo consumo energético, se transmiten paquetes periódicos de información desde zonas remotas, lo que permite una comunicación confiable y con tiempos de transmisión reducidos. Este sistema resultó adecuado para plataformas autónomas y funcionó de manera exitosa durante las pruebas de 24 horas realizadas en el centro de operaciones del consorcio ASM-CICESE, donde los datos fueron recibidos de forma continua.</w:t>
-      </w:r>
     </w:p>
     <w:p>
       <w:pPr>
         <w:ind w:firstLine="360"/>
       </w:pPr>
+      <w:r>
+        <w:t>Finalmente, los sensores de medición, como el acelerómetro y los termómetros instalados en la</w:t>
+      </w:r>
+      <w:r>
+        <w:t>s</w:t>
+      </w:r>
+      <w:r>
+        <w:t xml:space="preserve"> sonda</w:t>
+      </w:r>
+      <w:r>
+        <w:t>s</w:t>
+      </w:r>
+      <w:r>
+        <w:t xml:space="preserve">, fueron evaluados durante las pruebas de funcionamiento. La evidencia correspondiente se presenta en el </w:t>
+      </w:r>
+      <w:r>
+        <w:fldChar w:fldCharType="begin"/>
+      </w:r>
+      <w:r>
+        <w:instrText xml:space="preserve"> REF _Ref221185985 \h </w:instrText>
+      </w:r>
+      <w:r>
+        <w:instrText xml:space="preserve"> \* MERGEFORMAT </w:instrText>
+      </w:r>
+      <w:r>
+        <w:fldChar w:fldCharType="separate"/>
+      </w:r>
+      <w:r>
+        <w:rPr>
+          <w:rStyle w:val="Title1"/>
+        </w:rPr>
+        <w:t>ANEXO 2: PRUEBAS DE TRANSMISIÓN PREVIAS AL DESPLIEGUE</w:t>
+      </w:r>
+      <w:r>
+        <w:fldChar w:fldCharType="end"/>
+      </w:r>
+      <w:r>
+        <w:t>, como parte del presente documento.</w:t>
+      </w:r>
     </w:p>
     <w:p>
       <w:pPr>
-        <w:ind w:firstLine="360"/>
-      </w:pPr>
-      <w:r>
-        <w:t>Finalmente, los sensores de medición, como el acelerómetro y los termómetros instalados en la</w:t>
-      </w:r>
-      <w:r>
-        <w:t>s</w:t>
-      </w:r>
-      <w:r>
-        <w:t xml:space="preserve"> sonda</w:t>
-      </w:r>
-      <w:r>
-        <w:t>s</w:t>
-      </w:r>
-      <w:r>
-        <w:t xml:space="preserve">, fueron evaluados durante las pruebas de funcionamiento. La evidencia correspondiente se presenta en el </w:t>
-      </w:r>
-      <w:r>
-        <w:fldChar w:fldCharType="begin"/>
-      </w:r>
-      <w:r>
-        <w:instrText xml:space="preserve"> REF _Ref221185985 \h </w:instrText>
-      </w:r>
-      <w:r>
-        <w:instrText xml:space="preserve"> \* MERGEFORMAT </w:instrText>
-      </w:r>
-      <w:r>
-        <w:fldChar w:fldCharType="separate"/>
-      </w:r>
-      <w:r>
-        <w:rPr>
-          <w:rStyle w:val="Title1"/>
-        </w:rPr>
-        <w:t>ANEXO 2: PRUEBAS DE TRANSMISIÓN PREVIAS AL DESPLIEGUE</w:t>
-      </w:r>
-      <w:r>
-        <w:fldChar w:fldCharType="end"/>
-      </w:r>
-      <w:r>
-        <w:t>, como parte del presente documento.</w:t>
-      </w:r>
+        <w:spacing w:before="240"/>
+      </w:pPr>
     </w:p>
     <w:p>
       <w:pPr>
-        <w:spacing w:before="240"/>
-      </w:pPr>
-    </w:p>
-    <w:p>
-      <w:pPr>
         <w:pStyle w:val="Ttulo1"/>
         <w:rPr>
           <w:rStyle w:val="Title1"/>
         </w:rPr>
       </w:pPr>
-      <w:bookmarkStart w:id="96" w:name="_Ref217472609"/>
-      <w:bookmarkStart w:id="97" w:name="_Toc229049276"/>
+      <w:bookmarkStart w:id="82" w:name="_Ref217472609"/>
+      <w:bookmarkStart w:id="83" w:name="_Toc229049276"/>
       <w:r>
         <w:rPr>
           <w:rStyle w:val="Title1"/>
@@ -10267,8 +9819,8 @@
         </w:rPr>
         <w:t>DESPLIEGUE DE LAS SONDAS OCEANOGRÁFICAS</w:t>
       </w:r>
-      <w:bookmarkEnd w:id="96"/>
-      <w:bookmarkEnd w:id="97"/>
+      <w:bookmarkEnd w:id="82"/>
+      <w:bookmarkEnd w:id="83"/>
     </w:p>
     <w:p>
       <w:pPr>
@@ -10281,8 +9833,8 @@
           <w:color w:val="auto"/>
         </w:rPr>
       </w:pPr>
-      <w:bookmarkStart w:id="98" w:name="_Ref217472780"/>
-      <w:bookmarkStart w:id="99" w:name="_Hlk204704390"/>
+      <w:bookmarkStart w:id="84" w:name="_Ref217472780"/>
+      <w:bookmarkStart w:id="85" w:name="_Hlk204704390"/>
       <w:r>
         <w:rPr>
           <w:rFonts w:ascii="Microsoft Sans Serif" w:eastAsia="Times New Roman" w:hAnsi="Microsoft Sans Serif" w:cs="Times New Roman"/>
@@ -10325,9 +9877,10 @@
           <w:rFonts w:ascii="Microsoft Sans Serif" w:eastAsia="Times New Roman" w:hAnsi="Microsoft Sans Serif" w:cs="Times New Roman"/>
           <w:color w:val="auto"/>
         </w:rPr>
+        <w:lastRenderedPageBreak/>
         <w:t>&lt;&lt;ejecucion_de_la_campania_parrafo2&gt;&gt;</w:t>
       </w:r>
-      <w:bookmarkEnd w:id="98"/>
+      <w:bookmarkEnd w:id="84"/>
       <w:r>
         <w:rPr>
           <w:rFonts w:ascii="Microsoft Sans Serif" w:eastAsia="Times New Roman" w:hAnsi="Microsoft Sans Serif" w:cs="Times New Roman"/>
@@ -10665,7 +10218,6 @@
         <w:rPr>
           <w:szCs w:val="22"/>
         </w:rPr>
-        <w:lastRenderedPageBreak/>
         <w:t xml:space="preserve">Una vez liberada la sonda oceanográfica el personal se comunicó mediante telefonía satelital con el personal en tierra para avisar de la maniobra. Posteriormente el personal en tierra realizó el despliegue de la información en el </w:t>
       </w:r>
       <w:r>
@@ -10731,6 +10283,7 @@
         <w:jc w:val="center"/>
       </w:pPr>
       <w:r>
+        <w:lastRenderedPageBreak/>
         <w:t>&lt;&lt;</w:t>
       </w:r>
       <w:proofErr w:type="spellStart"/>
@@ -10742,189 +10295,69 @@
         <w:t>&gt;&gt;</w:t>
       </w:r>
     </w:p>
+    <w:p/>
     <w:p>
       <w:pPr>
-        <w:keepNext/>
+        <w:ind w:left="360" w:firstLine="360"/>
+        <w:rPr>
+          <w:szCs w:val="22"/>
+        </w:rPr>
+      </w:pPr>
+      <w:r>
+        <w:rPr>
+          <w:szCs w:val="22"/>
+        </w:rPr>
+        <w:t xml:space="preserve">A continuación, de la </w:t>
+      </w:r>
+      <w:r>
+        <w:rPr>
+          <w:rFonts w:cs="Arial"/>
+        </w:rPr>
+        <w:t>&lt;&lt;</w:t>
+      </w:r>
+      <w:proofErr w:type="spellStart"/>
+      <w:r>
+        <w:rPr>
+          <w:rFonts w:cs="Arial"/>
+        </w:rPr>
+        <w:t>ref_</w:t>
+      </w:r>
+      <w:r>
+        <w:t>ejecucion_de_la_campania</w:t>
+      </w:r>
+      <w:proofErr w:type="spellEnd"/>
+      <w:r>
+        <w:t>&gt;&gt;</w:t>
+      </w:r>
+      <w:r>
+        <w:t xml:space="preserve"> </w:t>
+      </w:r>
+      <w:r>
+        <w:rPr>
+          <w:szCs w:val="22"/>
+        </w:rPr>
+        <w:t xml:space="preserve">se presentan las evidencias fotográficas del despliegue de las </w:t>
+      </w:r>
+      <w:r>
+        <w:rPr>
+          <w:szCs w:val="22"/>
+        </w:rPr>
+        <w:t>sondas</w:t>
+      </w:r>
+      <w:r>
+        <w:rPr>
+          <w:szCs w:val="22"/>
+        </w:rPr>
+        <w:t>.</w:t>
+      </w:r>
+      <w:bookmarkEnd w:id="85"/>
+    </w:p>
+    <w:p/>
+    <w:p>
+      <w:pPr>
         <w:suppressAutoHyphens w:val="0"/>
         <w:spacing w:line="240" w:lineRule="auto"/>
         <w:jc w:val="center"/>
-      </w:pPr>
-      <w:bookmarkStart w:id="100" w:name="_Ref217465608"/>
-      <w:bookmarkStart w:id="101" w:name="_Toc229049292"/>
-      <w:r>
-        <w:t xml:space="preserve">Figura </w:t>
-      </w:r>
-      <w:fldSimple w:instr=" SEQ Figura \* ARABIC ">
-        <w:r>
-          <w:rPr>
-            <w:noProof/>
-          </w:rPr>
-          <w:t>8</w:t>
-        </w:r>
-      </w:fldSimple>
-      <w:bookmarkEnd w:id="100"/>
-      <w:r>
-        <w:t xml:space="preserve">. </w:t>
-      </w:r>
-      <w:r>
-        <w:t>&lt;&lt;</w:t>
-      </w:r>
-      <w:proofErr w:type="spellStart"/>
-      <w:r>
-        <w:t>pie_mapa_de_despliegue</w:t>
-      </w:r>
-      <w:proofErr w:type="spellEnd"/>
-      <w:r>
-        <w:t>&gt;&gt;</w:t>
-      </w:r>
-      <w:bookmarkEnd w:id="101"/>
-    </w:p>
-    <w:p/>
-    <w:p>
-      <w:pPr>
-        <w:ind w:left="360" w:firstLine="360"/>
-        <w:rPr>
-          <w:szCs w:val="22"/>
-        </w:rPr>
-      </w:pPr>
-      <w:r>
-        <w:rPr>
-          <w:szCs w:val="22"/>
-        </w:rPr>
-        <w:t xml:space="preserve">A continuación, de la </w:t>
-      </w:r>
-      <w:r>
-        <w:rPr>
-          <w:szCs w:val="22"/>
-        </w:rPr>
-        <w:fldChar w:fldCharType="begin"/>
-      </w:r>
-      <w:r>
-        <w:rPr>
-          <w:szCs w:val="22"/>
-        </w:rPr>
-        <w:instrText xml:space="preserve"> REF _Ref218072764 \h </w:instrText>
-      </w:r>
-      <w:r>
-        <w:rPr>
-          <w:szCs w:val="22"/>
-        </w:rPr>
-        <w:instrText xml:space="preserve"> \* MERGEFORMAT </w:instrText>
-      </w:r>
-      <w:r>
-        <w:rPr>
-          <w:szCs w:val="22"/>
-        </w:rPr>
-      </w:r>
-      <w:r>
-        <w:rPr>
-          <w:szCs w:val="22"/>
-        </w:rPr>
-        <w:fldChar w:fldCharType="separate"/>
-      </w:r>
-      <w:r>
-        <w:t xml:space="preserve">Figura </w:t>
-      </w:r>
-      <w:r>
-        <w:rPr>
-          <w:noProof/>
-        </w:rPr>
-        <w:t>10</w:t>
-      </w:r>
-      <w:r>
-        <w:rPr>
-          <w:szCs w:val="22"/>
-        </w:rPr>
-        <w:fldChar w:fldCharType="end"/>
-      </w:r>
-      <w:r>
-        <w:rPr>
-          <w:szCs w:val="22"/>
-        </w:rPr>
-        <w:t xml:space="preserve"> </w:t>
-      </w:r>
-      <w:r>
-        <w:rPr>
-          <w:szCs w:val="22"/>
-        </w:rPr>
-        <w:t xml:space="preserve">a la </w:t>
-      </w:r>
-      <w:r>
-        <w:rPr>
-          <w:szCs w:val="22"/>
-        </w:rPr>
-        <w:fldChar w:fldCharType="begin"/>
-      </w:r>
-      <w:r>
-        <w:rPr>
-          <w:szCs w:val="22"/>
-        </w:rPr>
-        <w:instrText xml:space="preserve"> REF _Ref218072782 \h </w:instrText>
-      </w:r>
-      <w:r>
-        <w:rPr>
-          <w:szCs w:val="22"/>
-        </w:rPr>
-        <w:instrText xml:space="preserve"> \* MERGEFORMAT </w:instrText>
-      </w:r>
-      <w:r>
-        <w:rPr>
-          <w:szCs w:val="22"/>
-        </w:rPr>
-      </w:r>
-      <w:r>
-        <w:rPr>
-          <w:szCs w:val="22"/>
-        </w:rPr>
-        <w:fldChar w:fldCharType="separate"/>
-      </w:r>
-      <w:r>
-        <w:t xml:space="preserve">Figura </w:t>
-      </w:r>
-      <w:r>
-        <w:rPr>
-          <w:noProof/>
-        </w:rPr>
-        <w:t>16</w:t>
-      </w:r>
-      <w:r>
-        <w:rPr>
-          <w:szCs w:val="22"/>
-        </w:rPr>
-        <w:fldChar w:fldCharType="end"/>
-      </w:r>
-      <w:r>
-        <w:rPr>
-          <w:szCs w:val="22"/>
-        </w:rPr>
-        <w:t xml:space="preserve"> </w:t>
-      </w:r>
-      <w:r>
-        <w:rPr>
-          <w:szCs w:val="22"/>
-        </w:rPr>
-        <w:t xml:space="preserve">se presentan las evidencias fotográficas del despliegue de las </w:t>
-      </w:r>
-      <w:r>
-        <w:rPr>
-          <w:szCs w:val="22"/>
-        </w:rPr>
-        <w:t>sondas</w:t>
-      </w:r>
-      <w:r>
-        <w:rPr>
-          <w:szCs w:val="22"/>
-        </w:rPr>
-        <w:t>.</w:t>
-      </w:r>
-      <w:bookmarkEnd w:id="99"/>
-    </w:p>
-    <w:p/>
-    <w:p>
-      <w:pPr>
-        <w:suppressAutoHyphens w:val="0"/>
-        <w:spacing w:line="240" w:lineRule="auto"/>
-        <w:jc w:val="center"/>
         <w:rPr>
           <w:rFonts w:cs="Microsoft Sans Serif"/>
           <w:sz w:val="20"/>
@@ -10947,80 +10380,6 @@
           <w:szCs w:val="22"/>
         </w:rPr>
         <w:t>fig_ejecucion_</w:t>
-      </w:r>
-      <w:r>
-        <w:rPr>
-          <w:rFonts w:cs="Microsoft Sans Serif"/>
-          <w:sz w:val="20"/>
-          <w:szCs w:val="22"/>
-        </w:rPr>
-        <w:t>de_la_campania</w:t>
-      </w:r>
-      <w:proofErr w:type="spellEnd"/>
-      <w:r>
-        <w:rPr>
-          <w:rFonts w:cs="Microsoft Sans Serif"/>
-          <w:sz w:val="20"/>
-          <w:szCs w:val="22"/>
-        </w:rPr>
-        <w:t>&gt;&gt;</w:t>
-      </w:r>
-    </w:p>
-    <w:p>
-      <w:pPr>
-        <w:suppressAutoHyphens w:val="0"/>
-        <w:spacing w:line="240" w:lineRule="auto"/>
-        <w:jc w:val="center"/>
-        <w:rPr>
-          <w:rFonts w:cs="Microsoft Sans Serif"/>
-          <w:sz w:val="20"/>
-          <w:szCs w:val="22"/>
-        </w:rPr>
-      </w:pPr>
-      <w:bookmarkStart w:id="102" w:name="_Ref218072764"/>
-      <w:bookmarkStart w:id="103" w:name="_Toc224230754"/>
-      <w:bookmarkStart w:id="104" w:name="_Toc229049294"/>
-      <w:r>
-        <w:t xml:space="preserve">Figura </w:t>
-      </w:r>
-      <w:fldSimple w:instr=" SEQ Figura \* ARABIC ">
-        <w:r>
-          <w:rPr>
-            <w:noProof/>
-          </w:rPr>
-          <w:t>10</w:t>
-        </w:r>
-      </w:fldSimple>
-      <w:bookmarkEnd w:id="102"/>
-      <w:r>
-        <w:t>.</w:t>
-      </w:r>
-      <w:bookmarkEnd w:id="103"/>
-      <w:bookmarkEnd w:id="104"/>
-      <w:r>
-        <w:rPr>
-          <w:rFonts w:cs="Microsoft Sans Serif"/>
-          <w:sz w:val="20"/>
-          <w:szCs w:val="22"/>
-        </w:rPr>
-        <w:t xml:space="preserve"> &lt;&lt;</w:t>
-      </w:r>
-      <w:proofErr w:type="spellStart"/>
-      <w:r>
-        <w:rPr>
-          <w:rFonts w:cs="Microsoft Sans Serif"/>
-          <w:sz w:val="20"/>
-          <w:szCs w:val="22"/>
-        </w:rPr>
-        <w:t>pie</w:t>
-      </w:r>
-      <w:r>
-        <w:rPr>
-          <w:rFonts w:cs="Microsoft Sans Serif"/>
-          <w:sz w:val="20"/>
-          <w:szCs w:val="22"/>
-        </w:rPr>
-        <w:t>_ejecucion_</w:t>
       </w:r>
       <w:r>
         <w:rPr>
@@ -11115,9 +10474,9 @@
         <w:keepLines/>
         <w:jc w:val="center"/>
       </w:pPr>
-      <w:bookmarkStart w:id="105" w:name="_Ref204082582"/>
-      <w:bookmarkStart w:id="106" w:name="_Toc215827128"/>
-      <w:bookmarkStart w:id="107" w:name="_Toc229049319"/>
+      <w:bookmarkStart w:id="86" w:name="_Ref204082582"/>
+      <w:bookmarkStart w:id="87" w:name="_Toc215827128"/>
+      <w:bookmarkStart w:id="88" w:name="_Toc229049319"/>
       <w:r>
         <w:t xml:space="preserve">Tabla </w:t>
       </w:r>
@@ -11129,7 +10488,7 @@
           <w:t>2</w:t>
         </w:r>
       </w:fldSimple>
-      <w:bookmarkEnd w:id="105"/>
+      <w:bookmarkEnd w:id="86"/>
       <w:r>
         <w:t xml:space="preserve">. Coordenadas geográficas de </w:t>
       </w:r>
@@ -11151,8 +10510,8 @@
       <w:r>
         <w:t>.</w:t>
       </w:r>
-      <w:bookmarkEnd w:id="106"/>
-      <w:bookmarkEnd w:id="107"/>
+      <w:bookmarkEnd w:id="87"/>
+      <w:bookmarkEnd w:id="88"/>
     </w:p>
     <w:tbl>
       <w:tblPr>
@@ -11654,17 +11013,17 @@
       <w:pPr>
         <w:pStyle w:val="Ttulo2"/>
       </w:pPr>
-      <w:bookmarkStart w:id="108" w:name="_Ref217472664"/>
-      <w:bookmarkStart w:id="109" w:name="_Ref224230591"/>
-      <w:bookmarkStart w:id="110" w:name="_Ref224230599"/>
-      <w:bookmarkStart w:id="111" w:name="_Toc229049277"/>
+      <w:bookmarkStart w:id="89" w:name="_Ref217472664"/>
+      <w:bookmarkStart w:id="90" w:name="_Ref224230591"/>
+      <w:bookmarkStart w:id="91" w:name="_Ref224230599"/>
+      <w:bookmarkStart w:id="92" w:name="_Toc229049277"/>
       <w:r>
         <w:t>INFORMACIÓN DEL DESPLIEGUE DE LAS SONDAS OCEANOGRÁFICAS</w:t>
       </w:r>
-      <w:bookmarkEnd w:id="108"/>
-      <w:bookmarkEnd w:id="109"/>
-      <w:bookmarkEnd w:id="110"/>
-      <w:bookmarkEnd w:id="111"/>
+      <w:bookmarkEnd w:id="89"/>
+      <w:bookmarkEnd w:id="90"/>
+      <w:bookmarkEnd w:id="91"/>
+      <w:bookmarkEnd w:id="92"/>
     </w:p>
     <w:p>
       <w:pPr>
@@ -11677,7 +11036,13 @@
         <w:t>o</w:t>
       </w:r>
       <w:r>
-        <w:t>n_de_la_camapnia_parrafo</w:t>
+        <w:t>n_de_la_cam</w:t>
+      </w:r>
+      <w:r>
+        <w:t>pan</w:t>
+      </w:r>
+      <w:r>
+        <w:t>ia_parrafo</w:t>
       </w:r>
       <w:r>
         <w:t>5</w:t>
@@ -11775,10 +11140,9 @@
         <w:keepNext/>
         <w:jc w:val="center"/>
       </w:pPr>
-      <w:bookmarkStart w:id="112" w:name="_Ref217401548"/>
-      <w:bookmarkStart w:id="113" w:name="_Toc229049320"/>
-      <w:r>
-        <w:lastRenderedPageBreak/>
+      <w:bookmarkStart w:id="93" w:name="_Ref217401548"/>
+      <w:bookmarkStart w:id="94" w:name="_Toc229049320"/>
+      <w:r>
         <w:t xml:space="preserve">Tabla </w:t>
       </w:r>
       <w:fldSimple w:instr=" SEQ Tabla \* ARABIC ">
@@ -11789,7 +11153,7 @@
           <w:t>3</w:t>
         </w:r>
       </w:fldSimple>
-      <w:bookmarkEnd w:id="112"/>
+      <w:bookmarkEnd w:id="93"/>
       <w:r>
         <w:t xml:space="preserve">. </w:t>
       </w:r>
@@ -11811,7 +11175,7 @@
       <w:r>
         <w:t>.</w:t>
       </w:r>
-      <w:bookmarkEnd w:id="113"/>
+      <w:bookmarkEnd w:id="94"/>
     </w:p>
     <w:tbl>
       <w:tblPr>
@@ -12407,7 +11771,7 @@
       </w:tr>
     </w:tbl>
     <w:p>
-      <w:bookmarkStart w:id="114" w:name="_Ref217469988"/>
+      <w:bookmarkStart w:id="95" w:name="_Ref217469988"/>
     </w:p>
     <w:p>
       <w:pPr>
@@ -12415,8 +11779,8 @@
         <w:keepNext/>
         <w:jc w:val="center"/>
       </w:pPr>
-      <w:bookmarkStart w:id="115" w:name="_Ref229050865"/>
-      <w:bookmarkStart w:id="116" w:name="_Toc229049321"/>
+      <w:bookmarkStart w:id="96" w:name="_Ref229050865"/>
+      <w:bookmarkStart w:id="97" w:name="_Toc229049321"/>
       <w:r>
         <w:t xml:space="preserve">Tabla </w:t>
       </w:r>
@@ -12428,8 +11792,8 @@
           <w:t>4</w:t>
         </w:r>
       </w:fldSimple>
-      <w:bookmarkEnd w:id="114"/>
-      <w:bookmarkEnd w:id="115"/>
+      <w:bookmarkEnd w:id="95"/>
+      <w:bookmarkEnd w:id="96"/>
       <w:r>
         <w:t xml:space="preserve">. </w:t>
       </w:r>
@@ -12445,7 +11809,7 @@
       <w:r>
         <w:t>.</w:t>
       </w:r>
-      <w:bookmarkEnd w:id="116"/>
+      <w:bookmarkEnd w:id="97"/>
     </w:p>
     <w:tbl>
       <w:tblPr>
@@ -13587,1086 +12951,841 @@
           <w:rStyle w:val="Title1"/>
         </w:rPr>
       </w:pPr>
-      <w:bookmarkStart w:id="117" w:name="_DATOS_DE_LA"/>
-      <w:bookmarkStart w:id="118" w:name="_Toc219903453"/>
-      <w:bookmarkStart w:id="119" w:name="_Toc221259433"/>
-      <w:bookmarkStart w:id="120" w:name="_Toc219903490"/>
-      <w:bookmarkStart w:id="121" w:name="_Toc221259470"/>
-      <w:bookmarkStart w:id="122" w:name="_Ref217473600"/>
-      <w:bookmarkStart w:id="123" w:name="_Ref219907446"/>
+      <w:bookmarkStart w:id="98" w:name="_DATOS_DE_LA"/>
+      <w:bookmarkStart w:id="99" w:name="_Toc219903453"/>
+      <w:bookmarkStart w:id="100" w:name="_Toc221259433"/>
+      <w:bookmarkStart w:id="101" w:name="_Toc219903490"/>
+      <w:bookmarkStart w:id="102" w:name="_Toc221259470"/>
+      <w:bookmarkStart w:id="103" w:name="_Ref217473600"/>
+      <w:bookmarkStart w:id="104" w:name="_Ref219907446"/>
+      <w:bookmarkEnd w:id="98"/>
+      <w:bookmarkEnd w:id="99"/>
+      <w:bookmarkEnd w:id="100"/>
+      <w:bookmarkEnd w:id="101"/>
+      <w:bookmarkEnd w:id="102"/>
+    </w:p>
+    <w:p>
+      <w:pPr>
+        <w:ind w:firstLine="426"/>
+      </w:pPr>
+      <w:r>
+        <w:t>D</w:t>
+      </w:r>
+      <w:r>
+        <w:t xml:space="preserve">e la </w:t>
+      </w:r>
+      <w:r>
+        <w:t>&lt;&lt;</w:t>
+      </w:r>
+      <w:proofErr w:type="spellStart"/>
+      <w:r>
+        <w:t>ref_esquema_de_sonda</w:t>
+      </w:r>
+      <w:proofErr w:type="spellEnd"/>
+      <w:r>
+        <w:t xml:space="preserve">&gt;&gt; </w:t>
+      </w:r>
+      <w:r>
+        <w:t xml:space="preserve">se presentan los esquemas de despliegues de las sondas, con la información importante obtenida durante las actividades del despliegue y las notas de campo. </w:t>
+      </w:r>
+    </w:p>
+    <w:p>
+      <w:pPr>
+        <w:ind w:firstLine="426"/>
+      </w:pPr>
+    </w:p>
+    <w:p>
+      <w:pPr>
+        <w:ind w:firstLine="426"/>
+        <w:jc w:val="center"/>
+      </w:pPr>
+      <w:bookmarkStart w:id="105" w:name="_Ref224117752"/>
+      <w:r>
+        <w:t>&lt;&lt;</w:t>
+      </w:r>
+      <w:proofErr w:type="spellStart"/>
+      <w:r>
+        <w:t>fig_</w:t>
+      </w:r>
+      <w:r>
+        <w:t>esquema</w:t>
+      </w:r>
+      <w:r>
+        <w:t>_de_sonda</w:t>
+      </w:r>
+      <w:proofErr w:type="spellEnd"/>
+      <w:r>
+        <w:t>&gt;&gt;</w:t>
+      </w:r>
+      <w:bookmarkEnd w:id="105"/>
+    </w:p>
+    <w:p>
+      <w:pPr>
+        <w:jc w:val="center"/>
+      </w:pPr>
+      <w:bookmarkStart w:id="106" w:name="_Toc229049307"/>
+      <w:r>
+        <w:t>.</w:t>
+      </w:r>
+      <w:bookmarkEnd w:id="106"/>
+      <w:r>
+        <w:br w:type="page"/>
+      </w:r>
+    </w:p>
+    <w:p>
+      <w:pPr>
+        <w:pStyle w:val="Ttulo1"/>
+        <w:rPr>
+          <w:rStyle w:val="Title1"/>
+        </w:rPr>
+      </w:pPr>
+      <w:bookmarkStart w:id="107" w:name="_Ref223695225"/>
+      <w:bookmarkStart w:id="108" w:name="_Toc229049278"/>
+      <w:r>
+        <w:rPr>
+          <w:rStyle w:val="Title1"/>
+        </w:rPr>
+        <w:lastRenderedPageBreak/>
+        <w:t>TELEMETRÍA, R</w:t>
+      </w:r>
+      <w:r>
+        <w:rPr>
+          <w:rStyle w:val="Title1"/>
+        </w:rPr>
+        <w:t xml:space="preserve">ECEPCIÓN Y ALMACENAMIENTO DE DATOS </w:t>
+      </w:r>
+      <w:bookmarkEnd w:id="103"/>
+      <w:r>
+        <w:rPr>
+          <w:rStyle w:val="Title1"/>
+        </w:rPr>
+        <w:t>PREVIOS</w:t>
+      </w:r>
+      <w:r>
+        <w:rPr>
+          <w:rStyle w:val="Title1"/>
+        </w:rPr>
+        <w:t xml:space="preserve"> AL DESPLIEGUE</w:t>
+      </w:r>
+      <w:r>
+        <w:rPr>
+          <w:rStyle w:val="Title1"/>
+        </w:rPr>
+        <w:t xml:space="preserve"> DE LA SONDA</w:t>
+      </w:r>
+      <w:bookmarkEnd w:id="104"/>
+      <w:bookmarkEnd w:id="107"/>
+      <w:r>
+        <w:rPr>
+          <w:rStyle w:val="Title1"/>
+        </w:rPr>
+        <w:t>.</w:t>
+      </w:r>
+      <w:bookmarkEnd w:id="108"/>
+    </w:p>
+    <w:p>
+      <w:pPr>
+        <w:ind w:firstLine="360"/>
+        <w:rPr>
+          <w:rFonts w:cs="Arial"/>
+        </w:rPr>
+      </w:pPr>
+      <w:r>
+        <w:rPr>
+          <w:rFonts w:cs="Arial"/>
+        </w:rPr>
+        <w:t xml:space="preserve">Antes de desplegar las sondas </w:t>
+      </w:r>
+      <w:r>
+        <w:rPr>
+          <w:rFonts w:cs="Arial"/>
+        </w:rPr>
+        <w:t>oceanográficas</w:t>
+      </w:r>
+      <w:r>
+        <w:rPr>
+          <w:rFonts w:cs="Arial"/>
+        </w:rPr>
+        <w:t xml:space="preserve"> se realizaron pruebas </w:t>
+      </w:r>
+      <w:r>
+        <w:rPr>
+          <w:rFonts w:cs="Arial"/>
+        </w:rPr>
+        <w:t xml:space="preserve">en el laboratorio </w:t>
+      </w:r>
+      <w:r>
+        <w:rPr>
+          <w:rFonts w:cs="Arial"/>
+        </w:rPr>
+        <w:t xml:space="preserve">para garantizar el correcto funcionamiento de </w:t>
+      </w:r>
+      <w:r>
+        <w:rPr>
+          <w:rFonts w:cs="Arial"/>
+        </w:rPr>
+        <w:t>las mismas</w:t>
+      </w:r>
+      <w:r>
+        <w:rPr>
+          <w:rFonts w:cs="Arial"/>
+        </w:rPr>
+        <w:t xml:space="preserve">. Una vez que las sondas </w:t>
+      </w:r>
+      <w:r>
+        <w:rPr>
+          <w:rFonts w:cs="Arial"/>
+        </w:rPr>
+        <w:t>estuvieron</w:t>
+      </w:r>
+      <w:r>
+        <w:rPr>
+          <w:rFonts w:cs="Arial"/>
+        </w:rPr>
+        <w:t xml:space="preserve"> ensambladas y selladas, éstas se </w:t>
+      </w:r>
+      <w:r>
+        <w:rPr>
+          <w:rFonts w:cs="Arial"/>
+        </w:rPr>
+        <w:t>encendieron</w:t>
+      </w:r>
+      <w:r>
+        <w:rPr>
+          <w:rFonts w:cs="Arial"/>
+        </w:rPr>
+        <w:t xml:space="preserve"> para comprobar que el sistema de telemetría, recepción y almacenamiento de </w:t>
+      </w:r>
+      <w:r>
+        <w:rPr>
+          <w:rFonts w:cs="Arial"/>
+        </w:rPr>
+        <w:t xml:space="preserve">datos </w:t>
+      </w:r>
+      <w:r>
+        <w:rPr>
+          <w:rFonts w:cs="Arial"/>
+        </w:rPr>
+        <w:t>funcion</w:t>
+      </w:r>
+      <w:r>
+        <w:rPr>
+          <w:rFonts w:cs="Arial"/>
+        </w:rPr>
+        <w:t>ara</w:t>
+      </w:r>
+      <w:r>
+        <w:rPr>
+          <w:rFonts w:cs="Arial"/>
+        </w:rPr>
+        <w:t xml:space="preserve"> correctamente. </w:t>
+      </w:r>
+    </w:p>
+    <w:p>
+      <w:pPr>
+        <w:ind w:firstLine="360"/>
+        <w:rPr>
+          <w:rFonts w:cs="Arial"/>
+        </w:rPr>
+      </w:pPr>
+    </w:p>
+    <w:p>
+      <w:pPr>
+        <w:ind w:firstLine="360"/>
+        <w:rPr>
+          <w:szCs w:val="22"/>
+        </w:rPr>
+      </w:pPr>
+      <w:r>
+        <w:rPr>
+          <w:rFonts w:cs="Arial"/>
+        </w:rPr>
+        <w:t>Durante las primeras 24 horas, las sondas se mantuvieron en pruebas de telemetría y carga de energía, con el objetivo de verificar la correcta transmisión y almacenamiento de la información, así como el adecuado almacenamiento de energía solar en las baterías. La frecuencia de comunicación de la sonda está configurada para realizarse cada media hora; es decir, en ese intervalo la sonda se comunica con el satélite, el cual envía la información a los servidores de ASM-CICESE asignados al proyecto. En dichos servidores se almacenan los mensajes con el estado de la sonda y los datos medidos correspondientes a ese intervalo de tiempo</w:t>
+      </w:r>
+      <w:r>
+        <w:rPr>
+          <w:szCs w:val="22"/>
+        </w:rPr>
+        <w:t>.</w:t>
+      </w:r>
+    </w:p>
+    <w:p>
+      <w:pPr>
+        <w:ind w:firstLine="360"/>
+        <w:rPr>
+          <w:rFonts w:cs="Arial"/>
+        </w:rPr>
+      </w:pPr>
+    </w:p>
+    <w:p>
+      <w:pPr>
+        <w:ind w:firstLine="360"/>
+        <w:rPr>
+          <w:rFonts w:cs="Arial"/>
+        </w:rPr>
+      </w:pPr>
+      <w:r>
+        <w:rPr>
+          <w:rFonts w:cs="Arial"/>
+        </w:rPr>
+        <w:t>La información enviada por las sondas está</w:t>
+      </w:r>
+      <w:r>
+        <w:rPr>
+          <w:rFonts w:cs="Arial"/>
+        </w:rPr>
+        <w:t xml:space="preserve"> </w:t>
+      </w:r>
+      <w:r>
+        <w:rPr>
+          <w:rFonts w:cs="Arial"/>
+        </w:rPr>
+        <w:t>compuesta</w:t>
+      </w:r>
+      <w:r>
+        <w:rPr>
+          <w:rFonts w:cs="Arial"/>
+        </w:rPr>
+        <w:t xml:space="preserve"> por: </w:t>
+      </w:r>
+      <w:r>
+        <w:rPr>
+          <w:rFonts w:cs="Arial"/>
+        </w:rPr>
+        <w:t>vector</w:t>
+      </w:r>
+      <w:r>
+        <w:rPr>
+          <w:rFonts w:cs="Arial"/>
+        </w:rPr>
+        <w:t xml:space="preserve"> de tiempo, posición (latitud y longitud</w:t>
+      </w:r>
+      <w:r>
+        <w:rPr>
+          <w:rFonts w:cs="Arial"/>
+        </w:rPr>
+        <w:t>, grados decimales</w:t>
+      </w:r>
+      <w:r>
+        <w:rPr>
+          <w:rFonts w:cs="Arial"/>
+        </w:rPr>
+        <w:t>), velocidad</w:t>
+      </w:r>
+      <w:r>
+        <w:rPr>
+          <w:rFonts w:cs="Arial"/>
+        </w:rPr>
+        <w:t xml:space="preserve"> (m/s)</w:t>
+      </w:r>
+      <w:r>
+        <w:rPr>
+          <w:rFonts w:cs="Arial"/>
+        </w:rPr>
+        <w:t>, distancia recorrida</w:t>
+      </w:r>
+      <w:r>
+        <w:rPr>
+          <w:rFonts w:cs="Arial"/>
+        </w:rPr>
+        <w:t xml:space="preserve"> (m)</w:t>
+      </w:r>
+      <w:r>
+        <w:rPr>
+          <w:rFonts w:cs="Arial"/>
+        </w:rPr>
+        <w:t>, dirección del desplazamiento (grados), dirección del desplazamiento (</w:t>
+      </w:r>
+      <w:r>
+        <w:rPr>
+          <w:rFonts w:cs="Arial"/>
+        </w:rPr>
+        <w:t xml:space="preserve">cadena de </w:t>
+      </w:r>
+      <w:r>
+        <w:rPr>
+          <w:rFonts w:cs="Arial"/>
+        </w:rPr>
+        <w:t>texto), temperatura</w:t>
+      </w:r>
+      <w:r>
+        <w:rPr>
+          <w:rFonts w:cs="Arial"/>
+        </w:rPr>
+        <w:t xml:space="preserve"> </w:t>
+      </w:r>
+      <w:r>
+        <w:rPr>
+          <w:rFonts w:cs="Arial"/>
+        </w:rPr>
+        <w:t xml:space="preserve">sensor primario </w:t>
+      </w:r>
+      <w:r>
+        <w:rPr>
+          <w:rFonts w:cs="Arial"/>
+        </w:rPr>
+        <w:t>(grados centígrados)</w:t>
+      </w:r>
+      <w:r>
+        <w:rPr>
+          <w:rFonts w:cs="Arial"/>
+        </w:rPr>
+        <w:t>, temperatura sensor secundario (grados centígrados), aceleraciones horizontales y verticales en m/s</w:t>
+      </w:r>
+      <w:r>
+        <w:rPr>
+          <w:rFonts w:cs="Arial"/>
+          <w:vertAlign w:val="superscript"/>
+        </w:rPr>
+        <w:t>2</w:t>
+      </w:r>
+      <w:r>
+        <w:rPr>
+          <w:rFonts w:cs="Arial"/>
+        </w:rPr>
+        <w:t xml:space="preserve"> y voltaje</w:t>
+      </w:r>
+      <w:r>
+        <w:rPr>
+          <w:rFonts w:cs="Arial"/>
+        </w:rPr>
+        <w:t xml:space="preserve"> (voltios).</w:t>
+      </w:r>
+      <w:r>
+        <w:rPr>
+          <w:rFonts w:cs="Arial"/>
+        </w:rPr>
+        <w:t xml:space="preserve"> </w:t>
+      </w:r>
+      <w:r>
+        <w:rPr>
+          <w:rFonts w:cs="Arial"/>
+        </w:rPr>
+        <w:t xml:space="preserve">La evidencia de la información de las primeras 24 horas de transmisión de cada sonda se encuentra en el </w:t>
+      </w:r>
+      <w:r>
+        <w:rPr>
+          <w:rFonts w:cs="Arial"/>
+        </w:rPr>
+        <w:fldChar w:fldCharType="begin"/>
+      </w:r>
+      <w:r>
+        <w:rPr>
+          <w:rFonts w:cs="Arial"/>
+        </w:rPr>
+        <w:instrText xml:space="preserve"> REF _Ref221185985 \h </w:instrText>
+      </w:r>
+      <w:r>
+        <w:rPr>
+          <w:rFonts w:cs="Arial"/>
+        </w:rPr>
+        <w:instrText xml:space="preserve"> \* MERGEFORMAT </w:instrText>
+      </w:r>
+      <w:r>
+        <w:rPr>
+          <w:rFonts w:cs="Arial"/>
+        </w:rPr>
+      </w:r>
+      <w:r>
+        <w:rPr>
+          <w:rFonts w:cs="Arial"/>
+        </w:rPr>
+        <w:fldChar w:fldCharType="separate"/>
+      </w:r>
+      <w:r>
+        <w:rPr>
+          <w:rStyle w:val="Title1"/>
+        </w:rPr>
+        <w:t>ANEXO 2: PRUEBAS DE TRANSMISIÓN PREVIAS AL DESPLIEGUE</w:t>
+      </w:r>
+      <w:r>
+        <w:rPr>
+          <w:rFonts w:cs="Arial"/>
+        </w:rPr>
+        <w:fldChar w:fldCharType="end"/>
+      </w:r>
+      <w:r>
+        <w:rPr>
+          <w:rFonts w:cs="Arial"/>
+        </w:rPr>
+        <w:t xml:space="preserve">. </w:t>
+      </w:r>
+      <w:r>
+        <w:rPr>
+          <w:rFonts w:cs="Arial"/>
+        </w:rPr>
+        <w:t>A continuación</w:t>
+      </w:r>
+      <w:r>
+        <w:rPr>
+          <w:rFonts w:cs="Arial"/>
+        </w:rPr>
+        <w:t>,</w:t>
+      </w:r>
+      <w:r>
+        <w:rPr>
+          <w:rFonts w:cs="Arial"/>
+        </w:rPr>
+        <w:t xml:space="preserve"> se muestra</w:t>
+      </w:r>
+      <w:r>
+        <w:rPr>
+          <w:rFonts w:cs="Arial"/>
+        </w:rPr>
+        <w:t>n</w:t>
+      </w:r>
+      <w:r>
+        <w:rPr>
+          <w:rFonts w:cs="Arial"/>
+        </w:rPr>
+        <w:t xml:space="preserve"> la</w:t>
+      </w:r>
+      <w:r>
+        <w:rPr>
+          <w:rFonts w:cs="Arial"/>
+        </w:rPr>
+        <w:t>s</w:t>
+      </w:r>
+      <w:r>
+        <w:rPr>
+          <w:rFonts w:cs="Arial"/>
+        </w:rPr>
+        <w:t xml:space="preserve"> serie</w:t>
+      </w:r>
+      <w:r>
+        <w:rPr>
+          <w:rFonts w:cs="Arial"/>
+        </w:rPr>
+        <w:t>s</w:t>
+      </w:r>
+      <w:r>
+        <w:rPr>
+          <w:rFonts w:cs="Arial"/>
+        </w:rPr>
+        <w:t xml:space="preserve"> de tiempo</w:t>
+      </w:r>
+      <w:r>
+        <w:rPr>
+          <w:rFonts w:cs="Arial"/>
+        </w:rPr>
+        <w:t xml:space="preserve"> </w:t>
+      </w:r>
+      <w:r>
+        <w:rPr>
+          <w:rFonts w:cs="Arial"/>
+        </w:rPr>
+        <w:t>con el</w:t>
+      </w:r>
+      <w:r>
+        <w:rPr>
+          <w:rFonts w:cs="Arial"/>
+        </w:rPr>
+        <w:t xml:space="preserve"> estado de las baterías</w:t>
+      </w:r>
+      <w:r>
+        <w:rPr>
+          <w:rFonts w:cs="Arial"/>
+        </w:rPr>
+        <w:t xml:space="preserve"> </w:t>
+      </w:r>
+      <w:r>
+        <w:rPr>
+          <w:rFonts w:cs="Arial"/>
+        </w:rPr>
+        <w:t xml:space="preserve">durante las pruebas de funcionamiento </w:t>
+      </w:r>
+      <w:r>
+        <w:rPr>
+          <w:rFonts w:cs="Arial"/>
+        </w:rPr>
+        <w:t>para cada una de las sondas</w:t>
+      </w:r>
+      <w:r>
+        <w:rPr>
+          <w:rFonts w:cs="Arial"/>
+        </w:rPr>
+        <w:t xml:space="preserve"> </w:t>
+      </w:r>
+      <w:r>
+        <w:rPr>
+          <w:rFonts w:cs="Arial"/>
+        </w:rPr>
+        <w:t xml:space="preserve">oceanográficas </w:t>
+      </w:r>
+      <w:r>
+        <w:rPr>
+          <w:rFonts w:cs="Arial"/>
+        </w:rPr>
+        <w:t>(</w:t>
+      </w:r>
+      <w:r>
+        <w:rPr>
+          <w:rFonts w:cs="Arial"/>
+        </w:rPr>
+        <w:t>&lt;&lt;</w:t>
+      </w:r>
+      <w:proofErr w:type="spellStart"/>
+      <w:r>
+        <w:rPr>
+          <w:rFonts w:cs="Arial"/>
+        </w:rPr>
+        <w:t>ref_pruebas_baterias</w:t>
+      </w:r>
+      <w:proofErr w:type="spellEnd"/>
+      <w:r>
+        <w:rPr>
+          <w:rFonts w:cs="Arial"/>
+        </w:rPr>
+        <w:t>&gt;&gt;</w:t>
+      </w:r>
+      <w:r>
+        <w:rPr>
+          <w:rFonts w:cs="Arial"/>
+        </w:rPr>
+        <w:t>)</w:t>
+      </w:r>
+      <w:r>
+        <w:rPr>
+          <w:rFonts w:cs="Arial"/>
+        </w:rPr>
+        <w:t xml:space="preserve">, y los mapas de las posiciones </w:t>
+      </w:r>
+      <w:r>
+        <w:rPr>
+          <w:rFonts w:cs="Arial"/>
+        </w:rPr>
+        <w:t>transmitidas (</w:t>
+      </w:r>
+      <w:r>
+        <w:rPr>
+          <w:rFonts w:cs="Arial"/>
+        </w:rPr>
+        <w:t>&lt;&lt;</w:t>
+      </w:r>
+      <w:proofErr w:type="spellStart"/>
+      <w:r>
+        <w:rPr>
+          <w:rFonts w:cs="Arial"/>
+        </w:rPr>
+        <w:t>ref_ubicac</w:t>
+      </w:r>
+      <w:r>
+        <w:rPr>
+          <w:rFonts w:cs="Arial"/>
+        </w:rPr>
+        <w:t>i</w:t>
+      </w:r>
+      <w:r>
+        <w:rPr>
+          <w:rFonts w:cs="Arial"/>
+        </w:rPr>
+        <w:t>on_durante_pruebas</w:t>
+      </w:r>
+      <w:proofErr w:type="spellEnd"/>
+      <w:r>
+        <w:rPr>
+          <w:rFonts w:cs="Arial"/>
+        </w:rPr>
+        <w:t>&gt;&gt;</w:t>
+      </w:r>
+      <w:r>
+        <w:rPr>
+          <w:rFonts w:cs="Arial"/>
+        </w:rPr>
+        <w:t xml:space="preserve">) </w:t>
+      </w:r>
+      <w:r>
+        <w:rPr>
+          <w:rFonts w:cs="Arial"/>
+        </w:rPr>
+        <w:t>durante las pruebas en laboratorio</w:t>
+      </w:r>
+      <w:r>
+        <w:rPr>
+          <w:rFonts w:cs="Arial"/>
+        </w:rPr>
+        <w:t>.</w:t>
+      </w:r>
+    </w:p>
+    <w:p>
+      <w:pPr>
+        <w:spacing w:line="240" w:lineRule="auto"/>
+        <w:jc w:val="left"/>
+      </w:pPr>
+    </w:p>
+    <w:p>
+      <w:pPr>
+        <w:pStyle w:val="Textoindependiente"/>
+        <w:keepNext/>
+        <w:jc w:val="center"/>
+      </w:pPr>
+      <w:r>
+        <w:rPr>
+          <w:noProof/>
+        </w:rPr>
+        <w:t>&lt;&lt;fig_pruebas_baterias&gt;&gt;</w:t>
+      </w:r>
+    </w:p>
+    <w:p>
+      <w:pPr>
+        <w:spacing w:line="240" w:lineRule="auto"/>
+        <w:jc w:val="center"/>
+      </w:pPr>
+    </w:p>
+    <w:p>
+      <w:pPr>
+        <w:spacing w:line="240" w:lineRule="auto"/>
+        <w:jc w:val="center"/>
+      </w:pPr>
+      <w:r>
+        <w:t>&lt;&lt;</w:t>
+      </w:r>
+      <w:proofErr w:type="spellStart"/>
+      <w:r>
+        <w:t>fig_ubicacion_durante_pruebas</w:t>
+      </w:r>
+      <w:proofErr w:type="spellEnd"/>
+      <w:r>
+        <w:t>&gt;&gt;</w:t>
+      </w:r>
+    </w:p>
+    <w:p>
+      <w:pPr>
+        <w:pStyle w:val="Descripcin"/>
+        <w:jc w:val="center"/>
+      </w:pPr>
+    </w:p>
+    <w:p>
+      <w:pPr>
+        <w:pStyle w:val="Textoindependiente"/>
+        <w:rPr>
+          <w:lang w:eastAsia="es-MX"/>
+        </w:rPr>
+      </w:pPr>
+    </w:p>
+    <w:p>
+      <w:pPr>
+        <w:pStyle w:val="Textoindependiente"/>
+        <w:ind w:firstLine="349"/>
+        <w:rPr>
+          <w:rFonts w:cs="Arial"/>
+          <w:lang w:eastAsia="es-MX"/>
+        </w:rPr>
+      </w:pPr>
+      <w:r>
+        <w:rPr>
+          <w:lang w:eastAsia="es-MX"/>
+        </w:rPr>
+        <w:lastRenderedPageBreak/>
+        <w:t xml:space="preserve">El almacenamiento de la información se realiza en los servidores del consorcio ASM-CICESE y es resguardada en duplicado para evitar la pérdida de información. Asimismo, la información se despliega en el sitio WEB del proyecto </w:t>
+      </w:r>
+      <w:hyperlink r:id="rId17" w:history="1">
+        <w:r>
+          <w:rPr>
+            <w:rStyle w:val="Hipervnculo"/>
+            <w:rFonts w:ascii="Microsoft Sans Serif" w:hAnsi="Microsoft Sans Serif"/>
+            <w:sz w:val="22"/>
+            <w:szCs w:val="22"/>
+            <w:lang w:eastAsia="es-MX"/>
+          </w:rPr>
+          <w:t>https://www.boyas.asm-cicese.mx</w:t>
+        </w:r>
+      </w:hyperlink>
+      <w:r>
+        <w:rPr>
+          <w:szCs w:val="22"/>
+          <w:lang w:eastAsia="es-MX"/>
+        </w:rPr>
+        <w:t xml:space="preserve"> y puede visualizarse desde el momento en que la boya es desplegada hasta el momento en que se pierde comunicación con la misma. </w:t>
+      </w:r>
+      <w:r>
+        <w:rPr>
+          <w:rFonts w:cs="Arial"/>
+        </w:rPr>
+        <w:t xml:space="preserve">Para ingresar al sitio web el </w:t>
+      </w:r>
+      <w:r>
+        <w:rPr>
+          <w:rFonts w:cs="Microsoft Sans Serif"/>
+        </w:rPr>
+        <w:t xml:space="preserve">usuario debe contar con el nombre de usuario y la contraseña asignada por el personal del consorcio ASM-CICESE. </w:t>
+      </w:r>
+    </w:p>
+    <w:p>
+      <w:pPr>
+        <w:spacing w:line="240" w:lineRule="auto"/>
+        <w:jc w:val="left"/>
+      </w:pPr>
+      <w:r>
+        <w:br w:type="page"/>
+      </w:r>
+    </w:p>
+    <w:p>
+      <w:pPr>
+        <w:pStyle w:val="Ttulo1"/>
+        <w:rPr>
+          <w:rStyle w:val="Title1"/>
+        </w:rPr>
+      </w:pPr>
+      <w:bookmarkStart w:id="109" w:name="_Toc229049279"/>
+      <w:r>
+        <w:rPr>
+          <w:rStyle w:val="Title1"/>
+        </w:rPr>
+        <w:lastRenderedPageBreak/>
+        <w:t>CONCLUSION</w:t>
+      </w:r>
+      <w:bookmarkStart w:id="110" w:name="_Toc239048372"/>
+      <w:bookmarkStart w:id="111" w:name="_Toc239003245"/>
+      <w:bookmarkStart w:id="112" w:name="_Toc238907546"/>
+      <w:bookmarkStart w:id="113" w:name="_Toc216302232"/>
+      <w:bookmarkStart w:id="114" w:name="_Toc216225393"/>
+      <w:bookmarkStart w:id="115" w:name="_Toc216223757"/>
+      <w:bookmarkStart w:id="116" w:name="_Toc216223366"/>
+      <w:bookmarkStart w:id="117" w:name="_Toc215712797"/>
+      <w:bookmarkStart w:id="118" w:name="_Toc215682794"/>
+      <w:bookmarkStart w:id="119" w:name="_Toc215682689"/>
+      <w:bookmarkStart w:id="120" w:name="_Toc215675354"/>
+      <w:bookmarkStart w:id="121" w:name="_Toc215578727"/>
+      <w:bookmarkStart w:id="122" w:name="_Toc215548253"/>
+      <w:bookmarkStart w:id="123" w:name="_Toc215370590"/>
+      <w:bookmarkEnd w:id="110"/>
+      <w:bookmarkEnd w:id="111"/>
+      <w:bookmarkEnd w:id="112"/>
+      <w:bookmarkEnd w:id="113"/>
+      <w:bookmarkEnd w:id="114"/>
+      <w:bookmarkEnd w:id="115"/>
+      <w:bookmarkEnd w:id="116"/>
       <w:bookmarkEnd w:id="117"/>
       <w:bookmarkEnd w:id="118"/>
       <w:bookmarkEnd w:id="119"/>
       <w:bookmarkEnd w:id="120"/>
       <w:bookmarkEnd w:id="121"/>
+      <w:bookmarkEnd w:id="122"/>
+      <w:bookmarkEnd w:id="123"/>
+      <w:r>
+        <w:rPr>
+          <w:rStyle w:val="Title1"/>
+        </w:rPr>
+        <w:t>ES</w:t>
+      </w:r>
+      <w:bookmarkEnd w:id="109"/>
     </w:p>
     <w:p>
       <w:pPr>
-        <w:ind w:firstLine="426"/>
-      </w:pPr>
-      <w:r>
-        <w:t>D</w:t>
-      </w:r>
-      <w:r>
-        <w:t xml:space="preserve">e la </w:t>
-      </w:r>
-      <w:r>
-        <w:fldChar w:fldCharType="begin"/>
-      </w:r>
-      <w:r>
-        <w:instrText xml:space="preserve"> REF _Ref229050778 \h </w:instrText>
-      </w:r>
-      <w:r>
-        <w:fldChar w:fldCharType="separate"/>
-      </w:r>
-      <w:r>
-        <w:t xml:space="preserve">Figura </w:t>
-      </w:r>
-      <w:r>
-        <w:rPr>
-          <w:noProof/>
-        </w:rPr>
-        <w:t>17</w:t>
-      </w:r>
-      <w:r>
-        <w:fldChar w:fldCharType="end"/>
-      </w:r>
-      <w:r>
-        <w:t xml:space="preserve"> </w:t>
-      </w:r>
-      <w:r>
-        <w:t xml:space="preserve">a la </w:t>
-      </w:r>
-      <w:r>
-        <w:fldChar w:fldCharType="begin"/>
-      </w:r>
-      <w:r>
-        <w:instrText xml:space="preserve"> REF _Ref229050784 \h  \* MERGEFORMAT </w:instrText>
-      </w:r>
-      <w:r>
-        <w:fldChar w:fldCharType="separate"/>
-      </w:r>
-      <w:r>
-        <w:t>Figura 23</w:t>
-      </w:r>
-      <w:r>
-        <w:fldChar w:fldCharType="end"/>
-      </w:r>
-      <w:r>
-        <w:t xml:space="preserve"> se presentan los esquemas de despliegues de las sondas, con la información importante obtenida durante las actividades del despliegue y las notas de campo. </w:t>
-      </w:r>
-    </w:p>
-    <w:p>
-      <w:pPr>
-        <w:ind w:firstLine="426"/>
-      </w:pPr>
-    </w:p>
-    <w:p>
-      <w:pPr>
-        <w:ind w:firstLine="426"/>
-        <w:jc w:val="center"/>
-      </w:pPr>
-      <w:bookmarkStart w:id="124" w:name="_Ref224117752"/>
-      <w:r>
-        <w:t>&lt;&lt;</w:t>
-      </w:r>
-      <w:proofErr w:type="spellStart"/>
-      <w:r>
-        <w:t>fig_</w:t>
-      </w:r>
-      <w:r>
-        <w:t>esquema</w:t>
-      </w:r>
-      <w:r>
-        <w:t>_de_sonda_oceanografica</w:t>
-      </w:r>
-      <w:proofErr w:type="spellEnd"/>
-      <w:r>
-        <w:t>&gt;&gt;</w:t>
-      </w:r>
-    </w:p>
-    <w:p>
-      <w:pPr>
-        <w:pStyle w:val="Descripcin"/>
-        <w:keepNext/>
-        <w:jc w:val="center"/>
-      </w:pPr>
-      <w:bookmarkStart w:id="125" w:name="_Ref229050778"/>
-      <w:bookmarkStart w:id="126" w:name="_Toc229049301"/>
-      <w:bookmarkStart w:id="127" w:name="_Ref229050770"/>
-      <w:r>
-        <w:t xml:space="preserve">Figura </w:t>
-      </w:r>
-      <w:fldSimple w:instr=" SEQ Figura \* ARABIC ">
-        <w:r>
-          <w:rPr>
-            <w:noProof/>
-          </w:rPr>
-          <w:t>17</w:t>
-        </w:r>
-      </w:fldSimple>
+        <w:ind w:firstLine="360"/>
+        <w:rPr>
+          <w:szCs w:val="22"/>
+        </w:rPr>
+      </w:pPr>
+      <w:bookmarkStart w:id="124" w:name="_Hlk209524998"/>
+      <w:r>
+        <w:rPr>
+          <w:szCs w:val="22"/>
+        </w:rPr>
+        <w:t xml:space="preserve">En este reporte se describen los trabajos realizados dentro del Contrato No. 658225821 “Servicio de Medición y Análisis Metoceánicos del Golfo de México” celebrado entre PEMEX Exploración y Extracción y el consorcio All Solutions de México S. A. de C. V. (ASM) y el Centro de Investigación Científica y de Educación Superior de Ensenada (CICESE), relacionados con el concepto </w:t>
+      </w:r>
       <w:bookmarkEnd w:id="124"/>
-      <w:bookmarkEnd w:id="125"/>
-      <w:r>
-        <w:t xml:space="preserve">. </w:t>
-      </w:r>
-      <w:r>
-        <w:t>&lt;&lt;</w:t>
-      </w:r>
-      <w:proofErr w:type="spellStart"/>
-      <w:r>
-        <w:t>pie_</w:t>
-      </w:r>
-      <w:r>
-        <w:t>esquema</w:t>
-      </w:r>
-      <w:r>
-        <w:t>_de_sonda_oceanografica</w:t>
-      </w:r>
-      <w:proofErr w:type="spellEnd"/>
-      <w:r>
-        <w:t xml:space="preserve"> &gt;&gt;</w:t>
-      </w:r>
-      <w:r>
-        <w:t>.</w:t>
-      </w:r>
-      <w:bookmarkEnd w:id="126"/>
-      <w:bookmarkEnd w:id="127"/>
-    </w:p>
-    <w:p/>
-    <w:p>
-      <w:pPr>
-        <w:jc w:val="center"/>
-      </w:pPr>
-    </w:p>
-    <w:p>
-      <w:pPr>
-        <w:jc w:val="center"/>
-      </w:pPr>
-      <w:bookmarkStart w:id="128" w:name="_Toc229049307"/>
-      <w:r>
-        <w:t>.</w:t>
-      </w:r>
-      <w:bookmarkEnd w:id="128"/>
-      <w:r>
-        <w:br w:type="page"/>
-      </w:r>
-    </w:p>
-    <w:p>
-      <w:pPr>
-        <w:pStyle w:val="Ttulo1"/>
-        <w:rPr>
-          <w:rStyle w:val="Title1"/>
-        </w:rPr>
-      </w:pPr>
-      <w:bookmarkStart w:id="129" w:name="_Ref223695225"/>
-      <w:bookmarkStart w:id="130" w:name="_Toc229049278"/>
-      <w:r>
-        <w:rPr>
-          <w:rStyle w:val="Title1"/>
-        </w:rPr>
-        <w:lastRenderedPageBreak/>
-        <w:t>TELEMETRÍA, R</w:t>
-      </w:r>
-      <w:r>
-        <w:rPr>
-          <w:rStyle w:val="Title1"/>
-        </w:rPr>
-        <w:t xml:space="preserve">ECEPCIÓN Y ALMACENAMIENTO DE DATOS </w:t>
-      </w:r>
-      <w:bookmarkEnd w:id="122"/>
-      <w:r>
-        <w:rPr>
-          <w:rStyle w:val="Title1"/>
-        </w:rPr>
-        <w:t>PREVIOS</w:t>
-      </w:r>
-      <w:r>
-        <w:rPr>
-          <w:rStyle w:val="Title1"/>
-        </w:rPr>
-        <w:t xml:space="preserve"> AL DESPLIEGUE</w:t>
-      </w:r>
-      <w:r>
-        <w:rPr>
-          <w:rStyle w:val="Title1"/>
-        </w:rPr>
-        <w:t xml:space="preserve"> DE LA SONDA</w:t>
-      </w:r>
-      <w:bookmarkEnd w:id="123"/>
-      <w:bookmarkEnd w:id="129"/>
-      <w:r>
-        <w:rPr>
-          <w:rStyle w:val="Title1"/>
-        </w:rPr>
-        <w:t>.</w:t>
-      </w:r>
-      <w:bookmarkEnd w:id="130"/>
-    </w:p>
-    <w:p>
-      <w:pPr>
-        <w:ind w:firstLine="360"/>
-        <w:rPr>
-          <w:rFonts w:cs="Arial"/>
-        </w:rPr>
-      </w:pPr>
-      <w:r>
-        <w:rPr>
-          <w:rFonts w:cs="Arial"/>
-        </w:rPr>
-        <w:t xml:space="preserve">Antes de desplegar las sondas </w:t>
-      </w:r>
-      <w:r>
-        <w:rPr>
-          <w:rFonts w:cs="Arial"/>
-        </w:rPr>
-        <w:t>oceanográficas</w:t>
-      </w:r>
-      <w:r>
-        <w:rPr>
-          <w:rFonts w:cs="Arial"/>
-        </w:rPr>
-        <w:t xml:space="preserve"> se realizaron pruebas </w:t>
-      </w:r>
-      <w:r>
-        <w:rPr>
-          <w:rFonts w:cs="Arial"/>
-        </w:rPr>
-        <w:t xml:space="preserve">en el laboratorio </w:t>
-      </w:r>
-      <w:r>
-        <w:rPr>
-          <w:rFonts w:cs="Arial"/>
-        </w:rPr>
-        <w:t xml:space="preserve">para garantizar el correcto funcionamiento de </w:t>
-      </w:r>
-      <w:r>
-        <w:rPr>
-          <w:rFonts w:cs="Arial"/>
-        </w:rPr>
-        <w:t>las mismas</w:t>
-      </w:r>
-      <w:r>
-        <w:rPr>
-          <w:rFonts w:cs="Arial"/>
-        </w:rPr>
-        <w:t xml:space="preserve">. Una vez que las sondas </w:t>
-      </w:r>
-      <w:r>
-        <w:rPr>
-          <w:rFonts w:cs="Arial"/>
-        </w:rPr>
-        <w:t>estuvieron</w:t>
-      </w:r>
-      <w:r>
-        <w:rPr>
-          <w:rFonts w:cs="Arial"/>
-        </w:rPr>
-        <w:t xml:space="preserve"> ensambladas y selladas, éstas se </w:t>
-      </w:r>
-      <w:r>
-        <w:rPr>
-          <w:rFonts w:cs="Arial"/>
-        </w:rPr>
-        <w:t>encendieron</w:t>
-      </w:r>
-      <w:r>
-        <w:rPr>
-          <w:rFonts w:cs="Arial"/>
-        </w:rPr>
-        <w:t xml:space="preserve"> para comprobar que el sistema de telemetría, recepción y almacenamiento de </w:t>
-      </w:r>
-      <w:r>
-        <w:rPr>
-          <w:rFonts w:cs="Arial"/>
-        </w:rPr>
-        <w:t xml:space="preserve">datos </w:t>
-      </w:r>
-      <w:r>
-        <w:rPr>
-          <w:rFonts w:cs="Arial"/>
-        </w:rPr>
-        <w:t>funcion</w:t>
-      </w:r>
-      <w:r>
-        <w:rPr>
-          <w:rFonts w:cs="Arial"/>
-        </w:rPr>
-        <w:t>ara</w:t>
-      </w:r>
-      <w:r>
-        <w:rPr>
-          <w:rFonts w:cs="Arial"/>
-        </w:rPr>
-        <w:t xml:space="preserve"> correctamente. </w:t>
-      </w:r>
-    </w:p>
-    <w:p>
-      <w:pPr>
-        <w:ind w:firstLine="360"/>
-        <w:rPr>
-          <w:rFonts w:cs="Arial"/>
-        </w:rPr>
-      </w:pPr>
-    </w:p>
-    <w:p>
-      <w:pPr>
-        <w:ind w:firstLine="360"/>
-        <w:rPr>
-          <w:szCs w:val="22"/>
-        </w:rPr>
-      </w:pPr>
-      <w:r>
-        <w:rPr>
-          <w:rFonts w:cs="Arial"/>
-        </w:rPr>
-        <w:t>Durante las primeras 24 horas, las sondas se mantuvieron en pruebas de telemetría y carga de energía, con el objetivo de verificar la correcta transmisión y almacenamiento de la información, así como el adecuado almacenamiento de energía solar en las baterías. La frecuencia de comunicación de la sonda está configurada para realizarse cada media hora; es decir, en ese intervalo la sonda se comunica con el satélite, el cual envía la información a los servidores de ASM-CICESE asignados al proyecto. En dichos servidores se almacenan los mensajes con el estado de la sonda y los datos medidos correspondientes a ese intervalo de tiempo</w:t>
-      </w:r>
-      <w:r>
-        <w:rPr>
-          <w:szCs w:val="22"/>
-        </w:rPr>
-        <w:t>.</w:t>
-      </w:r>
-    </w:p>
-    <w:p>
-      <w:pPr>
-        <w:ind w:firstLine="360"/>
-        <w:rPr>
-          <w:rFonts w:cs="Arial"/>
-        </w:rPr>
-      </w:pPr>
-    </w:p>
-    <w:p>
-      <w:pPr>
-        <w:ind w:firstLine="360"/>
-        <w:rPr>
-          <w:rFonts w:cs="Arial"/>
-        </w:rPr>
-      </w:pPr>
-      <w:r>
-        <w:rPr>
-          <w:rFonts w:cs="Arial"/>
-        </w:rPr>
-        <w:t>La información enviada por las sondas está</w:t>
-      </w:r>
-      <w:r>
-        <w:rPr>
-          <w:rFonts w:cs="Arial"/>
-        </w:rPr>
-        <w:t xml:space="preserve"> </w:t>
-      </w:r>
-      <w:r>
-        <w:rPr>
-          <w:rFonts w:cs="Arial"/>
-        </w:rPr>
-        <w:t>compuesta</w:t>
-      </w:r>
-      <w:r>
-        <w:rPr>
-          <w:rFonts w:cs="Arial"/>
-        </w:rPr>
-        <w:t xml:space="preserve"> por: </w:t>
-      </w:r>
-      <w:r>
-        <w:rPr>
-          <w:rFonts w:cs="Arial"/>
-        </w:rPr>
-        <w:t>vector</w:t>
-      </w:r>
-      <w:r>
-        <w:rPr>
-          <w:rFonts w:cs="Arial"/>
-        </w:rPr>
-        <w:t xml:space="preserve"> de tiempo, posición (latitud y longitud</w:t>
-      </w:r>
-      <w:r>
-        <w:rPr>
-          <w:rFonts w:cs="Arial"/>
-        </w:rPr>
-        <w:t>, grados decimales</w:t>
-      </w:r>
-      <w:r>
-        <w:rPr>
-          <w:rFonts w:cs="Arial"/>
-        </w:rPr>
-        <w:t>), velocidad</w:t>
-      </w:r>
-      <w:r>
-        <w:rPr>
-          <w:rFonts w:cs="Arial"/>
-        </w:rPr>
-        <w:t xml:space="preserve"> (m/s)</w:t>
-      </w:r>
-      <w:r>
-        <w:rPr>
-          <w:rFonts w:cs="Arial"/>
-        </w:rPr>
-        <w:t>, distancia recorrida</w:t>
-      </w:r>
-      <w:r>
-        <w:rPr>
-          <w:rFonts w:cs="Arial"/>
-        </w:rPr>
-        <w:t xml:space="preserve"> (m)</w:t>
-      </w:r>
-      <w:r>
-        <w:rPr>
-          <w:rFonts w:cs="Arial"/>
-        </w:rPr>
-        <w:t>, dirección del desplazamiento (grados), dirección del desplazamiento (</w:t>
-      </w:r>
-      <w:r>
-        <w:rPr>
-          <w:rFonts w:cs="Arial"/>
-        </w:rPr>
-        <w:t xml:space="preserve">cadena de </w:t>
-      </w:r>
-      <w:r>
-        <w:rPr>
-          <w:rFonts w:cs="Arial"/>
-        </w:rPr>
-        <w:t>texto), temperatura</w:t>
-      </w:r>
-      <w:r>
-        <w:rPr>
-          <w:rFonts w:cs="Arial"/>
-        </w:rPr>
-        <w:t xml:space="preserve"> </w:t>
-      </w:r>
-      <w:r>
-        <w:rPr>
-          <w:rFonts w:cs="Arial"/>
-        </w:rPr>
-        <w:t xml:space="preserve">sensor primario </w:t>
-      </w:r>
-      <w:r>
-        <w:rPr>
-          <w:rFonts w:cs="Arial"/>
-        </w:rPr>
-        <w:t>(grados centígrados)</w:t>
-      </w:r>
-      <w:r>
-        <w:rPr>
-          <w:rFonts w:cs="Arial"/>
-        </w:rPr>
-        <w:t>, temperatura sensor secundario (grados centígrados), aceleraciones horizontales y verticales en m/s</w:t>
-      </w:r>
-      <w:r>
-        <w:rPr>
-          <w:rFonts w:cs="Arial"/>
-          <w:vertAlign w:val="superscript"/>
-        </w:rPr>
-        <w:t>2</w:t>
-      </w:r>
-      <w:r>
-        <w:rPr>
-          <w:rFonts w:cs="Arial"/>
-        </w:rPr>
-        <w:t xml:space="preserve"> y voltaje</w:t>
-      </w:r>
-      <w:r>
-        <w:rPr>
-          <w:rFonts w:cs="Arial"/>
-        </w:rPr>
-        <w:t xml:space="preserve"> (voltios).</w:t>
-      </w:r>
-      <w:r>
-        <w:rPr>
-          <w:rFonts w:cs="Arial"/>
-        </w:rPr>
-        <w:t xml:space="preserve"> </w:t>
-      </w:r>
-      <w:r>
-        <w:rPr>
-          <w:rFonts w:cs="Arial"/>
-        </w:rPr>
-        <w:t xml:space="preserve">La evidencia de la información de las primeras 24 horas de transmisión de cada sonda se encuentra en el </w:t>
-      </w:r>
-      <w:r>
-        <w:rPr>
-          <w:rFonts w:cs="Arial"/>
-        </w:rPr>
-        <w:fldChar w:fldCharType="begin"/>
-      </w:r>
-      <w:r>
-        <w:rPr>
-          <w:rFonts w:cs="Arial"/>
-        </w:rPr>
-        <w:instrText xml:space="preserve"> REF _Ref221185985 \h </w:instrText>
-      </w:r>
-      <w:r>
-        <w:rPr>
-          <w:rFonts w:cs="Arial"/>
-        </w:rPr>
-        <w:instrText xml:space="preserve"> \* MERGEFORMAT </w:instrText>
-      </w:r>
-      <w:r>
-        <w:rPr>
-          <w:rFonts w:cs="Arial"/>
-        </w:rPr>
-      </w:r>
-      <w:r>
-        <w:rPr>
-          <w:rFonts w:cs="Arial"/>
-        </w:rPr>
-        <w:fldChar w:fldCharType="separate"/>
-      </w:r>
-      <w:r>
-        <w:rPr>
-          <w:rStyle w:val="Title1"/>
-        </w:rPr>
-        <w:t>ANEXO 2: PRUEBAS DE TRANSMISIÓN PREVIAS AL DESPLIEGUE</w:t>
-      </w:r>
-      <w:r>
-        <w:rPr>
-          <w:rFonts w:cs="Arial"/>
-        </w:rPr>
-        <w:fldChar w:fldCharType="end"/>
-      </w:r>
-      <w:r>
-        <w:rPr>
-          <w:rFonts w:cs="Arial"/>
-        </w:rPr>
-        <w:t xml:space="preserve">. </w:t>
-      </w:r>
-      <w:r>
-        <w:rPr>
-          <w:rFonts w:cs="Arial"/>
-        </w:rPr>
-        <w:t>A continuación</w:t>
-      </w:r>
-      <w:r>
-        <w:rPr>
-          <w:rFonts w:cs="Arial"/>
-        </w:rPr>
-        <w:t>,</w:t>
-      </w:r>
-      <w:r>
-        <w:rPr>
-          <w:rFonts w:cs="Arial"/>
-        </w:rPr>
-        <w:t xml:space="preserve"> se muestra</w:t>
-      </w:r>
-      <w:r>
-        <w:rPr>
-          <w:rFonts w:cs="Arial"/>
-        </w:rPr>
-        <w:t>n</w:t>
-      </w:r>
-      <w:r>
-        <w:rPr>
-          <w:rFonts w:cs="Arial"/>
-        </w:rPr>
-        <w:t xml:space="preserve"> la</w:t>
-      </w:r>
-      <w:r>
-        <w:rPr>
-          <w:rFonts w:cs="Arial"/>
-        </w:rPr>
-        <w:t>s</w:t>
-      </w:r>
-      <w:r>
-        <w:rPr>
-          <w:rFonts w:cs="Arial"/>
-        </w:rPr>
-        <w:t xml:space="preserve"> serie</w:t>
-      </w:r>
-      <w:r>
-        <w:rPr>
-          <w:rFonts w:cs="Arial"/>
-        </w:rPr>
-        <w:t>s</w:t>
-      </w:r>
-      <w:r>
-        <w:rPr>
-          <w:rFonts w:cs="Arial"/>
-        </w:rPr>
-        <w:t xml:space="preserve"> de tiempo</w:t>
-      </w:r>
-      <w:r>
-        <w:rPr>
-          <w:rFonts w:cs="Arial"/>
-        </w:rPr>
-        <w:t xml:space="preserve"> </w:t>
-      </w:r>
-      <w:r>
-        <w:rPr>
-          <w:rFonts w:cs="Arial"/>
-        </w:rPr>
-        <w:t>con el</w:t>
-      </w:r>
-      <w:r>
-        <w:rPr>
-          <w:rFonts w:cs="Arial"/>
-        </w:rPr>
-        <w:t xml:space="preserve"> estado de las baterías</w:t>
-      </w:r>
-      <w:r>
-        <w:rPr>
-          <w:rFonts w:cs="Arial"/>
-        </w:rPr>
-        <w:t xml:space="preserve"> </w:t>
-      </w:r>
-      <w:r>
-        <w:rPr>
-          <w:rFonts w:cs="Arial"/>
-        </w:rPr>
-        <w:t xml:space="preserve">durante las pruebas de funcionamiento </w:t>
-      </w:r>
-      <w:r>
-        <w:rPr>
-          <w:rFonts w:cs="Arial"/>
-        </w:rPr>
-        <w:t>para cada una de las sondas</w:t>
-      </w:r>
-      <w:r>
-        <w:rPr>
-          <w:rFonts w:cs="Arial"/>
-        </w:rPr>
-        <w:t xml:space="preserve"> </w:t>
-      </w:r>
-      <w:r>
-        <w:rPr>
-          <w:rFonts w:cs="Arial"/>
-        </w:rPr>
-        <w:t xml:space="preserve">oceanográficas </w:t>
-      </w:r>
-      <w:r>
-        <w:rPr>
-          <w:rFonts w:cs="Arial"/>
-        </w:rPr>
-        <w:t>(</w:t>
-      </w:r>
-      <w:r>
-        <w:rPr>
-          <w:rFonts w:cs="Arial"/>
-        </w:rPr>
-        <w:fldChar w:fldCharType="begin"/>
-      </w:r>
-      <w:r>
-        <w:rPr>
-          <w:rFonts w:cs="Arial"/>
-        </w:rPr>
-        <w:instrText xml:space="preserve"> REF _Ref221810327 \h </w:instrText>
-      </w:r>
-      <w:r>
-        <w:rPr>
-          <w:rFonts w:cs="Arial"/>
-        </w:rPr>
-        <w:instrText xml:space="preserve"> \* MERGEFORMAT </w:instrText>
-      </w:r>
-      <w:r>
-        <w:rPr>
-          <w:rFonts w:cs="Arial"/>
-        </w:rPr>
-      </w:r>
-      <w:r>
-        <w:rPr>
-          <w:rFonts w:cs="Arial"/>
-        </w:rPr>
-        <w:fldChar w:fldCharType="separate"/>
-      </w:r>
-      <w:r>
-        <w:rPr>
-          <w:rFonts w:cs="Arial"/>
-        </w:rPr>
-        <w:t>Figura 24</w:t>
-      </w:r>
-      <w:r>
-        <w:rPr>
-          <w:rFonts w:cs="Arial"/>
-        </w:rPr>
-        <w:fldChar w:fldCharType="end"/>
-      </w:r>
-      <w:r>
-        <w:rPr>
-          <w:rFonts w:cs="Arial"/>
-        </w:rPr>
-        <w:t xml:space="preserve"> y </w:t>
-      </w:r>
-      <w:r>
-        <w:rPr>
-          <w:rFonts w:cs="Arial"/>
-        </w:rPr>
-        <w:fldChar w:fldCharType="begin"/>
-      </w:r>
-      <w:r>
-        <w:rPr>
-          <w:rFonts w:cs="Arial"/>
-        </w:rPr>
-        <w:instrText xml:space="preserve"> REF _Ref228962900 \h </w:instrText>
-      </w:r>
-      <w:r>
-        <w:rPr>
-          <w:rFonts w:cs="Arial"/>
-        </w:rPr>
-      </w:r>
-      <w:r>
-        <w:rPr>
-          <w:rFonts w:cs="Arial"/>
-        </w:rPr>
-        <w:fldChar w:fldCharType="separate"/>
-      </w:r>
-      <w:r>
-        <w:t xml:space="preserve">Figura </w:t>
-      </w:r>
-      <w:r>
-        <w:rPr>
-          <w:noProof/>
-        </w:rPr>
-        <w:t>25</w:t>
-      </w:r>
-      <w:r>
-        <w:rPr>
-          <w:rFonts w:cs="Arial"/>
-        </w:rPr>
-        <w:fldChar w:fldCharType="end"/>
-      </w:r>
-      <w:r>
-        <w:rPr>
-          <w:rFonts w:cs="Arial"/>
-        </w:rPr>
-        <w:t>)</w:t>
-      </w:r>
-      <w:r>
-        <w:rPr>
-          <w:rFonts w:cs="Arial"/>
-        </w:rPr>
-        <w:t xml:space="preserve">, y los mapas de las posiciones </w:t>
-      </w:r>
-      <w:r>
-        <w:rPr>
-          <w:rFonts w:cs="Arial"/>
-        </w:rPr>
-        <w:t>transmitidas (</w:t>
-      </w:r>
-      <w:r>
-        <w:rPr>
-          <w:rFonts w:cs="Arial"/>
-        </w:rPr>
-        <w:fldChar w:fldCharType="begin"/>
-      </w:r>
-      <w:r>
-        <w:rPr>
-          <w:rFonts w:cs="Arial"/>
-        </w:rPr>
-        <w:instrText xml:space="preserve"> REF _Ref221810355 \h </w:instrText>
-      </w:r>
-      <w:r>
-        <w:rPr>
-          <w:rFonts w:cs="Arial"/>
-        </w:rPr>
-        <w:instrText xml:space="preserve"> \* MERGEFORMAT </w:instrText>
-      </w:r>
-      <w:r>
-        <w:rPr>
-          <w:rFonts w:cs="Arial"/>
-        </w:rPr>
-      </w:r>
-      <w:r>
-        <w:rPr>
-          <w:rFonts w:cs="Arial"/>
-        </w:rPr>
-        <w:fldChar w:fldCharType="separate"/>
-      </w:r>
-      <w:r>
-        <w:rPr>
-          <w:rFonts w:cs="Arial"/>
-        </w:rPr>
-        <w:t>Figura 26</w:t>
-      </w:r>
-      <w:r>
-        <w:rPr>
-          <w:rFonts w:cs="Arial"/>
-        </w:rPr>
-        <w:fldChar w:fldCharType="end"/>
-      </w:r>
-      <w:r>
-        <w:rPr>
-          <w:rFonts w:cs="Arial"/>
-        </w:rPr>
-        <w:t xml:space="preserve">) </w:t>
-      </w:r>
-      <w:r>
-        <w:rPr>
-          <w:rFonts w:cs="Arial"/>
-        </w:rPr>
-        <w:t>durante las pruebas en laboratorio</w:t>
-      </w:r>
-      <w:r>
-        <w:rPr>
-          <w:rFonts w:cs="Arial"/>
-        </w:rPr>
-        <w:t>.</w:t>
-      </w:r>
-    </w:p>
-    <w:p>
-      <w:pPr>
-        <w:spacing w:line="240" w:lineRule="auto"/>
-        <w:jc w:val="left"/>
-      </w:pPr>
-    </w:p>
-    <w:p>
-      <w:pPr>
-        <w:pStyle w:val="Textoindependiente"/>
-        <w:keepNext/>
-        <w:jc w:val="center"/>
-      </w:pPr>
-      <w:r>
-        <w:rPr>
-          <w:noProof/>
-        </w:rPr>
-        <w:t>&lt;&lt;fig_pruebas_baterias&gt;&gt;</w:t>
-      </w:r>
-    </w:p>
-    <w:p>
-      <w:pPr>
-        <w:pStyle w:val="Descripcin"/>
-        <w:jc w:val="center"/>
-      </w:pPr>
-      <w:bookmarkStart w:id="131" w:name="_Ref221810327"/>
-      <w:bookmarkStart w:id="132" w:name="_Toc229049308"/>
-      <w:r>
-        <w:t xml:space="preserve">Figura </w:t>
-      </w:r>
-      <w:fldSimple w:instr=" SEQ Figura \* ARABIC ">
-        <w:r>
-          <w:rPr>
-            <w:noProof/>
-          </w:rPr>
-          <w:t>24</w:t>
-        </w:r>
-      </w:fldSimple>
-      <w:bookmarkEnd w:id="131"/>
-      <w:r>
-        <w:t xml:space="preserve">. </w:t>
-      </w:r>
-      <w:bookmarkEnd w:id="132"/>
-      <w:r>
-        <w:rPr>
-          <w:rStyle w:val="DescripcinCar"/>
-        </w:rPr>
-        <w:t>&lt;&lt;</w:t>
-      </w:r>
-      <w:proofErr w:type="spellStart"/>
-      <w:r>
-        <w:rPr>
-          <w:rStyle w:val="DescripcinCar"/>
-        </w:rPr>
-        <w:t>pie_pruebas_baterias</w:t>
-      </w:r>
-      <w:proofErr w:type="spellEnd"/>
-      <w:r>
-        <w:rPr>
-          <w:rStyle w:val="DescripcinCar"/>
-        </w:rPr>
-        <w:t>&gt;&gt;</w:t>
-      </w:r>
-    </w:p>
-    <w:p>
-      <w:pPr>
-        <w:spacing w:line="240" w:lineRule="auto"/>
-      </w:pPr>
-    </w:p>
-    <w:p>
-      <w:pPr>
-        <w:spacing w:line="240" w:lineRule="auto"/>
-        <w:jc w:val="center"/>
-      </w:pPr>
-    </w:p>
-    <w:p>
-      <w:pPr>
-        <w:spacing w:line="240" w:lineRule="auto"/>
-        <w:jc w:val="center"/>
-      </w:pPr>
-      <w:r>
-        <w:t>&lt;&lt;</w:t>
-      </w:r>
-      <w:proofErr w:type="spellStart"/>
-      <w:r>
-        <w:t>fig_ubicacion_durante_pruebas</w:t>
-      </w:r>
-      <w:proofErr w:type="spellEnd"/>
-      <w:r>
-        <w:t>&gt;&gt;</w:t>
-      </w:r>
-    </w:p>
-    <w:p>
-      <w:pPr>
-        <w:spacing w:line="240" w:lineRule="auto"/>
-        <w:jc w:val="center"/>
-      </w:pPr>
-      <w:bookmarkStart w:id="133" w:name="_Ref221810355"/>
-      <w:bookmarkStart w:id="134" w:name="_Toc229049310"/>
-      <w:r>
-        <w:t xml:space="preserve">Figura </w:t>
-      </w:r>
-      <w:fldSimple w:instr=" SEQ Figura \* ARABIC ">
-        <w:r>
-          <w:rPr>
-            <w:noProof/>
-          </w:rPr>
-          <w:t>26</w:t>
-        </w:r>
-      </w:fldSimple>
-      <w:bookmarkEnd w:id="133"/>
-      <w:r>
-        <w:t>.</w:t>
-      </w:r>
-      <w:r>
-        <w:t xml:space="preserve"> </w:t>
-      </w:r>
-      <w:bookmarkEnd w:id="134"/>
-      <w:r>
-        <w:t>&lt;&lt;</w:t>
-      </w:r>
-      <w:proofErr w:type="spellStart"/>
-      <w:r>
-        <w:t>pie_ubicacion_durante_pruebas</w:t>
-      </w:r>
-      <w:proofErr w:type="spellEnd"/>
-      <w:r>
-        <w:t>&gt;&gt;</w:t>
-      </w:r>
-    </w:p>
-    <w:p>
-      <w:pPr>
-        <w:pStyle w:val="Descripcin"/>
-        <w:jc w:val="center"/>
-      </w:pPr>
-    </w:p>
-    <w:p>
-      <w:pPr>
-        <w:pStyle w:val="Textoindependiente"/>
-        <w:rPr>
-          <w:lang w:eastAsia="es-MX"/>
-        </w:rPr>
-      </w:pPr>
-    </w:p>
-    <w:p>
-      <w:pPr>
-        <w:pStyle w:val="Textoindependiente"/>
-        <w:ind w:firstLine="349"/>
-        <w:rPr>
-          <w:rFonts w:cs="Arial"/>
-          <w:lang w:eastAsia="es-MX"/>
-        </w:rPr>
-      </w:pPr>
-      <w:r>
-        <w:rPr>
-          <w:lang w:eastAsia="es-MX"/>
-        </w:rPr>
-        <w:lastRenderedPageBreak/>
-        <w:t xml:space="preserve">El almacenamiento de la información se realiza en los servidores del consorcio ASM-CICESE y es resguardada en duplicado para evitar la pérdida de información. Asimismo, la información se despliega en el sitio WEB del proyecto </w:t>
-      </w:r>
-      <w:hyperlink r:id="rId17" w:history="1">
-        <w:r>
-          <w:rPr>
-            <w:rStyle w:val="Hipervnculo"/>
-            <w:rFonts w:ascii="Microsoft Sans Serif" w:hAnsi="Microsoft Sans Serif"/>
-            <w:sz w:val="22"/>
-            <w:szCs w:val="22"/>
-            <w:lang w:eastAsia="es-MX"/>
-          </w:rPr>
-          <w:t>https://www.boyas.asm-cicese.mx</w:t>
-        </w:r>
-      </w:hyperlink>
-      <w:r>
-        <w:rPr>
-          <w:szCs w:val="22"/>
-          <w:lang w:eastAsia="es-MX"/>
-        </w:rPr>
-        <w:t xml:space="preserve"> y puede visualizarse desde el momento en que la boya es desplegada hasta el momento en que se pierde comunicación con la misma. </w:t>
-      </w:r>
-      <w:r>
-        <w:rPr>
-          <w:rFonts w:cs="Arial"/>
-        </w:rPr>
-        <w:t xml:space="preserve">Para ingresar al sitio web el </w:t>
-      </w:r>
-      <w:r>
-        <w:rPr>
-          <w:rFonts w:cs="Microsoft Sans Serif"/>
-        </w:rPr>
-        <w:t xml:space="preserve">usuario debe contar con el nombre de usuario y la contraseña asignada por el personal del consorcio ASM-CICESE. </w:t>
-      </w:r>
-    </w:p>
-    <w:p>
-      <w:pPr>
-        <w:spacing w:line="240" w:lineRule="auto"/>
-        <w:jc w:val="left"/>
-      </w:pPr>
-      <w:r>
-        <w:br w:type="page"/>
-      </w:r>
-    </w:p>
-    <w:p>
-      <w:pPr>
-        <w:pStyle w:val="Ttulo1"/>
-        <w:rPr>
-          <w:rStyle w:val="Title1"/>
-        </w:rPr>
-      </w:pPr>
-      <w:bookmarkStart w:id="135" w:name="_Toc229049279"/>
-      <w:r>
-        <w:rPr>
-          <w:rStyle w:val="Title1"/>
-        </w:rPr>
-        <w:lastRenderedPageBreak/>
-        <w:t>CONCLUSION</w:t>
-      </w:r>
-      <w:bookmarkStart w:id="136" w:name="_Toc239048372"/>
-      <w:bookmarkStart w:id="137" w:name="_Toc239003245"/>
-      <w:bookmarkStart w:id="138" w:name="_Toc238907546"/>
-      <w:bookmarkStart w:id="139" w:name="_Toc216302232"/>
-      <w:bookmarkStart w:id="140" w:name="_Toc216225393"/>
-      <w:bookmarkStart w:id="141" w:name="_Toc216223757"/>
-      <w:bookmarkStart w:id="142" w:name="_Toc216223366"/>
-      <w:bookmarkStart w:id="143" w:name="_Toc215712797"/>
-      <w:bookmarkStart w:id="144" w:name="_Toc215682794"/>
-      <w:bookmarkStart w:id="145" w:name="_Toc215682689"/>
-      <w:bookmarkStart w:id="146" w:name="_Toc215675354"/>
-      <w:bookmarkStart w:id="147" w:name="_Toc215578727"/>
-      <w:bookmarkStart w:id="148" w:name="_Toc215548253"/>
-      <w:bookmarkStart w:id="149" w:name="_Toc215370590"/>
-      <w:bookmarkEnd w:id="136"/>
-      <w:bookmarkEnd w:id="137"/>
-      <w:bookmarkEnd w:id="138"/>
-      <w:bookmarkEnd w:id="139"/>
-      <w:bookmarkEnd w:id="140"/>
-      <w:bookmarkEnd w:id="141"/>
-      <w:bookmarkEnd w:id="142"/>
-      <w:bookmarkEnd w:id="143"/>
-      <w:bookmarkEnd w:id="144"/>
-      <w:bookmarkEnd w:id="145"/>
-      <w:bookmarkEnd w:id="146"/>
-      <w:bookmarkEnd w:id="147"/>
-      <w:bookmarkEnd w:id="148"/>
-      <w:bookmarkEnd w:id="149"/>
-      <w:r>
-        <w:rPr>
-          <w:rStyle w:val="Title1"/>
-        </w:rPr>
-        <w:t>ES</w:t>
-      </w:r>
-      <w:bookmarkEnd w:id="135"/>
-    </w:p>
-    <w:p>
-      <w:pPr>
-        <w:ind w:firstLine="360"/>
-        <w:rPr>
-          <w:szCs w:val="22"/>
-        </w:rPr>
-      </w:pPr>
-      <w:bookmarkStart w:id="150" w:name="_Hlk209524998"/>
-      <w:r>
-        <w:rPr>
-          <w:szCs w:val="22"/>
-        </w:rPr>
-        <w:t xml:space="preserve">En este reporte se describen los trabajos realizados dentro del Contrato No. 658225821 “Servicio de Medición y Análisis Metoceánicos del Golfo de México” celebrado entre PEMEX Exploración y Extracción y el consorcio All Solutions de México S. A. de C. V. (ASM) y el Centro de Investigación Científica y de Educación Superior de Ensenada (CICESE), relacionados con el concepto </w:t>
-      </w:r>
-      <w:bookmarkEnd w:id="150"/>
       <w:r>
         <w:rPr>
           <w:i/>
@@ -14689,14 +13808,6 @@
         </w:rPr>
         <w:t>PEMEX-ASM-CICESE-658225821-</w:t>
       </w:r>
-    </w:p>
-    <w:p>
-      <w:pPr>
-        <w:ind w:firstLine="360"/>
-        <w:rPr>
-          <w:szCs w:val="22"/>
-        </w:rPr>
-      </w:pPr>
       <w:r>
         <w:rPr>
           <w:b/>
@@ -14866,7 +13977,7 @@
           <w:szCs w:val="22"/>
         </w:rPr>
       </w:pPr>
-      <w:bookmarkStart w:id="151" w:name="_Hlk209525103"/>
+      <w:bookmarkStart w:id="125" w:name="_Hlk209525103"/>
       <w:r>
         <w:rPr>
           <w:szCs w:val="22"/>
@@ -14925,7 +14036,7 @@
         <w:t>Se describieron las pruebas de funcionamiento realizadas a las sondas para verificar el buen funcionamiento previo al despliegue.</w:t>
       </w:r>
     </w:p>
-    <w:bookmarkEnd w:id="151"/>
+    <w:bookmarkEnd w:id="125"/>
     <w:p>
       <w:pPr>
         <w:rPr>
@@ -14997,14 +14108,14 @@
         </w:rPr>
         <w:t xml:space="preserve"> se trasmitieran por telemetría y se recibieran por los servidores </w:t>
       </w:r>
-      <w:bookmarkStart w:id="152" w:name="_Hlk209525171"/>
+      <w:bookmarkStart w:id="126" w:name="_Hlk209525171"/>
       <w:r>
         <w:rPr>
           <w:szCs w:val="22"/>
         </w:rPr>
         <w:t xml:space="preserve">en tierra </w:t>
       </w:r>
-      <w:bookmarkEnd w:id="152"/>
+      <w:bookmarkEnd w:id="126"/>
       <w:r>
         <w:rPr>
           <w:szCs w:val="22"/>
@@ -15022,12 +14133,12 @@
       <w:pPr>
         <w:pStyle w:val="Ttulo1"/>
       </w:pPr>
-      <w:bookmarkStart w:id="153" w:name="_Toc229049280"/>
+      <w:bookmarkStart w:id="127" w:name="_Toc229049280"/>
       <w:r>
         <w:lastRenderedPageBreak/>
         <w:t>REFERENCIAS</w:t>
       </w:r>
-      <w:bookmarkEnd w:id="153"/>
+      <w:bookmarkEnd w:id="127"/>
     </w:p>
     <w:p>
       <w:pPr>
@@ -15344,7 +14455,7 @@
                 <w:lang w:val="en-US"/>
               </w:rPr>
             </w:pPr>
-            <w:bookmarkStart w:id="154" w:name="_Hlk218066363"/>
+            <w:bookmarkStart w:id="128" w:name="_Hlk218066363"/>
           </w:p>
           <w:p>
             <w:pPr>
@@ -15369,7 +14480,7 @@
                 <w:rFonts w:cs="Microsoft Sans Serif"/>
               </w:rPr>
             </w:pPr>
-            <w:bookmarkStart w:id="155" w:name="_Hlk121125304"/>
+            <w:bookmarkStart w:id="129" w:name="_Hlk121125304"/>
             <w:r>
               <w:rPr>
                 <w:rFonts w:cs="Microsoft Sans Serif"/>
@@ -15405,8 +14516,8 @@
               <w:t>+52 646 1750500, x27865</w:t>
             </w:r>
           </w:p>
-          <w:bookmarkStart w:id="156" w:name="_Hlk218066398"/>
-          <w:bookmarkEnd w:id="154"/>
+          <w:bookmarkStart w:id="130" w:name="_Hlk218066398"/>
+          <w:bookmarkEnd w:id="128"/>
           <w:p>
             <w:pPr>
               <w:jc w:val="center"/>
@@ -15439,8 +14550,8 @@
               <w:fldChar w:fldCharType="end"/>
             </w:r>
           </w:p>
-          <w:bookmarkEnd w:id="155"/>
-          <w:bookmarkEnd w:id="156"/>
+          <w:bookmarkEnd w:id="129"/>
+          <w:bookmarkEnd w:id="130"/>
           <w:p>
             <w:pPr>
               <w:jc w:val="center"/>
@@ -15476,7 +14587,7 @@
           <w:rStyle w:val="Title1"/>
         </w:rPr>
       </w:pPr>
-      <w:bookmarkStart w:id="157" w:name="_Toc229049281"/>
+      <w:bookmarkStart w:id="131" w:name="_Toc229049281"/>
       <w:r>
         <w:rPr>
           <w:rStyle w:val="Title1"/>
@@ -15484,7 +14595,7 @@
         <w:lastRenderedPageBreak/>
         <w:t>ANEXO 1: PRUEBAS DE FUNCIONAMIENTO PREVIAS AL DESPLIEGUE</w:t>
       </w:r>
-      <w:bookmarkEnd w:id="157"/>
+      <w:bookmarkEnd w:id="131"/>
     </w:p>
     <w:p>
       <w:pPr>
@@ -15605,10 +14716,10 @@
           <w:rStyle w:val="Title1"/>
         </w:rPr>
       </w:pPr>
-      <w:bookmarkStart w:id="158" w:name="_Ref221185985"/>
-      <w:bookmarkStart w:id="159" w:name="_Ref217405568"/>
-      <w:bookmarkStart w:id="160" w:name="_Ref217405581"/>
-      <w:bookmarkStart w:id="161" w:name="_Toc229049282"/>
+      <w:bookmarkStart w:id="132" w:name="_Ref221185985"/>
+      <w:bookmarkStart w:id="133" w:name="_Ref217405568"/>
+      <w:bookmarkStart w:id="134" w:name="_Ref217405581"/>
+      <w:bookmarkStart w:id="135" w:name="_Toc229049282"/>
       <w:r>
         <w:rPr>
           <w:rStyle w:val="Title1"/>
@@ -15646,10 +14757,10 @@
         </w:rPr>
         <w:t xml:space="preserve"> PREVIAS AL DESPLIEGUE</w:t>
       </w:r>
-      <w:bookmarkEnd w:id="158"/>
-      <w:bookmarkEnd w:id="159"/>
-      <w:bookmarkEnd w:id="160"/>
-      <w:bookmarkEnd w:id="161"/>
+      <w:bookmarkEnd w:id="132"/>
+      <w:bookmarkEnd w:id="133"/>
+      <w:bookmarkEnd w:id="134"/>
+      <w:bookmarkEnd w:id="135"/>
     </w:p>
     <w:p>
       <w:pPr>
@@ -15717,83 +14828,19 @@
         <w:rPr>
           <w:rFonts w:ascii="Microsoft Sans Serif" w:hAnsi="Microsoft Sans Serif" w:cs="Microsoft Sans Serif"/>
         </w:rPr>
-        <w:t>fig_pruebas_transmision</w:t>
-      </w:r>
-      <w:proofErr w:type="spellEnd"/>
+        <w:t>fig_pruebas_</w:t>
+      </w:r>
       <w:r>
         <w:rPr>
           <w:rFonts w:ascii="Microsoft Sans Serif" w:hAnsi="Microsoft Sans Serif" w:cs="Microsoft Sans Serif"/>
         </w:rPr>
-        <w:t>&gt;&gt;</w:t>
-      </w:r>
-    </w:p>
-    <w:p>
-      <w:pPr>
-        <w:pStyle w:val="NormalWeb"/>
-        <w:keepNext/>
-        <w:jc w:val="center"/>
+        <w:t>de_</w:t>
+      </w:r>
+      <w:r>
         <w:rPr>
           <w:rFonts w:ascii="Microsoft Sans Serif" w:hAnsi="Microsoft Sans Serif" w:cs="Microsoft Sans Serif"/>
         </w:rPr>
-      </w:pPr>
-      <w:bookmarkStart w:id="162" w:name="_Toc229049311"/>
-      <w:r>
-        <w:rPr>
-          <w:rFonts w:ascii="Microsoft Sans Serif" w:hAnsi="Microsoft Sans Serif" w:cs="Microsoft Sans Serif"/>
-        </w:rPr>
-        <w:t xml:space="preserve">Figura </w:t>
-      </w:r>
-      <w:r>
-        <w:rPr>
-          <w:rFonts w:ascii="Microsoft Sans Serif" w:hAnsi="Microsoft Sans Serif" w:cs="Microsoft Sans Serif"/>
-        </w:rPr>
-        <w:fldChar w:fldCharType="begin"/>
-      </w:r>
-      <w:r>
-        <w:rPr>
-          <w:rFonts w:ascii="Microsoft Sans Serif" w:hAnsi="Microsoft Sans Serif" w:cs="Microsoft Sans Serif"/>
-        </w:rPr>
-        <w:instrText xml:space="preserve"> SEQ Figura \* ARABIC </w:instrText>
-      </w:r>
-      <w:r>
-        <w:rPr>
-          <w:rFonts w:ascii="Microsoft Sans Serif" w:hAnsi="Microsoft Sans Serif" w:cs="Microsoft Sans Serif"/>
-        </w:rPr>
-        <w:fldChar w:fldCharType="separate"/>
-      </w:r>
-      <w:r>
-        <w:rPr>
-          <w:rFonts w:ascii="Microsoft Sans Serif" w:hAnsi="Microsoft Sans Serif" w:cs="Microsoft Sans Serif"/>
-          <w:noProof/>
-        </w:rPr>
-        <w:t>27</w:t>
-      </w:r>
-      <w:r>
-        <w:rPr>
-          <w:rFonts w:ascii="Microsoft Sans Serif" w:hAnsi="Microsoft Sans Serif" w:cs="Microsoft Sans Serif"/>
-          <w:noProof/>
-        </w:rPr>
-        <w:fldChar w:fldCharType="end"/>
-      </w:r>
-      <w:r>
-        <w:rPr>
-          <w:rFonts w:ascii="Microsoft Sans Serif" w:hAnsi="Microsoft Sans Serif" w:cs="Microsoft Sans Serif"/>
-        </w:rPr>
-        <w:t xml:space="preserve">. </w:t>
-      </w:r>
-      <w:bookmarkEnd w:id="162"/>
-      <w:r>
-        <w:rPr>
-          <w:rFonts w:ascii="Microsoft Sans Serif" w:hAnsi="Microsoft Sans Serif" w:cs="Microsoft Sans Serif"/>
-        </w:rPr>
-        <w:t>&lt;&lt;</w:t>
-      </w:r>
-      <w:proofErr w:type="spellStart"/>
-      <w:r>
-        <w:rPr>
-          <w:rFonts w:ascii="Microsoft Sans Serif" w:hAnsi="Microsoft Sans Serif" w:cs="Microsoft Sans Serif"/>
-        </w:rPr>
-        <w:t>pie_pruebas_transmision</w:t>
+        <w:t>transmision</w:t>
       </w:r>
       <w:proofErr w:type="spellEnd"/>
       <w:r>
@@ -16391,9 +15438,9 @@
           <w:rStyle w:val="Title1"/>
         </w:rPr>
       </w:pPr>
-      <w:bookmarkStart w:id="163" w:name="_Ref219907034"/>
-      <w:bookmarkStart w:id="164" w:name="_Ref220316895"/>
-      <w:bookmarkStart w:id="165" w:name="_Toc229049283"/>
+      <w:bookmarkStart w:id="136" w:name="_Ref219907034"/>
+      <w:bookmarkStart w:id="137" w:name="_Ref220316895"/>
+      <w:bookmarkStart w:id="138" w:name="_Toc229049283"/>
       <w:r>
         <w:rPr>
           <w:rStyle w:val="Title1"/>
@@ -16413,9 +15460,9 @@
         </w:rPr>
         <w:t>: PLAN DE CRUCERO</w:t>
       </w:r>
-      <w:bookmarkEnd w:id="163"/>
-      <w:bookmarkEnd w:id="164"/>
-      <w:bookmarkEnd w:id="165"/>
+      <w:bookmarkEnd w:id="136"/>
+      <w:bookmarkEnd w:id="137"/>
+      <w:bookmarkEnd w:id="138"/>
     </w:p>
     <w:p>
       <w:pPr>
@@ -16478,7 +15525,7 @@
           <w:rStyle w:val="Title1"/>
         </w:rPr>
       </w:pPr>
-      <w:bookmarkStart w:id="166" w:name="_Toc229049284"/>
+      <w:bookmarkStart w:id="139" w:name="_Toc229049284"/>
       <w:r>
         <w:rPr>
           <w:rStyle w:val="Title1"/>
@@ -16498,7 +15545,7 @@
         </w:rPr>
         <w:t>: ANEXO FOTOGRÁFICO</w:t>
       </w:r>
-      <w:bookmarkEnd w:id="166"/>
+      <w:bookmarkEnd w:id="139"/>
     </w:p>
     <w:p>
       <w:pPr>
@@ -19397,8 +18444,8 @@
             <w:ind w:hanging="107"/>
             <w:jc w:val="left"/>
           </w:pPr>
-          <w:bookmarkStart w:id="167" w:name="_Hlk218267088"/>
-          <w:bookmarkStart w:id="168" w:name="_Hlk218267089"/>
+          <w:bookmarkStart w:id="140" w:name="_Hlk218267088"/>
+          <w:bookmarkStart w:id="141" w:name="_Hlk218267089"/>
           <w:r>
             <w:rPr>
               <w:noProof/>
@@ -19669,8 +18716,8 @@
         </mc:Fallback>
       </mc:AlternateContent>
     </w:r>
-    <w:bookmarkEnd w:id="167"/>
-    <w:bookmarkEnd w:id="168"/>
+    <w:bookmarkEnd w:id="140"/>
+    <w:bookmarkEnd w:id="141"/>
   </w:p>
 </w:hdr>
 </file>

</xml_diff>

<commit_message>
Add: cambios de plantilla
</commit_message>
<xml_diff>
--- a/crear_documentos/services/doc_101/plantilla.docx
+++ b/crear_documentos/services/doc_101/plantilla.docx
@@ -7025,22 +7025,7 @@
         <w:rPr>
           <w:rFonts w:cs="Arial"/>
         </w:rPr>
-        <w:t xml:space="preserve"> (</w:t>
-      </w:r>
-      <w:r>
-        <w:rPr>
-          <w:rFonts w:cs="Arial"/>
-        </w:rPr>
-        <w:t>&lt;&lt;ref_</w:t>
-      </w:r>
-      <w:r>
-        <w:t>descripcion_arquitectura_1</w:t>
-      </w:r>
-      <w:r>
-        <w:rPr>
-          <w:rFonts w:cs="Arial"/>
-        </w:rPr>
-        <w:t>&gt;&gt;</w:t>
+        <w:t xml:space="preserve"> (&lt;&lt;ref_descripcion_arquictectura_1&gt;&gt;</w:t>
       </w:r>
       <w:r>
         <w:rPr>
@@ -7304,16 +7289,7 @@
         <w:rPr>
           <w:rFonts w:cs="Arial"/>
         </w:rPr>
-        <w:t>&lt;&lt;ref_</w:t>
-      </w:r>
-      <w:r>
-        <w:t>descripcion_arquitectura_1</w:t>
-      </w:r>
-      <w:r>
-        <w:rPr>
-          <w:rFonts w:cs="Arial"/>
-        </w:rPr>
-        <w:t>&gt;&gt;</w:t>
+        <w:t>&lt;&lt;ref_descripcion_arquitectura_1&gt;&gt;</w:t>
       </w:r>
       <w:r>
         <w:rPr>
@@ -7424,13 +7400,6 @@
         <w:rPr>
           <w:rFonts w:cs="Arial"/>
         </w:rPr>
-      </w:pPr>
-    </w:p>
-    <w:p>
-      <w:pPr>
-        <w:keepNext/>
-        <w:ind w:firstLine="360"/>
-        <w:jc w:val="center"/>
       </w:pPr>
     </w:p>
     <w:p>
@@ -7474,6 +7443,7 @@
           <w:b/>
           <w:bCs/>
         </w:rPr>
+        <w:lastRenderedPageBreak/>
         <w:t>Draga de arrastre</w:t>
       </w:r>
     </w:p>
@@ -7502,31 +7472,13 @@
         <w:rPr>
           <w:rFonts w:cs="Arial"/>
         </w:rPr>
+        <w:t xml:space="preserve"> (&lt;&lt;ref_descripcion_arquitectura_2&gt;&gt;)</w:t>
+      </w:r>
+      <w:r>
+        <w:rPr>
+          <w:rFonts w:cs="Arial"/>
+        </w:rPr>
         <w:t xml:space="preserve"> </w:t>
-      </w:r>
-      <w:r>
-        <w:rPr>
-          <w:rFonts w:cs="Arial"/>
-        </w:rPr>
-        <w:t>(</w:t>
-      </w:r>
-      <w:r>
-        <w:rPr>
-          <w:rFonts w:cs="Arial"/>
-        </w:rPr>
-        <w:t>&lt;&lt;ref_</w:t>
-      </w:r>
-      <w:r>
-        <w:t>descripcion_arquitectura_2</w:t>
-      </w:r>
-      <w:r>
-        <w:t>&gt;&gt;</w:t>
-      </w:r>
-      <w:r>
-        <w:rPr>
-          <w:rFonts w:cs="Arial"/>
-        </w:rPr>
-        <w:t xml:space="preserve">) </w:t>
       </w:r>
       <w:r>
         <w:rPr>
@@ -7881,36 +7833,20 @@
         <w:rPr>
           <w:rFonts w:cs="Arial"/>
         </w:rPr>
-        <w:t xml:space="preserve">se integra un regulador de seguimiento del punto de </w:t>
+        <w:t xml:space="preserve">se integra un regulador de seguimiento del punto de máxima potencia (MPPT), encargado de optimizar el aprovechamiento de la energía solar y asegurar una carga eficiente </w:t>
       </w:r>
       <w:r>
         <w:rPr>
           <w:rFonts w:cs="Arial"/>
         </w:rPr>
-        <w:lastRenderedPageBreak/>
-        <w:t xml:space="preserve">máxima potencia (MPPT), encargado de optimizar el aprovechamiento de la energía solar y asegurar una carga eficiente </w:t>
+        <w:t>aún</w:t>
       </w:r>
       <w:r>
         <w:rPr>
           <w:rFonts w:cs="Arial"/>
         </w:rPr>
-        <w:t>aún</w:t>
-      </w:r>
-      <w:r>
-        <w:rPr>
-          <w:rFonts w:cs="Arial"/>
-        </w:rPr>
         <w:t xml:space="preserve"> bajo condiciones de radiación variable.</w:t>
       </w:r>
-    </w:p>
-    <w:p>
-      <w:pPr>
-        <w:spacing w:line="240" w:lineRule="auto"/>
-        <w:ind w:firstLine="360"/>
-        <w:rPr>
-          <w:rFonts w:cs="Arial"/>
-        </w:rPr>
-      </w:pPr>
     </w:p>
     <w:p>
       <w:pPr>
@@ -7919,6 +7855,7 @@
         <w:jc w:val="center"/>
       </w:pPr>
       <w:r>
+        <w:lastRenderedPageBreak/>
         <w:t>&lt;&lt;fig_descripcion_arquitectura_4&gt;&gt;</w:t>
       </w:r>
     </w:p>
@@ -8162,14 +8099,7 @@
         <w:rPr>
           <w:rFonts w:cs="Arial"/>
         </w:rPr>
-        <w:t xml:space="preserve"> Pro, que permite la transmisión de datos en tiempo real en zonas de mar abierto. Asimismo, la sonda integra un sistema </w:t>
-      </w:r>
-      <w:r>
-        <w:rPr>
-          <w:rFonts w:cs="Arial"/>
-        </w:rPr>
-        <w:lastRenderedPageBreak/>
-        <w:t>de telemetría mediante red celular (GSM), compatible con tecnologías SIM900, 3G y 4G, el cual se emplea en áreas con cobertura terrestre, optimizando los costos de comunicación.</w:t>
+        <w:t xml:space="preserve"> Pro, que permite la transmisión de datos en tiempo real en zonas de mar abierto. Asimismo, la sonda integra un sistema de telemetría mediante red celular (GSM), compatible con tecnologías SIM900, 3G y 4G, el cual se emplea en áreas con cobertura terrestre, optimizando los costos de comunicación.</w:t>
       </w:r>
     </w:p>
     <w:p>
@@ -8186,6 +8116,7 @@
         <w:rPr>
           <w:noProof/>
         </w:rPr>
+        <w:lastRenderedPageBreak/>
         <w:t xml:space="preserve"> </w:t>
       </w:r>
     </w:p>
@@ -9496,8 +9427,12 @@
     </w:p>
     <w:p>
       <w:pPr>
-        <w:ind w:firstLine="360"/>
-      </w:pPr>
+        <w:spacing w:line="240" w:lineRule="auto"/>
+        <w:jc w:val="left"/>
+      </w:pPr>
+      <w:r>
+        <w:br w:type="page"/>
+      </w:r>
     </w:p>
     <w:p>
       <w:pPr>
@@ -9738,8 +9673,12 @@
     </w:p>
     <w:p>
       <w:pPr>
-        <w:spacing w:before="240"/>
-      </w:pPr>
+        <w:spacing w:line="240" w:lineRule="auto"/>
+        <w:jc w:val="left"/>
+      </w:pPr>
+      <w:r>
+        <w:br w:type="page"/>
+      </w:r>
     </w:p>
     <w:p>
       <w:pPr>
@@ -9754,6 +9693,7 @@
         <w:rPr>
           <w:rStyle w:val="Title1"/>
         </w:rPr>
+        <w:lastRenderedPageBreak/>
         <w:t>DESCRIPCIÓN DE LA</w:t>
       </w:r>
       <w:r>
@@ -13469,7 +13409,13 @@
         <w:rPr>
           <w:rFonts w:cs="Arial"/>
         </w:rPr>
-        <w:t>ref_pruebas_baterias</w:t>
+        <w:t>ref_pruebas_</w:t>
+      </w:r>
+      <w:r>
+        <w:rPr>
+          <w:rFonts w:cs="Arial"/>
+        </w:rPr>
+        <w:t>baterias</w:t>
       </w:r>
       <w:proofErr w:type="spellEnd"/>
       <w:r>
@@ -13585,6 +13531,38 @@
     </w:p>
     <w:p>
       <w:pPr>
+        <w:spacing w:line="240" w:lineRule="auto"/>
+        <w:jc w:val="center"/>
+      </w:pPr>
+      <w:r>
+        <w:t>&lt;&lt;</w:t>
+      </w:r>
+      <w:proofErr w:type="spellStart"/>
+      <w:r>
+        <w:t>ref_ubicacion_durante_pruebas</w:t>
+      </w:r>
+      <w:proofErr w:type="spellEnd"/>
+      <w:r>
+        <w:t xml:space="preserve">&gt;&gt;. </w:t>
+      </w:r>
+      <w:r>
+        <w:t>Mapa con la información de las primeras 24 horas de transmisión de la</w:t>
+      </w:r>
+      <w:r>
+        <w:t>s sondas</w:t>
+      </w:r>
+      <w:r>
+        <w:t>.</w:t>
+      </w:r>
+    </w:p>
+    <w:p>
+      <w:pPr>
+        <w:spacing w:line="240" w:lineRule="auto"/>
+        <w:jc w:val="center"/>
+      </w:pPr>
+    </w:p>
+    <w:p>
+      <w:pPr>
         <w:pStyle w:val="Textoindependiente"/>
         <w:ind w:firstLine="349"/>
         <w:rPr>
@@ -13596,7 +13574,14 @@
         <w:rPr>
           <w:lang w:eastAsia="es-MX"/>
         </w:rPr>
-        <w:t xml:space="preserve">El almacenamiento de la información se realiza en los servidores del consorcio ASM-CICESE y es resguardada en duplicado para evitar la pérdida de información. Asimismo, la información se despliega en el sitio WEB del proyecto </w:t>
+        <w:t xml:space="preserve">El almacenamiento de la información se realiza en los servidores del consorcio ASM-CICESE y es resguardada en duplicado para evitar la pérdida de información. Asimismo, la información se </w:t>
+      </w:r>
+      <w:r>
+        <w:rPr>
+          <w:lang w:eastAsia="es-MX"/>
+        </w:rPr>
+        <w:lastRenderedPageBreak/>
+        <w:t xml:space="preserve">despliega en el sitio WEB del proyecto </w:t>
       </w:r>
       <w:hyperlink r:id="rId17" w:history="1">
         <w:r>
@@ -13615,15 +13600,7 @@
           <w:szCs w:val="22"/>
           <w:lang w:eastAsia="es-MX"/>
         </w:rPr>
-        <w:t xml:space="preserve"> y puede visualizarse desde el momento en que la boya es desplegada hasta el momento en que se pierde comunicación con la </w:t>
-      </w:r>
-      <w:r>
-        <w:rPr>
-          <w:szCs w:val="22"/>
-          <w:lang w:eastAsia="es-MX"/>
-        </w:rPr>
-        <w:lastRenderedPageBreak/>
-        <w:t xml:space="preserve">misma. </w:t>
+        <w:t xml:space="preserve"> y puede visualizarse desde el momento en que la boya es desplegada hasta el momento en que se pierde comunicación con la misma. </w:t>
       </w:r>
       <w:r>
         <w:rPr>
@@ -23768,7 +23745,6 @@
   <w:style w:type="character" w:default="1" w:styleId="Fuentedeprrafopredeter">
     <w:name w:val="Default Paragraph Font"/>
     <w:uiPriority w:val="1"/>
-    <w:semiHidden/>
     <w:unhideWhenUsed/>
   </w:style>
   <w:style w:type="table" w:default="1" w:styleId="Tablanormal">

</xml_diff>

<commit_message>
FIX: Se comienzan los ajustes para hacer los reemplazos de textos en el word
</commit_message>
<xml_diff>
--- a/crear_documentos/services/doc_101/plantilla.docx
+++ b/crear_documentos/services/doc_101/plantilla.docx
@@ -6149,16 +6149,63 @@
     </w:p>
     <w:p>
       <w:pPr>
-        <w:ind w:firstLine="207"/>
-      </w:pPr>
-      <w:r>
-        <w:t>&lt;&lt;alcances_</w:t>
-      </w:r>
-      <w:r>
-        <w:t>parrafo1</w:t>
-      </w:r>
+        <w:ind w:firstLine="360"/>
+      </w:pPr>
+      <w:r>
+        <w:t>Con base en las especificaciones particulares del Contrato No. 658225821</w:t>
+      </w:r>
+      <w:r>
+        <w:t xml:space="preserve"> </w:t>
+      </w:r>
+      <w:r>
+        <w:t xml:space="preserve">en este documento se reportan las actividades asociadas al concepto “10.1 Protocolo de liberación de las sondas oceanográficas y transmisión de datos”, relacionadas con las sondas oceanográficas liberadas en </w:t>
+      </w:r>
+      <w:r>
+        <w:t>&lt;&lt;</w:t>
+      </w:r>
+      <w:proofErr w:type="spellStart"/>
+      <w:r>
+        <w:t>mes_y_anio</w:t>
+      </w:r>
+      <w:proofErr w:type="spellEnd"/>
       <w:r>
         <w:t>&gt;&gt;</w:t>
+      </w:r>
+      <w:r>
+        <w:t xml:space="preserve">, las cuales se ejecutaron para dar cumplimiento a la orden de servicio </w:t>
+      </w:r>
+      <w:r>
+        <w:rPr>
+          <w:b/>
+          <w:bCs/>
+        </w:rPr>
+        <w:t>PEMEX-ASM-CICESE-658225821-</w:t>
+      </w:r>
+      <w:r>
+        <w:rPr>
+          <w:b/>
+          <w:bCs/>
+        </w:rPr>
+        <w:t>&lt;&lt;</w:t>
+      </w:r>
+      <w:proofErr w:type="spellStart"/>
+      <w:r>
+        <w:rPr>
+          <w:b/>
+          <w:bCs/>
+        </w:rPr>
+        <w:t>orden_de_servicio</w:t>
+      </w:r>
+      <w:proofErr w:type="spellEnd"/>
+      <w:r>
+        <w:rPr>
+          <w:b/>
+          <w:bCs/>
+        </w:rPr>
+        <w:t>&gt;&gt;</w:t>
+      </w:r>
+      <w:r>
+        <w:t xml:space="preserve"> e incluyen los siguientes alcances:</w:t>
       </w:r>
     </w:p>
     <w:p/>
@@ -7458,16 +7505,8 @@
         <w:rPr>
           <w:rFonts w:cs="Arial"/>
         </w:rPr>
-        <w:t xml:space="preserve">La draga de arrastre </w:t>
-      </w:r>
-      <w:proofErr w:type="spellStart"/>
-      <w:r>
-        <w:rPr>
-          <w:rFonts w:cs="Arial"/>
-        </w:rPr>
-        <w:t>sub-superficial</w:t>
-      </w:r>
-      <w:proofErr w:type="spellEnd"/>
+        <w:t>La draga de arrastre sub-superficial</w:t>
+      </w:r>
       <w:r>
         <w:rPr>
           <w:rFonts w:cs="Arial"/>
@@ -9626,15 +9665,7 @@
         <w:ind w:firstLine="360"/>
       </w:pPr>
       <w:r>
-        <w:t xml:space="preserve">En cuanto al sistema de telemetría, la sonda emplea tecnología satelital </w:t>
-      </w:r>
-      <w:proofErr w:type="spellStart"/>
-      <w:r>
-        <w:t>Globalstar</w:t>
-      </w:r>
-      <w:proofErr w:type="spellEnd"/>
-      <w:r>
-        <w:t>, basada en una constelación de satélites en órbita baja (LEO) que operan en banda L. Mediante servicios simplex de bajo consumo energético, se transmiten paquetes periódicos de información desde zonas remotas, lo que permite una comunicación confiable y con tiempos de transmisión reducidos. Este sistema resultó adecuado para plataformas autónomas y funcionó de manera exitosa durante las pruebas de 24 horas realizadas en el centro de operaciones del consorcio ASM-CICESE, donde los datos fueron recibidos de forma continua.</w:t>
+        <w:t>En cuanto al sistema de telemetría, la sonda emplea tecnología satelital Globalstar, basada en una constelación de satélites en órbita baja (LEO) que operan en banda L. Mediante servicios simplex de bajo consumo energético, se transmiten paquetes periódicos de información desde zonas remotas, lo que permite una comunicación confiable y con tiempos de transmisión reducidos. Este sistema resultó adecuado para plataformas autónomas y funcionó de manera exitosa durante las pruebas de 24 horas realizadas en el centro de operaciones del consorcio ASM-CICESE, donde los datos fueron recibidos de forma continua.</w:t>
       </w:r>
     </w:p>
     <w:p>
@@ -14836,43 +14867,7 @@
           <w:rFonts w:ascii="Microsoft Sans Serif" w:hAnsi="Microsoft Sans Serif" w:cs="Microsoft Sans Serif"/>
           <w:vertAlign w:val="baseline"/>
         </w:rPr>
-        <w:t xml:space="preserve"> estampa de tiempo en formato </w:t>
-      </w:r>
-      <w:proofErr w:type="spellStart"/>
-      <w:r>
-        <w:rPr>
-          <w:rStyle w:val="Caracteresdenotaalpie"/>
-          <w:rFonts w:ascii="Microsoft Sans Serif" w:hAnsi="Microsoft Sans Serif" w:cs="Microsoft Sans Serif"/>
-          <w:vertAlign w:val="baseline"/>
-        </w:rPr>
-        <w:t>YYYY-MM-DD-THH:</w:t>
-      </w:r>
-      <w:proofErr w:type="gramStart"/>
-      <w:r>
-        <w:rPr>
-          <w:rStyle w:val="Caracteresdenotaalpie"/>
-          <w:rFonts w:ascii="Microsoft Sans Serif" w:hAnsi="Microsoft Sans Serif" w:cs="Microsoft Sans Serif"/>
-          <w:vertAlign w:val="baseline"/>
-        </w:rPr>
-        <w:t>mm:ss</w:t>
-      </w:r>
-      <w:proofErr w:type="gramEnd"/>
-      <w:r>
-        <w:rPr>
-          <w:rStyle w:val="Caracteresdenotaalpie"/>
-          <w:rFonts w:ascii="Microsoft Sans Serif" w:hAnsi="Microsoft Sans Serif" w:cs="Microsoft Sans Serif"/>
-          <w:vertAlign w:val="baseline"/>
-        </w:rPr>
-        <w:t>.sssz</w:t>
-      </w:r>
-      <w:proofErr w:type="spellEnd"/>
-      <w:r>
-        <w:rPr>
-          <w:rStyle w:val="Caracteresdenotaalpie"/>
-          <w:rFonts w:ascii="Microsoft Sans Serif" w:hAnsi="Microsoft Sans Serif" w:cs="Microsoft Sans Serif"/>
-          <w:vertAlign w:val="baseline"/>
-        </w:rPr>
-        <w:t>.</w:t>
+        <w:t xml:space="preserve"> estampa de tiempo en formato YYYY-MM-DD-THH:mm:ss.sssz.</w:t>
       </w:r>
     </w:p>
     <w:p>
@@ -23753,7 +23748,6 @@
   <w:style w:type="character" w:default="1" w:styleId="Fuentedeprrafopredeter">
     <w:name w:val="Default Paragraph Font"/>
     <w:uiPriority w:val="1"/>
-    <w:semiHidden/>
     <w:unhideWhenUsed/>
   </w:style>
   <w:style w:type="table" w:default="1" w:styleId="Tablanormal">
@@ -24455,10 +24449,10 @@
       <w:szCs w:val="24"/>
     </w:rPr>
   </w:style>
-  <w:style w:type="character" w:customStyle="1" w:styleId="FirmadecorreoelectrnicoCar">
-    <w:name w:val="Firma de correo electrónico Car"/>
+  <w:style w:type="character" w:customStyle="1" w:styleId="FirmadecorreoCar">
+    <w:name w:val="Firma de correo Car"/>
     <w:basedOn w:val="Fuentedeprrafopredeter"/>
-    <w:link w:val="Firmadecorreoelectrnico"/>
+    <w:link w:val="Firmadecorreo"/>
     <w:uiPriority w:val="99"/>
     <w:semiHidden/>
     <w:qFormat/>
@@ -26806,10 +26800,10 @@
       <w:ind w:left="4252"/>
     </w:pPr>
   </w:style>
-  <w:style w:type="paragraph" w:styleId="Firmadecorreoelectrnico">
+  <w:style w:type="paragraph" w:styleId="Firmadecorreo">
     <w:name w:val="E-mail Signature"/>
     <w:basedOn w:val="Normal"/>
-    <w:link w:val="FirmadecorreoelectrnicoCar"/>
+    <w:link w:val="FirmadecorreoCar"/>
     <w:uiPriority w:val="99"/>
     <w:semiHidden/>
     <w:unhideWhenUsed/>

</xml_diff>

<commit_message>
FIX: Se arreglan funciones que reemplazan los textos en el word. Se modifican las funciones que generan textos del word. DEL: Se eliminan funciones que creaban textos en el word porque era mejor manejarlo como variables en lugar de un parrafo entero. PENIDNG: Modificar la forma en que se generan las funciones que escriben el texto de los parrafos para que sea por runs
</commit_message>
<xml_diff>
--- a/crear_documentos/services/doc_101/plantilla.docx
+++ b/crear_documentos/services/doc_101/plantilla.docx
@@ -6167,6 +6167,9 @@
       <w:r>
         <w:t>mes_y_anio</w:t>
       </w:r>
+      <w:r>
+        <w:t>_de_liberacion</w:t>
+      </w:r>
       <w:proofErr w:type="spellEnd"/>
       <w:r>
         <w:t>&gt;&gt;</w:t>
@@ -7443,7 +7446,6 @@
     </w:p>
     <w:p>
       <w:pPr>
-        <w:ind w:firstLine="360"/>
         <w:rPr>
           <w:rFonts w:cs="Arial"/>
         </w:rPr>
@@ -7451,8 +7453,7 @@
     </w:p>
     <w:p>
       <w:pPr>
-        <w:pStyle w:val="Carjustificado"/>
-        <w:jc w:val="center"/>
+        <w:pStyle w:val="Figura"/>
       </w:pPr>
       <w:r>
         <w:t>&lt;&lt;fig</w:t>
@@ -7461,7 +7462,10 @@
         <w:t>_</w:t>
       </w:r>
       <w:r>
-        <w:t>descripcion_arquitectura</w:t>
+        <w:t>descripcion</w:t>
+      </w:r>
+      <w:r>
+        <w:t>_arquitectura</w:t>
       </w:r>
       <w:r>
         <w:t>_1</w:t>
@@ -7664,20 +7668,24 @@
     <w:p>
       <w:pPr>
         <w:rPr>
-          <w:noProof/>
-        </w:rPr>
+          <w:rFonts w:cs="Arial"/>
+        </w:rPr>
+      </w:pPr>
+    </w:p>
+    <w:p>
+      <w:pPr>
+        <w:pStyle w:val="Figura"/>
       </w:pPr>
       <w:bookmarkStart w:id="69" w:name="_Ref220060808"/>
       <w:bookmarkStart w:id="70" w:name="_Ref220060798"/>
-    </w:p>
-    <w:p>
-      <w:pPr>
-        <w:keepNext/>
-        <w:ind w:firstLine="360"/>
-        <w:jc w:val="center"/>
-      </w:pPr>
-      <w:r>
-        <w:t>&lt;&lt;fig_descripcion_arquitectura_2&gt;&gt;</w:t>
+      <w:r>
+        <w:t>&lt;&lt;fig_</w:t>
+      </w:r>
+      <w:r>
+        <w:t>descripcion</w:t>
+      </w:r>
+      <w:r>
+        <w:t>_arquitectura_2&gt;&gt;</w:t>
       </w:r>
       <w:bookmarkEnd w:id="69"/>
       <w:bookmarkEnd w:id="70"/>
@@ -7796,22 +7804,16 @@
         <w:t xml:space="preserve"> para el almacenamiento de datos.</w:t>
       </w:r>
     </w:p>
+    <w:p/>
     <w:p>
       <w:pPr>
-        <w:keepNext/>
-        <w:spacing w:line="240" w:lineRule="auto"/>
-        <w:ind w:firstLine="360"/>
-        <w:jc w:val="center"/>
-      </w:pPr>
-    </w:p>
-    <w:p>
-      <w:pPr>
-        <w:keepNext/>
-        <w:ind w:firstLine="360"/>
-        <w:jc w:val="center"/>
-      </w:pPr>
-      <w:r>
-        <w:t>&lt;&lt;fig_descripcion_arquitectura_3&gt;&gt;</w:t>
+        <w:pStyle w:val="Figura"/>
+      </w:pPr>
+      <w:r>
+        <w:t>&lt;&lt;fig_descripcion</w:t>
+      </w:r>
+      <w:r>
+        <w:t>_arquitectura_3&gt;&gt;</w:t>
       </w:r>
     </w:p>
     <w:p>
@@ -7887,7 +7889,14 @@
         <w:rPr>
           <w:rFonts w:cs="Arial"/>
         </w:rPr>
-        <w:t xml:space="preserve">se integra un regulador de seguimiento del punto de máxima potencia (MPPT), encargado de optimizar el aprovechamiento de la energía solar y asegurar una carga eficiente </w:t>
+        <w:t xml:space="preserve">se integra un regulador de seguimiento del punto de </w:t>
+      </w:r>
+      <w:r>
+        <w:rPr>
+          <w:rFonts w:cs="Arial"/>
+        </w:rPr>
+        <w:lastRenderedPageBreak/>
+        <w:t xml:space="preserve">máxima potencia (MPPT), encargado de optimizar el aprovechamiento de la energía solar y asegurar una carga eficiente </w:t>
       </w:r>
       <w:r>
         <w:rPr>
@@ -7904,13 +7913,19 @@
     </w:p>
     <w:p>
       <w:pPr>
-        <w:keepNext/>
-        <w:ind w:firstLine="360"/>
-        <w:jc w:val="center"/>
-      </w:pPr>
-      <w:r>
-        <w:lastRenderedPageBreak/>
-        <w:t>&lt;&lt;fig_descripcion_arquitectura_4&gt;&gt;</w:t>
+        <w:pStyle w:val="Figura"/>
+        <w:jc w:val="both"/>
+      </w:pPr>
+    </w:p>
+    <w:p>
+      <w:pPr>
+        <w:pStyle w:val="Figura"/>
+      </w:pPr>
+      <w:r>
+        <w:t>&lt;&lt;fig_descripcion</w:t>
+      </w:r>
+      <w:r>
+        <w:t>_arquitectura_4&gt;&gt;</w:t>
       </w:r>
     </w:p>
     <w:p>
@@ -7979,19 +7994,22 @@
     </w:p>
     <w:p>
       <w:pPr>
-        <w:keepNext/>
-        <w:suppressAutoHyphens w:val="0"/>
-        <w:spacing w:before="100" w:beforeAutospacing="1" w:line="240" w:lineRule="auto"/>
+        <w:pStyle w:val="Figura"/>
+        <w:jc w:val="both"/>
       </w:pPr>
     </w:p>
     <w:p>
       <w:pPr>
-        <w:keepNext/>
-        <w:ind w:firstLine="360"/>
-        <w:jc w:val="center"/>
-      </w:pPr>
-      <w:r>
-        <w:t>&lt;&lt;fig_descripcion_arquitectura_5&gt;&gt;</w:t>
+        <w:pStyle w:val="Figura"/>
+      </w:pPr>
+      <w:r>
+        <w:t>&lt;&lt;fig_</w:t>
+      </w:r>
+      <w:r>
+        <w:t>descripcion</w:t>
+      </w:r>
+      <w:r>
+        <w:t>_arquitectura_5&gt;&gt;</w:t>
       </w:r>
     </w:p>
     <w:p>
@@ -8153,32 +8171,31 @@
         <w:rPr>
           <w:rFonts w:cs="Arial"/>
         </w:rPr>
-        <w:t xml:space="preserve"> Pro, que permite la transmisión de datos en tiempo real en zonas de mar abierto. Asimismo, la sonda integra un sistema de telemetría mediante red celular (GSM), compatible con tecnologías SIM900, 3G y 4G, el cual se emplea en áreas con cobertura terrestre, optimizando los costos de comunicación.</w:t>
+        <w:t xml:space="preserve"> Pro, que permite la transmisión de datos en tiempo real en zonas de mar abierto. Asimismo, la sonda integra un sistema </w:t>
+      </w:r>
+      <w:r>
+        <w:rPr>
+          <w:rFonts w:cs="Arial"/>
+        </w:rPr>
+        <w:lastRenderedPageBreak/>
+        <w:t>de telemetría mediante red celular (GSM), compatible con tecnologías SIM900, 3G y 4G, el cual se emplea en áreas con cobertura terrestre, optimizando los costos de comunicación.</w:t>
+      </w:r>
+      <w:r>
+        <w:rPr>
+          <w:noProof/>
+        </w:rPr>
+        <w:t xml:space="preserve"> </w:t>
       </w:r>
     </w:p>
     <w:p>
       <w:pPr>
-        <w:keepNext/>
-        <w:suppressAutoHyphens w:val="0"/>
-        <w:spacing w:line="240" w:lineRule="auto"/>
-        <w:jc w:val="center"/>
-        <w:rPr>
-          <w:noProof/>
-        </w:rPr>
-      </w:pPr>
-      <w:r>
-        <w:rPr>
-          <w:noProof/>
-        </w:rPr>
-        <w:lastRenderedPageBreak/>
-        <w:t xml:space="preserve"> </w:t>
-      </w:r>
+        <w:pStyle w:val="Figura"/>
+        <w:jc w:val="both"/>
+      </w:pPr>
     </w:p>
     <w:p>
       <w:pPr>
-        <w:keepNext/>
-        <w:ind w:firstLine="360"/>
-        <w:jc w:val="center"/>
+        <w:pStyle w:val="Figura"/>
       </w:pPr>
       <w:r>
         <w:t>&lt;&lt;fig_descripcion_arquitectura_6&gt;&gt;</w:t>
@@ -9273,36 +9290,29 @@
     </w:p>
     <w:p>
       <w:pPr>
-        <w:ind w:firstLine="360"/>
+        <w:pStyle w:val="Figura"/>
+        <w:jc w:val="both"/>
       </w:pPr>
     </w:p>
     <w:p>
       <w:pPr>
-        <w:suppressAutoHyphens w:val="0"/>
-        <w:spacing w:line="240" w:lineRule="auto"/>
-        <w:jc w:val="center"/>
-        <w:rPr>
-          <w:rFonts w:cs="Microsoft Sans Serif"/>
-        </w:rPr>
-      </w:pPr>
-      <w:r>
-        <w:rPr>
-          <w:rFonts w:cs="Microsoft Sans Serif"/>
-        </w:rPr>
+        <w:pStyle w:val="Figura"/>
+      </w:pPr>
+      <w:r>
         <w:t>&lt;&lt;</w:t>
       </w:r>
       <w:proofErr w:type="spellStart"/>
       <w:r>
-        <w:rPr>
-          <w:rFonts w:cs="Microsoft Sans Serif"/>
-        </w:rPr>
-        <w:t>fig_actividades_previas</w:t>
+        <w:t>fig_</w:t>
+      </w:r>
+      <w:r>
+        <w:t>actividades</w:t>
+      </w:r>
+      <w:r>
+        <w:t>_previas</w:t>
       </w:r>
       <w:proofErr w:type="spellEnd"/>
       <w:r>
-        <w:rPr>
-          <w:rFonts w:cs="Microsoft Sans Serif"/>
-        </w:rPr>
         <w:t>&gt;&gt;</w:t>
       </w:r>
     </w:p>
@@ -10218,17 +10228,20 @@
     <w:p/>
     <w:p>
       <w:pPr>
-        <w:keepNext/>
-        <w:suppressAutoHyphens w:val="0"/>
-        <w:spacing w:line="240" w:lineRule="auto"/>
-        <w:jc w:val="center"/>
+        <w:pStyle w:val="Figura"/>
       </w:pPr>
       <w:r>
         <w:t>&lt;&lt;</w:t>
       </w:r>
       <w:proofErr w:type="spellStart"/>
       <w:r>
-        <w:t>fig_mapa_de_despliegue</w:t>
+        <w:t>fig_</w:t>
+      </w:r>
+      <w:r>
+        <w:t>mapa</w:t>
+      </w:r>
+      <w:r>
+        <w:t>_de_despliegue</w:t>
       </w:r>
       <w:proofErr w:type="spellEnd"/>
       <w:r>
@@ -10291,47 +10304,20 @@
     <w:p/>
     <w:p>
       <w:pPr>
-        <w:suppressAutoHyphens w:val="0"/>
-        <w:spacing w:line="240" w:lineRule="auto"/>
-        <w:jc w:val="center"/>
-        <w:rPr>
-          <w:rFonts w:cs="Microsoft Sans Serif"/>
-          <w:sz w:val="20"/>
-          <w:szCs w:val="22"/>
-        </w:rPr>
-      </w:pPr>
-      <w:r>
-        <w:rPr>
-          <w:rFonts w:cs="Microsoft Sans Serif"/>
-          <w:sz w:val="20"/>
-          <w:szCs w:val="22"/>
-        </w:rPr>
+        <w:pStyle w:val="Figura"/>
+      </w:pPr>
+      <w:r>
         <w:t>&lt;&lt;</w:t>
       </w:r>
       <w:proofErr w:type="spellStart"/>
       <w:r>
-        <w:rPr>
-          <w:rFonts w:cs="Microsoft Sans Serif"/>
-          <w:sz w:val="20"/>
-          <w:szCs w:val="22"/>
-        </w:rPr>
         <w:t>fig_ejecucion_</w:t>
       </w:r>
       <w:r>
-        <w:rPr>
-          <w:rFonts w:cs="Microsoft Sans Serif"/>
-          <w:sz w:val="20"/>
-          <w:szCs w:val="22"/>
-        </w:rPr>
         <w:t>de_la_campania</w:t>
       </w:r>
       <w:proofErr w:type="spellEnd"/>
       <w:r>
-        <w:rPr>
-          <w:rFonts w:cs="Microsoft Sans Serif"/>
-          <w:sz w:val="20"/>
-          <w:szCs w:val="22"/>
-        </w:rPr>
         <w:t>&gt;&gt;</w:t>
       </w:r>
     </w:p>
@@ -11068,6 +11054,7 @@
       <w:bookmarkStart w:id="93" w:name="_Ref217401548"/>
       <w:bookmarkStart w:id="94" w:name="_Toc229049320"/>
       <w:r>
+        <w:lastRenderedPageBreak/>
         <w:t xml:space="preserve">Tabla </w:t>
       </w:r>
       <w:fldSimple w:instr=" SEQ Tabla \* ARABIC ">
@@ -11707,7 +11694,6 @@
       <w:bookmarkStart w:id="96" w:name="_Ref229050865"/>
       <w:bookmarkStart w:id="97" w:name="_Toc229049321"/>
       <w:r>
-        <w:lastRenderedPageBreak/>
         <w:t xml:space="preserve">Tabla </w:t>
       </w:r>
       <w:fldSimple w:instr=" SEQ Tabla \* ARABIC ">
@@ -12922,8 +12908,7 @@
     </w:p>
     <w:p>
       <w:pPr>
-        <w:ind w:firstLine="426"/>
-        <w:jc w:val="center"/>
+        <w:pStyle w:val="Figura"/>
       </w:pPr>
       <w:bookmarkStart w:id="105" w:name="_Ref224117752"/>
       <w:r>
@@ -12944,70 +12929,158 @@
         <w:t>&gt;&gt;</w:t>
       </w:r>
       <w:bookmarkEnd w:id="105"/>
+      <w:r>
+        <w:br w:type="page"/>
+      </w:r>
     </w:p>
     <w:p>
       <w:pPr>
-        <w:jc w:val="center"/>
-      </w:pPr>
-      <w:bookmarkStart w:id="106" w:name="_Toc229049307"/>
-      <w:r>
+        <w:pStyle w:val="Ttulo1"/>
+        <w:rPr>
+          <w:rStyle w:val="Title1"/>
+        </w:rPr>
+      </w:pPr>
+      <w:bookmarkStart w:id="106" w:name="_Ref223695225"/>
+      <w:bookmarkStart w:id="107" w:name="_Toc229049278"/>
+      <w:r>
+        <w:rPr>
+          <w:rStyle w:val="Title1"/>
+        </w:rPr>
+        <w:lastRenderedPageBreak/>
+        <w:t>TELEMETRÍA, R</w:t>
+      </w:r>
+      <w:r>
+        <w:rPr>
+          <w:rStyle w:val="Title1"/>
+        </w:rPr>
+        <w:t xml:space="preserve">ECEPCIÓN Y ALMACENAMIENTO DE DATOS </w:t>
+      </w:r>
+      <w:bookmarkEnd w:id="103"/>
+      <w:r>
+        <w:rPr>
+          <w:rStyle w:val="Title1"/>
+        </w:rPr>
+        <w:t>PREVIOS</w:t>
+      </w:r>
+      <w:r>
+        <w:rPr>
+          <w:rStyle w:val="Title1"/>
+        </w:rPr>
+        <w:t xml:space="preserve"> AL DESPLIEGUE</w:t>
+      </w:r>
+      <w:r>
+        <w:rPr>
+          <w:rStyle w:val="Title1"/>
+        </w:rPr>
+        <w:t xml:space="preserve"> DE LA SONDA</w:t>
+      </w:r>
+      <w:bookmarkEnd w:id="104"/>
+      <w:bookmarkEnd w:id="106"/>
+      <w:r>
+        <w:rPr>
+          <w:rStyle w:val="Title1"/>
+        </w:rPr>
         <w:t>.</w:t>
       </w:r>
-      <w:bookmarkEnd w:id="106"/>
-      <w:r>
-        <w:br w:type="page"/>
-      </w:r>
+      <w:bookmarkEnd w:id="107"/>
     </w:p>
     <w:p>
       <w:pPr>
-        <w:pStyle w:val="Ttulo1"/>
-        <w:rPr>
-          <w:rStyle w:val="Title1"/>
-        </w:rPr>
-      </w:pPr>
-      <w:bookmarkStart w:id="107" w:name="_Ref223695225"/>
-      <w:bookmarkStart w:id="108" w:name="_Toc229049278"/>
-      <w:r>
-        <w:rPr>
-          <w:rStyle w:val="Title1"/>
-        </w:rPr>
-        <w:lastRenderedPageBreak/>
-        <w:t>TELEMETRÍA, R</w:t>
-      </w:r>
-      <w:r>
-        <w:rPr>
-          <w:rStyle w:val="Title1"/>
-        </w:rPr>
-        <w:t xml:space="preserve">ECEPCIÓN Y ALMACENAMIENTO DE DATOS </w:t>
-      </w:r>
-      <w:bookmarkEnd w:id="103"/>
-      <w:r>
-        <w:rPr>
-          <w:rStyle w:val="Title1"/>
-        </w:rPr>
-        <w:t>PREVIOS</w:t>
-      </w:r>
-      <w:r>
-        <w:rPr>
-          <w:rStyle w:val="Title1"/>
-        </w:rPr>
-        <w:t xml:space="preserve"> AL DESPLIEGUE</w:t>
-      </w:r>
-      <w:r>
-        <w:rPr>
-          <w:rStyle w:val="Title1"/>
-        </w:rPr>
-        <w:t xml:space="preserve"> DE LA SONDA</w:t>
-      </w:r>
-      <w:bookmarkEnd w:id="104"/>
-      <w:bookmarkEnd w:id="107"/>
-      <w:r>
-        <w:rPr>
-          <w:rStyle w:val="Title1"/>
-        </w:rPr>
-        <w:t>.</w:t>
-      </w:r>
-      <w:bookmarkEnd w:id="108"/>
+        <w:ind w:firstLine="360"/>
+        <w:rPr>
+          <w:rFonts w:cs="Arial"/>
+        </w:rPr>
+      </w:pPr>
+      <w:r>
+        <w:rPr>
+          <w:rFonts w:cs="Arial"/>
+        </w:rPr>
+        <w:t xml:space="preserve">Antes de desplegar las sondas </w:t>
+      </w:r>
+      <w:r>
+        <w:rPr>
+          <w:rFonts w:cs="Arial"/>
+        </w:rPr>
+        <w:t>oceanográficas</w:t>
+      </w:r>
+      <w:r>
+        <w:rPr>
+          <w:rFonts w:cs="Arial"/>
+        </w:rPr>
+        <w:t xml:space="preserve"> se realizaron pruebas </w:t>
+      </w:r>
+      <w:r>
+        <w:rPr>
+          <w:rFonts w:cs="Arial"/>
+        </w:rPr>
+        <w:t xml:space="preserve">en el laboratorio </w:t>
+      </w:r>
+      <w:r>
+        <w:rPr>
+          <w:rFonts w:cs="Arial"/>
+        </w:rPr>
+        <w:t xml:space="preserve">para garantizar el correcto funcionamiento de </w:t>
+      </w:r>
+      <w:r>
+        <w:rPr>
+          <w:rFonts w:cs="Arial"/>
+        </w:rPr>
+        <w:t>las mismas</w:t>
+      </w:r>
+      <w:r>
+        <w:rPr>
+          <w:rFonts w:cs="Arial"/>
+        </w:rPr>
+        <w:t xml:space="preserve">. Una vez que las sondas </w:t>
+      </w:r>
+      <w:r>
+        <w:rPr>
+          <w:rFonts w:cs="Arial"/>
+        </w:rPr>
+        <w:t>estuvieron</w:t>
+      </w:r>
+      <w:r>
+        <w:rPr>
+          <w:rFonts w:cs="Arial"/>
+        </w:rPr>
+        <w:t xml:space="preserve"> ensambladas y selladas, éstas se </w:t>
+      </w:r>
+      <w:r>
+        <w:rPr>
+          <w:rFonts w:cs="Arial"/>
+        </w:rPr>
+        <w:t>encendieron</w:t>
+      </w:r>
+      <w:r>
+        <w:rPr>
+          <w:rFonts w:cs="Arial"/>
+        </w:rPr>
+        <w:t xml:space="preserve"> para comprobar que el sistema de telemetría, recepción y almacenamiento de </w:t>
+      </w:r>
+      <w:r>
+        <w:rPr>
+          <w:rFonts w:cs="Arial"/>
+        </w:rPr>
+        <w:t xml:space="preserve">datos </w:t>
+      </w:r>
+      <w:r>
+        <w:rPr>
+          <w:rFonts w:cs="Arial"/>
+        </w:rPr>
+        <w:t>funcion</w:t>
+      </w:r>
+      <w:r>
+        <w:rPr>
+          <w:rFonts w:cs="Arial"/>
+        </w:rPr>
+        <w:t>ara</w:t>
+      </w:r>
+      <w:r>
+        <w:rPr>
+          <w:rFonts w:cs="Arial"/>
+        </w:rPr>
+        <w:t xml:space="preserve"> correctamente. </w:t>
+      </w:r>
     </w:p>
     <w:p>
       <w:pPr>
@@ -13016,124 +13089,34 @@
           <w:rFonts w:cs="Arial"/>
         </w:rPr>
       </w:pPr>
-      <w:r>
-        <w:rPr>
-          <w:rFonts w:cs="Arial"/>
-        </w:rPr>
-        <w:t xml:space="preserve">Antes de desplegar las sondas </w:t>
-      </w:r>
-      <w:r>
-        <w:rPr>
-          <w:rFonts w:cs="Arial"/>
-        </w:rPr>
-        <w:t>oceanográficas</w:t>
-      </w:r>
-      <w:r>
-        <w:rPr>
-          <w:rFonts w:cs="Arial"/>
-        </w:rPr>
-        <w:t xml:space="preserve"> se realizaron pruebas </w:t>
-      </w:r>
-      <w:r>
-        <w:rPr>
-          <w:rFonts w:cs="Arial"/>
-        </w:rPr>
-        <w:t xml:space="preserve">en el laboratorio </w:t>
-      </w:r>
-      <w:r>
-        <w:rPr>
-          <w:rFonts w:cs="Arial"/>
-        </w:rPr>
-        <w:t xml:space="preserve">para garantizar el correcto funcionamiento de </w:t>
-      </w:r>
-      <w:r>
-        <w:rPr>
-          <w:rFonts w:cs="Arial"/>
-        </w:rPr>
-        <w:t>las mismas</w:t>
-      </w:r>
-      <w:r>
-        <w:rPr>
-          <w:rFonts w:cs="Arial"/>
-        </w:rPr>
-        <w:t xml:space="preserve">. Una vez que las sondas </w:t>
-      </w:r>
-      <w:r>
-        <w:rPr>
-          <w:rFonts w:cs="Arial"/>
-        </w:rPr>
-        <w:t>estuvieron</w:t>
-      </w:r>
-      <w:r>
-        <w:rPr>
-          <w:rFonts w:cs="Arial"/>
-        </w:rPr>
-        <w:t xml:space="preserve"> ensambladas y selladas, éstas se </w:t>
-      </w:r>
-      <w:r>
-        <w:rPr>
-          <w:rFonts w:cs="Arial"/>
-        </w:rPr>
-        <w:t>encendieron</w:t>
-      </w:r>
-      <w:r>
-        <w:rPr>
-          <w:rFonts w:cs="Arial"/>
-        </w:rPr>
-        <w:t xml:space="preserve"> para comprobar que el sistema de telemetría, recepción y almacenamiento de </w:t>
-      </w:r>
-      <w:r>
-        <w:rPr>
-          <w:rFonts w:cs="Arial"/>
-        </w:rPr>
-        <w:t xml:space="preserve">datos </w:t>
-      </w:r>
-      <w:r>
-        <w:rPr>
-          <w:rFonts w:cs="Arial"/>
-        </w:rPr>
-        <w:t>funcion</w:t>
-      </w:r>
-      <w:r>
-        <w:rPr>
-          <w:rFonts w:cs="Arial"/>
-        </w:rPr>
-        <w:t>ara</w:t>
-      </w:r>
-      <w:r>
-        <w:rPr>
-          <w:rFonts w:cs="Arial"/>
-        </w:rPr>
-        <w:t xml:space="preserve"> correctamente. </w:t>
-      </w:r>
     </w:p>
     <w:p>
       <w:pPr>
         <w:ind w:firstLine="360"/>
         <w:rPr>
+          <w:szCs w:val="22"/>
+        </w:rPr>
+      </w:pPr>
+      <w:r>
+        <w:rPr>
           <w:rFonts w:cs="Arial"/>
         </w:rPr>
-      </w:pPr>
+        <w:t>Durante las primeras 24 horas, las sondas se mantuvieron en pruebas de telemetría y carga de energía, con el objetivo de verificar la correcta transmisión y almacenamiento de la información, así como el adecuado almacenamiento de energía solar en las baterías. La frecuencia de comunicación de la sonda está configurada para realizarse cada media hora; es decir, en ese intervalo la sonda se comunica con el satélite, el cual envía la información a los servidores de ASM-CICESE asignados al proyecto. En dichos servidores se almacenan los mensajes con el estado de la sonda y los datos medidos correspondientes a ese intervalo de tiempo</w:t>
+      </w:r>
+      <w:r>
+        <w:rPr>
+          <w:szCs w:val="22"/>
+        </w:rPr>
+        <w:t>.</w:t>
+      </w:r>
     </w:p>
     <w:p>
       <w:pPr>
         <w:ind w:firstLine="360"/>
         <w:rPr>
-          <w:szCs w:val="22"/>
-        </w:rPr>
-      </w:pPr>
-      <w:r>
-        <w:rPr>
           <w:rFonts w:cs="Arial"/>
         </w:rPr>
-        <w:t>Durante las primeras 24 horas, las sondas se mantuvieron en pruebas de telemetría y carga de energía, con el objetivo de verificar la correcta transmisión y almacenamiento de la información, así como el adecuado almacenamiento de energía solar en las baterías. La frecuencia de comunicación de la sonda está configurada para realizarse cada media hora; es decir, en ese intervalo la sonda se comunica con el satélite, el cual envía la información a los servidores de ASM-CICESE asignados al proyecto. En dichos servidores se almacenan los mensajes con el estado de la sonda y los datos medidos correspondientes a ese intervalo de tiempo</w:t>
-      </w:r>
-      <w:r>
-        <w:rPr>
-          <w:szCs w:val="22"/>
-        </w:rPr>
-        <w:t>.</w:t>
-      </w:r>
+      </w:pPr>
     </w:p>
     <w:p>
       <w:pPr>
@@ -13142,398 +13125,398 @@
           <w:rFonts w:cs="Arial"/>
         </w:rPr>
       </w:pPr>
+      <w:r>
+        <w:rPr>
+          <w:rFonts w:cs="Arial"/>
+        </w:rPr>
+        <w:t>La información enviada por las sondas está</w:t>
+      </w:r>
+      <w:r>
+        <w:rPr>
+          <w:rFonts w:cs="Arial"/>
+        </w:rPr>
+        <w:t xml:space="preserve"> </w:t>
+      </w:r>
+      <w:r>
+        <w:rPr>
+          <w:rFonts w:cs="Arial"/>
+        </w:rPr>
+        <w:t>compuesta</w:t>
+      </w:r>
+      <w:r>
+        <w:rPr>
+          <w:rFonts w:cs="Arial"/>
+        </w:rPr>
+        <w:t xml:space="preserve"> por: </w:t>
+      </w:r>
+      <w:r>
+        <w:rPr>
+          <w:rFonts w:cs="Arial"/>
+        </w:rPr>
+        <w:t>vector</w:t>
+      </w:r>
+      <w:r>
+        <w:rPr>
+          <w:rFonts w:cs="Arial"/>
+        </w:rPr>
+        <w:t xml:space="preserve"> de tiempo, posición (latitud y longitud</w:t>
+      </w:r>
+      <w:r>
+        <w:rPr>
+          <w:rFonts w:cs="Arial"/>
+        </w:rPr>
+        <w:t>, grados decimales</w:t>
+      </w:r>
+      <w:r>
+        <w:rPr>
+          <w:rFonts w:cs="Arial"/>
+        </w:rPr>
+        <w:t>), velocidad</w:t>
+      </w:r>
+      <w:r>
+        <w:rPr>
+          <w:rFonts w:cs="Arial"/>
+        </w:rPr>
+        <w:t xml:space="preserve"> (m/s)</w:t>
+      </w:r>
+      <w:r>
+        <w:rPr>
+          <w:rFonts w:cs="Arial"/>
+        </w:rPr>
+        <w:t>, distancia recorrida</w:t>
+      </w:r>
+      <w:r>
+        <w:rPr>
+          <w:rFonts w:cs="Arial"/>
+        </w:rPr>
+        <w:t xml:space="preserve"> (m)</w:t>
+      </w:r>
+      <w:r>
+        <w:rPr>
+          <w:rFonts w:cs="Arial"/>
+        </w:rPr>
+        <w:t>, dirección del desplazamiento (grados), dirección del desplazamiento (</w:t>
+      </w:r>
+      <w:r>
+        <w:rPr>
+          <w:rFonts w:cs="Arial"/>
+        </w:rPr>
+        <w:t xml:space="preserve">cadena de </w:t>
+      </w:r>
+      <w:r>
+        <w:rPr>
+          <w:rFonts w:cs="Arial"/>
+        </w:rPr>
+        <w:t>texto), temperatura</w:t>
+      </w:r>
+      <w:r>
+        <w:rPr>
+          <w:rFonts w:cs="Arial"/>
+        </w:rPr>
+        <w:t xml:space="preserve"> </w:t>
+      </w:r>
+      <w:r>
+        <w:rPr>
+          <w:rFonts w:cs="Arial"/>
+        </w:rPr>
+        <w:t xml:space="preserve">sensor primario </w:t>
+      </w:r>
+      <w:r>
+        <w:rPr>
+          <w:rFonts w:cs="Arial"/>
+        </w:rPr>
+        <w:t>(grados centígrados)</w:t>
+      </w:r>
+      <w:r>
+        <w:rPr>
+          <w:rFonts w:cs="Arial"/>
+        </w:rPr>
+        <w:t>, temperatura sensor secundario (grados centígrados), aceleraciones horizontales y verticales en m/s</w:t>
+      </w:r>
+      <w:r>
+        <w:rPr>
+          <w:rFonts w:cs="Arial"/>
+          <w:vertAlign w:val="superscript"/>
+        </w:rPr>
+        <w:t>2</w:t>
+      </w:r>
+      <w:r>
+        <w:rPr>
+          <w:rFonts w:cs="Arial"/>
+        </w:rPr>
+        <w:t xml:space="preserve"> y voltaje</w:t>
+      </w:r>
+      <w:r>
+        <w:rPr>
+          <w:rFonts w:cs="Arial"/>
+        </w:rPr>
+        <w:t xml:space="preserve"> (voltios).</w:t>
+      </w:r>
+      <w:r>
+        <w:rPr>
+          <w:rFonts w:cs="Arial"/>
+        </w:rPr>
+        <w:t xml:space="preserve"> </w:t>
+      </w:r>
+      <w:r>
+        <w:rPr>
+          <w:rFonts w:cs="Arial"/>
+        </w:rPr>
+        <w:t xml:space="preserve">La evidencia de la información de las primeras 24 horas de transmisión de cada sonda se encuentra en el </w:t>
+      </w:r>
+      <w:r>
+        <w:rPr>
+          <w:rFonts w:cs="Arial"/>
+        </w:rPr>
+        <w:fldChar w:fldCharType="begin"/>
+      </w:r>
+      <w:r>
+        <w:rPr>
+          <w:rFonts w:cs="Arial"/>
+        </w:rPr>
+        <w:instrText xml:space="preserve"> REF _Ref221185985 \h </w:instrText>
+      </w:r>
+      <w:r>
+        <w:rPr>
+          <w:rFonts w:cs="Arial"/>
+        </w:rPr>
+        <w:instrText xml:space="preserve"> \* MERGEFORMAT </w:instrText>
+      </w:r>
+      <w:r>
+        <w:rPr>
+          <w:rFonts w:cs="Arial"/>
+        </w:rPr>
+      </w:r>
+      <w:r>
+        <w:rPr>
+          <w:rFonts w:cs="Arial"/>
+        </w:rPr>
+        <w:fldChar w:fldCharType="separate"/>
+      </w:r>
+      <w:r>
+        <w:rPr>
+          <w:rStyle w:val="Title1"/>
+        </w:rPr>
+        <w:t>ANEXO 2: PRUEBAS DE TRANSMISIÓN PREVIAS AL DESPLIEGUE</w:t>
+      </w:r>
+      <w:r>
+        <w:rPr>
+          <w:rFonts w:cs="Arial"/>
+        </w:rPr>
+        <w:fldChar w:fldCharType="end"/>
+      </w:r>
+      <w:r>
+        <w:rPr>
+          <w:rFonts w:cs="Arial"/>
+        </w:rPr>
+        <w:t xml:space="preserve">. </w:t>
+      </w:r>
+      <w:r>
+        <w:rPr>
+          <w:rFonts w:cs="Arial"/>
+        </w:rPr>
+        <w:t>A continuación</w:t>
+      </w:r>
+      <w:r>
+        <w:rPr>
+          <w:rFonts w:cs="Arial"/>
+        </w:rPr>
+        <w:t>,</w:t>
+      </w:r>
+      <w:r>
+        <w:rPr>
+          <w:rFonts w:cs="Arial"/>
+        </w:rPr>
+        <w:t xml:space="preserve"> se muestra</w:t>
+      </w:r>
+      <w:r>
+        <w:rPr>
+          <w:rFonts w:cs="Arial"/>
+        </w:rPr>
+        <w:t>n</w:t>
+      </w:r>
+      <w:r>
+        <w:rPr>
+          <w:rFonts w:cs="Arial"/>
+        </w:rPr>
+        <w:t xml:space="preserve"> la</w:t>
+      </w:r>
+      <w:r>
+        <w:rPr>
+          <w:rFonts w:cs="Arial"/>
+        </w:rPr>
+        <w:t>s</w:t>
+      </w:r>
+      <w:r>
+        <w:rPr>
+          <w:rFonts w:cs="Arial"/>
+        </w:rPr>
+        <w:t xml:space="preserve"> serie</w:t>
+      </w:r>
+      <w:r>
+        <w:rPr>
+          <w:rFonts w:cs="Arial"/>
+        </w:rPr>
+        <w:t>s</w:t>
+      </w:r>
+      <w:r>
+        <w:rPr>
+          <w:rFonts w:cs="Arial"/>
+        </w:rPr>
+        <w:t xml:space="preserve"> de tiempo</w:t>
+      </w:r>
+      <w:r>
+        <w:rPr>
+          <w:rFonts w:cs="Arial"/>
+        </w:rPr>
+        <w:t xml:space="preserve"> </w:t>
+      </w:r>
+      <w:r>
+        <w:rPr>
+          <w:rFonts w:cs="Arial"/>
+        </w:rPr>
+        <w:t>con el</w:t>
+      </w:r>
+      <w:r>
+        <w:rPr>
+          <w:rFonts w:cs="Arial"/>
+        </w:rPr>
+        <w:t xml:space="preserve"> estado de las baterías</w:t>
+      </w:r>
+      <w:r>
+        <w:rPr>
+          <w:rFonts w:cs="Arial"/>
+        </w:rPr>
+        <w:t xml:space="preserve"> </w:t>
+      </w:r>
+      <w:r>
+        <w:rPr>
+          <w:rFonts w:cs="Arial"/>
+        </w:rPr>
+        <w:t xml:space="preserve">durante las pruebas de funcionamiento </w:t>
+      </w:r>
+      <w:r>
+        <w:rPr>
+          <w:rFonts w:cs="Arial"/>
+        </w:rPr>
+        <w:t>para cada una de las sondas</w:t>
+      </w:r>
+      <w:r>
+        <w:rPr>
+          <w:rFonts w:cs="Arial"/>
+        </w:rPr>
+        <w:t xml:space="preserve"> </w:t>
+      </w:r>
+      <w:r>
+        <w:rPr>
+          <w:rFonts w:cs="Arial"/>
+        </w:rPr>
+        <w:t xml:space="preserve">oceanográficas </w:t>
+      </w:r>
+      <w:r>
+        <w:rPr>
+          <w:rFonts w:cs="Arial"/>
+        </w:rPr>
+        <w:t>(</w:t>
+      </w:r>
+      <w:r>
+        <w:rPr>
+          <w:rFonts w:cs="Arial"/>
+        </w:rPr>
+        <w:t>&lt;&lt;</w:t>
+      </w:r>
+      <w:proofErr w:type="spellStart"/>
+      <w:r>
+        <w:rPr>
+          <w:rFonts w:cs="Arial"/>
+        </w:rPr>
+        <w:t>ref_pruebas_</w:t>
+      </w:r>
+      <w:r>
+        <w:rPr>
+          <w:rFonts w:cs="Arial"/>
+        </w:rPr>
+        <w:t>baterias</w:t>
+      </w:r>
+      <w:proofErr w:type="spellEnd"/>
+      <w:r>
+        <w:rPr>
+          <w:rFonts w:cs="Arial"/>
+        </w:rPr>
+        <w:t>&gt;&gt;</w:t>
+      </w:r>
+      <w:r>
+        <w:rPr>
+          <w:rFonts w:cs="Arial"/>
+        </w:rPr>
+        <w:t>)</w:t>
+      </w:r>
+      <w:r>
+        <w:rPr>
+          <w:rFonts w:cs="Arial"/>
+        </w:rPr>
+        <w:t xml:space="preserve">, y los mapas de las posiciones </w:t>
+      </w:r>
+      <w:r>
+        <w:rPr>
+          <w:rFonts w:cs="Arial"/>
+        </w:rPr>
+        <w:t>transmitidas (</w:t>
+      </w:r>
+      <w:r>
+        <w:rPr>
+          <w:rFonts w:cs="Arial"/>
+        </w:rPr>
+        <w:t>&lt;&lt;</w:t>
+      </w:r>
+      <w:proofErr w:type="spellStart"/>
+      <w:r>
+        <w:rPr>
+          <w:rFonts w:cs="Arial"/>
+        </w:rPr>
+        <w:t>ref_</w:t>
+      </w:r>
+      <w:r>
+        <w:t>ubicacion_durante_pruebas</w:t>
+      </w:r>
+      <w:proofErr w:type="spellEnd"/>
+      <w:r>
+        <w:rPr>
+          <w:rFonts w:cs="Arial"/>
+        </w:rPr>
+        <w:t>&gt;&gt;</w:t>
+      </w:r>
+      <w:r>
+        <w:rPr>
+          <w:rFonts w:cs="Arial"/>
+        </w:rPr>
+        <w:t xml:space="preserve">) </w:t>
+      </w:r>
+      <w:r>
+        <w:rPr>
+          <w:rFonts w:cs="Arial"/>
+        </w:rPr>
+        <w:t>durante las pruebas en laboratorio</w:t>
+      </w:r>
+      <w:r>
+        <w:rPr>
+          <w:rFonts w:cs="Arial"/>
+        </w:rPr>
+        <w:t>.</w:t>
+      </w:r>
     </w:p>
     <w:p>
       <w:pPr>
-        <w:ind w:firstLine="360"/>
-        <w:rPr>
-          <w:rFonts w:cs="Arial"/>
-        </w:rPr>
-      </w:pPr>
-      <w:r>
-        <w:rPr>
-          <w:rFonts w:cs="Arial"/>
-        </w:rPr>
-        <w:t>La información enviada por las sondas está</w:t>
-      </w:r>
-      <w:r>
-        <w:rPr>
-          <w:rFonts w:cs="Arial"/>
-        </w:rPr>
-        <w:t xml:space="preserve"> </w:t>
-      </w:r>
-      <w:r>
-        <w:rPr>
-          <w:rFonts w:cs="Arial"/>
-        </w:rPr>
-        <w:t>compuesta</w:t>
-      </w:r>
-      <w:r>
-        <w:rPr>
-          <w:rFonts w:cs="Arial"/>
-        </w:rPr>
-        <w:t xml:space="preserve"> por: </w:t>
-      </w:r>
-      <w:r>
-        <w:rPr>
-          <w:rFonts w:cs="Arial"/>
-        </w:rPr>
-        <w:t>vector</w:t>
-      </w:r>
-      <w:r>
-        <w:rPr>
-          <w:rFonts w:cs="Arial"/>
-        </w:rPr>
-        <w:t xml:space="preserve"> de tiempo, posición (latitud y longitud</w:t>
-      </w:r>
-      <w:r>
-        <w:rPr>
-          <w:rFonts w:cs="Arial"/>
-        </w:rPr>
-        <w:t>, grados decimales</w:t>
-      </w:r>
-      <w:r>
-        <w:rPr>
-          <w:rFonts w:cs="Arial"/>
-        </w:rPr>
-        <w:t>), velocidad</w:t>
-      </w:r>
-      <w:r>
-        <w:rPr>
-          <w:rFonts w:cs="Arial"/>
-        </w:rPr>
-        <w:t xml:space="preserve"> (m/s)</w:t>
-      </w:r>
-      <w:r>
-        <w:rPr>
-          <w:rFonts w:cs="Arial"/>
-        </w:rPr>
-        <w:t>, distancia recorrida</w:t>
-      </w:r>
-      <w:r>
-        <w:rPr>
-          <w:rFonts w:cs="Arial"/>
-        </w:rPr>
-        <w:t xml:space="preserve"> (m)</w:t>
-      </w:r>
-      <w:r>
-        <w:rPr>
-          <w:rFonts w:cs="Arial"/>
-        </w:rPr>
-        <w:t>, dirección del desplazamiento (grados), dirección del desplazamiento (</w:t>
-      </w:r>
-      <w:r>
-        <w:rPr>
-          <w:rFonts w:cs="Arial"/>
-        </w:rPr>
-        <w:t xml:space="preserve">cadena de </w:t>
-      </w:r>
-      <w:r>
-        <w:rPr>
-          <w:rFonts w:cs="Arial"/>
-        </w:rPr>
-        <w:t>texto), temperatura</w:t>
-      </w:r>
-      <w:r>
-        <w:rPr>
-          <w:rFonts w:cs="Arial"/>
-        </w:rPr>
-        <w:t xml:space="preserve"> </w:t>
-      </w:r>
-      <w:r>
-        <w:rPr>
-          <w:rFonts w:cs="Arial"/>
-        </w:rPr>
-        <w:t xml:space="preserve">sensor primario </w:t>
-      </w:r>
-      <w:r>
-        <w:rPr>
-          <w:rFonts w:cs="Arial"/>
-        </w:rPr>
-        <w:t>(grados centígrados)</w:t>
-      </w:r>
-      <w:r>
-        <w:rPr>
-          <w:rFonts w:cs="Arial"/>
-        </w:rPr>
-        <w:t>, temperatura sensor secundario (grados centígrados), aceleraciones horizontales y verticales en m/s</w:t>
-      </w:r>
-      <w:r>
-        <w:rPr>
-          <w:rFonts w:cs="Arial"/>
-          <w:vertAlign w:val="superscript"/>
-        </w:rPr>
-        <w:t>2</w:t>
-      </w:r>
-      <w:r>
-        <w:rPr>
-          <w:rFonts w:cs="Arial"/>
-        </w:rPr>
-        <w:t xml:space="preserve"> y voltaje</w:t>
-      </w:r>
-      <w:r>
-        <w:rPr>
-          <w:rFonts w:cs="Arial"/>
-        </w:rPr>
-        <w:t xml:space="preserve"> (voltios).</w:t>
-      </w:r>
-      <w:r>
-        <w:rPr>
-          <w:rFonts w:cs="Arial"/>
-        </w:rPr>
-        <w:t xml:space="preserve"> </w:t>
-      </w:r>
-      <w:r>
-        <w:rPr>
-          <w:rFonts w:cs="Arial"/>
-        </w:rPr>
-        <w:t xml:space="preserve">La evidencia de la información de las primeras 24 horas de transmisión de cada sonda se encuentra en el </w:t>
-      </w:r>
-      <w:r>
-        <w:rPr>
-          <w:rFonts w:cs="Arial"/>
-        </w:rPr>
-        <w:fldChar w:fldCharType="begin"/>
-      </w:r>
-      <w:r>
-        <w:rPr>
-          <w:rFonts w:cs="Arial"/>
-        </w:rPr>
-        <w:instrText xml:space="preserve"> REF _Ref221185985 \h </w:instrText>
-      </w:r>
-      <w:r>
-        <w:rPr>
-          <w:rFonts w:cs="Arial"/>
-        </w:rPr>
-        <w:instrText xml:space="preserve"> \* MERGEFORMAT </w:instrText>
-      </w:r>
-      <w:r>
-        <w:rPr>
-          <w:rFonts w:cs="Arial"/>
-        </w:rPr>
-      </w:r>
-      <w:r>
-        <w:rPr>
-          <w:rFonts w:cs="Arial"/>
-        </w:rPr>
-        <w:fldChar w:fldCharType="separate"/>
-      </w:r>
-      <w:r>
-        <w:rPr>
-          <w:rStyle w:val="Title1"/>
-        </w:rPr>
-        <w:t>ANEXO 2: PRUEBAS DE TRANSMISIÓN PREVIAS AL DESPLIEGUE</w:t>
-      </w:r>
-      <w:r>
-        <w:rPr>
-          <w:rFonts w:cs="Arial"/>
-        </w:rPr>
-        <w:fldChar w:fldCharType="end"/>
-      </w:r>
-      <w:r>
-        <w:rPr>
-          <w:rFonts w:cs="Arial"/>
-        </w:rPr>
-        <w:t xml:space="preserve">. </w:t>
-      </w:r>
-      <w:r>
-        <w:rPr>
-          <w:rFonts w:cs="Arial"/>
-        </w:rPr>
-        <w:t>A continuación</w:t>
-      </w:r>
-      <w:r>
-        <w:rPr>
-          <w:rFonts w:cs="Arial"/>
-        </w:rPr>
-        <w:t>,</w:t>
-      </w:r>
-      <w:r>
-        <w:rPr>
-          <w:rFonts w:cs="Arial"/>
-        </w:rPr>
-        <w:t xml:space="preserve"> se muestra</w:t>
-      </w:r>
-      <w:r>
-        <w:rPr>
-          <w:rFonts w:cs="Arial"/>
-        </w:rPr>
-        <w:t>n</w:t>
-      </w:r>
-      <w:r>
-        <w:rPr>
-          <w:rFonts w:cs="Arial"/>
-        </w:rPr>
-        <w:t xml:space="preserve"> la</w:t>
-      </w:r>
-      <w:r>
-        <w:rPr>
-          <w:rFonts w:cs="Arial"/>
-        </w:rPr>
-        <w:t>s</w:t>
-      </w:r>
-      <w:r>
-        <w:rPr>
-          <w:rFonts w:cs="Arial"/>
-        </w:rPr>
-        <w:t xml:space="preserve"> serie</w:t>
-      </w:r>
-      <w:r>
-        <w:rPr>
-          <w:rFonts w:cs="Arial"/>
-        </w:rPr>
-        <w:t>s</w:t>
-      </w:r>
-      <w:r>
-        <w:rPr>
-          <w:rFonts w:cs="Arial"/>
-        </w:rPr>
-        <w:t xml:space="preserve"> de tiempo</w:t>
-      </w:r>
-      <w:r>
-        <w:rPr>
-          <w:rFonts w:cs="Arial"/>
-        </w:rPr>
-        <w:t xml:space="preserve"> </w:t>
-      </w:r>
-      <w:r>
-        <w:rPr>
-          <w:rFonts w:cs="Arial"/>
-        </w:rPr>
-        <w:t>con el</w:t>
-      </w:r>
-      <w:r>
-        <w:rPr>
-          <w:rFonts w:cs="Arial"/>
-        </w:rPr>
-        <w:t xml:space="preserve"> estado de las baterías</w:t>
-      </w:r>
-      <w:r>
-        <w:rPr>
-          <w:rFonts w:cs="Arial"/>
-        </w:rPr>
-        <w:t xml:space="preserve"> </w:t>
-      </w:r>
-      <w:r>
-        <w:rPr>
-          <w:rFonts w:cs="Arial"/>
-        </w:rPr>
-        <w:t xml:space="preserve">durante las pruebas de funcionamiento </w:t>
-      </w:r>
-      <w:r>
-        <w:rPr>
-          <w:rFonts w:cs="Arial"/>
-        </w:rPr>
-        <w:t>para cada una de las sondas</w:t>
-      </w:r>
-      <w:r>
-        <w:rPr>
-          <w:rFonts w:cs="Arial"/>
-        </w:rPr>
-        <w:t xml:space="preserve"> </w:t>
-      </w:r>
-      <w:r>
-        <w:rPr>
-          <w:rFonts w:cs="Arial"/>
-        </w:rPr>
-        <w:t xml:space="preserve">oceanográficas </w:t>
-      </w:r>
-      <w:r>
-        <w:rPr>
-          <w:rFonts w:cs="Arial"/>
-        </w:rPr>
-        <w:t>(</w:t>
-      </w:r>
-      <w:r>
-        <w:rPr>
-          <w:rFonts w:cs="Arial"/>
-        </w:rPr>
-        <w:t>&lt;&lt;</w:t>
-      </w:r>
-      <w:proofErr w:type="spellStart"/>
-      <w:r>
-        <w:rPr>
-          <w:rFonts w:cs="Arial"/>
-        </w:rPr>
-        <w:t>ref_pruebas_</w:t>
-      </w:r>
-      <w:r>
-        <w:rPr>
-          <w:rFonts w:cs="Arial"/>
-        </w:rPr>
-        <w:t>baterias</w:t>
-      </w:r>
-      <w:proofErr w:type="spellEnd"/>
-      <w:r>
-        <w:rPr>
-          <w:rFonts w:cs="Arial"/>
-        </w:rPr>
-        <w:t>&gt;&gt;</w:t>
-      </w:r>
-      <w:r>
-        <w:rPr>
-          <w:rFonts w:cs="Arial"/>
-        </w:rPr>
-        <w:t>)</w:t>
-      </w:r>
-      <w:r>
-        <w:rPr>
-          <w:rFonts w:cs="Arial"/>
-        </w:rPr>
-        <w:t xml:space="preserve">, y los mapas de las posiciones </w:t>
-      </w:r>
-      <w:r>
-        <w:rPr>
-          <w:rFonts w:cs="Arial"/>
-        </w:rPr>
-        <w:t>transmitidas (</w:t>
-      </w:r>
-      <w:r>
-        <w:rPr>
-          <w:rFonts w:cs="Arial"/>
-        </w:rPr>
-        <w:t>&lt;&lt;</w:t>
-      </w:r>
-      <w:proofErr w:type="spellStart"/>
-      <w:r>
-        <w:rPr>
-          <w:rFonts w:cs="Arial"/>
-        </w:rPr>
-        <w:t>ref_</w:t>
-      </w:r>
-      <w:r>
-        <w:t>ubicacion_durante_pruebas</w:t>
-      </w:r>
-      <w:proofErr w:type="spellEnd"/>
-      <w:r>
-        <w:rPr>
-          <w:rFonts w:cs="Arial"/>
-        </w:rPr>
-        <w:t>&gt;&gt;</w:t>
-      </w:r>
-      <w:r>
-        <w:rPr>
-          <w:rFonts w:cs="Arial"/>
-        </w:rPr>
-        <w:t xml:space="preserve">) </w:t>
-      </w:r>
-      <w:r>
-        <w:rPr>
-          <w:rFonts w:cs="Arial"/>
-        </w:rPr>
-        <w:t>durante las pruebas en laboratorio</w:t>
-      </w:r>
-      <w:r>
-        <w:rPr>
-          <w:rFonts w:cs="Arial"/>
-        </w:rPr>
-        <w:t>.</w:t>
-      </w:r>
+        <w:rPr>
+          <w:noProof/>
+        </w:rPr>
+      </w:pPr>
     </w:p>
     <w:p>
       <w:pPr>
-        <w:rPr>
-          <w:rFonts w:cs="Arial"/>
+        <w:pStyle w:val="Figura"/>
+        <w:rPr>
+          <w:noProof/>
         </w:rPr>
       </w:pPr>
       <w:r>
@@ -13556,6 +13539,9 @@
       </w:r>
     </w:p>
     <w:p>
+      <w:pPr>
+        <w:pStyle w:val="Figura"/>
+      </w:pPr>
       <w:r>
         <w:t>&lt;&lt;</w:t>
       </w:r>
@@ -13603,7 +13589,7 @@
           <w:szCs w:val="22"/>
           <w:lang w:eastAsia="es-MX"/>
         </w:rPr>
-        <w:t xml:space="preserve"> y puede visualizarse desde el momento en que la boya es desplegada hasta el momento en que se pierde comunicación con la </w:t>
+        <w:t xml:space="preserve"> y puede visualizarse desde </w:t>
       </w:r>
       <w:r>
         <w:rPr>
@@ -13611,7 +13597,7 @@
           <w:lang w:eastAsia="es-MX"/>
         </w:rPr>
         <w:lastRenderedPageBreak/>
-        <w:t xml:space="preserve">misma. </w:t>
+        <w:t xml:space="preserve">el momento en que la boya es desplegada hasta el momento en que se pierde comunicación con la misma. </w:t>
       </w:r>
       <w:r>
         <w:rPr>
@@ -13642,7 +13628,7 @@
           <w:rStyle w:val="Title1"/>
         </w:rPr>
       </w:pPr>
-      <w:bookmarkStart w:id="109" w:name="_Toc229049279"/>
+      <w:bookmarkStart w:id="108" w:name="_Toc229049279"/>
       <w:r>
         <w:rPr>
           <w:rStyle w:val="Title1"/>
@@ -13650,20 +13636,21 @@
         <w:lastRenderedPageBreak/>
         <w:t>CONCLUSION</w:t>
       </w:r>
-      <w:bookmarkStart w:id="110" w:name="_Toc239048372"/>
-      <w:bookmarkStart w:id="111" w:name="_Toc239003245"/>
-      <w:bookmarkStart w:id="112" w:name="_Toc238907546"/>
-      <w:bookmarkStart w:id="113" w:name="_Toc216302232"/>
-      <w:bookmarkStart w:id="114" w:name="_Toc216225393"/>
-      <w:bookmarkStart w:id="115" w:name="_Toc216223757"/>
-      <w:bookmarkStart w:id="116" w:name="_Toc216223366"/>
-      <w:bookmarkStart w:id="117" w:name="_Toc215712797"/>
-      <w:bookmarkStart w:id="118" w:name="_Toc215682794"/>
-      <w:bookmarkStart w:id="119" w:name="_Toc215682689"/>
-      <w:bookmarkStart w:id="120" w:name="_Toc215675354"/>
-      <w:bookmarkStart w:id="121" w:name="_Toc215578727"/>
-      <w:bookmarkStart w:id="122" w:name="_Toc215548253"/>
-      <w:bookmarkStart w:id="123" w:name="_Toc215370590"/>
+      <w:bookmarkStart w:id="109" w:name="_Toc239048372"/>
+      <w:bookmarkStart w:id="110" w:name="_Toc239003245"/>
+      <w:bookmarkStart w:id="111" w:name="_Toc238907546"/>
+      <w:bookmarkStart w:id="112" w:name="_Toc216302232"/>
+      <w:bookmarkStart w:id="113" w:name="_Toc216225393"/>
+      <w:bookmarkStart w:id="114" w:name="_Toc216223757"/>
+      <w:bookmarkStart w:id="115" w:name="_Toc216223366"/>
+      <w:bookmarkStart w:id="116" w:name="_Toc215712797"/>
+      <w:bookmarkStart w:id="117" w:name="_Toc215682794"/>
+      <w:bookmarkStart w:id="118" w:name="_Toc215682689"/>
+      <w:bookmarkStart w:id="119" w:name="_Toc215675354"/>
+      <w:bookmarkStart w:id="120" w:name="_Toc215578727"/>
+      <w:bookmarkStart w:id="121" w:name="_Toc215548253"/>
+      <w:bookmarkStart w:id="122" w:name="_Toc215370590"/>
+      <w:bookmarkEnd w:id="109"/>
       <w:bookmarkEnd w:id="110"/>
       <w:bookmarkEnd w:id="111"/>
       <w:bookmarkEnd w:id="112"/>
@@ -13677,14 +13664,13 @@
       <w:bookmarkEnd w:id="120"/>
       <w:bookmarkEnd w:id="121"/>
       <w:bookmarkEnd w:id="122"/>
-      <w:bookmarkEnd w:id="123"/>
       <w:r>
         <w:rPr>
           <w:rStyle w:val="Title1"/>
         </w:rPr>
         <w:t>ES</w:t>
       </w:r>
-      <w:bookmarkEnd w:id="109"/>
+      <w:bookmarkEnd w:id="108"/>
     </w:p>
     <w:p>
       <w:pPr>
@@ -13693,7 +13679,7 @@
           <w:szCs w:val="22"/>
         </w:rPr>
       </w:pPr>
-      <w:bookmarkStart w:id="124" w:name="_Hlk209524998"/>
+      <w:bookmarkStart w:id="123" w:name="_Hlk209524998"/>
       <w:r>
         <w:rPr>
           <w:szCs w:val="22"/>
@@ -13728,7 +13714,7 @@
         </w:rPr>
         <w:t xml:space="preserve"> de México S. A. de C. V. (ASM) y el Centro de Investigación Científica y de Educación Superior de Ensenada (CICESE), relacionados con el concepto </w:t>
       </w:r>
-      <w:bookmarkEnd w:id="124"/>
+      <w:bookmarkEnd w:id="123"/>
       <w:r>
         <w:rPr>
           <w:i/>
@@ -13920,7 +13906,7 @@
           <w:szCs w:val="22"/>
         </w:rPr>
       </w:pPr>
-      <w:bookmarkStart w:id="125" w:name="_Hlk209525103"/>
+      <w:bookmarkStart w:id="124" w:name="_Hlk209525103"/>
       <w:r>
         <w:rPr>
           <w:szCs w:val="22"/>
@@ -13979,7 +13965,7 @@
         <w:t>Se describieron las pruebas de funcionamiento realizadas a las sondas para verificar el buen funcionamiento previo al despliegue.</w:t>
       </w:r>
     </w:p>
-    <w:bookmarkEnd w:id="125"/>
+    <w:bookmarkEnd w:id="124"/>
     <w:p>
       <w:pPr>
         <w:rPr>
@@ -14051,14 +14037,14 @@
         </w:rPr>
         <w:t xml:space="preserve"> se trasmitieran por telemetría y se recibieran por los servidores </w:t>
       </w:r>
-      <w:bookmarkStart w:id="126" w:name="_Hlk209525171"/>
+      <w:bookmarkStart w:id="125" w:name="_Hlk209525171"/>
       <w:r>
         <w:rPr>
           <w:szCs w:val="22"/>
         </w:rPr>
         <w:t xml:space="preserve">en tierra </w:t>
       </w:r>
-      <w:bookmarkEnd w:id="126"/>
+      <w:bookmarkEnd w:id="125"/>
       <w:r>
         <w:rPr>
           <w:szCs w:val="22"/>
@@ -14076,12 +14062,12 @@
       <w:pPr>
         <w:pStyle w:val="Ttulo1"/>
       </w:pPr>
-      <w:bookmarkStart w:id="127" w:name="_Toc229049280"/>
+      <w:bookmarkStart w:id="126" w:name="_Toc229049280"/>
       <w:r>
         <w:lastRenderedPageBreak/>
         <w:t>REFERENCIAS</w:t>
       </w:r>
-      <w:bookmarkEnd w:id="127"/>
+      <w:bookmarkEnd w:id="126"/>
     </w:p>
     <w:p>
       <w:pPr>
@@ -14398,7 +14384,7 @@
                 <w:lang w:val="en-US"/>
               </w:rPr>
             </w:pPr>
-            <w:bookmarkStart w:id="128" w:name="_Hlk218066363"/>
+            <w:bookmarkStart w:id="127" w:name="_Hlk218066363"/>
           </w:p>
           <w:p>
             <w:pPr>
@@ -14423,7 +14409,7 @@
                 <w:rFonts w:cs="Microsoft Sans Serif"/>
               </w:rPr>
             </w:pPr>
-            <w:bookmarkStart w:id="129" w:name="_Hlk121125304"/>
+            <w:bookmarkStart w:id="128" w:name="_Hlk121125304"/>
             <w:r>
               <w:rPr>
                 <w:rFonts w:cs="Microsoft Sans Serif"/>
@@ -14459,8 +14445,8 @@
               <w:t>+52 646 1750500, x27865</w:t>
             </w:r>
           </w:p>
-          <w:bookmarkStart w:id="130" w:name="_Hlk218066398"/>
-          <w:bookmarkEnd w:id="128"/>
+          <w:bookmarkStart w:id="129" w:name="_Hlk218066398"/>
+          <w:bookmarkEnd w:id="127"/>
           <w:p>
             <w:pPr>
               <w:jc w:val="center"/>
@@ -14493,8 +14479,8 @@
               <w:fldChar w:fldCharType="end"/>
             </w:r>
           </w:p>
+          <w:bookmarkEnd w:id="128"/>
           <w:bookmarkEnd w:id="129"/>
-          <w:bookmarkEnd w:id="130"/>
           <w:p>
             <w:pPr>
               <w:jc w:val="center"/>
@@ -14530,7 +14516,7 @@
           <w:rStyle w:val="Title1"/>
         </w:rPr>
       </w:pPr>
-      <w:bookmarkStart w:id="131" w:name="_Toc229049281"/>
+      <w:bookmarkStart w:id="130" w:name="_Toc229049281"/>
       <w:r>
         <w:rPr>
           <w:rStyle w:val="Title1"/>
@@ -14538,172 +14524,7 @@
         <w:lastRenderedPageBreak/>
         <w:t>ANEXO 1: PRUEBAS DE FUNCIONAMIENTO PREVIAS AL DESPLIEGUE</w:t>
       </w:r>
-      <w:bookmarkEnd w:id="131"/>
-    </w:p>
-    <w:p>
-      <w:pPr>
-        <w:pStyle w:val="NormalWeb"/>
-        <w:ind w:firstLine="284"/>
-        <w:jc w:val="both"/>
-        <w:rPr>
-          <w:rStyle w:val="Caracteresdenotaalpie"/>
-          <w:rFonts w:ascii="Microsoft Sans Serif" w:hAnsi="Microsoft Sans Serif" w:cs="Microsoft Sans Serif"/>
-          <w:vertAlign w:val="baseline"/>
-        </w:rPr>
-      </w:pPr>
-      <w:r>
-        <w:rPr>
-          <w:rStyle w:val="Caracteresdenotaalpie"/>
-          <w:rFonts w:ascii="Microsoft Sans Serif" w:hAnsi="Microsoft Sans Serif" w:cs="Microsoft Sans Serif"/>
-          <w:vertAlign w:val="baseline"/>
-        </w:rPr>
-        <w:t>A continuación</w:t>
-      </w:r>
-      <w:r>
-        <w:rPr>
-          <w:rStyle w:val="Caracteresdenotaalpie"/>
-          <w:rFonts w:ascii="Microsoft Sans Serif" w:hAnsi="Microsoft Sans Serif" w:cs="Microsoft Sans Serif"/>
-          <w:vertAlign w:val="baseline"/>
-        </w:rPr>
-        <w:t>,</w:t>
-      </w:r>
-      <w:r>
-        <w:rPr>
-          <w:rStyle w:val="Caracteresdenotaalpie"/>
-          <w:rFonts w:ascii="Microsoft Sans Serif" w:hAnsi="Microsoft Sans Serif" w:cs="Microsoft Sans Serif"/>
-          <w:vertAlign w:val="baseline"/>
-        </w:rPr>
-        <w:t xml:space="preserve"> se presentan la</w:t>
-      </w:r>
-      <w:r>
-        <w:rPr>
-          <w:rStyle w:val="Caracteresdenotaalpie"/>
-          <w:rFonts w:ascii="Microsoft Sans Serif" w:hAnsi="Microsoft Sans Serif" w:cs="Microsoft Sans Serif"/>
-          <w:vertAlign w:val="baseline"/>
-        </w:rPr>
-        <w:t>s</w:t>
-      </w:r>
-      <w:r>
-        <w:rPr>
-          <w:rStyle w:val="Caracteresdenotaalpie"/>
-          <w:rFonts w:ascii="Microsoft Sans Serif" w:hAnsi="Microsoft Sans Serif" w:cs="Microsoft Sans Serif"/>
-          <w:vertAlign w:val="baseline"/>
-        </w:rPr>
-        <w:t xml:space="preserve"> evidencia</w:t>
-      </w:r>
-      <w:r>
-        <w:rPr>
-          <w:rStyle w:val="Caracteresdenotaalpie"/>
-          <w:rFonts w:ascii="Microsoft Sans Serif" w:hAnsi="Microsoft Sans Serif" w:cs="Microsoft Sans Serif"/>
-          <w:vertAlign w:val="baseline"/>
-        </w:rPr>
-        <w:t>s</w:t>
-      </w:r>
-      <w:r>
-        <w:rPr>
-          <w:rStyle w:val="Caracteresdenotaalpie"/>
-          <w:rFonts w:ascii="Microsoft Sans Serif" w:hAnsi="Microsoft Sans Serif" w:cs="Microsoft Sans Serif"/>
-          <w:vertAlign w:val="baseline"/>
-        </w:rPr>
-        <w:t xml:space="preserve"> de las pruebas de funcionamiento realizadas en el laboratorio, las cuales incluyen las pruebas de las conexiones físicas, el cableado, el montaje y el sellado hermético, así como las pruebas de transmisión y carga de energía.</w:t>
-      </w:r>
-    </w:p>
-    <w:p>
-      <w:pPr>
-        <w:pStyle w:val="NormalWeb"/>
-        <w:ind w:firstLine="284"/>
-        <w:jc w:val="center"/>
-        <w:rPr>
-          <w:rFonts w:ascii="Microsoft Sans Serif" w:hAnsi="Microsoft Sans Serif" w:cs="Microsoft Sans Serif"/>
-        </w:rPr>
-      </w:pPr>
-      <w:r>
-        <w:rPr>
-          <w:rFonts w:ascii="Microsoft Sans Serif" w:hAnsi="Microsoft Sans Serif" w:cs="Microsoft Sans Serif"/>
-          <w:noProof/>
-        </w:rPr>
-        <w:t>&lt;&lt;fig_pruebas_de_funcionamiento&gt;</w:t>
-      </w:r>
-      <w:r>
-        <w:rPr>
-          <w:rFonts w:ascii="Microsoft Sans Serif" w:hAnsi="Microsoft Sans Serif" w:cs="Microsoft Sans Serif"/>
-          <w:noProof/>
-        </w:rPr>
-        <w:t>&gt;</w:t>
-      </w:r>
-    </w:p>
-    <w:p>
-      <w:pPr>
-        <w:pStyle w:val="NormalWeb"/>
-        <w:ind w:firstLine="284"/>
-        <w:jc w:val="center"/>
-        <w:rPr>
-          <w:rStyle w:val="Caracteresdenotaalpie"/>
-          <w:rFonts w:cs="Microsoft Sans Serif"/>
-          <w:vertAlign w:val="baseline"/>
-        </w:rPr>
-      </w:pPr>
-      <w:r>
-        <w:rPr>
-          <w:rStyle w:val="Caracteresdenotaalpie"/>
-          <w:rFonts w:cs="Microsoft Sans Serif"/>
-          <w:vertAlign w:val="baseline"/>
-        </w:rPr>
-        <w:br w:type="page"/>
-      </w:r>
-    </w:p>
-    <w:p>
-      <w:pPr>
-        <w:pStyle w:val="Ttulo1"/>
-        <w:rPr>
-          <w:rStyle w:val="Title1"/>
-        </w:rPr>
-      </w:pPr>
-      <w:bookmarkStart w:id="132" w:name="_Ref221185985"/>
-      <w:bookmarkStart w:id="133" w:name="_Ref217405568"/>
-      <w:bookmarkStart w:id="134" w:name="_Ref217405581"/>
-      <w:bookmarkStart w:id="135" w:name="_Toc229049282"/>
-      <w:r>
-        <w:rPr>
-          <w:rStyle w:val="Title1"/>
-        </w:rPr>
-        <w:lastRenderedPageBreak/>
-        <w:t xml:space="preserve">ANEXO </w:t>
-      </w:r>
-      <w:r>
-        <w:rPr>
-          <w:rStyle w:val="Title1"/>
-        </w:rPr>
-        <w:t>2</w:t>
-      </w:r>
-      <w:r>
-        <w:rPr>
-          <w:rStyle w:val="Title1"/>
-        </w:rPr>
-        <w:t>:</w:t>
-      </w:r>
-      <w:r>
-        <w:rPr>
-          <w:rStyle w:val="Title1"/>
-        </w:rPr>
-        <w:t xml:space="preserve"> PRUEBAS DE </w:t>
-      </w:r>
-      <w:r>
-        <w:rPr>
-          <w:rStyle w:val="Title1"/>
-        </w:rPr>
-        <w:t>TRANSMISIÓN</w:t>
-      </w:r>
-      <w:r>
-        <w:rPr>
-          <w:rStyle w:val="Title1"/>
-        </w:rPr>
-        <w:t xml:space="preserve"> PREVIAS AL DESPLIEGUE</w:t>
-      </w:r>
-      <w:bookmarkEnd w:id="132"/>
-      <w:bookmarkEnd w:id="133"/>
-      <w:bookmarkEnd w:id="134"/>
-      <w:bookmarkEnd w:id="135"/>
+      <w:bookmarkEnd w:id="130"/>
     </w:p>
     <w:p>
       <w:pPr>
@@ -14723,7 +14544,7 @@
           <w:rFonts w:ascii="Microsoft Sans Serif" w:hAnsi="Microsoft Sans Serif" w:cs="Microsoft Sans Serif"/>
           <w:vertAlign w:val="baseline"/>
         </w:rPr>
-        <w:t xml:space="preserve">Los datos de las pruebas de transmisión, recepción y almacenamiento realizadas en el laboratorio se almacenan en archivos separados por coma (CSV). </w:t>
+        <w:t>A continuación</w:t>
       </w:r>
       <w:r>
         <w:rPr>
@@ -14731,7 +14552,7 @@
           <w:rFonts w:ascii="Microsoft Sans Serif" w:hAnsi="Microsoft Sans Serif" w:cs="Microsoft Sans Serif"/>
           <w:vertAlign w:val="baseline"/>
         </w:rPr>
-        <w:t>Las siguientes figuras muestran un ejemplo de los datos transmitidos por cada una de las sondas durante las pruebas de funcionamiento en el laboratorio</w:t>
+        <w:t>,</w:t>
       </w:r>
       <w:r>
         <w:rPr>
@@ -14739,58 +14560,203 @@
           <w:rFonts w:ascii="Microsoft Sans Serif" w:hAnsi="Microsoft Sans Serif" w:cs="Microsoft Sans Serif"/>
           <w:vertAlign w:val="baseline"/>
         </w:rPr>
-        <w:t>.</w:t>
+        <w:t xml:space="preserve"> se presentan la</w:t>
+      </w:r>
+      <w:r>
+        <w:rPr>
+          <w:rStyle w:val="Caracteresdenotaalpie"/>
+          <w:rFonts w:ascii="Microsoft Sans Serif" w:hAnsi="Microsoft Sans Serif" w:cs="Microsoft Sans Serif"/>
+          <w:vertAlign w:val="baseline"/>
+        </w:rPr>
+        <w:t>s</w:t>
+      </w:r>
+      <w:r>
+        <w:rPr>
+          <w:rStyle w:val="Caracteresdenotaalpie"/>
+          <w:rFonts w:ascii="Microsoft Sans Serif" w:hAnsi="Microsoft Sans Serif" w:cs="Microsoft Sans Serif"/>
+          <w:vertAlign w:val="baseline"/>
+        </w:rPr>
+        <w:t xml:space="preserve"> evidencia</w:t>
+      </w:r>
+      <w:r>
+        <w:rPr>
+          <w:rStyle w:val="Caracteresdenotaalpie"/>
+          <w:rFonts w:ascii="Microsoft Sans Serif" w:hAnsi="Microsoft Sans Serif" w:cs="Microsoft Sans Serif"/>
+          <w:vertAlign w:val="baseline"/>
+        </w:rPr>
+        <w:t>s</w:t>
+      </w:r>
+      <w:r>
+        <w:rPr>
+          <w:rStyle w:val="Caracteresdenotaalpie"/>
+          <w:rFonts w:ascii="Microsoft Sans Serif" w:hAnsi="Microsoft Sans Serif" w:cs="Microsoft Sans Serif"/>
+          <w:vertAlign w:val="baseline"/>
+        </w:rPr>
+        <w:t xml:space="preserve"> de las pruebas de funcionamiento realizadas en el laboratorio, las cuales incluyen las pruebas de las conexiones físicas, el cableado, el montaje y el sellado hermético, así como las pruebas de transmisión y carga de energía.</w:t>
       </w:r>
     </w:p>
     <w:p>
       <w:pPr>
+        <w:pStyle w:val="NormalWeb"/>
+        <w:spacing w:beforeAutospacing="0" w:afterAutospacing="0"/>
+        <w:jc w:val="both"/>
+        <w:rPr>
+          <w:rStyle w:val="Caracteresdenotaalpie"/>
+          <w:rFonts w:ascii="Microsoft Sans Serif" w:hAnsi="Microsoft Sans Serif" w:cs="Microsoft Sans Serif"/>
+          <w:vertAlign w:val="baseline"/>
+        </w:rPr>
+      </w:pPr>
+    </w:p>
+    <w:p>
+      <w:pPr>
+        <w:pStyle w:val="Figura"/>
+        <w:rPr>
+          <w:rStyle w:val="Caracteresdenotaalpie"/>
+          <w:vertAlign w:val="baseline"/>
+        </w:rPr>
+      </w:pPr>
+      <w:r>
+        <w:rPr>
+          <w:noProof/>
+        </w:rPr>
+        <w:t>&lt;&lt;fig_pruebas_de_funcionamiento&gt;</w:t>
+      </w:r>
+      <w:r>
+        <w:rPr>
+          <w:noProof/>
+        </w:rPr>
+        <w:t>&gt;</w:t>
+      </w:r>
+      <w:r>
         <w:rPr>
           <w:rStyle w:val="Caracteresdenotaalpie"/>
           <w:rFonts w:cs="Microsoft Sans Serif"/>
           <w:vertAlign w:val="baseline"/>
         </w:rPr>
-      </w:pPr>
+        <w:br w:type="page"/>
+      </w:r>
     </w:p>
     <w:p>
       <w:pPr>
+        <w:pStyle w:val="Ttulo1"/>
+        <w:rPr>
+          <w:rStyle w:val="Title1"/>
+        </w:rPr>
+      </w:pPr>
+      <w:bookmarkStart w:id="131" w:name="_Ref221185985"/>
+      <w:bookmarkStart w:id="132" w:name="_Ref217405568"/>
+      <w:bookmarkStart w:id="133" w:name="_Ref217405581"/>
+      <w:bookmarkStart w:id="134" w:name="_Toc229049282"/>
+      <w:r>
+        <w:rPr>
+          <w:rStyle w:val="Title1"/>
+        </w:rPr>
+        <w:lastRenderedPageBreak/>
+        <w:t xml:space="preserve">ANEXO </w:t>
+      </w:r>
+      <w:r>
+        <w:rPr>
+          <w:rStyle w:val="Title1"/>
+        </w:rPr>
+        <w:t>2</w:t>
+      </w:r>
+      <w:r>
+        <w:rPr>
+          <w:rStyle w:val="Title1"/>
+        </w:rPr>
+        <w:t>:</w:t>
+      </w:r>
+      <w:r>
+        <w:rPr>
+          <w:rStyle w:val="Title1"/>
+        </w:rPr>
+        <w:t xml:space="preserve"> PRUEBAS DE </w:t>
+      </w:r>
+      <w:r>
+        <w:rPr>
+          <w:rStyle w:val="Title1"/>
+        </w:rPr>
+        <w:t>TRANSMISIÓN</w:t>
+      </w:r>
+      <w:r>
+        <w:rPr>
+          <w:rStyle w:val="Title1"/>
+        </w:rPr>
+        <w:t xml:space="preserve"> PREVIAS AL DESPLIEGUE</w:t>
+      </w:r>
+      <w:bookmarkEnd w:id="131"/>
+      <w:bookmarkEnd w:id="132"/>
+      <w:bookmarkEnd w:id="133"/>
+      <w:bookmarkEnd w:id="134"/>
+    </w:p>
+    <w:p>
+      <w:pPr>
         <w:pStyle w:val="NormalWeb"/>
-        <w:keepNext/>
         <w:spacing w:beforeAutospacing="0" w:afterAutospacing="0"/>
-        <w:jc w:val="center"/>
-        <w:rPr>
+        <w:ind w:firstLine="284"/>
+        <w:jc w:val="both"/>
+        <w:rPr>
+          <w:rStyle w:val="Caracteresdenotaalpie"/>
           <w:rFonts w:ascii="Microsoft Sans Serif" w:hAnsi="Microsoft Sans Serif" w:cs="Microsoft Sans Serif"/>
-        </w:rPr>
-      </w:pPr>
-      <w:r>
-        <w:rPr>
+          <w:vertAlign w:val="baseline"/>
+        </w:rPr>
+      </w:pPr>
+      <w:r>
+        <w:rPr>
+          <w:rStyle w:val="Caracteresdenotaalpie"/>
           <w:rFonts w:ascii="Microsoft Sans Serif" w:hAnsi="Microsoft Sans Serif" w:cs="Microsoft Sans Serif"/>
-        </w:rPr>
+          <w:vertAlign w:val="baseline"/>
+        </w:rPr>
+        <w:t xml:space="preserve">Los datos de las pruebas de transmisión, recepción y almacenamiento realizadas en el laboratorio se almacenan en archivos separados por coma (CSV). </w:t>
+      </w:r>
+      <w:r>
+        <w:rPr>
+          <w:rStyle w:val="Caracteresdenotaalpie"/>
+          <w:rFonts w:ascii="Microsoft Sans Serif" w:hAnsi="Microsoft Sans Serif" w:cs="Microsoft Sans Serif"/>
+          <w:vertAlign w:val="baseline"/>
+        </w:rPr>
+        <w:t>Las siguientes figuras muestran un ejemplo de los datos transmitidos por cada una de las sondas durante las pruebas de funcionamiento en el laboratorio</w:t>
+      </w:r>
+      <w:r>
+        <w:rPr>
+          <w:rStyle w:val="Caracteresdenotaalpie"/>
+          <w:rFonts w:ascii="Microsoft Sans Serif" w:hAnsi="Microsoft Sans Serif" w:cs="Microsoft Sans Serif"/>
+          <w:vertAlign w:val="baseline"/>
+        </w:rPr>
+        <w:t>.</w:t>
+      </w:r>
+    </w:p>
+    <w:p>
+      <w:pPr>
+        <w:rPr>
+          <w:rStyle w:val="Caracteresdenotaalpie"/>
+          <w:rFonts w:cs="Microsoft Sans Serif"/>
+          <w:vertAlign w:val="baseline"/>
+        </w:rPr>
+      </w:pPr>
+    </w:p>
+    <w:p>
+      <w:pPr>
+        <w:pStyle w:val="Figura"/>
+      </w:pPr>
+      <w:r>
         <w:t>&lt;&lt;</w:t>
       </w:r>
       <w:proofErr w:type="spellStart"/>
       <w:r>
-        <w:rPr>
-          <w:rFonts w:ascii="Microsoft Sans Serif" w:hAnsi="Microsoft Sans Serif" w:cs="Microsoft Sans Serif"/>
-        </w:rPr>
         <w:t>fig_pruebas_</w:t>
       </w:r>
       <w:r>
-        <w:rPr>
-          <w:rFonts w:ascii="Microsoft Sans Serif" w:hAnsi="Microsoft Sans Serif" w:cs="Microsoft Sans Serif"/>
-        </w:rPr>
-        <w:t>de_</w:t>
-      </w:r>
-      <w:r>
-        <w:rPr>
-          <w:rFonts w:ascii="Microsoft Sans Serif" w:hAnsi="Microsoft Sans Serif" w:cs="Microsoft Sans Serif"/>
-        </w:rPr>
+        <w:t>de</w:t>
+      </w:r>
+      <w:r>
+        <w:t>_</w:t>
+      </w:r>
+      <w:r>
         <w:t>transmision</w:t>
       </w:r>
       <w:proofErr w:type="spellEnd"/>
       <w:r>
-        <w:rPr>
-          <w:rFonts w:ascii="Microsoft Sans Serif" w:hAnsi="Microsoft Sans Serif" w:cs="Microsoft Sans Serif"/>
-        </w:rPr>
         <w:t>&gt;&gt;</w:t>
       </w:r>
     </w:p>
@@ -15348,9 +15314,9 @@
           <w:rStyle w:val="Title1"/>
         </w:rPr>
       </w:pPr>
-      <w:bookmarkStart w:id="136" w:name="_Ref219907034"/>
-      <w:bookmarkStart w:id="137" w:name="_Ref220316895"/>
-      <w:bookmarkStart w:id="138" w:name="_Toc229049283"/>
+      <w:bookmarkStart w:id="135" w:name="_Ref219907034"/>
+      <w:bookmarkStart w:id="136" w:name="_Ref220316895"/>
+      <w:bookmarkStart w:id="137" w:name="_Toc229049283"/>
       <w:r>
         <w:rPr>
           <w:rStyle w:val="Title1"/>
@@ -15370,114 +15336,100 @@
         </w:rPr>
         <w:t>: PLAN DE CRUCERO</w:t>
       </w:r>
+      <w:bookmarkEnd w:id="135"/>
       <w:bookmarkEnd w:id="136"/>
       <w:bookmarkEnd w:id="137"/>
+    </w:p>
+    <w:p>
+      <w:pPr>
+        <w:keepNext/>
+        <w:rPr>
+          <w:noProof/>
+          <w14:ligatures w14:val="standardContextual"/>
+        </w:rPr>
+      </w:pPr>
+      <w:r>
+        <w:rPr>
+          <w:noProof/>
+          <w14:ligatures w14:val="standardContextual"/>
+        </w:rPr>
+        <w:t>&lt;&lt;</w:t>
+      </w:r>
+      <w:r>
+        <w:rPr>
+          <w:noProof/>
+          <w14:ligatures w14:val="standardContextual"/>
+        </w:rPr>
+        <w:t>ruta_</w:t>
+      </w:r>
+      <w:r>
+        <w:rPr>
+          <w:noProof/>
+          <w14:ligatures w14:val="standardContextual"/>
+        </w:rPr>
+        <w:t>plan_de_crucero&gt;&gt;</w:t>
+      </w:r>
+    </w:p>
+    <w:p>
+      <w:pPr>
+        <w:spacing w:line="240" w:lineRule="auto"/>
+        <w:jc w:val="left"/>
+        <w:rPr>
+          <w:rFonts w:cs="Microsoft Sans Serif"/>
+        </w:rPr>
+      </w:pPr>
+      <w:r>
+        <w:rPr>
+          <w:rFonts w:cs="Microsoft Sans Serif"/>
+        </w:rPr>
+        <w:br w:type="page"/>
+      </w:r>
+    </w:p>
+    <w:p>
+      <w:pPr>
+        <w:pStyle w:val="Ttulo1"/>
+        <w:rPr>
+          <w:rStyle w:val="Title1"/>
+        </w:rPr>
+      </w:pPr>
+      <w:bookmarkStart w:id="138" w:name="_Toc229049284"/>
+      <w:r>
+        <w:rPr>
+          <w:rStyle w:val="Title1"/>
+        </w:rPr>
+        <w:lastRenderedPageBreak/>
+        <w:t xml:space="preserve">ANEXO </w:t>
+      </w:r>
+      <w:r>
+        <w:rPr>
+          <w:rStyle w:val="Title1"/>
+        </w:rPr>
+        <w:t>4</w:t>
+      </w:r>
+      <w:r>
+        <w:rPr>
+          <w:rStyle w:val="Title1"/>
+        </w:rPr>
+        <w:t>: ANEXO FOTOGRÁFICO</w:t>
+      </w:r>
       <w:bookmarkEnd w:id="138"/>
     </w:p>
     <w:p>
       <w:pPr>
-        <w:keepNext/>
-        <w:rPr>
-          <w:noProof/>
-          <w14:ligatures w14:val="standardContextual"/>
-        </w:rPr>
-      </w:pPr>
-      <w:r>
-        <w:rPr>
-          <w:noProof/>
-          <w14:ligatures w14:val="standardContextual"/>
-        </w:rPr>
+        <w:pStyle w:val="Figura"/>
+      </w:pPr>
+      <w:r>
         <w:t>&lt;&lt;</w:t>
       </w:r>
-      <w:r>
-        <w:rPr>
-          <w:noProof/>
-          <w14:ligatures w14:val="standardContextual"/>
-        </w:rPr>
-        <w:t>ruta_</w:t>
-      </w:r>
-      <w:r>
-        <w:rPr>
-          <w:noProof/>
-          <w14:ligatures w14:val="standardContextual"/>
-        </w:rPr>
-        <w:t>plan_de_crucero&gt;&gt;</w:t>
-      </w:r>
-    </w:p>
-    <w:p>
-      <w:pPr>
-        <w:spacing w:line="240" w:lineRule="auto"/>
-        <w:jc w:val="left"/>
-        <w:rPr>
-          <w:rFonts w:cs="Microsoft Sans Serif"/>
-        </w:rPr>
-      </w:pPr>
-      <w:r>
-        <w:rPr>
-          <w:rFonts w:cs="Microsoft Sans Serif"/>
-        </w:rPr>
-        <w:br w:type="page"/>
-      </w:r>
-    </w:p>
-    <w:p>
-      <w:pPr>
-        <w:pStyle w:val="Ttulo1"/>
-        <w:rPr>
-          <w:rStyle w:val="Title1"/>
-        </w:rPr>
-      </w:pPr>
-      <w:bookmarkStart w:id="139" w:name="_Toc229049284"/>
-      <w:r>
-        <w:rPr>
-          <w:rStyle w:val="Title1"/>
-        </w:rPr>
-        <w:lastRenderedPageBreak/>
-        <w:t xml:space="preserve">ANEXO </w:t>
-      </w:r>
-      <w:r>
-        <w:rPr>
-          <w:rStyle w:val="Title1"/>
-        </w:rPr>
-        <w:t>4</w:t>
-      </w:r>
-      <w:r>
-        <w:rPr>
-          <w:rStyle w:val="Title1"/>
-        </w:rPr>
-        <w:t>: ANEXO FOTOGRÁFICO</w:t>
-      </w:r>
-      <w:bookmarkEnd w:id="139"/>
-    </w:p>
-    <w:p>
-      <w:pPr>
-        <w:pStyle w:val="Normal1"/>
-        <w:jc w:val="center"/>
-        <w:rPr>
-          <w:rFonts w:ascii="Microsoft Sans Serif" w:hAnsi="Microsoft Sans Serif" w:cs="Microsoft Sans Serif"/>
-          <w:szCs w:val="22"/>
-        </w:rPr>
-      </w:pPr>
-      <w:r>
-        <w:rPr>
-          <w:rFonts w:ascii="Microsoft Sans Serif" w:hAnsi="Microsoft Sans Serif" w:cs="Microsoft Sans Serif"/>
-          <w:szCs w:val="22"/>
-        </w:rPr>
-        <w:t>&lt;&lt;</w:t>
-      </w:r>
       <w:proofErr w:type="spellStart"/>
       <w:r>
-        <w:rPr>
-          <w:rFonts w:ascii="Microsoft Sans Serif" w:hAnsi="Microsoft Sans Serif" w:cs="Microsoft Sans Serif"/>
-          <w:szCs w:val="22"/>
-        </w:rPr>
-        <w:t>fig_anexo_fotografico</w:t>
+        <w:t>fig_anexo_</w:t>
+      </w:r>
+      <w:r>
+        <w:t>fotografico</w:t>
       </w:r>
       <w:proofErr w:type="spellEnd"/>
       <w:r>
-        <w:rPr>
-          <w:rFonts w:ascii="Microsoft Sans Serif" w:hAnsi="Microsoft Sans Serif" w:cs="Microsoft Sans Serif"/>
-          <w:szCs w:val="22"/>
-        </w:rPr>
         <w:t>&gt;&gt;</w:t>
       </w:r>
     </w:p>
@@ -18337,8 +18289,8 @@
             <w:ind w:hanging="107"/>
             <w:jc w:val="left"/>
           </w:pPr>
-          <w:bookmarkStart w:id="140" w:name="_Hlk218267088"/>
-          <w:bookmarkStart w:id="141" w:name="_Hlk218267089"/>
+          <w:bookmarkStart w:id="139" w:name="_Hlk218267088"/>
+          <w:bookmarkStart w:id="140" w:name="_Hlk218267089"/>
           <w:r>
             <w:rPr>
               <w:noProof/>
@@ -18609,8 +18561,8 @@
         </mc:Fallback>
       </mc:AlternateContent>
     </w:r>
+    <w:bookmarkEnd w:id="139"/>
     <w:bookmarkEnd w:id="140"/>
-    <w:bookmarkEnd w:id="141"/>
   </w:p>
 </w:hdr>
 </file>
@@ -23748,6 +23700,7 @@
   <w:style w:type="character" w:default="1" w:styleId="Fuentedeprrafopredeter">
     <w:name w:val="Default Paragraph Font"/>
     <w:uiPriority w:val="1"/>
+    <w:semiHidden/>
     <w:unhideWhenUsed/>
   </w:style>
   <w:style w:type="table" w:default="1" w:styleId="Tablanormal">
@@ -29270,10 +29223,10 @@
     <w:next w:val="Normal"/>
     <w:link w:val="CarcentradoCar"/>
     <w:qFormat/>
-    <w:rsid w:val="000D0457"/>
+    <w:rsid w:val="00EE4BC8"/>
     <w:pPr>
       <w:keepNext/>
-      <w:ind w:firstLine="360"/>
+      <w:spacing w:line="240" w:lineRule="auto"/>
       <w:jc w:val="center"/>
     </w:pPr>
     <w:rPr>
@@ -29285,7 +29238,7 @@
     <w:name w:val="Car_centrado Car"/>
     <w:basedOn w:val="Fuentedeprrafopredeter"/>
     <w:link w:val="Carcentrado"/>
-    <w:rsid w:val="000D0457"/>
+    <w:rsid w:val="00EE4BC8"/>
     <w:rPr>
       <w:color w:val="000000" w:themeColor="text1"/>
       <w:sz w:val="20"/>
@@ -29297,7 +29250,10 @@
     <w:next w:val="Normal"/>
     <w:link w:val="CarjustificadoCar"/>
     <w:qFormat/>
-    <w:rsid w:val="000D0457"/>
+    <w:rsid w:val="00EE4BC8"/>
+    <w:pPr>
+      <w:spacing w:line="240" w:lineRule="auto"/>
+    </w:pPr>
     <w:rPr>
       <w:color w:val="000000" w:themeColor="text1"/>
       <w:sz w:val="20"/>
@@ -29307,7 +29263,7 @@
     <w:name w:val="Car_justificado Car"/>
     <w:basedOn w:val="Fuentedeprrafopredeter"/>
     <w:link w:val="Carjustificado"/>
-    <w:rsid w:val="000D0457"/>
+    <w:rsid w:val="00EE4BC8"/>
     <w:rPr>
       <w:color w:val="000000" w:themeColor="text1"/>
       <w:sz w:val="20"/>

</xml_diff>

<commit_message>
ADD: Se crea el modulo que edita una plantilla
</commit_message>
<xml_diff>
--- a/crear_documentos/services/doc_101/plantilla.docx
+++ b/crear_documentos/services/doc_101/plantilla.docx
@@ -9101,7 +9101,19 @@
         <w:rPr>
           <w:rFonts w:cs="Arial"/>
         </w:rPr>
-        <w:t>&lt;&lt;descripción_actividades_previas_parrafo1&gt;&gt;</w:t>
+        <w:t>&lt;&lt;descripci</w:t>
+      </w:r>
+      <w:r>
+        <w:rPr>
+          <w:rFonts w:cs="Arial"/>
+        </w:rPr>
+        <w:t>o</w:t>
+      </w:r>
+      <w:r>
+        <w:rPr>
+          <w:rFonts w:cs="Arial"/>
+        </w:rPr>
+        <w:t>n_actividades_previas_parrafo1&gt;&gt;</w:t>
       </w:r>
     </w:p>
     <w:p/>
@@ -9116,7 +9128,19 @@
         <w:rPr>
           <w:rFonts w:cs="Arial"/>
         </w:rPr>
-        <w:t>&lt;&lt;descripción_actividades_previas_parrafo2&gt;&gt;</w:t>
+        <w:t>&lt;&lt;descripci</w:t>
+      </w:r>
+      <w:r>
+        <w:rPr>
+          <w:rFonts w:cs="Arial"/>
+        </w:rPr>
+        <w:t>o</w:t>
+      </w:r>
+      <w:r>
+        <w:rPr>
+          <w:rFonts w:cs="Arial"/>
+        </w:rPr>
+        <w:t>n_actividades_previas_parrafo2&gt;&gt;</w:t>
       </w:r>
     </w:p>
     <w:p>
@@ -9139,6 +9163,30 @@
       </w:r>
       <w:r>
         <w:t>&gt;&gt;</w:t>
+      </w:r>
+      <w:r>
+        <w:t xml:space="preserve"> (ver </w:t>
+      </w:r>
+      <w:r>
+        <w:fldChar w:fldCharType="begin"/>
+      </w:r>
+      <w:r>
+        <w:instrText xml:space="preserve"> REF _Ref219907034 \h  \* MERGEFORMAT </w:instrText>
+      </w:r>
+      <w:r>
+        <w:fldChar w:fldCharType="separate"/>
+      </w:r>
+      <w:r>
+        <w:t>ANEXO 3: PLAN DE CRUCERO</w:t>
+      </w:r>
+      <w:r>
+        <w:fldChar w:fldCharType="end"/>
+      </w:r>
+      <w:r>
+        <w:t>)</w:t>
+      </w:r>
+      <w:r>
+        <w:t>.</w:t>
       </w:r>
     </w:p>
     <w:p>
@@ -9402,18 +9450,51 @@
         <w:ind w:firstLine="360"/>
       </w:pPr>
       <w:r>
-        <w:t>&lt;&lt;descripcion_actividades_previas_parrafo</w:t>
-      </w:r>
-      <w:r>
-        <w:t>4</w:t>
-      </w:r>
+        <w:t xml:space="preserve">De esta forma se realizaron las pruebas de funcionamiento en las </w:t>
+      </w:r>
+      <w:r>
+        <w:t>&lt;&lt;</w:t>
+      </w:r>
+      <w:proofErr w:type="spellStart"/>
+      <w:r>
+        <w:t>numero_de_sondas</w:t>
+      </w:r>
+      <w:proofErr w:type="spellEnd"/>
       <w:r>
         <w:t>&gt;&gt;</w:t>
       </w:r>
       <w:r>
+        <w:t xml:space="preserve"> sondas que se desplegaron correspondientes a la </w:t>
+      </w:r>
+      <w:r>
+        <w:t>Orden de Servicio PEMEX-ASM-CICESE-658225821-</w:t>
+      </w:r>
+      <w:r>
+        <w:t>&lt;&lt;</w:t>
+      </w:r>
+      <w:proofErr w:type="spellStart"/>
+      <w:r>
+        <w:t>orden_de_servicio</w:t>
+      </w:r>
+      <w:proofErr w:type="spellEnd"/>
+      <w:r>
+        <w:t>&gt;&gt; del mes de</w:t>
+      </w:r>
+      <w:r>
         <w:t xml:space="preserve"> </w:t>
       </w:r>
       <w:bookmarkStart w:id="77" w:name="_Hlk224322141"/>
+      <w:r>
+        <w:t>&lt;&lt;</w:t>
+      </w:r>
+      <w:proofErr w:type="spellStart"/>
+      <w:r>
+        <w:t>mes_y_anio_de_liberacion</w:t>
+      </w:r>
+      <w:proofErr w:type="spellEnd"/>
+      <w:r>
+        <w:t xml:space="preserve">&gt;&gt;. </w:t>
+      </w:r>
       <w:r>
         <w:t>Como parte de las evidencias se presentan los reportes de funcionamiento de cada una de ellas</w:t>
       </w:r>
@@ -9480,6 +9561,7 @@
         <w:ind w:firstLine="360"/>
       </w:pPr>
       <w:r>
+        <w:lastRenderedPageBreak/>
         <w:t xml:space="preserve">Finalmente, cuando se comprobó que las </w:t>
       </w:r>
       <w:r>
@@ -9488,12 +9570,6 @@
       <w:r>
         <w:t xml:space="preserve"> se encontraban en perfecto estado, fueron transportadas a la embarcación junto con todas las herramientas y componentes necesarios para el despliegue. </w:t>
       </w:r>
-    </w:p>
-    <w:p>
-      <w:pPr>
-        <w:spacing w:line="240" w:lineRule="auto"/>
-        <w:jc w:val="left"/>
-      </w:pPr>
       <w:r>
         <w:br w:type="page"/>
       </w:r>
@@ -9775,209 +9851,155 @@
     </w:p>
     <w:p>
       <w:pPr>
+        <w:ind w:firstLine="426"/>
+      </w:pPr>
+      <w:bookmarkStart w:id="84" w:name="_Ref217472780"/>
+      <w:bookmarkStart w:id="85" w:name="_Hlk204704390"/>
+      <w:r>
+        <w:t>La logística para la preparación y despliegue de las sondas fue</w:t>
+      </w:r>
+      <w:r>
+        <w:t xml:space="preserve"> planeada</w:t>
+      </w:r>
+      <w:r>
+        <w:t xml:space="preserve"> y enviada con </w:t>
+      </w:r>
+      <w:r>
+        <w:t>antelación a PEMEX para su a</w:t>
+      </w:r>
+      <w:r>
+        <w:t>pr</w:t>
+      </w:r>
+      <w:r>
+        <w:t>obación. El derrotero o ruta de liberación de las sondas consideró</w:t>
+      </w:r>
+      <w:r>
+        <w:t xml:space="preserve"> el trayecto desde tierra hasta el lugar de despliegue de las &lt;&lt;</w:t>
+      </w:r>
+      <w:proofErr w:type="spellStart"/>
+      <w:r>
+        <w:t>numero_de_sondas</w:t>
+      </w:r>
+      <w:proofErr w:type="spellEnd"/>
+      <w:r>
+        <w:t>&gt;&gt;</w:t>
+      </w:r>
+      <w:r>
+        <w:t xml:space="preserve"> </w:t>
+      </w:r>
+      <w:r>
+        <w:t>sondas oceanográficas liberadas en el &lt;&lt;</w:t>
+      </w:r>
+      <w:proofErr w:type="spellStart"/>
+      <w:r>
+        <w:t>mes_y_anio_de_liberacion</w:t>
+      </w:r>
+      <w:proofErr w:type="spellEnd"/>
+      <w:r>
+        <w:t>&gt;&gt; tomando en cuenta las condiciones ambientales y la posición de despliegue. &lt;&lt;ejecucion</w:t>
+      </w:r>
+      <w:r>
+        <w:t>_de_la_campania_parrafo1&gt;&gt;.</w:t>
+      </w:r>
+    </w:p>
+    <w:p>
+      <w:pPr>
+        <w:pStyle w:val="Normal1"/>
+        <w:spacing w:line="360" w:lineRule="auto"/>
+        <w:jc w:val="both"/>
+        <w:rPr>
+          <w:rFonts w:ascii="Microsoft Sans Serif" w:eastAsia="Times New Roman" w:hAnsi="Microsoft Sans Serif" w:cs="Times New Roman"/>
+          <w:color w:val="auto"/>
+        </w:rPr>
+      </w:pPr>
+    </w:p>
+    <w:p>
+      <w:pPr>
+        <w:ind w:firstLine="426"/>
+      </w:pPr>
+      <w:r>
+        <w:t>&lt;&lt;ejecucion_de_la_campania_parrafo2&gt;&gt;</w:t>
+      </w:r>
+      <w:bookmarkEnd w:id="84"/>
+      <w:r>
+        <w:t xml:space="preserve">; se efectuó de acuerdo con la planeación de la logística y derrotero de la embarcación. El </w:t>
+      </w:r>
+      <w:r>
+        <w:t>líder del equipo de instalación le informó al personal las actividades que se realizarían durante el despliegue de las sondas con el fin de que cada miembro del equipo conociera los detalles de la operación, propiciando la integridad del personal y de los equipos de dichas sondas; asimismo se siguieron los procedimientos de seguridad durante todas las campañas de despliegue de las sondas oceanográficas</w:t>
+      </w:r>
+      <w:r>
+        <w:t xml:space="preserve">. </w:t>
+      </w:r>
+      <w:r>
+        <w:t xml:space="preserve">Para más detalles sobre las campañas vea el </w:t>
+      </w:r>
+      <w:r>
+        <w:fldChar w:fldCharType="begin"/>
+      </w:r>
+      <w:r>
+        <w:instrText xml:space="preserve"> REF _Ref219907034 \h </w:instrText>
+      </w:r>
+      <w:r>
+        <w:instrText xml:space="preserve"> \* MERGEFORMAT </w:instrText>
+      </w:r>
+      <w:r>
+        <w:fldChar w:fldCharType="separate"/>
+      </w:r>
+      <w:r>
+        <w:rPr>
+          <w:rStyle w:val="Title1"/>
+        </w:rPr>
+        <w:t>ANEXO 3: PLAN DE CRUCERO</w:t>
+      </w:r>
+      <w:r>
+        <w:fldChar w:fldCharType="end"/>
+      </w:r>
+      <w:r>
+        <w:t>.</w:t>
+      </w:r>
+    </w:p>
+    <w:p>
+      <w:pPr>
         <w:pStyle w:val="Normal1"/>
         <w:spacing w:line="360" w:lineRule="auto"/>
         <w:ind w:firstLine="432"/>
         <w:jc w:val="both"/>
-        <w:rPr>
-          <w:rFonts w:ascii="Microsoft Sans Serif" w:eastAsia="Times New Roman" w:hAnsi="Microsoft Sans Serif" w:cs="Times New Roman"/>
-          <w:color w:val="auto"/>
-        </w:rPr>
-      </w:pPr>
-      <w:bookmarkStart w:id="84" w:name="_Ref217472780"/>
-      <w:bookmarkStart w:id="85" w:name="_Hlk204704390"/>
-      <w:r>
-        <w:rPr>
-          <w:rFonts w:ascii="Microsoft Sans Serif" w:eastAsia="Times New Roman" w:hAnsi="Microsoft Sans Serif" w:cs="Times New Roman"/>
-          <w:color w:val="auto"/>
-        </w:rPr>
-        <w:t>&lt;&lt;ejecucion_de_la_campania_parrafo1&gt;&gt;</w:t>
-      </w:r>
-      <w:r>
-        <w:rPr>
-          <w:rFonts w:ascii="Microsoft Sans Serif" w:eastAsia="Times New Roman" w:hAnsi="Microsoft Sans Serif" w:cs="Times New Roman"/>
-          <w:color w:val="auto"/>
-        </w:rPr>
-        <w:t xml:space="preserve">. </w:t>
-      </w:r>
+      </w:pPr>
     </w:p>
     <w:p>
       <w:pPr>
-        <w:pStyle w:val="Normal1"/>
-        <w:spacing w:line="360" w:lineRule="auto"/>
-        <w:jc w:val="both"/>
-        <w:rPr>
-          <w:rFonts w:ascii="Microsoft Sans Serif" w:eastAsia="Times New Roman" w:hAnsi="Microsoft Sans Serif" w:cs="Times New Roman"/>
-          <w:color w:val="auto"/>
-        </w:rPr>
-      </w:pPr>
+        <w:ind w:firstLine="426"/>
+      </w:pPr>
+      <w:r>
+        <w:t xml:space="preserve">Las actividades asociadas a la ejecución de las campañas para la liberación de sondas oceanográficas son similares entre ellas. </w:t>
+      </w:r>
+      <w:r>
+        <w:t xml:space="preserve">A continuación, se describen las actividades asociadas a la ejecución de </w:t>
+      </w:r>
+      <w:r>
+        <w:t xml:space="preserve">la campaña </w:t>
+      </w:r>
+      <w:r>
+        <w:t>&lt;&lt;</w:t>
+      </w:r>
+      <w:r>
+        <w:t>ejecucion_de_la_campania_parrafo3</w:t>
+      </w:r>
+      <w:r>
+        <w:t xml:space="preserve">&gt;&gt; para el despliegue de </w:t>
+      </w:r>
+      <w:r>
+        <w:t xml:space="preserve">las </w:t>
+      </w:r>
+      <w:r>
+        <w:t>sondas oceanográficas</w:t>
+      </w:r>
+      <w:r>
+        <w:t xml:space="preserve">. </w:t>
+      </w:r>
     </w:p>
     <w:p>
       <w:pPr>
-        <w:pStyle w:val="Normal1"/>
-        <w:spacing w:line="360" w:lineRule="auto"/>
-        <w:ind w:firstLine="432"/>
-        <w:jc w:val="both"/>
-        <w:rPr>
-          <w:rFonts w:ascii="Microsoft Sans Serif" w:eastAsia="Times New Roman" w:hAnsi="Microsoft Sans Serif" w:cs="Times New Roman"/>
-          <w:color w:val="auto"/>
-        </w:rPr>
-      </w:pPr>
-      <w:r>
-        <w:rPr>
-          <w:rFonts w:ascii="Microsoft Sans Serif" w:eastAsia="Times New Roman" w:hAnsi="Microsoft Sans Serif" w:cs="Times New Roman"/>
-          <w:color w:val="auto"/>
-        </w:rPr>
-        <w:t>&lt;&lt;ejecucion_de_la_campania_parrafo2&gt;&gt;</w:t>
-      </w:r>
-      <w:bookmarkEnd w:id="84"/>
-      <w:r>
-        <w:rPr>
-          <w:rFonts w:ascii="Microsoft Sans Serif" w:eastAsia="Times New Roman" w:hAnsi="Microsoft Sans Serif" w:cs="Times New Roman"/>
-          <w:color w:val="auto"/>
-        </w:rPr>
-        <w:t xml:space="preserve"> </w:t>
-      </w:r>
-      <w:r>
-        <w:t xml:space="preserve">El </w:t>
-      </w:r>
-      <w:r>
-        <w:t>líder del equipo de instalación le informó al personal las actividades que se realizarían durante el despliegue de las sondas con el fin de que cada miembro del equipo conociera los detalles de la operación, propiciando la integridad del personal y de los equipos de dichas sondas; asimismo se siguieron los procedimientos de seguridad durante todas las campañas de despliegue de las sondas oceanográficas</w:t>
-      </w:r>
-      <w:r>
-        <w:t xml:space="preserve"> (ver </w:t>
-      </w:r>
-      <w:r>
-        <w:fldChar w:fldCharType="begin"/>
-      </w:r>
-      <w:r>
-        <w:instrText xml:space="preserve"> REF _Ref219907034 \h </w:instrText>
-      </w:r>
-      <w:r>
-        <w:instrText xml:space="preserve"> \* MERGEFORMAT </w:instrText>
-      </w:r>
-      <w:r>
-        <w:fldChar w:fldCharType="separate"/>
-      </w:r>
-      <w:r>
-        <w:rPr>
-          <w:rStyle w:val="Title1"/>
-        </w:rPr>
-        <w:t>ANEXO 3: PLAN DE CRUCERO</w:t>
-      </w:r>
-      <w:r>
-        <w:fldChar w:fldCharType="end"/>
-      </w:r>
-      <w:r>
-        <w:t>).</w:t>
-      </w:r>
-      <w:r>
-        <w:t xml:space="preserve"> </w:t>
-      </w:r>
-      <w:r>
-        <w:rPr>
-          <w:rFonts w:ascii="Microsoft Sans Serif" w:hAnsi="Microsoft Sans Serif" w:cs="Microsoft Sans Serif"/>
-        </w:rPr>
-        <w:t>&lt;&lt;ejecución_de_la_campania_parrafo</w:t>
-      </w:r>
-      <w:r>
-        <w:rPr>
-          <w:rFonts w:ascii="Microsoft Sans Serif" w:hAnsi="Microsoft Sans Serif" w:cs="Microsoft Sans Serif"/>
-        </w:rPr>
-        <w:t>3</w:t>
-      </w:r>
-      <w:r>
-        <w:rPr>
-          <w:rFonts w:ascii="Microsoft Sans Serif" w:hAnsi="Microsoft Sans Serif" w:cs="Microsoft Sans Serif"/>
-        </w:rPr>
-        <w:t>&gt;&gt;.</w:t>
-      </w:r>
-      <w:r>
-        <w:t xml:space="preserve"> </w:t>
-      </w:r>
-      <w:r>
-        <w:rPr>
-          <w:rFonts w:ascii="Microsoft Sans Serif" w:hAnsi="Microsoft Sans Serif" w:cs="Microsoft Sans Serif"/>
-        </w:rPr>
-        <w:t>&lt;&lt;ejecucion_de_la_campania_parrafo4&gt;&gt;</w:t>
-      </w:r>
-      <w:r>
-        <w:rPr>
-          <w:szCs w:val="22"/>
-        </w:rPr>
-        <w:t xml:space="preserve"> las localizaciones </w:t>
-      </w:r>
-      <w:r>
-        <w:rPr>
-          <w:szCs w:val="22"/>
-        </w:rPr>
-        <w:t>solicitada</w:t>
-      </w:r>
-      <w:r>
-        <w:rPr>
-          <w:szCs w:val="22"/>
-        </w:rPr>
-        <w:t>s</w:t>
-      </w:r>
-      <w:r>
-        <w:rPr>
-          <w:szCs w:val="22"/>
-        </w:rPr>
-        <w:t xml:space="preserve"> por </w:t>
-      </w:r>
-      <w:r>
-        <w:rPr>
-          <w:szCs w:val="22"/>
-        </w:rPr>
-        <w:t>PEMEX</w:t>
-      </w:r>
-      <w:r>
-        <w:rPr>
-          <w:szCs w:val="22"/>
-        </w:rPr>
-        <w:t xml:space="preserve"> para </w:t>
-      </w:r>
-      <w:r>
-        <w:rPr>
-          <w:szCs w:val="22"/>
-        </w:rPr>
-        <w:t xml:space="preserve">el despliegue </w:t>
-      </w:r>
-      <w:r>
-        <w:rPr>
-          <w:szCs w:val="22"/>
-        </w:rPr>
-        <w:t>de la</w:t>
-      </w:r>
-      <w:r>
-        <w:rPr>
-          <w:szCs w:val="22"/>
-        </w:rPr>
-        <w:t>s</w:t>
-      </w:r>
-      <w:r>
-        <w:rPr>
-          <w:szCs w:val="22"/>
-        </w:rPr>
-        <w:t xml:space="preserve"> </w:t>
-      </w:r>
-      <w:r>
-        <w:rPr>
-          <w:szCs w:val="22"/>
-        </w:rPr>
-        <w:t>sondas oceanográficas</w:t>
-      </w:r>
-      <w:r>
-        <w:rPr>
-          <w:szCs w:val="22"/>
-        </w:rPr>
-        <w:t>.</w:t>
-      </w:r>
-    </w:p>
-    <w:p>
-      <w:pPr>
-        <w:pStyle w:val="Prrafodelista"/>
-        <w:ind w:left="720"/>
         <w:rPr>
           <w:szCs w:val="22"/>
         </w:rPr>
@@ -10110,6 +10132,7 @@
         <w:rPr>
           <w:szCs w:val="22"/>
         </w:rPr>
+        <w:lastRenderedPageBreak/>
         <w:t>Antes de poner la sonda en el agua, se hicieron las pruebas de conexión bluetooth in situ para asegurar el correcto funcionamiento de la sonda oceanográfica.</w:t>
       </w:r>
     </w:p>
@@ -10168,7 +10191,6 @@
         <w:rPr>
           <w:szCs w:val="22"/>
         </w:rPr>
-        <w:lastRenderedPageBreak/>
         <w:t xml:space="preserve">Una vez liberada la sonda oceanográfica el personal se comunicó mediante telefonía satelital con el personal en tierra para avisar de la maniobra. Posteriormente el personal en tierra realizó el despliegue de la información en el </w:t>
       </w:r>
       <w:r>
@@ -10228,6 +10250,29 @@
     <w:p/>
     <w:p>
       <w:pPr>
+        <w:ind w:firstLine="426"/>
+      </w:pPr>
+      <w:r>
+        <w:t>L</w:t>
+      </w:r>
+      <w:r>
+        <w:t>as localizaciones de despliegue se muestran en la &lt;&lt;</w:t>
+      </w:r>
+      <w:proofErr w:type="spellStart"/>
+      <w:r>
+        <w:t>ref_mapa_de_despliegue</w:t>
+      </w:r>
+      <w:proofErr w:type="spellEnd"/>
+      <w:r>
+        <w:t>&gt;&gt;</w:t>
+      </w:r>
+      <w:r>
+        <w:t xml:space="preserve"> </w:t>
+      </w:r>
+    </w:p>
+    <w:p/>
+    <w:p>
+      <w:pPr>
         <w:pStyle w:val="Figura"/>
       </w:pPr>
       <w:r>
@@ -10250,15 +10295,9 @@
     </w:p>
     <w:p>
       <w:pPr>
-        <w:ind w:left="360" w:firstLine="360"/>
-        <w:rPr>
-          <w:szCs w:val="22"/>
-        </w:rPr>
-      </w:pPr>
-      <w:r>
-        <w:rPr>
-          <w:szCs w:val="22"/>
-        </w:rPr>
+        <w:ind w:firstLine="426"/>
+      </w:pPr>
+      <w:r>
         <w:t xml:space="preserve">A continuación, de la </w:t>
       </w:r>
       <w:r>
@@ -10282,21 +10321,12 @@
         <w:t xml:space="preserve">&gt;&gt; </w:t>
       </w:r>
       <w:r>
-        <w:rPr>
-          <w:szCs w:val="22"/>
-        </w:rPr>
         <w:t xml:space="preserve">se presentan las evidencias fotográficas del despliegue de las </w:t>
       </w:r>
       <w:r>
-        <w:rPr>
-          <w:szCs w:val="22"/>
-        </w:rPr>
         <w:t>sondas</w:t>
       </w:r>
       <w:r>
-        <w:rPr>
-          <w:szCs w:val="22"/>
-        </w:rPr>
         <w:t>.</w:t>
       </w:r>
       <w:bookmarkEnd w:id="85"/>
@@ -10929,6 +10959,7 @@
       <w:bookmarkStart w:id="91" w:name="_Ref224230599"/>
       <w:bookmarkStart w:id="92" w:name="_Toc229049277"/>
       <w:r>
+        <w:lastRenderedPageBreak/>
         <w:t>INFORMACIÓN DEL DESPLIEGUE DE LAS SONDAS OCEANOGRÁFICAS</w:t>
       </w:r>
       <w:bookmarkEnd w:id="89"/>
@@ -10956,13 +10987,13 @@
         <w:t>ia_parrafo</w:t>
       </w:r>
       <w:r>
-        <w:t>5</w:t>
+        <w:t>4</w:t>
       </w:r>
       <w:r>
         <w:t>&gt;&gt;</w:t>
       </w:r>
       <w:r>
-        <w:t xml:space="preserve"> </w:t>
+        <w:t xml:space="preserve">; todas las sondas funcionaron perfectamente durante y después del despliegue. </w:t>
       </w:r>
       <w:r>
         <w:t xml:space="preserve">En la </w:t>
@@ -11054,7 +11085,6 @@
       <w:bookmarkStart w:id="93" w:name="_Ref217401548"/>
       <w:bookmarkStart w:id="94" w:name="_Toc229049320"/>
       <w:r>
-        <w:lastRenderedPageBreak/>
         <w:t xml:space="preserve">Tabla </w:t>
       </w:r>
       <w:fldSimple w:instr=" SEQ Tabla \* ARABIC ">
@@ -12929,6 +12959,12 @@
         <w:t>&gt;&gt;</w:t>
       </w:r>
       <w:bookmarkEnd w:id="105"/>
+    </w:p>
+    <w:p>
+      <w:pPr>
+        <w:pStyle w:val="Figura"/>
+        <w:jc w:val="both"/>
+      </w:pPr>
       <w:r>
         <w:br w:type="page"/>
       </w:r>
@@ -13830,19 +13866,15 @@
         </w:rPr>
       </w:pPr>
       <w:r>
-        <w:t>&lt;&lt;conclu</w:t>
-      </w:r>
-      <w:r>
-        <w:t>s</w:t>
-      </w:r>
-      <w:r>
-        <w:t>iones_parrafo</w:t>
-      </w:r>
-      <w:r>
-        <w:t>1</w:t>
-      </w:r>
-      <w:r>
-        <w:t>&gt;&gt;</w:t>
+        <w:t>Se desplegaron exitosamente &lt;&lt;</w:t>
+      </w:r>
+      <w:proofErr w:type="spellStart"/>
+      <w:r>
+        <w:t>numero_de_sondas</w:t>
+      </w:r>
+      <w:proofErr w:type="spellEnd"/>
+      <w:r>
+        <w:t>&gt;&gt; sondas oceanográficas en las localizaciones solicitadas por PEMEX.</w:t>
       </w:r>
     </w:p>
     <w:p>

</xml_diff>

<commit_message>
FIX: Se incluye una funcion que reemplaza variables en las tablas, para esos casos de tablas semiestaticas
</commit_message>
<xml_diff>
--- a/crear_documentos/services/doc_101/plantilla.docx
+++ b/crear_documentos/services/doc_101/plantilla.docx
@@ -231,8 +231,9 @@
           <w:sz w:val="28"/>
           <w:szCs w:val="28"/>
         </w:rPr>
-        <w:t>9878221</w:t>
-      </w:r>
+        <w:t>&lt;&lt;</w:t>
+      </w:r>
+      <w:proofErr w:type="spellStart"/>
       <w:r>
         <w:rPr>
           <w:rFonts w:cs="Microsoft Sans Serif"/>
@@ -240,8 +241,9 @@
           <w:sz w:val="28"/>
           <w:szCs w:val="28"/>
         </w:rPr>
-        <w:t xml:space="preserve">, </w:t>
-      </w:r>
+        <w:t>seriales_de_sondas</w:t>
+      </w:r>
+      <w:proofErr w:type="spellEnd"/>
       <w:r>
         <w:rPr>
           <w:rFonts w:cs="Microsoft Sans Serif"/>
@@ -249,61 +251,7 @@
           <w:sz w:val="28"/>
           <w:szCs w:val="28"/>
         </w:rPr>
-        <w:t>9878504</w:t>
-      </w:r>
-      <w:r>
-        <w:rPr>
-          <w:rFonts w:cs="Microsoft Sans Serif"/>
-          <w:b/>
-          <w:sz w:val="28"/>
-          <w:szCs w:val="28"/>
-        </w:rPr>
-        <w:t xml:space="preserve">, </w:t>
-      </w:r>
-      <w:r>
-        <w:rPr>
-          <w:rFonts w:cs="Microsoft Sans Serif"/>
-          <w:b/>
-          <w:sz w:val="28"/>
-          <w:szCs w:val="28"/>
-        </w:rPr>
-        <w:t>9878225</w:t>
-      </w:r>
-      <w:r>
-        <w:rPr>
-          <w:rFonts w:cs="Microsoft Sans Serif"/>
-          <w:b/>
-          <w:sz w:val="28"/>
-          <w:szCs w:val="28"/>
-        </w:rPr>
-        <w:t xml:space="preserve">, </w:t>
-      </w:r>
-      <w:r>
-        <w:rPr>
-          <w:rFonts w:cs="Microsoft Sans Serif"/>
-          <w:b/>
-          <w:sz w:val="28"/>
-          <w:szCs w:val="28"/>
-        </w:rPr>
-        <w:t>9876178</w:t>
-      </w:r>
-      <w:r>
-        <w:rPr>
-          <w:rFonts w:cs="Microsoft Sans Serif"/>
-          <w:b/>
-          <w:sz w:val="28"/>
-          <w:szCs w:val="28"/>
-        </w:rPr>
-        <w:t xml:space="preserve">, </w:t>
-      </w:r>
-      <w:r>
-        <w:rPr>
-          <w:rFonts w:cs="Microsoft Sans Serif"/>
-          <w:b/>
-          <w:sz w:val="28"/>
-          <w:szCs w:val="28"/>
-        </w:rPr>
-        <w:t>9878203, 4878505, 9878218</w:t>
+        <w:t>&gt;&gt;</w:t>
       </w:r>
     </w:p>
     <w:tbl>
@@ -422,15 +370,16 @@
                 <w:sz w:val="20"/>
                 <w:szCs w:val="20"/>
               </w:rPr>
-              <w:t>1</w:t>
+              <w:t>&lt;&lt;</w:t>
             </w:r>
+            <w:proofErr w:type="spellStart"/>
             <w:r>
               <w:rPr>
                 <w:rFonts w:cs="Microsoft Sans Serif"/>
                 <w:sz w:val="20"/>
                 <w:szCs w:val="20"/>
               </w:rPr>
-              <w:t>0</w:t>
+              <w:t>fe</w:t>
             </w:r>
             <w:r>
               <w:rPr>
@@ -438,39 +387,16 @@
                 <w:sz w:val="20"/>
                 <w:szCs w:val="20"/>
               </w:rPr>
-              <w:t xml:space="preserve"> de </w:t>
+              <w:t>cha_de_solicitud</w:t>
             </w:r>
+            <w:proofErr w:type="spellEnd"/>
             <w:r>
               <w:rPr>
                 <w:rFonts w:cs="Microsoft Sans Serif"/>
                 <w:sz w:val="20"/>
                 <w:szCs w:val="20"/>
               </w:rPr>
-              <w:t>marzo</w:t>
-            </w:r>
-            <w:r>
-              <w:rPr>
-                <w:rFonts w:cs="Microsoft Sans Serif"/>
-                <w:sz w:val="20"/>
-                <w:szCs w:val="20"/>
-              </w:rPr>
-              <w:t xml:space="preserve"> </w:t>
-            </w:r>
-            <w:r>
-              <w:rPr>
-                <w:rFonts w:cs="Microsoft Sans Serif"/>
-                <w:sz w:val="20"/>
-                <w:szCs w:val="20"/>
-              </w:rPr>
-              <w:t>de 202</w:t>
-            </w:r>
-            <w:r>
-              <w:rPr>
-                <w:rFonts w:cs="Microsoft Sans Serif"/>
-                <w:sz w:val="20"/>
-                <w:szCs w:val="20"/>
-              </w:rPr>
-              <w:t>6</w:t>
+              <w:t>&gt;&gt;</w:t>
             </w:r>
           </w:p>
         </w:tc>
@@ -529,31 +455,25 @@
                 <w:sz w:val="20"/>
                 <w:szCs w:val="20"/>
               </w:rPr>
-              <w:t xml:space="preserve">01 de </w:t>
+              <w:t>&lt;&lt;</w:t>
             </w:r>
+            <w:proofErr w:type="spellStart"/>
             <w:r>
               <w:rPr>
                 <w:rFonts w:cs="Microsoft Sans Serif"/>
                 <w:sz w:val="20"/>
                 <w:szCs w:val="20"/>
               </w:rPr>
-              <w:t>abril</w:t>
+              <w:t>fecha_inicio_vigencia</w:t>
             </w:r>
+            <w:proofErr w:type="spellEnd"/>
             <w:r>
               <w:rPr>
                 <w:rFonts w:cs="Microsoft Sans Serif"/>
                 <w:sz w:val="20"/>
                 <w:szCs w:val="20"/>
               </w:rPr>
-              <w:t xml:space="preserve"> de 202</w:t>
-            </w:r>
-            <w:r>
-              <w:rPr>
-                <w:rFonts w:cs="Microsoft Sans Serif"/>
-                <w:sz w:val="20"/>
-                <w:szCs w:val="20"/>
-              </w:rPr>
-              <w:t>6</w:t>
+              <w:t>&gt;&gt;</w:t>
             </w:r>
           </w:p>
         </w:tc>
@@ -595,10 +515,8 @@
               <w:jc w:val="left"/>
               <w:rPr>
                 <w:rFonts w:cs="Microsoft Sans Serif"/>
-                <w:b/>
                 <w:sz w:val="20"/>
                 <w:szCs w:val="20"/>
-                <w:lang w:eastAsia="es-ES"/>
               </w:rPr>
             </w:pPr>
             <w:r>
@@ -607,39 +525,25 @@
                 <w:sz w:val="20"/>
                 <w:szCs w:val="20"/>
               </w:rPr>
-              <w:t>3</w:t>
+              <w:t>&lt;&lt;</w:t>
             </w:r>
+            <w:proofErr w:type="spellStart"/>
             <w:r>
               <w:rPr>
                 <w:rFonts w:cs="Microsoft Sans Serif"/>
                 <w:sz w:val="20"/>
                 <w:szCs w:val="20"/>
               </w:rPr>
-              <w:t>0</w:t>
+              <w:t>fecha_final_vigencia</w:t>
             </w:r>
+            <w:proofErr w:type="spellEnd"/>
             <w:r>
               <w:rPr>
                 <w:rFonts w:cs="Microsoft Sans Serif"/>
                 <w:sz w:val="20"/>
                 <w:szCs w:val="20"/>
               </w:rPr>
-              <w:t xml:space="preserve"> de </w:t>
-            </w:r>
-            <w:r>
-              <w:rPr>
-                <w:rFonts w:cs="Microsoft Sans Serif"/>
-                <w:sz w:val="20"/>
-                <w:szCs w:val="20"/>
-              </w:rPr>
-              <w:t>abril</w:t>
-            </w:r>
-            <w:r>
-              <w:rPr>
-                <w:rFonts w:cs="Microsoft Sans Serif"/>
-                <w:sz w:val="20"/>
-                <w:szCs w:val="20"/>
-              </w:rPr>
-              <w:t xml:space="preserve"> de 2026</w:t>
+              <w:t>&gt;&gt;</w:t>
             </w:r>
           </w:p>
         </w:tc>
@@ -716,31 +620,25 @@
                 <w:sz w:val="20"/>
                 <w:szCs w:val="20"/>
               </w:rPr>
-              <w:t xml:space="preserve">01 de </w:t>
+              <w:t>&lt;&lt;</w:t>
             </w:r>
+            <w:proofErr w:type="spellStart"/>
             <w:r>
               <w:rPr>
                 <w:rFonts w:cs="Microsoft Sans Serif"/>
                 <w:sz w:val="20"/>
                 <w:szCs w:val="20"/>
               </w:rPr>
-              <w:t>mayo</w:t>
+              <w:t>fecha_de_entrega</w:t>
             </w:r>
+            <w:proofErr w:type="spellEnd"/>
             <w:r>
               <w:rPr>
                 <w:rFonts w:cs="Microsoft Sans Serif"/>
                 <w:sz w:val="20"/>
                 <w:szCs w:val="20"/>
               </w:rPr>
-              <w:t xml:space="preserve"> de 202</w:t>
-            </w:r>
-            <w:r>
-              <w:rPr>
-                <w:rFonts w:cs="Microsoft Sans Serif"/>
-                <w:sz w:val="20"/>
-                <w:szCs w:val="20"/>
-              </w:rPr>
-              <w:t>6</w:t>
+              <w:t>&gt;&gt;</w:t>
             </w:r>
           </w:p>
         </w:tc>
@@ -974,33 +872,35 @@
               <w:cnfStyle w:val="000000000000" w:firstRow="0" w:lastRow="0" w:firstColumn="0" w:lastColumn="0" w:oddVBand="0" w:evenVBand="0" w:oddHBand="0" w:evenHBand="0" w:firstRowFirstColumn="0" w:firstRowLastColumn="0" w:lastRowFirstColumn="0" w:lastRowLastColumn="0"/>
               <w:rPr>
                 <w:rFonts w:cs="Microsoft Sans Serif"/>
-                <w:color w:val="auto"/>
+                <w:color w:val="000000" w:themeColor="text1"/>
                 <w:szCs w:val="22"/>
               </w:rPr>
             </w:pPr>
             <w:r>
               <w:rPr>
                 <w:rFonts w:cs="Microsoft Sans Serif"/>
-                <w:color w:val="auto"/>
+                <w:color w:val="000000" w:themeColor="text1"/>
                 <w:szCs w:val="22"/>
               </w:rPr>
-              <w:t xml:space="preserve">01 de </w:t>
+              <w:t>&lt;&lt;</w:t>
             </w:r>
+            <w:proofErr w:type="spellStart"/>
             <w:r>
               <w:rPr>
                 <w:rFonts w:cs="Microsoft Sans Serif"/>
-                <w:color w:val="auto"/>
+                <w:color w:val="000000" w:themeColor="text1"/>
                 <w:szCs w:val="22"/>
               </w:rPr>
-              <w:t>may</w:t>
+              <w:t>fecha_de_entrega</w:t>
             </w:r>
+            <w:proofErr w:type="spellEnd"/>
             <w:r>
               <w:rPr>
                 <w:rFonts w:cs="Microsoft Sans Serif"/>
-                <w:color w:val="auto"/>
+                <w:color w:val="000000" w:themeColor="text1"/>
                 <w:szCs w:val="22"/>
               </w:rPr>
-              <w:t>o de 2026</w:t>
+              <w:t>&gt;&gt;</w:t>
             </w:r>
           </w:p>
         </w:tc>
@@ -14993,32 +14893,19 @@
               <w:lang w:val="en-US"/>
             </w:rPr>
           </w:pPr>
-          <w:r>
-            <w:fldChar w:fldCharType="begin"/>
-          </w:r>
-          <w:r>
-            <w:rPr>
-              <w:lang w:val="en-US"/>
-            </w:rPr>
-            <w:instrText>HYPERLINK "https://www.asm.mx/" \h</w:instrText>
-          </w:r>
-          <w:r>
-            <w:fldChar w:fldCharType="separate"/>
-          </w:r>
-          <w:r>
-            <w:rPr>
-              <w:rStyle w:val="Hipervnculo"/>
-              <w:rFonts w:ascii="Arial Narrow" w:hAnsi="Arial Narrow" w:cs="Arial"/>
-              <w:b/>
-              <w:sz w:val="14"/>
-              <w:szCs w:val="14"/>
-              <w:lang w:val="en-US"/>
-            </w:rPr>
-            <w:t>https://www.asm.mx</w:t>
-          </w:r>
-          <w:r>
-            <w:fldChar w:fldCharType="end"/>
-          </w:r>
+          <w:hyperlink r:id="rId1">
+            <w:r>
+              <w:rPr>
+                <w:rStyle w:val="Hipervnculo"/>
+                <w:rFonts w:ascii="Arial Narrow" w:hAnsi="Arial Narrow" w:cs="Arial"/>
+                <w:b/>
+                <w:sz w:val="14"/>
+                <w:szCs w:val="14"/>
+                <w:lang w:val="en-US"/>
+              </w:rPr>
+              <w:t>https://www.asm.mx</w:t>
+            </w:r>
+          </w:hyperlink>
           <w:r>
             <w:rPr>
               <w:rFonts w:ascii="Arial Narrow" w:hAnsi="Arial Narrow" w:cs="Arial"/>
@@ -15038,7 +14925,7 @@
             </w:rPr>
             <w:t xml:space="preserve">   </w:t>
           </w:r>
-          <w:hyperlink r:id="rId1">
+          <w:hyperlink r:id="rId2">
             <w:r>
               <w:rPr>
                 <w:rStyle w:val="Hipervnculo"/>
@@ -22478,7 +22365,6 @@
   <w:style w:type="character" w:default="1" w:styleId="Fuentedeprrafopredeter">
     <w:name w:val="Default Paragraph Font"/>
     <w:uiPriority w:val="1"/>
-    <w:semiHidden/>
     <w:unhideWhenUsed/>
   </w:style>
   <w:style w:type="table" w:default="1" w:styleId="Tablanormal">

</xml_diff>

<commit_message>
guardando cambios y reiniciando el programa
</commit_message>
<xml_diff>
--- a/crear_documentos/services/doc_101/plantilla.docx
+++ b/crear_documentos/services/doc_101/plantilla.docx
@@ -231,27 +231,7 @@
           <w:sz w:val="28"/>
           <w:szCs w:val="28"/>
         </w:rPr>
-        <w:t>&lt;&lt;</w:t>
-      </w:r>
-      <w:proofErr w:type="spellStart"/>
-      <w:r>
-        <w:rPr>
-          <w:rFonts w:cs="Microsoft Sans Serif"/>
-          <w:b/>
-          <w:sz w:val="28"/>
-          <w:szCs w:val="28"/>
-        </w:rPr>
-        <w:t>seriales_de_sondas</w:t>
-      </w:r>
-      <w:proofErr w:type="spellEnd"/>
-      <w:r>
-        <w:rPr>
-          <w:rFonts w:cs="Microsoft Sans Serif"/>
-          <w:b/>
-          <w:sz w:val="28"/>
-          <w:szCs w:val="28"/>
-        </w:rPr>
-        <w:t>&gt;&gt;</w:t>
+        <w:t>&lt;&lt;seriales_de_sondas&gt;&gt;</w:t>
       </w:r>
     </w:p>
     <w:tbl>
@@ -305,15 +285,7 @@
               <w:t>PEMEX-ASM-CICESE-658225821-</w:t>
             </w:r>
             <w:r>
-              <w:t>&lt;&lt;</w:t>
-            </w:r>
-            <w:proofErr w:type="spellStart"/>
-            <w:r>
-              <w:t>orden_de_servicio</w:t>
-            </w:r>
-            <w:proofErr w:type="spellEnd"/>
-            <w:r>
-              <w:t>&gt;&gt;</w:t>
+              <w:t>&lt;&lt;orden_de_servicio&gt;&gt;</w:t>
             </w:r>
           </w:p>
         </w:tc>
@@ -370,26 +342,16 @@
                 <w:sz w:val="20"/>
                 <w:szCs w:val="20"/>
               </w:rPr>
-              <w:t>&lt;&lt;</w:t>
+              <w:t>&lt;&lt;fe</w:t>
             </w:r>
-            <w:proofErr w:type="spellStart"/>
             <w:r>
               <w:rPr>
                 <w:rFonts w:cs="Microsoft Sans Serif"/>
                 <w:sz w:val="20"/>
                 <w:szCs w:val="20"/>
               </w:rPr>
-              <w:t>fe</w:t>
-            </w:r>
-            <w:r>
-              <w:rPr>
-                <w:rFonts w:cs="Microsoft Sans Serif"/>
-                <w:sz w:val="20"/>
-                <w:szCs w:val="20"/>
-              </w:rPr>
               <w:t>cha_de_solicitud</w:t>
             </w:r>
-            <w:proofErr w:type="spellEnd"/>
             <w:r>
               <w:rPr>
                 <w:rFonts w:cs="Microsoft Sans Serif"/>
@@ -455,25 +417,7 @@
                 <w:sz w:val="20"/>
                 <w:szCs w:val="20"/>
               </w:rPr>
-              <w:t>&lt;&lt;</w:t>
-            </w:r>
-            <w:proofErr w:type="spellStart"/>
-            <w:r>
-              <w:rPr>
-                <w:rFonts w:cs="Microsoft Sans Serif"/>
-                <w:sz w:val="20"/>
-                <w:szCs w:val="20"/>
-              </w:rPr>
-              <w:t>fecha_inicio_vigencia</w:t>
-            </w:r>
-            <w:proofErr w:type="spellEnd"/>
-            <w:r>
-              <w:rPr>
-                <w:rFonts w:cs="Microsoft Sans Serif"/>
-                <w:sz w:val="20"/>
-                <w:szCs w:val="20"/>
-              </w:rPr>
-              <w:t>&gt;&gt;</w:t>
+              <w:t>&lt;&lt;fecha_inicio_vigencia&gt;&gt;</w:t>
             </w:r>
           </w:p>
         </w:tc>
@@ -525,25 +469,7 @@
                 <w:sz w:val="20"/>
                 <w:szCs w:val="20"/>
               </w:rPr>
-              <w:t>&lt;&lt;</w:t>
-            </w:r>
-            <w:proofErr w:type="spellStart"/>
-            <w:r>
-              <w:rPr>
-                <w:rFonts w:cs="Microsoft Sans Serif"/>
-                <w:sz w:val="20"/>
-                <w:szCs w:val="20"/>
-              </w:rPr>
-              <w:t>fecha_final_vigencia</w:t>
-            </w:r>
-            <w:proofErr w:type="spellEnd"/>
-            <w:r>
-              <w:rPr>
-                <w:rFonts w:cs="Microsoft Sans Serif"/>
-                <w:sz w:val="20"/>
-                <w:szCs w:val="20"/>
-              </w:rPr>
-              <w:t>&gt;&gt;</w:t>
+              <w:t>&lt;&lt;fecha_final_vigencia&gt;&gt;</w:t>
             </w:r>
           </w:p>
         </w:tc>
@@ -620,25 +546,7 @@
                 <w:sz w:val="20"/>
                 <w:szCs w:val="20"/>
               </w:rPr>
-              <w:t>&lt;&lt;</w:t>
-            </w:r>
-            <w:proofErr w:type="spellStart"/>
-            <w:r>
-              <w:rPr>
-                <w:rFonts w:cs="Microsoft Sans Serif"/>
-                <w:sz w:val="20"/>
-                <w:szCs w:val="20"/>
-              </w:rPr>
-              <w:t>fecha_de_entrega</w:t>
-            </w:r>
-            <w:proofErr w:type="spellEnd"/>
-            <w:r>
-              <w:rPr>
-                <w:rFonts w:cs="Microsoft Sans Serif"/>
-                <w:sz w:val="20"/>
-                <w:szCs w:val="20"/>
-              </w:rPr>
-              <w:t>&gt;&gt;</w:t>
+              <w:t>&lt;&lt;fecha_de_entrega&gt;&gt;</w:t>
             </w:r>
           </w:p>
         </w:tc>
@@ -882,25 +790,7 @@
                 <w:color w:val="000000" w:themeColor="text1"/>
                 <w:szCs w:val="22"/>
               </w:rPr>
-              <w:t>&lt;&lt;</w:t>
-            </w:r>
-            <w:proofErr w:type="spellStart"/>
-            <w:r>
-              <w:rPr>
-                <w:rFonts w:cs="Microsoft Sans Serif"/>
-                <w:color w:val="000000" w:themeColor="text1"/>
-                <w:szCs w:val="22"/>
-              </w:rPr>
-              <w:t>fecha_de_entrega</w:t>
-            </w:r>
-            <w:proofErr w:type="spellEnd"/>
-            <w:r>
-              <w:rPr>
-                <w:rFonts w:cs="Microsoft Sans Serif"/>
-                <w:color w:val="000000" w:themeColor="text1"/>
-                <w:szCs w:val="22"/>
-              </w:rPr>
-              <w:t>&gt;&gt;</w:t>
+              <w:t>&lt;&lt;fecha_de_entrega&gt;&gt;</w:t>
             </w:r>
           </w:p>
         </w:tc>
@@ -1361,6 +1251,7 @@
           <w:docPartUnique/>
         </w:docPartObj>
       </w:sdtPr>
+      <w:sdtEndPr/>
       <w:sdtContent>
         <w:p>
           <w:pPr>
@@ -5566,23 +5457,7 @@
         <w:t>Servicio de Medición y Análisis Metoceánicos del Golfo de México”</w:t>
       </w:r>
       <w:r>
-        <w:t xml:space="preserve"> inició en 2007 con un enfoque orientado al monitoreo de aguas profundas e intermedias, regiones en las que la información metoceánica disponible era limitada o inexistente, como en las áreas de Perdido y </w:t>
-      </w:r>
-      <w:proofErr w:type="spellStart"/>
-      <w:r>
-        <w:t>Lakach</w:t>
-      </w:r>
-      <w:proofErr w:type="spellEnd"/>
-      <w:r>
-        <w:t xml:space="preserve">. Posteriormente, el alcance del proyecto se amplió para incluir el monitoreo en aguas someras, sin descuidar las regiones profundas, incorporando además un enfoque más operativo. Una etapa adicional relevante se presentó cuando el proyecto se adaptó para atender nuevas áreas donde PEMEX tenía asignaciones directas para exploración y producción y/o donde compartía algún tipo de asociación con alguna otra empresa (por citar un ejemplo, </w:t>
-      </w:r>
-      <w:proofErr w:type="spellStart"/>
-      <w:r>
-        <w:t>Trión</w:t>
-      </w:r>
-      <w:proofErr w:type="spellEnd"/>
-      <w:r>
-        <w:t xml:space="preserve">). Para la etapa 2024-2025, a solicitud de PEMEX, el proyecto se enfocó a la disponibilidad inmediata de información </w:t>
+        <w:t xml:space="preserve"> inició en 2007 con un enfoque orientado al monitoreo de aguas profundas e intermedias, regiones en las que la información metoceánica disponible era limitada o inexistente, como en las áreas de Perdido y Lakach. Posteriormente, el alcance del proyecto se amplió para incluir el monitoreo en aguas someras, sin descuidar las regiones profundas, incorporando además un enfoque más operativo. Una etapa adicional relevante se presentó cuando el proyecto se adaptó para atender nuevas áreas donde PEMEX tenía asignaciones directas para exploración y producción y/o donde compartía algún tipo de asociación con alguna otra empresa (por citar un ejemplo, Trión). Para la etapa 2024-2025, a solicitud de PEMEX, el proyecto se enfocó a la disponibilidad inmediata de información </w:t>
       </w:r>
       <w:r>
         <w:lastRenderedPageBreak/>
@@ -5708,40 +5583,26 @@
         <w:ind w:firstLine="360"/>
       </w:pPr>
       <w:r>
-        <w:t xml:space="preserve">Este reporte describe y enumera las actividades realizadas por el consorcio </w:t>
-      </w:r>
-      <w:proofErr w:type="spellStart"/>
-      <w:r>
-        <w:t>All</w:t>
-      </w:r>
-      <w:proofErr w:type="spellEnd"/>
+        <w:t>Este reporte describe y enumera las actividades realizadas por el consorcio All Solutions de México S. A. de C. V. (en lo sucesivo ASM) y el Centro de Investigación Científica y Educación Superior de Ensenada (en lo sucesivo CICESE) para la preparación, movilización y finalmente el</w:t>
+      </w:r>
       <w:r>
         <w:t xml:space="preserve"> </w:t>
       </w:r>
-      <w:proofErr w:type="spellStart"/>
-      <w:r>
-        <w:t>Solutions</w:t>
-      </w:r>
-      <w:proofErr w:type="spellEnd"/>
-      <w:r>
-        <w:t xml:space="preserve"> de México S. A. de C. V. (en lo sucesivo ASM) y el Centro de Investigación Científica y Educación Superior de Ensenada (en lo sucesivo CICESE) para la preparación, movilización y finalmente el</w:t>
-      </w:r>
-      <w:r>
-        <w:t xml:space="preserve"> </w:t>
-      </w:r>
-      <w:r>
-        <w:t>despliegue satisfactorio de sondas oceanográficas; dando cumplimiento así al compromiso establecido en la sección 10.1 del contrato No. 658225821 “Reporte del protocolo de liberación de las sondas oceanográficas y transmisión de datos.” y específicamente a la Orden de Servicio PEMEX-ASM-CICESE-658225821-</w:t>
-      </w:r>
-      <w:r>
-        <w:t>&lt;&lt;</w:t>
-      </w:r>
-      <w:proofErr w:type="spellStart"/>
-      <w:r>
-        <w:t>orden_de_servicio</w:t>
-      </w:r>
-      <w:proofErr w:type="spellEnd"/>
-      <w:r>
-        <w:t>&gt;&gt;</w:t>
+      <w:r>
+        <w:t>despliegue satisfactorio de sondas oceanográficas; dando cumplimiento así al compromiso establecido en la sección 10.1 del contrato No. 658225821 “</w:t>
+      </w:r>
+      <w:r>
+        <w:rPr>
+          <w:i/>
+          <w:iCs/>
+        </w:rPr>
+        <w:t>Reporte del protocolo de liberación de las sondas oceanográficas y transmisión de datos</w:t>
+      </w:r>
+      <w:r>
+        <w:t>.” y específicamente a la Orden de Servicio PEMEX-ASM-CICESE-658225821-</w:t>
+      </w:r>
+      <w:r>
+        <w:t>&lt;&lt;orden_de_servicio&gt;&gt;</w:t>
       </w:r>
       <w:r>
         <w:t>.</w:t>
@@ -5778,21 +5639,26 @@
         <w:t xml:space="preserve"> </w:t>
       </w:r>
       <w:r>
-        <w:t xml:space="preserve">en este documento se reportan las actividades asociadas al concepto “10.1 Protocolo de liberación de las sondas oceanográficas y transmisión de datos”, relacionadas con las sondas oceanográficas liberadas en </w:t>
+        <w:t>en este documento se reportan las actividades asociadas al concepto “</w:t>
+      </w:r>
+      <w:r>
+        <w:rPr>
+          <w:i/>
+          <w:iCs/>
+        </w:rPr>
+        <w:t>10.1 Protocolo de liberación de las sondas oceanográficas y transmisión de datos</w:t>
+      </w:r>
+      <w:r>
+        <w:t xml:space="preserve">”, relacionadas con las sondas oceanográficas liberadas en </w:t>
       </w:r>
       <w:r>
         <w:t>&lt;&lt;</w:t>
       </w:r>
-      <w:proofErr w:type="spellStart"/>
       <w:r>
         <w:t>mes_y_anio</w:t>
       </w:r>
       <w:r>
-        <w:t>_de_liberacion</w:t>
-      </w:r>
-      <w:proofErr w:type="spellEnd"/>
-      <w:r>
-        <w:t>&gt;&gt;</w:t>
+        <w:t>_de_liberacion&gt;&gt;</w:t>
       </w:r>
       <w:r>
         <w:t xml:space="preserve">, las cuales se ejecutaron para dar cumplimiento a la orden de servicio </w:t>
@@ -5811,7 +5677,6 @@
         </w:rPr>
         <w:t>&lt;&lt;</w:t>
       </w:r>
-      <w:proofErr w:type="spellStart"/>
       <w:r>
         <w:rPr>
           <w:b/>
@@ -5819,7 +5684,6 @@
         </w:rPr>
         <w:t>orden_de_servicio</w:t>
       </w:r>
-      <w:proofErr w:type="spellEnd"/>
       <w:r>
         <w:rPr>
           <w:b/>
@@ -6770,7 +6634,19 @@
         <w:rPr>
           <w:rFonts w:cs="Arial"/>
         </w:rPr>
-        <w:t xml:space="preserve">El cuerpo de la boya está diseñado para aguantar estados de mar </w:t>
+        <w:t xml:space="preserve">El cuerpo de la </w:t>
+      </w:r>
+      <w:r>
+        <w:rPr>
+          <w:rFonts w:cs="Arial"/>
+        </w:rPr>
+        <w:t>sonda</w:t>
+      </w:r>
+      <w:r>
+        <w:rPr>
+          <w:rFonts w:cs="Arial"/>
+        </w:rPr>
+        <w:t xml:space="preserve"> está diseñado para aguantar estados de mar </w:t>
       </w:r>
       <w:r>
         <w:rPr>
@@ -7061,7 +6937,19 @@
         <w:rPr>
           <w:rFonts w:cs="Arial"/>
         </w:rPr>
-        <w:t>los componentes electrónicos, los cuales, por razones de seguridad, se encuentran encapsulados mediante resina epóxica dieléctrica, que actúa como aislante eléctrico y térmico. Adicionalmente, para mantener la estabilidad y flotabilidad vertical de la boya, se integra un lastre interno que previene volcaduras y asegura la orientación adecuada de los paneles solares hacia la radiación solar.</w:t>
+        <w:t xml:space="preserve">los componentes electrónicos, los cuales, por razones de seguridad, se encuentran encapsulados mediante resina epóxica dieléctrica, que actúa como aislante eléctrico y térmico. Adicionalmente, para mantener la estabilidad y flotabilidad vertical de la </w:t>
+      </w:r>
+      <w:r>
+        <w:rPr>
+          <w:rFonts w:cs="Arial"/>
+        </w:rPr>
+        <w:t>sonda</w:t>
+      </w:r>
+      <w:r>
+        <w:rPr>
+          <w:rFonts w:cs="Arial"/>
+        </w:rPr>
+        <w:t>, se integra un lastre interno que previene volcaduras y asegura la orientación adecuada de los paneles solares hacia la radiación solar.</w:t>
       </w:r>
     </w:p>
     <w:p>
@@ -7344,21 +7232,7 @@
         <w:rPr>
           <w:rFonts w:cs="Arial"/>
         </w:rPr>
-        <w:t xml:space="preserve">Dentro del compartimiento interior de la sonda se resguarda un microcontrolador de 32 bits </w:t>
-      </w:r>
-      <w:proofErr w:type="spellStart"/>
-      <w:r>
-        <w:rPr>
-          <w:rFonts w:cs="Arial"/>
-        </w:rPr>
-        <w:t>Cortex</w:t>
-      </w:r>
-      <w:proofErr w:type="spellEnd"/>
-      <w:r>
-        <w:rPr>
-          <w:rFonts w:cs="Arial"/>
-        </w:rPr>
-        <w:t xml:space="preserve"> de 48 MHz</w:t>
+        <w:t>Dentro del compartimiento interior de la sonda se resguarda un microcontrolador de 32 bits Cortex de 48 MHz</w:t>
       </w:r>
       <w:r>
         <w:rPr>
@@ -7470,7 +7344,19 @@
         <w:rPr>
           <w:rFonts w:cs="Arial"/>
         </w:rPr>
-        <w:t>En la parte superior interna de la boya se instalaron paneles solares de 6.2 V y 1 A</w:t>
+        <w:t xml:space="preserve">En la parte superior interna de la </w:t>
+      </w:r>
+      <w:r>
+        <w:rPr>
+          <w:rFonts w:cs="Arial"/>
+        </w:rPr>
+        <w:t>sonda</w:t>
+      </w:r>
+      <w:r>
+        <w:rPr>
+          <w:rFonts w:cs="Arial"/>
+        </w:rPr>
+        <w:t xml:space="preserve"> se instalaron paneles solares de 6.2 V y 1 A</w:t>
       </w:r>
       <w:r>
         <w:rPr>
@@ -7582,7 +7468,31 @@
         <w:rPr>
           <w:rFonts w:cs="Arial"/>
         </w:rPr>
-        <w:t>Como parte del sistema de seguridad, la esfera de flotación incorpora un sistema de monitoreo de temperatura, presión interna y nivel de carga de las baterías, lo que permite dar seguimiento continuo a las condiciones internas de la boya. Asimismo, integra un sistema de purga como medida de protección, diseñado para evitar la acumulación de gases en caso de sobrecalentamiento de las baterías. Adicionalmente, la sonda cuenta con un circuito invertido de apertura que permite identificar si la boya se encuentra dentro o fuera del agua. Finalmente, el compartimento interno donde se alojan los componentes electrónicos se rellena con poliuretano, con el fin de minimizar variaciones de presión interna derivadas de la expansión y contracción del aire</w:t>
+        <w:t xml:space="preserve">Como parte del sistema de seguridad, la esfera de flotación incorpora un sistema de monitoreo de temperatura, presión interna y nivel de carga de las baterías, lo que permite dar seguimiento continuo a las condiciones internas de la </w:t>
+      </w:r>
+      <w:r>
+        <w:rPr>
+          <w:rFonts w:cs="Arial"/>
+        </w:rPr>
+        <w:t>sonda</w:t>
+      </w:r>
+      <w:r>
+        <w:rPr>
+          <w:rFonts w:cs="Arial"/>
+        </w:rPr>
+        <w:t xml:space="preserve">. Asimismo, integra un sistema de purga como medida de protección, diseñado para evitar la acumulación de gases en caso de sobrecalentamiento de las baterías. Adicionalmente, la sonda cuenta con un circuito invertido de apertura que permite identificar si la </w:t>
+      </w:r>
+      <w:r>
+        <w:rPr>
+          <w:rFonts w:cs="Arial"/>
+        </w:rPr>
+        <w:t>sonda</w:t>
+      </w:r>
+      <w:r>
+        <w:rPr>
+          <w:rFonts w:cs="Arial"/>
+        </w:rPr>
+        <w:t xml:space="preserve"> se encuentra dentro o fuera del agua. Finalmente, el compartimento interno donde se alojan los componentes electrónicos se rellena con poliuretano, con el fin de minimizar variaciones de presión interna derivadas de la expansión y contracción del aire</w:t>
       </w:r>
       <w:r>
         <w:rPr>
@@ -7644,7 +7554,19 @@
         <w:rPr>
           <w:rFonts w:cs="Arial"/>
         </w:rPr>
-        <w:t>Dado que la boya se encuentra sellada herméticamente y no es posible su apertura una vez cerrada, se incorpora un interruptor magnético que permite el encendido y apagado de la sonda sin necesidad de contacto físico directo. De igual forma, el sistema integra un módulo de comunicación Bluetooth, el cual permite la programación de la sonda y la descarga de datos una vez concluido el cierre de la estructura esférica.</w:t>
+        <w:t xml:space="preserve">Dado que la </w:t>
+      </w:r>
+      <w:r>
+        <w:rPr>
+          <w:rFonts w:cs="Arial"/>
+        </w:rPr>
+        <w:t>sonda</w:t>
+      </w:r>
+      <w:r>
+        <w:rPr>
+          <w:rFonts w:cs="Arial"/>
+        </w:rPr>
+        <w:t xml:space="preserve"> se encuentra sellada herméticamente y no es posible su apertura una vez cerrada, se incorpora un interruptor magnético que permite el encendido y apagado de la sonda sin necesidad de contacto físico directo. De igual forma, el sistema integra un módulo de comunicación Bluetooth, el cual permite la programación de la sonda y la descarga de datos una vez concluido el cierre de la estructura esférica.</w:t>
       </w:r>
     </w:p>
     <w:p/>
@@ -7682,116 +7604,46 @@
         <w:rPr>
           <w:rFonts w:cs="Arial"/>
         </w:rPr>
-        <w:t xml:space="preserve">La sonda oceanográfica incorpora un sistema redundante de posicionamiento global basado en receptores GNSS </w:t>
-      </w:r>
-      <w:proofErr w:type="spellStart"/>
+        <w:t>La sonda oceanográfica incorpora un sistema redundante de posicionamiento global basado en receptores GNSS multiconstelación, que integran los sistemas GPS</w:t>
+      </w:r>
       <w:r>
         <w:rPr>
           <w:rFonts w:cs="Arial"/>
         </w:rPr>
-        <w:t>multiconstelación</w:t>
-      </w:r>
-      <w:proofErr w:type="spellEnd"/>
+        <w:t xml:space="preserve"> (</w:t>
+      </w:r>
       <w:r>
         <w:rPr>
           <w:rFonts w:cs="Arial"/>
         </w:rPr>
-        <w:t>, que integran los sistemas GPS</w:t>
+        <w:t>&lt;&lt;ref_</w:t>
+      </w:r>
+      <w:r>
+        <w:t>descripcion_arquitectura_6&gt;&gt;</w:t>
       </w:r>
       <w:r>
         <w:rPr>
           <w:rFonts w:cs="Arial"/>
         </w:rPr>
-        <w:t xml:space="preserve"> (</w:t>
+        <w:t>)</w:t>
       </w:r>
       <w:r>
         <w:rPr>
           <w:rFonts w:cs="Arial"/>
         </w:rPr>
-        <w:t>&lt;&lt;ref_</w:t>
-      </w:r>
-      <w:r>
-        <w:t>descripcion_arquitectura_6&gt;&gt;</w:t>
+        <w:t xml:space="preserve">, GLONASS, BeiDou y Galileo, así como correcciones mediante sistemas SBAS, como WAAS, lo que permite alcanzar una precisión inferior a 3 m el 90 % del tiempo, con una tasa de muestreo </w:t>
       </w:r>
       <w:r>
         <w:rPr>
           <w:rFonts w:cs="Arial"/>
         </w:rPr>
-        <w:t>)</w:t>
+        <w:t>mínima</w:t>
       </w:r>
       <w:r>
         <w:rPr>
           <w:rFonts w:cs="Arial"/>
         </w:rPr>
-        <w:t xml:space="preserve">, GLONASS, </w:t>
-      </w:r>
-      <w:proofErr w:type="spellStart"/>
-      <w:r>
-        <w:rPr>
-          <w:rFonts w:cs="Arial"/>
-        </w:rPr>
-        <w:t>BeiDou</w:t>
-      </w:r>
-      <w:proofErr w:type="spellEnd"/>
-      <w:r>
-        <w:rPr>
-          <w:rFonts w:cs="Arial"/>
-        </w:rPr>
-        <w:t xml:space="preserve"> y Galileo, así como correcciones mediante sistemas SBAS, como WAAS, lo que permite alcanzar una precisión inferior a 3 m el 90 % del tiempo, con una tasa de muestreo </w:t>
-      </w:r>
-      <w:r>
-        <w:rPr>
-          <w:rFonts w:cs="Arial"/>
-        </w:rPr>
-        <w:t>mínima</w:t>
-      </w:r>
-      <w:r>
-        <w:rPr>
-          <w:rFonts w:cs="Arial"/>
-        </w:rPr>
-        <w:t xml:space="preserve"> 10 Hz. Adicionalmente, cuenta con un sistema de telemetría satelital, compatible con redes </w:t>
-      </w:r>
-      <w:proofErr w:type="spellStart"/>
-      <w:r>
-        <w:rPr>
-          <w:rFonts w:cs="Arial"/>
-        </w:rPr>
-        <w:t>Iridium</w:t>
-      </w:r>
-      <w:proofErr w:type="spellEnd"/>
-      <w:r>
-        <w:rPr>
-          <w:rFonts w:cs="Arial"/>
-        </w:rPr>
-        <w:t xml:space="preserve">, </w:t>
-      </w:r>
-      <w:proofErr w:type="spellStart"/>
-      <w:r>
-        <w:rPr>
-          <w:rFonts w:cs="Arial"/>
-        </w:rPr>
-        <w:t>GlobalStar</w:t>
-      </w:r>
-      <w:proofErr w:type="spellEnd"/>
-      <w:r>
-        <w:rPr>
-          <w:rFonts w:cs="Arial"/>
-        </w:rPr>
-        <w:t xml:space="preserve"> o </w:t>
-      </w:r>
-      <w:proofErr w:type="spellStart"/>
-      <w:r>
-        <w:rPr>
-          <w:rFonts w:cs="Arial"/>
-        </w:rPr>
-        <w:t>IsatData</w:t>
-      </w:r>
-      <w:proofErr w:type="spellEnd"/>
-      <w:r>
-        <w:rPr>
-          <w:rFonts w:cs="Arial"/>
-        </w:rPr>
-        <w:t xml:space="preserve"> Pro, que permite la transmisión de datos en tiempo real en zonas de mar abierto. Asimismo, la sonda integra un sistema </w:t>
+        <w:t xml:space="preserve"> 10 Hz. Adicionalmente, cuenta con un sistema de telemetría satelital, compatible con redes Iridium, GlobalStar o IsatData Pro, que permite la transmisión de datos en tiempo real en zonas de mar abierto. Asimismo, la sonda integra un sistema </w:t>
       </w:r>
       <w:r>
         <w:rPr>
@@ -7879,7 +7731,19 @@
         <w:rPr>
           <w:rFonts w:cs="Arial"/>
         </w:rPr>
-        <w:t>integra un acelerómetro inercial con una tasa de muestreo mínima de 10 Hz, el cual permite registrar el movimiento y la dinámica de la boya, proporcionando información relevante sobre su comportamiento ante</w:t>
+        <w:t xml:space="preserve">integra un acelerómetro inercial con una tasa de muestreo mínima de 10 Hz, el cual permite registrar el movimiento y la dinámica de la </w:t>
+      </w:r>
+      <w:r>
+        <w:rPr>
+          <w:rFonts w:cs="Arial"/>
+        </w:rPr>
+        <w:t>sonda</w:t>
+      </w:r>
+      <w:r>
+        <w:rPr>
+          <w:rFonts w:cs="Arial"/>
+        </w:rPr>
+        <w:t>, proporcionando información relevante sobre su comportamiento ante</w:t>
       </w:r>
       <w:r>
         <w:rPr>
@@ -8930,21 +8794,10 @@
         <w:rPr>
           <w:rFonts w:cs="Arial"/>
         </w:rPr>
-        <w:t>&lt;&lt;</w:t>
-      </w:r>
-      <w:proofErr w:type="spellStart"/>
-      <w:r>
-        <w:rPr>
-          <w:rFonts w:cs="Arial"/>
-        </w:rPr>
-        <w:t>ref_</w:t>
-      </w:r>
-      <w:r>
-        <w:t>actividades_previas</w:t>
-      </w:r>
-      <w:proofErr w:type="spellEnd"/>
-      <w:r>
-        <w:t>&gt;&gt;</w:t>
+        <w:t>&lt;&lt;ref_</w:t>
+      </w:r>
+      <w:r>
+        <w:t>actividades_previas&gt;&gt;</w:t>
       </w:r>
       <w:r>
         <w:t>)</w:t>
@@ -8967,21 +8820,13 @@
         <w:pStyle w:val="Figura"/>
       </w:pPr>
       <w:r>
-        <w:t>&lt;&lt;</w:t>
-      </w:r>
-      <w:proofErr w:type="spellStart"/>
-      <w:r>
-        <w:t>fig_</w:t>
+        <w:t>&lt;&lt;fig_</w:t>
       </w:r>
       <w:r>
         <w:t>actividades</w:t>
       </w:r>
       <w:r>
-        <w:t>_previas</w:t>
-      </w:r>
-      <w:proofErr w:type="spellEnd"/>
-      <w:r>
-        <w:t>&gt;&gt;</w:t>
+        <w:t>_previas&gt;&gt;</w:t>
       </w:r>
     </w:p>
     <w:p>
@@ -9075,11 +8920,9 @@
       <w:r>
         <w:t>&lt;&lt;</w:t>
       </w:r>
-      <w:proofErr w:type="spellStart"/>
       <w:r>
         <w:t>numero_de_sondas</w:t>
       </w:r>
-      <w:proofErr w:type="spellEnd"/>
       <w:r>
         <w:t>&gt;&gt;</w:t>
       </w:r>
@@ -9090,28 +8933,18 @@
         <w:t>Orden de Servicio PEMEX-ASM-CICESE-658225821-</w:t>
       </w:r>
       <w:r>
+        <w:t>&lt;&lt;orden_de_servicio&gt;&gt; del mes de</w:t>
+      </w:r>
+      <w:r>
+        <w:t xml:space="preserve"> </w:t>
+      </w:r>
+      <w:bookmarkStart w:id="77" w:name="_Hlk224322141"/>
+      <w:r>
         <w:t>&lt;&lt;</w:t>
       </w:r>
-      <w:proofErr w:type="spellStart"/>
-      <w:r>
-        <w:t>orden_de_servicio</w:t>
-      </w:r>
-      <w:proofErr w:type="spellEnd"/>
-      <w:r>
-        <w:t>&gt;&gt; del mes de</w:t>
-      </w:r>
-      <w:r>
-        <w:t xml:space="preserve"> </w:t>
-      </w:r>
-      <w:bookmarkStart w:id="77" w:name="_Hlk224322141"/>
-      <w:r>
-        <w:t>&lt;&lt;</w:t>
-      </w:r>
-      <w:proofErr w:type="spellStart"/>
       <w:r>
         <w:t>mes_y_anio_de_liberacion</w:t>
       </w:r>
-      <w:proofErr w:type="spellEnd"/>
       <w:r>
         <w:t xml:space="preserve">&gt;&gt;. </w:t>
       </w:r>
@@ -9257,16 +9090,11 @@
         <w:t xml:space="preserve"> que estuvieron</w:t>
       </w:r>
       <w:r>
-        <w:t xml:space="preserve"> </w:t>
-      </w:r>
-      <w:proofErr w:type="spellStart"/>
-      <w:r>
-        <w:t>pre-armada</w:t>
+        <w:t xml:space="preserve"> pre-armada</w:t>
       </w:r>
       <w:r>
         <w:t>s</w:t>
       </w:r>
-      <w:proofErr w:type="spellEnd"/>
       <w:r>
         <w:t xml:space="preserve"> la</w:t>
       </w:r>
@@ -9494,29 +9322,13 @@
         <w:t>obación. El derrotero o ruta de liberación de las sondas consideró</w:t>
       </w:r>
       <w:r>
-        <w:t xml:space="preserve"> el trayecto desde tierra hasta el lugar de despliegue de las &lt;&lt;</w:t>
-      </w:r>
-      <w:proofErr w:type="spellStart"/>
-      <w:r>
-        <w:t>numero_de_sondas</w:t>
-      </w:r>
-      <w:proofErr w:type="spellEnd"/>
-      <w:r>
-        <w:t>&gt;&gt;</w:t>
+        <w:t xml:space="preserve"> el trayecto desde tierra hasta el lugar de despliegue de las &lt;&lt;numero_de_sondas&gt;&gt;</w:t>
       </w:r>
       <w:r>
         <w:t xml:space="preserve"> </w:t>
       </w:r>
       <w:r>
-        <w:t>sondas oceanográficas liberadas en el &lt;&lt;</w:t>
-      </w:r>
-      <w:proofErr w:type="spellStart"/>
-      <w:r>
-        <w:t>mes_y_anio_de_liberacion</w:t>
-      </w:r>
-      <w:proofErr w:type="spellEnd"/>
-      <w:r>
-        <w:t>&gt;&gt; tomando en cuenta las condiciones ambientales y la posición de despliegue. &lt;&lt;ejecucion</w:t>
+        <w:t>sondas oceanográficas liberadas en el &lt;&lt;mes_y_anio_de_liberacion&gt;&gt; tomando en cuenta las condiciones ambientales y la posición de despliegue. &lt;&lt;ejecucion</w:t>
       </w:r>
       <w:r>
         <w:t>_de_la_campania_parrafo1&gt;&gt;.</w:t>
@@ -9542,16 +9354,19 @@
       </w:r>
       <w:bookmarkEnd w:id="84"/>
       <w:r>
-        <w:t xml:space="preserve">; se efectuó de acuerdo con la planeación de la logística y derrotero de la embarcación. El </w:t>
-      </w:r>
-      <w:r>
-        <w:t>líder del equipo de instalación le informó al personal las actividades que se realizarían durante el despliegue de las sondas con el fin de que cada miembro del equipo conociera los detalles de la operación, propiciando la integridad del personal y de los equipos de dichas sondas; asimismo se siguieron los procedimientos de seguridad durante todas las campañas de despliegue de las sondas oceanográficas</w:t>
-      </w:r>
-      <w:r>
-        <w:t xml:space="preserve">. </w:t>
-      </w:r>
-      <w:r>
-        <w:t xml:space="preserve">Para más detalles sobre las campañas vea el </w:t>
+        <w:t>,</w:t>
+      </w:r>
+      <w:r>
+        <w:t xml:space="preserve"> se efectuó de acuerdo con la planeación de la logística y derrotero de la embarcación. El </w:t>
+      </w:r>
+      <w:r>
+        <w:t>líder del equipo de instalación le informó al personal las actividades que se realizarían durante el despliegue de las sondas con el fin de que cada miembro del equipo conociera los detalles de la operación, propiciando la integridad del personal y de los equipos de dichas sondas; asimismo se siguieron los procedimientos de seguridad durante</w:t>
+      </w:r>
+      <w:r>
+        <w:t xml:space="preserve"> &lt;&lt;ejecucion_de_la_campania_parrafo3&gt;&gt;</w:t>
+      </w:r>
+      <w:r>
+        <w:t xml:space="preserve"> </w:t>
       </w:r>
       <w:r>
         <w:fldChar w:fldCharType="begin"/>
@@ -9591,10 +9406,10 @@
         <w:ind w:firstLine="426"/>
       </w:pPr>
       <w:r>
-        <w:t xml:space="preserve">Las actividades asociadas a la ejecución de las campañas para la liberación de sondas oceanográficas son similares entre ellas. </w:t>
-      </w:r>
-      <w:r>
-        <w:t xml:space="preserve">A continuación, se describen las actividades asociadas a la ejecución de </w:t>
+        <w:t>&lt;&lt;ejecucion_de_la_campania_parrafo4&gt;&gt;</w:t>
+      </w:r>
+      <w:r>
+        <w:t xml:space="preserve"> se describen las actividades asociadas a la ejecución de </w:t>
       </w:r>
       <w:r>
         <w:t xml:space="preserve">la campaña </w:t>
@@ -9603,7 +9418,10 @@
         <w:t>&lt;&lt;</w:t>
       </w:r>
       <w:r>
-        <w:t>ejecucion_de_la_campania_parrafo3</w:t>
+        <w:t>ejecucion_de_la_campania_parrafo</w:t>
+      </w:r>
+      <w:r>
+        <w:t>5</w:t>
       </w:r>
       <w:r>
         <w:t xml:space="preserve">&gt;&gt; para el despliegue de </w:t>
@@ -9670,7 +9488,19 @@
         <w:rPr>
           <w:szCs w:val="22"/>
         </w:rPr>
-        <w:t>Se corroboraron las coordenadas y el tirante de liberación de la sonda</w:t>
+        <w:t xml:space="preserve">Se corroboraron las coordenadas y el tirante </w:t>
+      </w:r>
+      <w:r>
+        <w:rPr>
+          <w:szCs w:val="22"/>
+        </w:rPr>
+        <w:t xml:space="preserve">aproximado </w:t>
+      </w:r>
+      <w:r>
+        <w:rPr>
+          <w:szCs w:val="22"/>
+        </w:rPr>
+        <w:t>de liberación de la sonda</w:t>
       </w:r>
       <w:r>
         <w:rPr>
@@ -9876,18 +9706,58 @@
         <w:t>L</w:t>
       </w:r>
       <w:r>
-        <w:t>as localizaciones de despliegue se muestran en la &lt;&lt;</w:t>
-      </w:r>
-      <w:proofErr w:type="spellStart"/>
-      <w:r>
-        <w:t>ref_mapa_de_despliegue</w:t>
-      </w:r>
-      <w:proofErr w:type="spellEnd"/>
-      <w:r>
-        <w:t>&gt;&gt;</w:t>
-      </w:r>
-      <w:r>
-        <w:t xml:space="preserve"> </w:t>
+        <w:t xml:space="preserve">as localizaciones de despliegue </w:t>
+      </w:r>
+      <w:r>
+        <w:t xml:space="preserve">de las sondas oceanográficas </w:t>
+      </w:r>
+      <w:r>
+        <w:t>se muestran en la &lt;&lt;ref_mapa_de_despliegue&gt;&gt;</w:t>
+      </w:r>
+      <w:r>
+        <w:t xml:space="preserve">, </w:t>
+      </w:r>
+      <w:r>
+        <w:t xml:space="preserve">las </w:t>
+      </w:r>
+      <w:r>
+        <w:t>localizaciones</w:t>
+      </w:r>
+      <w:r>
+        <w:t xml:space="preserve"> se muestran con círculos tal como se indican en la leyenda a la derecha de la figura, </w:t>
+      </w:r>
+      <w:r>
+        <w:rPr>
+          <w:rFonts w:cs="Microsoft Sans Serif"/>
+        </w:rPr>
+        <w:t>los ejes vertical y horizontal de la figura indican las coordenadas en latitud y longitud, respectivamente; los valores de la batimetría y topografía se indican mediante la escala de color que se encuentra a la derecha de la figura; y en líneas continuas de color negro se presentan las isóbatas de 2</w:t>
+      </w:r>
+      <w:r>
+        <w:rPr>
+          <w:rFonts w:cs="Microsoft Sans Serif"/>
+        </w:rPr>
+        <w:t>5</w:t>
+      </w:r>
+      <w:r>
+        <w:rPr>
+          <w:rFonts w:cs="Microsoft Sans Serif"/>
+        </w:rPr>
+        <w:t xml:space="preserve">, 100, 500, 1000 y </w:t>
+      </w:r>
+      <w:r>
+        <w:rPr>
+          <w:rFonts w:cs="Microsoft Sans Serif"/>
+        </w:rPr>
+        <w:t>20</w:t>
+      </w:r>
+      <w:r>
+        <w:rPr>
+          <w:rFonts w:cs="Microsoft Sans Serif"/>
+        </w:rPr>
+        <w:t>00 metros</w:t>
+      </w:r>
+      <w:r>
+        <w:t>.</w:t>
       </w:r>
     </w:p>
     <w:p/>
@@ -9896,21 +9766,13 @@
         <w:pStyle w:val="Figura"/>
       </w:pPr>
       <w:r>
-        <w:t>&lt;&lt;</w:t>
-      </w:r>
-      <w:proofErr w:type="spellStart"/>
-      <w:r>
-        <w:t>fig_</w:t>
+        <w:t>&lt;&lt;fig_</w:t>
       </w:r>
       <w:r>
         <w:t>mapa</w:t>
       </w:r>
       <w:r>
-        <w:t>_de_despliegue</w:t>
-      </w:r>
-      <w:proofErr w:type="spellEnd"/>
-      <w:r>
-        <w:t>&gt;&gt;</w:t>
+        <w:t>_de_despliegue&gt;&gt;</w:t>
       </w:r>
     </w:p>
     <w:p>
@@ -9924,21 +9786,10 @@
         <w:rPr>
           <w:rFonts w:cs="Arial"/>
         </w:rPr>
-        <w:t>&lt;&lt;</w:t>
-      </w:r>
-      <w:proofErr w:type="spellStart"/>
-      <w:r>
-        <w:rPr>
-          <w:rFonts w:cs="Arial"/>
-        </w:rPr>
-        <w:t>ref_</w:t>
-      </w:r>
-      <w:r>
-        <w:t>ejecucion_de_la_campania</w:t>
-      </w:r>
-      <w:proofErr w:type="spellEnd"/>
-      <w:r>
-        <w:t xml:space="preserve">&gt;&gt; </w:t>
+        <w:t>&lt;&lt;ref_</w:t>
+      </w:r>
+      <w:r>
+        <w:t xml:space="preserve">ejecucion_de_la_campania&gt;&gt; </w:t>
       </w:r>
       <w:r>
         <w:t xml:space="preserve">se presentan las evidencias fotográficas del despliegue de las </w:t>
@@ -9957,16 +9808,11 @@
         <w:pStyle w:val="Figura"/>
       </w:pPr>
       <w:r>
-        <w:t>&lt;&lt;</w:t>
-      </w:r>
-      <w:proofErr w:type="spellStart"/>
-      <w:r>
-        <w:t>fig_ejecucion_</w:t>
+        <w:t>&lt;&lt;fig_ejecucion_</w:t>
       </w:r>
       <w:r>
         <w:t>de_la_campania</w:t>
       </w:r>
-      <w:proofErr w:type="spellEnd"/>
       <w:r>
         <w:t>&gt;&gt;</w:t>
       </w:r>
@@ -10039,6 +9885,7 @@
       <w:bookmarkStart w:id="87" w:name="_Toc215827128"/>
       <w:bookmarkStart w:id="88" w:name="_Toc230346470"/>
       <w:r>
+        <w:lastRenderedPageBreak/>
         <w:t xml:space="preserve">Tabla </w:t>
       </w:r>
       <w:fldSimple w:instr=" SEQ Tabla \* ARABIC ">
@@ -10430,27 +10277,7 @@
                 <w:sz w:val="20"/>
                 <w:szCs w:val="20"/>
               </w:rPr>
-              <w:t>&lt;&lt;</w:t>
-            </w:r>
-            <w:proofErr w:type="spellStart"/>
-            <w:r>
-              <w:rPr>
-                <w:rFonts w:cs="Microsoft Sans Serif"/>
-                <w:vanish/>
-                <w:sz w:val="20"/>
-                <w:szCs w:val="20"/>
-              </w:rPr>
-              <w:t>tabla_plan</w:t>
-            </w:r>
-            <w:proofErr w:type="spellEnd"/>
-            <w:r>
-              <w:rPr>
-                <w:rFonts w:cs="Microsoft Sans Serif"/>
-                <w:vanish/>
-                <w:sz w:val="20"/>
-                <w:szCs w:val="20"/>
-              </w:rPr>
-              <w:t>&gt;&gt;</w:t>
+              <w:t>&lt;&lt;tabla_plan&gt;&gt;</w:t>
             </w:r>
           </w:p>
         </w:tc>
@@ -10522,7 +10349,6 @@
       <w:bookmarkStart w:id="91" w:name="_Ref224230599"/>
       <w:bookmarkStart w:id="92" w:name="_Toc230346484"/>
       <w:r>
-        <w:lastRenderedPageBreak/>
         <w:t>INFORMACIÓN DEL DESPLIEGUE DE LAS SONDAS OCEANOGRÁFICAS</w:t>
       </w:r>
       <w:bookmarkEnd w:id="89"/>
@@ -10550,7 +10376,7 @@
         <w:t>ia_parrafo</w:t>
       </w:r>
       <w:r>
-        <w:t>4</w:t>
+        <w:t>6</w:t>
       </w:r>
       <w:r>
         <w:t>&gt;&gt;</w:t>
@@ -11064,23 +10890,7 @@
                 <w:vanish/>
                 <w:szCs w:val="20"/>
               </w:rPr>
-              <w:t>&lt;&lt;</w:t>
-            </w:r>
-            <w:proofErr w:type="spellStart"/>
-            <w:r>
-              <w:rPr>
-                <w:vanish/>
-                <w:szCs w:val="20"/>
-              </w:rPr>
-              <w:t>tabla_maniobra</w:t>
-            </w:r>
-            <w:proofErr w:type="spellEnd"/>
-            <w:r>
-              <w:rPr>
-                <w:vanish/>
-                <w:szCs w:val="20"/>
-              </w:rPr>
-              <w:t>&gt;&gt;</w:t>
+              <w:t>&lt;&lt;tabla_maniobra&gt;&gt;</w:t>
             </w:r>
           </w:p>
         </w:tc>
@@ -11216,7 +11026,8 @@
     </w:p>
     <w:tbl>
       <w:tblPr>
-        <w:tblW w:w="5000" w:type="pct"/>
+        <w:tblW w:w="0" w:type="auto"/>
+        <w:tblLayout w:type="fixed"/>
         <w:tblCellMar>
           <w:left w:w="70" w:type="dxa"/>
           <w:right w:w="70" w:type="dxa"/>
@@ -11224,10 +11035,10 @@
         <w:tblLook w:val="04A0" w:firstRow="1" w:lastRow="0" w:firstColumn="1" w:lastColumn="0" w:noHBand="0" w:noVBand="1"/>
       </w:tblPr>
       <w:tblGrid>
-        <w:gridCol w:w="1855"/>
-        <w:gridCol w:w="1314"/>
-        <w:gridCol w:w="3651"/>
-        <w:gridCol w:w="2848"/>
+        <w:gridCol w:w="1266"/>
+        <w:gridCol w:w="2294"/>
+        <w:gridCol w:w="2384"/>
+        <w:gridCol w:w="3724"/>
       </w:tblGrid>
       <w:tr>
         <w:trPr>
@@ -11236,7 +11047,7 @@
         </w:trPr>
         <w:tc>
           <w:tcPr>
-            <w:tcW w:w="959" w:type="pct"/>
+            <w:tcW w:w="1266" w:type="dxa"/>
             <w:tcBorders>
               <w:top w:val="single" w:sz="8" w:space="0" w:color="auto"/>
               <w:left w:val="single" w:sz="8" w:space="0" w:color="auto"/>
@@ -11276,7 +11087,7 @@
         </w:tc>
         <w:tc>
           <w:tcPr>
-            <w:tcW w:w="680" w:type="pct"/>
+            <w:tcW w:w="2294" w:type="dxa"/>
             <w:tcBorders>
               <w:top w:val="single" w:sz="8" w:space="0" w:color="auto"/>
               <w:left w:val="nil"/>
@@ -11316,7 +11127,7 @@
         </w:tc>
         <w:tc>
           <w:tcPr>
-            <w:tcW w:w="1888" w:type="pct"/>
+            <w:tcW w:w="2384" w:type="dxa"/>
             <w:tcBorders>
               <w:top w:val="single" w:sz="8" w:space="0" w:color="auto"/>
               <w:left w:val="nil"/>
@@ -11356,7 +11167,7 @@
         </w:tc>
         <w:tc>
           <w:tcPr>
-            <w:tcW w:w="1473" w:type="pct"/>
+            <w:tcW w:w="3724" w:type="dxa"/>
             <w:tcBorders>
               <w:top w:val="single" w:sz="8" w:space="0" w:color="auto"/>
               <w:left w:val="nil"/>
@@ -11401,7 +11212,7 @@
         </w:trPr>
         <w:tc>
           <w:tcPr>
-            <w:tcW w:w="959" w:type="pct"/>
+            <w:tcW w:w="1266" w:type="dxa"/>
             <w:tcBorders>
               <w:top w:val="single" w:sz="4" w:space="0" w:color="auto"/>
               <w:left w:val="single" w:sz="4" w:space="0" w:color="auto"/>
@@ -11433,7 +11244,6 @@
               </w:rPr>
               <w:t>&lt;&lt;</w:t>
             </w:r>
-            <w:proofErr w:type="spellStart"/>
             <w:r>
               <w:rPr>
                 <w:rFonts w:cs="Microsoft Sans Serif"/>
@@ -11442,7 +11252,6 @@
               </w:rPr>
               <w:t>tabla_equipos</w:t>
             </w:r>
-            <w:proofErr w:type="spellEnd"/>
             <w:r>
               <w:rPr>
                 <w:rFonts w:cs="Microsoft Sans Serif"/>
@@ -11455,7 +11264,7 @@
         </w:tc>
         <w:tc>
           <w:tcPr>
-            <w:tcW w:w="680" w:type="pct"/>
+            <w:tcW w:w="2294" w:type="dxa"/>
             <w:tcBorders>
               <w:top w:val="single" w:sz="4" w:space="0" w:color="auto"/>
               <w:left w:val="single" w:sz="4" w:space="0" w:color="auto"/>
@@ -11482,7 +11291,7 @@
         </w:tc>
         <w:tc>
           <w:tcPr>
-            <w:tcW w:w="1888" w:type="pct"/>
+            <w:tcW w:w="2384" w:type="dxa"/>
             <w:tcBorders>
               <w:top w:val="single" w:sz="4" w:space="0" w:color="auto"/>
               <w:left w:val="nil"/>
@@ -11509,7 +11318,7 @@
         </w:tc>
         <w:tc>
           <w:tcPr>
-            <w:tcW w:w="1473" w:type="pct"/>
+            <w:tcW w:w="3724" w:type="dxa"/>
             <w:tcBorders>
               <w:top w:val="single" w:sz="4" w:space="0" w:color="auto"/>
               <w:left w:val="nil"/>
@@ -11568,11 +11377,9 @@
       <w:r>
         <w:t>&lt;&lt;</w:t>
       </w:r>
-      <w:proofErr w:type="spellStart"/>
       <w:r>
         <w:t>ref_esquema_de_sonda</w:t>
       </w:r>
-      <w:proofErr w:type="spellEnd"/>
       <w:r>
         <w:t xml:space="preserve">&gt;&gt; </w:t>
       </w:r>
@@ -11591,21 +11398,13 @@
       </w:pPr>
       <w:bookmarkStart w:id="105" w:name="_Ref224117752"/>
       <w:r>
-        <w:t>&lt;&lt;</w:t>
-      </w:r>
-      <w:proofErr w:type="spellStart"/>
-      <w:r>
-        <w:t>fig_</w:t>
+        <w:t>&lt;&lt;fig_</w:t>
       </w:r>
       <w:r>
         <w:t>esquema</w:t>
       </w:r>
       <w:r>
-        <w:t>_de_sonda</w:t>
-      </w:r>
-      <w:proofErr w:type="spellEnd"/>
-      <w:r>
-        <w:t>&gt;&gt;</w:t>
+        <w:t>_de_sonda&gt;&gt;</w:t>
       </w:r>
       <w:bookmarkEnd w:id="105"/>
     </w:p>
@@ -12108,63 +11907,47 @@
         <w:rPr>
           <w:rFonts w:cs="Arial"/>
         </w:rPr>
-        <w:t>&lt;&lt;</w:t>
-      </w:r>
-      <w:proofErr w:type="spellStart"/>
+        <w:t>&lt;&lt;ref_pruebas_</w:t>
+      </w:r>
       <w:r>
         <w:rPr>
           <w:rFonts w:cs="Arial"/>
         </w:rPr>
-        <w:t>ref_pruebas_</w:t>
+        <w:t>baterias</w:t>
       </w:r>
       <w:r>
         <w:rPr>
           <w:rFonts w:cs="Arial"/>
         </w:rPr>
-        <w:t>baterias</w:t>
-      </w:r>
-      <w:proofErr w:type="spellEnd"/>
+        <w:t>&gt;&gt;</w:t>
+      </w:r>
       <w:r>
         <w:rPr>
           <w:rFonts w:cs="Arial"/>
         </w:rPr>
-        <w:t>&gt;&gt;</w:t>
+        <w:t>)</w:t>
       </w:r>
       <w:r>
         <w:rPr>
           <w:rFonts w:cs="Arial"/>
         </w:rPr>
-        <w:t>)</w:t>
+        <w:t xml:space="preserve">, y los mapas de las posiciones </w:t>
       </w:r>
       <w:r>
         <w:rPr>
           <w:rFonts w:cs="Arial"/>
         </w:rPr>
-        <w:t xml:space="preserve">, y los mapas de las posiciones </w:t>
+        <w:t>transmitidas (</w:t>
       </w:r>
       <w:r>
         <w:rPr>
           <w:rFonts w:cs="Arial"/>
         </w:rPr>
-        <w:t>transmitidas (</w:t>
-      </w:r>
-      <w:r>
-        <w:rPr>
-          <w:rFonts w:cs="Arial"/>
-        </w:rPr>
-        <w:t>&lt;&lt;</w:t>
-      </w:r>
-      <w:proofErr w:type="spellStart"/>
-      <w:r>
-        <w:rPr>
-          <w:rFonts w:cs="Arial"/>
-        </w:rPr>
-        <w:t>ref_</w:t>
+        <w:t>&lt;&lt;ref_</w:t>
       </w:r>
       <w:r>
         <w:t>ubicacion_durante_pruebas</w:t>
       </w:r>
-      <w:proofErr w:type="spellEnd"/>
       <w:r>
         <w:rPr>
           <w:rFonts w:cs="Arial"/>
@@ -12230,14 +12013,12 @@
       <w:r>
         <w:t>&lt;&lt;</w:t>
       </w:r>
-      <w:proofErr w:type="spellStart"/>
       <w:r>
         <w:t>fi</w:t>
       </w:r>
       <w:r>
         <w:t>g_ubicacion_durante_pruebas</w:t>
       </w:r>
-      <w:proofErr w:type="spellEnd"/>
       <w:r>
         <w:t>&gt;&gt;</w:t>
       </w:r>
@@ -12280,7 +12061,21 @@
           <w:lang w:eastAsia="es-MX"/>
         </w:rPr>
         <w:lastRenderedPageBreak/>
-        <w:t xml:space="preserve">el momento en que la boya es desplegada hasta el momento en que se pierde comunicación con la misma. </w:t>
+        <w:t xml:space="preserve">el momento en que la </w:t>
+      </w:r>
+      <w:r>
+        <w:rPr>
+          <w:szCs w:val="22"/>
+          <w:lang w:eastAsia="es-MX"/>
+        </w:rPr>
+        <w:t>sonda</w:t>
+      </w:r>
+      <w:r>
+        <w:rPr>
+          <w:szCs w:val="22"/>
+          <w:lang w:eastAsia="es-MX"/>
+        </w:rPr>
+        <w:t xml:space="preserve"> es desplegada hasta el momento en que se pierde comunicación con la misma. </w:t>
       </w:r>
       <w:r>
         <w:rPr>
@@ -12367,35 +12162,7 @@
         <w:rPr>
           <w:szCs w:val="22"/>
         </w:rPr>
-        <w:t xml:space="preserve">En este reporte se describen los trabajos realizados dentro del Contrato No. 658225821 “Servicio de Medición y Análisis Metoceánicos del Golfo de México” celebrado entre PEMEX Exploración y Extracción y el consorcio </w:t>
-      </w:r>
-      <w:proofErr w:type="spellStart"/>
-      <w:r>
-        <w:rPr>
-          <w:szCs w:val="22"/>
-        </w:rPr>
-        <w:t>All</w:t>
-      </w:r>
-      <w:proofErr w:type="spellEnd"/>
-      <w:r>
-        <w:rPr>
-          <w:szCs w:val="22"/>
-        </w:rPr>
-        <w:t xml:space="preserve"> </w:t>
-      </w:r>
-      <w:proofErr w:type="spellStart"/>
-      <w:r>
-        <w:rPr>
-          <w:szCs w:val="22"/>
-        </w:rPr>
-        <w:t>Solutions</w:t>
-      </w:r>
-      <w:proofErr w:type="spellEnd"/>
-      <w:r>
-        <w:rPr>
-          <w:szCs w:val="22"/>
-        </w:rPr>
-        <w:t xml:space="preserve"> de México S. A. de C. V. (ASM) y el Centro de Investigación Científica y de Educación Superior de Ensenada (CICESE), relacionados con el concepto </w:t>
+        <w:t xml:space="preserve">En este reporte se describen los trabajos realizados dentro del Contrato No. 658225821 “Servicio de Medición y Análisis Metoceánicos del Golfo de México” celebrado entre PEMEX Exploración y Extracción y el consorcio All Solutions de México S. A. de C. V. (ASM) y el Centro de Investigación Científica y de Educación Superior de Ensenada (CICESE), relacionados con el concepto </w:t>
       </w:r>
       <w:bookmarkEnd w:id="123"/>
       <w:r>
@@ -12428,7 +12195,6 @@
         </w:rPr>
         <w:t>&lt;&lt;</w:t>
       </w:r>
-      <w:proofErr w:type="spellStart"/>
       <w:r>
         <w:rPr>
           <w:b/>
@@ -12437,7 +12203,6 @@
         </w:rPr>
         <w:t>orden_de_servicio</w:t>
       </w:r>
-      <w:proofErr w:type="spellEnd"/>
       <w:r>
         <w:rPr>
           <w:b/>
@@ -12445,6 +12210,14 @@
           <w:szCs w:val="22"/>
         </w:rPr>
         <w:t>&gt;&gt;</w:t>
+      </w:r>
+      <w:r>
+        <w:rPr>
+          <w:b/>
+          <w:bCs/>
+          <w:szCs w:val="22"/>
+        </w:rPr>
+        <w:t>.</w:t>
       </w:r>
     </w:p>
     <w:p>
@@ -12513,15 +12286,7 @@
         </w:rPr>
       </w:pPr>
       <w:r>
-        <w:t>Se desplegaron exitosamente &lt;&lt;</w:t>
-      </w:r>
-      <w:proofErr w:type="spellStart"/>
-      <w:r>
-        <w:t>numero_de_sondas</w:t>
-      </w:r>
-      <w:proofErr w:type="spellEnd"/>
-      <w:r>
-        <w:t>&gt;&gt; sondas oceanográficas en las localizaciones solicitadas por PEMEX.</w:t>
+        <w:t>Se desplegaron exitosamente &lt;&lt;numero_de_sondas&gt;&gt; sondas oceanográficas en las localizaciones solicitadas por PEMEX.</w:t>
       </w:r>
     </w:p>
     <w:p>
@@ -12641,7 +12406,19 @@
         <w:rPr>
           <w:szCs w:val="22"/>
         </w:rPr>
-        <w:t>Se describieron las pruebas de funcionamiento realizadas a las sondas para verificar el buen funcionamiento previo al despliegue.</w:t>
+        <w:t xml:space="preserve">Se </w:t>
+      </w:r>
+      <w:r>
+        <w:rPr>
+          <w:szCs w:val="22"/>
+        </w:rPr>
+        <w:t>reportaron</w:t>
+      </w:r>
+      <w:r>
+        <w:rPr>
+          <w:szCs w:val="22"/>
+        </w:rPr>
+        <w:t xml:space="preserve"> las pruebas de funcionamiento realizadas a las sondas para verificar el buen funcionamiento previo al despliegue.</w:t>
       </w:r>
     </w:p>
     <w:bookmarkEnd w:id="124"/>
@@ -13417,11 +13194,7 @@
         <w:pStyle w:val="Figura"/>
       </w:pPr>
       <w:r>
-        <w:t>&lt;&lt;</w:t>
-      </w:r>
-      <w:proofErr w:type="spellStart"/>
-      <w:r>
-        <w:t>fig_pruebas_</w:t>
+        <w:t>&lt;&lt;fig_pruebas_</w:t>
       </w:r>
       <w:r>
         <w:t>de</w:t>
@@ -13430,11 +13203,7 @@
         <w:t>_</w:t>
       </w:r>
       <w:r>
-        <w:t>transmision</w:t>
-      </w:r>
-      <w:proofErr w:type="spellEnd"/>
-      <w:r>
-        <w:t>&gt;&gt;</w:t>
+        <w:t>transmision&gt;&gt;</w:t>
       </w:r>
     </w:p>
     <w:p>
@@ -13651,23 +13420,13 @@
           <w:vertAlign w:val="baseline"/>
         </w:rPr>
       </w:pPr>
-      <w:proofErr w:type="spellStart"/>
       <w:r>
         <w:rPr>
           <w:rStyle w:val="Caracteresdenotaalpie"/>
           <w:rFonts w:ascii="Microsoft Sans Serif" w:hAnsi="Microsoft Sans Serif" w:cs="Microsoft Sans Serif"/>
           <w:vertAlign w:val="baseline"/>
         </w:rPr>
-        <w:t>Direction</w:t>
-      </w:r>
-      <w:proofErr w:type="spellEnd"/>
-      <w:r>
-        <w:rPr>
-          <w:rStyle w:val="Caracteresdenotaalpie"/>
-          <w:rFonts w:ascii="Microsoft Sans Serif" w:hAnsi="Microsoft Sans Serif" w:cs="Microsoft Sans Serif"/>
-          <w:vertAlign w:val="baseline"/>
-        </w:rPr>
-        <w:t>:</w:t>
+        <w:t>Direction:</w:t>
       </w:r>
       <w:r>
         <w:rPr>
@@ -13692,7 +13451,6 @@
           <w:vertAlign w:val="baseline"/>
         </w:rPr>
       </w:pPr>
-      <w:proofErr w:type="spellStart"/>
       <w:r>
         <w:rPr>
           <w:rStyle w:val="Caracteresdenotaalpie"/>
@@ -13701,7 +13459,6 @@
         </w:rPr>
         <w:t>Direction_gen</w:t>
       </w:r>
-      <w:proofErr w:type="spellEnd"/>
       <w:r>
         <w:rPr>
           <w:rStyle w:val="Caracteresdenotaalpie"/>
@@ -13764,7 +13521,6 @@
           <w:vertAlign w:val="baseline"/>
         </w:rPr>
       </w:pPr>
-      <w:proofErr w:type="spellStart"/>
       <w:r>
         <w:rPr>
           <w:rStyle w:val="Caracteresdenotaalpie"/>
@@ -13773,7 +13529,6 @@
         </w:rPr>
         <w:t>Temp_s</w:t>
       </w:r>
-      <w:proofErr w:type="spellEnd"/>
       <w:r>
         <w:rPr>
           <w:rStyle w:val="Caracteresdenotaalpie"/>
@@ -13797,7 +13552,6 @@
           <w:vertAlign w:val="baseline"/>
         </w:rPr>
       </w:pPr>
-      <w:proofErr w:type="spellStart"/>
       <w:r>
         <w:rPr>
           <w:rStyle w:val="Caracteresdenotaalpie"/>
@@ -13806,7 +13560,6 @@
         </w:rPr>
         <w:t>Acc_x</w:t>
       </w:r>
-      <w:proofErr w:type="spellEnd"/>
       <w:r>
         <w:rPr>
           <w:rStyle w:val="Caracteresdenotaalpie"/>
@@ -13845,7 +13598,6 @@
           <w:vertAlign w:val="baseline"/>
         </w:rPr>
       </w:pPr>
-      <w:proofErr w:type="spellStart"/>
       <w:r>
         <w:rPr>
           <w:rStyle w:val="Caracteresdenotaalpie"/>
@@ -13854,7 +13606,6 @@
         </w:rPr>
         <w:t>Acc_y</w:t>
       </w:r>
-      <w:proofErr w:type="spellEnd"/>
       <w:r>
         <w:rPr>
           <w:rStyle w:val="Caracteresdenotaalpie"/>
@@ -13893,7 +13644,6 @@
           <w:vertAlign w:val="baseline"/>
         </w:rPr>
       </w:pPr>
-      <w:proofErr w:type="spellStart"/>
       <w:r>
         <w:rPr>
           <w:rStyle w:val="Caracteresdenotaalpie"/>
@@ -13902,7 +13652,6 @@
         </w:rPr>
         <w:t>Acc_z</w:t>
       </w:r>
-      <w:proofErr w:type="spellEnd"/>
       <w:r>
         <w:rPr>
           <w:rStyle w:val="Caracteresdenotaalpie"/>
@@ -14103,16 +13852,11 @@
         <w:pStyle w:val="Figura"/>
       </w:pPr>
       <w:r>
-        <w:t>&lt;&lt;</w:t>
-      </w:r>
-      <w:proofErr w:type="spellStart"/>
-      <w:r>
-        <w:t>fig_anexo_</w:t>
+        <w:t>&lt;&lt;fig_anexo_</w:t>
       </w:r>
       <w:r>
         <w:t>fotografico</w:t>
       </w:r>
-      <w:proofErr w:type="spellEnd"/>
       <w:r>
         <w:t>&gt;&gt;</w:t>
       </w:r>
@@ -14573,6 +14317,7 @@
                 <w:rStyle w:val="Hipervnculo"/>
                 <w:rFonts w:ascii="Arial Narrow" w:hAnsi="Arial Narrow" w:cs="Arial"/>
                 <w:b/>
+                <w:color w:val="0000FF"/>
                 <w:sz w:val="14"/>
                 <w:szCs w:val="14"/>
               </w:rPr>
@@ -15173,6 +14918,7 @@
                 <w:docPartUnique/>
               </w:docPartObj>
             </w:sdtPr>
+            <w:sdtEndPr/>
             <w:sdtContent>
               <w:p>
                 <w:pPr>
@@ -15486,6 +15232,7 @@
                             <w:rStyle w:val="Hipervnculo"/>
                             <w:rFonts w:ascii="Arial Narrow" w:eastAsiaTheme="majorEastAsia" w:hAnsi="Arial Narrow" w:cs="Arial"/>
                             <w:b/>
+                            <w:color w:val="0000FF"/>
                             <w:sz w:val="14"/>
                             <w:szCs w:val="14"/>
                           </w:rPr>
@@ -15663,6 +15410,7 @@
         <w:docPartUnique/>
       </w:docPartObj>
     </w:sdtPr>
+    <w:sdtEndPr/>
     <w:sdtContent>
       <w:p>
         <w:pPr>
@@ -15992,6 +15740,7 @@
                     <w:rStyle w:val="Hipervnculo"/>
                     <w:rFonts w:ascii="Arial Narrow" w:eastAsiaTheme="majorEastAsia" w:hAnsi="Arial Narrow" w:cs="Arial"/>
                     <w:b/>
+                    <w:color w:val="0000FF"/>
                     <w:sz w:val="14"/>
                     <w:szCs w:val="14"/>
                   </w:rPr>
@@ -22365,6 +22114,7 @@
   <w:style w:type="character" w:default="1" w:styleId="Fuentedeprrafopredeter">
     <w:name w:val="Default Paragraph Font"/>
     <w:uiPriority w:val="1"/>
+    <w:semiHidden/>
     <w:unhideWhenUsed/>
   </w:style>
   <w:style w:type="table" w:default="1" w:styleId="Tablanormal">
@@ -23054,10 +22804,10 @@
       <w:szCs w:val="24"/>
     </w:rPr>
   </w:style>
-  <w:style w:type="character" w:customStyle="1" w:styleId="FirmadecorreoCar">
-    <w:name w:val="Firma de correo Car"/>
+  <w:style w:type="character" w:customStyle="1" w:styleId="FirmadecorreoelectrnicoCar">
+    <w:name w:val="Firma de correo electrónico Car"/>
     <w:basedOn w:val="Fuentedeprrafopredeter"/>
-    <w:link w:val="Firmadecorreo"/>
+    <w:link w:val="Firmadecorreoelectrnico"/>
     <w:uiPriority w:val="99"/>
     <w:semiHidden/>
     <w:qFormat/>
@@ -25302,10 +25052,10 @@
       <w:ind w:left="4252"/>
     </w:pPr>
   </w:style>
-  <w:style w:type="paragraph" w:styleId="Firmadecorreo">
+  <w:style w:type="paragraph" w:styleId="Firmadecorreoelectrnico">
     <w:name w:val="E-mail Signature"/>
     <w:basedOn w:val="Normal"/>
-    <w:link w:val="FirmadecorreoCar"/>
+    <w:link w:val="FirmadecorreoelectrnicoCar"/>
     <w:uiPriority w:val="99"/>
     <w:semiHidden/>
     <w:unhideWhenUsed/>

</xml_diff>

<commit_message>
Fix: se atendieron las observaciones de Perlita sobre detalles en el codigo o en la plantilla. Lo único que falta es centrar las coordenadas en la tabla 2, tabla 3 y tabla 4.
</commit_message>
<xml_diff>
--- a/crear_documentos/services/doc_101/plantilla.docx
+++ b/crear_documentos/services/doc_101/plantilla.docx
@@ -231,7 +231,27 @@
           <w:sz w:val="28"/>
           <w:szCs w:val="28"/>
         </w:rPr>
-        <w:t>&lt;&lt;seriales_de_sondas&gt;&gt;</w:t>
+        <w:t>&lt;&lt;</w:t>
+      </w:r>
+      <w:proofErr w:type="spellStart"/>
+      <w:r>
+        <w:rPr>
+          <w:rFonts w:cs="Microsoft Sans Serif"/>
+          <w:b/>
+          <w:sz w:val="28"/>
+          <w:szCs w:val="28"/>
+        </w:rPr>
+        <w:t>seriales_de_sondas</w:t>
+      </w:r>
+      <w:proofErr w:type="spellEnd"/>
+      <w:r>
+        <w:rPr>
+          <w:rFonts w:cs="Microsoft Sans Serif"/>
+          <w:b/>
+          <w:sz w:val="28"/>
+          <w:szCs w:val="28"/>
+        </w:rPr>
+        <w:t>&gt;&gt;</w:t>
       </w:r>
     </w:p>
     <w:tbl>
@@ -285,7 +305,15 @@
               <w:t>PEMEX-ASM-CICESE-658225821-</w:t>
             </w:r>
             <w:r>
-              <w:t>&lt;&lt;orden_de_servicio&gt;&gt;</w:t>
+              <w:t>&lt;&lt;</w:t>
+            </w:r>
+            <w:proofErr w:type="spellStart"/>
+            <w:r>
+              <w:t>orden_de_servicio</w:t>
+            </w:r>
+            <w:proofErr w:type="spellEnd"/>
+            <w:r>
+              <w:t>&gt;&gt;</w:t>
             </w:r>
           </w:p>
         </w:tc>
@@ -342,16 +370,26 @@
                 <w:sz w:val="20"/>
                 <w:szCs w:val="20"/>
               </w:rPr>
-              <w:t>&lt;&lt;fe</w:t>
+              <w:t>&lt;&lt;</w:t>
             </w:r>
+            <w:proofErr w:type="spellStart"/>
             <w:r>
               <w:rPr>
                 <w:rFonts w:cs="Microsoft Sans Serif"/>
                 <w:sz w:val="20"/>
                 <w:szCs w:val="20"/>
               </w:rPr>
+              <w:t>fe</w:t>
+            </w:r>
+            <w:r>
+              <w:rPr>
+                <w:rFonts w:cs="Microsoft Sans Serif"/>
+                <w:sz w:val="20"/>
+                <w:szCs w:val="20"/>
+              </w:rPr>
               <w:t>cha_de_solicitud</w:t>
             </w:r>
+            <w:proofErr w:type="spellEnd"/>
             <w:r>
               <w:rPr>
                 <w:rFonts w:cs="Microsoft Sans Serif"/>
@@ -417,7 +455,25 @@
                 <w:sz w:val="20"/>
                 <w:szCs w:val="20"/>
               </w:rPr>
-              <w:t>&lt;&lt;fecha_inicio_vigencia&gt;&gt;</w:t>
+              <w:t>&lt;&lt;</w:t>
+            </w:r>
+            <w:proofErr w:type="spellStart"/>
+            <w:r>
+              <w:rPr>
+                <w:rFonts w:cs="Microsoft Sans Serif"/>
+                <w:sz w:val="20"/>
+                <w:szCs w:val="20"/>
+              </w:rPr>
+              <w:t>fecha_inicio_vigencia</w:t>
+            </w:r>
+            <w:proofErr w:type="spellEnd"/>
+            <w:r>
+              <w:rPr>
+                <w:rFonts w:cs="Microsoft Sans Serif"/>
+                <w:sz w:val="20"/>
+                <w:szCs w:val="20"/>
+              </w:rPr>
+              <w:t>&gt;&gt;</w:t>
             </w:r>
           </w:p>
         </w:tc>
@@ -469,7 +525,25 @@
                 <w:sz w:val="20"/>
                 <w:szCs w:val="20"/>
               </w:rPr>
-              <w:t>&lt;&lt;fecha_final_vigencia&gt;&gt;</w:t>
+              <w:t>&lt;&lt;</w:t>
+            </w:r>
+            <w:proofErr w:type="spellStart"/>
+            <w:r>
+              <w:rPr>
+                <w:rFonts w:cs="Microsoft Sans Serif"/>
+                <w:sz w:val="20"/>
+                <w:szCs w:val="20"/>
+              </w:rPr>
+              <w:t>fecha_final_vigencia</w:t>
+            </w:r>
+            <w:proofErr w:type="spellEnd"/>
+            <w:r>
+              <w:rPr>
+                <w:rFonts w:cs="Microsoft Sans Serif"/>
+                <w:sz w:val="20"/>
+                <w:szCs w:val="20"/>
+              </w:rPr>
+              <w:t>&gt;&gt;</w:t>
             </w:r>
           </w:p>
         </w:tc>
@@ -546,7 +620,25 @@
                 <w:sz w:val="20"/>
                 <w:szCs w:val="20"/>
               </w:rPr>
-              <w:t>&lt;&lt;fecha_de_entrega&gt;&gt;</w:t>
+              <w:t>&lt;&lt;</w:t>
+            </w:r>
+            <w:proofErr w:type="spellStart"/>
+            <w:r>
+              <w:rPr>
+                <w:rFonts w:cs="Microsoft Sans Serif"/>
+                <w:sz w:val="20"/>
+                <w:szCs w:val="20"/>
+              </w:rPr>
+              <w:t>fecha_de_entrega</w:t>
+            </w:r>
+            <w:proofErr w:type="spellEnd"/>
+            <w:r>
+              <w:rPr>
+                <w:rFonts w:cs="Microsoft Sans Serif"/>
+                <w:sz w:val="20"/>
+                <w:szCs w:val="20"/>
+              </w:rPr>
+              <w:t>&gt;&gt;</w:t>
             </w:r>
           </w:p>
         </w:tc>
@@ -790,7 +882,25 @@
                 <w:color w:val="000000" w:themeColor="text1"/>
                 <w:szCs w:val="22"/>
               </w:rPr>
-              <w:t>&lt;&lt;fecha_de_entrega&gt;&gt;</w:t>
+              <w:t>&lt;&lt;</w:t>
+            </w:r>
+            <w:proofErr w:type="spellStart"/>
+            <w:r>
+              <w:rPr>
+                <w:rFonts w:cs="Microsoft Sans Serif"/>
+                <w:color w:val="000000" w:themeColor="text1"/>
+                <w:szCs w:val="22"/>
+              </w:rPr>
+              <w:t>fecha_de_entrega</w:t>
+            </w:r>
+            <w:proofErr w:type="spellEnd"/>
+            <w:r>
+              <w:rPr>
+                <w:rFonts w:cs="Microsoft Sans Serif"/>
+                <w:color w:val="000000" w:themeColor="text1"/>
+                <w:szCs w:val="22"/>
+              </w:rPr>
+              <w:t>&gt;&gt;</w:t>
             </w:r>
           </w:p>
         </w:tc>
@@ -1251,7 +1361,6 @@
           <w:docPartUnique/>
         </w:docPartObj>
       </w:sdtPr>
-      <w:sdtEndPr/>
       <w:sdtContent>
         <w:p>
           <w:pPr>
@@ -5457,7 +5566,23 @@
         <w:t>Servicio de Medición y Análisis Metoceánicos del Golfo de México”</w:t>
       </w:r>
       <w:r>
-        <w:t xml:space="preserve"> inició en 2007 con un enfoque orientado al monitoreo de aguas profundas e intermedias, regiones en las que la información metoceánica disponible era limitada o inexistente, como en las áreas de Perdido y Lakach. Posteriormente, el alcance del proyecto se amplió para incluir el monitoreo en aguas someras, sin descuidar las regiones profundas, incorporando además un enfoque más operativo. Una etapa adicional relevante se presentó cuando el proyecto se adaptó para atender nuevas áreas donde PEMEX tenía asignaciones directas para exploración y producción y/o donde compartía algún tipo de asociación con alguna otra empresa (por citar un ejemplo, Trión). Para la etapa 2024-2025, a solicitud de PEMEX, el proyecto se enfocó a la disponibilidad inmediata de información </w:t>
+        <w:t xml:space="preserve"> inició en 2007 con un enfoque orientado al monitoreo de aguas profundas e intermedias, regiones en las que la información metoceánica disponible era limitada o inexistente, como en las áreas de Perdido y </w:t>
+      </w:r>
+      <w:proofErr w:type="spellStart"/>
+      <w:r>
+        <w:t>Lakach</w:t>
+      </w:r>
+      <w:proofErr w:type="spellEnd"/>
+      <w:r>
+        <w:t xml:space="preserve">. Posteriormente, el alcance del proyecto se amplió para incluir el monitoreo en aguas someras, sin descuidar las regiones profundas, incorporando además un enfoque más operativo. Una etapa adicional relevante se presentó cuando el proyecto se adaptó para atender nuevas áreas donde PEMEX tenía asignaciones directas para exploración y producción y/o donde compartía algún tipo de asociación con alguna otra empresa (por citar un ejemplo, </w:t>
+      </w:r>
+      <w:proofErr w:type="spellStart"/>
+      <w:r>
+        <w:t>Trión</w:t>
+      </w:r>
+      <w:proofErr w:type="spellEnd"/>
+      <w:r>
+        <w:t xml:space="preserve">). Para la etapa 2024-2025, a solicitud de PEMEX, el proyecto se enfocó a la disponibilidad inmediata de información </w:t>
       </w:r>
       <w:r>
         <w:lastRenderedPageBreak/>
@@ -5583,7 +5708,23 @@
         <w:ind w:firstLine="360"/>
       </w:pPr>
       <w:r>
-        <w:t>Este reporte describe y enumera las actividades realizadas por el consorcio All Solutions de México S. A. de C. V. (en lo sucesivo ASM) y el Centro de Investigación Científica y Educación Superior de Ensenada (en lo sucesivo CICESE) para la preparación, movilización y finalmente el</w:t>
+        <w:t xml:space="preserve">Este reporte describe y enumera las actividades realizadas por el consorcio </w:t>
+      </w:r>
+      <w:proofErr w:type="spellStart"/>
+      <w:r>
+        <w:t>All</w:t>
+      </w:r>
+      <w:proofErr w:type="spellEnd"/>
+      <w:r>
+        <w:t xml:space="preserve"> </w:t>
+      </w:r>
+      <w:proofErr w:type="spellStart"/>
+      <w:r>
+        <w:t>Solutions</w:t>
+      </w:r>
+      <w:proofErr w:type="spellEnd"/>
+      <w:r>
+        <w:t xml:space="preserve"> de México S. A. de C. V. (en lo sucesivo ASM) y el Centro de Investigación Científica y Educación Superior de Ensenada (en lo sucesivo CICESE) para la preparación, movilización y finalmente el</w:t>
       </w:r>
       <w:r>
         <w:t xml:space="preserve"> </w:t>
@@ -5602,7 +5743,15 @@
         <w:t>.” y específicamente a la Orden de Servicio PEMEX-ASM-CICESE-658225821-</w:t>
       </w:r>
       <w:r>
-        <w:t>&lt;&lt;orden_de_servicio&gt;&gt;</w:t>
+        <w:t>&lt;&lt;</w:t>
+      </w:r>
+      <w:proofErr w:type="spellStart"/>
+      <w:r>
+        <w:t>orden_de_servicio</w:t>
+      </w:r>
+      <w:proofErr w:type="spellEnd"/>
+      <w:r>
+        <w:t>&gt;&gt;</w:t>
       </w:r>
       <w:r>
         <w:t>.</w:t>
@@ -5654,11 +5803,16 @@
       <w:r>
         <w:t>&lt;&lt;</w:t>
       </w:r>
+      <w:proofErr w:type="spellStart"/>
       <w:r>
         <w:t>mes_y_anio</w:t>
       </w:r>
       <w:r>
-        <w:t>_de_liberacion&gt;&gt;</w:t>
+        <w:t>_de_liberacion</w:t>
+      </w:r>
+      <w:proofErr w:type="spellEnd"/>
+      <w:r>
+        <w:t>&gt;&gt;</w:t>
       </w:r>
       <w:r>
         <w:t xml:space="preserve">, las cuales se ejecutaron para dar cumplimiento a la orden de servicio </w:t>
@@ -5677,6 +5831,7 @@
         </w:rPr>
         <w:t>&lt;&lt;</w:t>
       </w:r>
+      <w:proofErr w:type="spellStart"/>
       <w:r>
         <w:rPr>
           <w:b/>
@@ -5684,6 +5839,7 @@
         </w:rPr>
         <w:t>orden_de_servicio</w:t>
       </w:r>
+      <w:proofErr w:type="spellEnd"/>
       <w:r>
         <w:rPr>
           <w:b/>
@@ -7017,8 +7173,16 @@
         <w:rPr>
           <w:rFonts w:cs="Arial"/>
         </w:rPr>
-        <w:t>La draga de arrastre sub-superficial</w:t>
-      </w:r>
+        <w:t xml:space="preserve">La draga de arrastre </w:t>
+      </w:r>
+      <w:proofErr w:type="spellStart"/>
+      <w:r>
+        <w:rPr>
+          <w:rFonts w:cs="Arial"/>
+        </w:rPr>
+        <w:t>sub-superficial</w:t>
+      </w:r>
+      <w:proofErr w:type="spellEnd"/>
       <w:r>
         <w:rPr>
           <w:rFonts w:cs="Arial"/>
@@ -7232,7 +7396,21 @@
         <w:rPr>
           <w:rFonts w:cs="Arial"/>
         </w:rPr>
-        <w:t>Dentro del compartimiento interior de la sonda se resguarda un microcontrolador de 32 bits Cortex de 48 MHz</w:t>
+        <w:t xml:space="preserve">Dentro del compartimiento interior de la sonda se resguarda un microcontrolador de 32 bits </w:t>
+      </w:r>
+      <w:proofErr w:type="spellStart"/>
+      <w:r>
+        <w:rPr>
+          <w:rFonts w:cs="Arial"/>
+        </w:rPr>
+        <w:t>Cortex</w:t>
+      </w:r>
+      <w:proofErr w:type="spellEnd"/>
+      <w:r>
+        <w:rPr>
+          <w:rFonts w:cs="Arial"/>
+        </w:rPr>
+        <w:t xml:space="preserve"> de 48 MHz</w:t>
       </w:r>
       <w:r>
         <w:rPr>
@@ -7604,7 +7782,21 @@
         <w:rPr>
           <w:rFonts w:cs="Arial"/>
         </w:rPr>
-        <w:t>La sonda oceanográfica incorpora un sistema redundante de posicionamiento global basado en receptores GNSS multiconstelación, que integran los sistemas GPS</w:t>
+        <w:t xml:space="preserve">La sonda oceanográfica incorpora un sistema redundante de posicionamiento global basado en receptores GNSS </w:t>
+      </w:r>
+      <w:proofErr w:type="spellStart"/>
+      <w:r>
+        <w:rPr>
+          <w:rFonts w:cs="Arial"/>
+        </w:rPr>
+        <w:t>multiconstelación</w:t>
+      </w:r>
+      <w:proofErr w:type="spellEnd"/>
+      <w:r>
+        <w:rPr>
+          <w:rFonts w:cs="Arial"/>
+        </w:rPr>
+        <w:t>, que integran los sistemas GPS</w:t>
       </w:r>
       <w:r>
         <w:rPr>
@@ -7631,7 +7823,21 @@
         <w:rPr>
           <w:rFonts w:cs="Arial"/>
         </w:rPr>
-        <w:t xml:space="preserve">, GLONASS, BeiDou y Galileo, así como correcciones mediante sistemas SBAS, como WAAS, lo que permite alcanzar una precisión inferior a 3 m el 90 % del tiempo, con una tasa de muestreo </w:t>
+        <w:t xml:space="preserve">, GLONASS, </w:t>
+      </w:r>
+      <w:proofErr w:type="spellStart"/>
+      <w:r>
+        <w:rPr>
+          <w:rFonts w:cs="Arial"/>
+        </w:rPr>
+        <w:t>BeiDou</w:t>
+      </w:r>
+      <w:proofErr w:type="spellEnd"/>
+      <w:r>
+        <w:rPr>
+          <w:rFonts w:cs="Arial"/>
+        </w:rPr>
+        <w:t xml:space="preserve"> y Galileo, así como correcciones mediante sistemas SBAS, como WAAS, lo que permite alcanzar una precisión inferior a 3 m el 90 % del tiempo, con una tasa de muestreo </w:t>
       </w:r>
       <w:r>
         <w:rPr>
@@ -7643,7 +7849,49 @@
         <w:rPr>
           <w:rFonts w:cs="Arial"/>
         </w:rPr>
-        <w:t xml:space="preserve"> 10 Hz. Adicionalmente, cuenta con un sistema de telemetría satelital, compatible con redes Iridium, GlobalStar o IsatData Pro, que permite la transmisión de datos en tiempo real en zonas de mar abierto. Asimismo, la sonda integra un sistema </w:t>
+        <w:t xml:space="preserve"> 10 Hz. Adicionalmente, cuenta con un sistema de telemetría satelital, compatible con redes </w:t>
+      </w:r>
+      <w:proofErr w:type="spellStart"/>
+      <w:r>
+        <w:rPr>
+          <w:rFonts w:cs="Arial"/>
+        </w:rPr>
+        <w:t>Iridium</w:t>
+      </w:r>
+      <w:proofErr w:type="spellEnd"/>
+      <w:r>
+        <w:rPr>
+          <w:rFonts w:cs="Arial"/>
+        </w:rPr>
+        <w:t xml:space="preserve">, </w:t>
+      </w:r>
+      <w:proofErr w:type="spellStart"/>
+      <w:r>
+        <w:rPr>
+          <w:rFonts w:cs="Arial"/>
+        </w:rPr>
+        <w:t>GlobalStar</w:t>
+      </w:r>
+      <w:proofErr w:type="spellEnd"/>
+      <w:r>
+        <w:rPr>
+          <w:rFonts w:cs="Arial"/>
+        </w:rPr>
+        <w:t xml:space="preserve"> o </w:t>
+      </w:r>
+      <w:proofErr w:type="spellStart"/>
+      <w:r>
+        <w:rPr>
+          <w:rFonts w:cs="Arial"/>
+        </w:rPr>
+        <w:t>IsatData</w:t>
+      </w:r>
+      <w:proofErr w:type="spellEnd"/>
+      <w:r>
+        <w:rPr>
+          <w:rFonts w:cs="Arial"/>
+        </w:rPr>
+        <w:t xml:space="preserve"> Pro, que permite la transmisión de datos en tiempo real en zonas de mar abierto. Asimismo, la sonda integra un sistema </w:t>
       </w:r>
       <w:r>
         <w:rPr>
@@ -8794,10 +9042,21 @@
         <w:rPr>
           <w:rFonts w:cs="Arial"/>
         </w:rPr>
-        <w:t>&lt;&lt;ref_</w:t>
-      </w:r>
-      <w:r>
-        <w:t>actividades_previas&gt;&gt;</w:t>
+        <w:t>&lt;&lt;</w:t>
+      </w:r>
+      <w:proofErr w:type="spellStart"/>
+      <w:r>
+        <w:rPr>
+          <w:rFonts w:cs="Arial"/>
+        </w:rPr>
+        <w:t>ref_</w:t>
+      </w:r>
+      <w:r>
+        <w:t>actividades_previas</w:t>
+      </w:r>
+      <w:proofErr w:type="spellEnd"/>
+      <w:r>
+        <w:t>&gt;&gt;</w:t>
       </w:r>
       <w:r>
         <w:t>)</w:t>
@@ -8820,13 +9079,21 @@
         <w:pStyle w:val="Figura"/>
       </w:pPr>
       <w:r>
-        <w:t>&lt;&lt;fig_</w:t>
+        <w:t>&lt;&lt;</w:t>
+      </w:r>
+      <w:proofErr w:type="spellStart"/>
+      <w:r>
+        <w:t>fig_</w:t>
       </w:r>
       <w:r>
         <w:t>actividades</w:t>
       </w:r>
       <w:r>
-        <w:t>_previas&gt;&gt;</w:t>
+        <w:t>_previas</w:t>
+      </w:r>
+      <w:proofErr w:type="spellEnd"/>
+      <w:r>
+        <w:t>&gt;&gt;</w:t>
       </w:r>
     </w:p>
     <w:p>
@@ -8920,9 +9187,11 @@
       <w:r>
         <w:t>&lt;&lt;</w:t>
       </w:r>
+      <w:proofErr w:type="spellStart"/>
       <w:r>
         <w:t>numero_de_sondas</w:t>
       </w:r>
+      <w:proofErr w:type="spellEnd"/>
       <w:r>
         <w:t>&gt;&gt;</w:t>
       </w:r>
@@ -8933,7 +9202,15 @@
         <w:t>Orden de Servicio PEMEX-ASM-CICESE-658225821-</w:t>
       </w:r>
       <w:r>
-        <w:t>&lt;&lt;orden_de_servicio&gt;&gt; del mes de</w:t>
+        <w:t>&lt;&lt;</w:t>
+      </w:r>
+      <w:proofErr w:type="spellStart"/>
+      <w:r>
+        <w:t>orden_de_servicio</w:t>
+      </w:r>
+      <w:proofErr w:type="spellEnd"/>
+      <w:r>
+        <w:t>&gt;&gt; del mes de</w:t>
       </w:r>
       <w:r>
         <w:t xml:space="preserve"> </w:t>
@@ -8942,9 +9219,11 @@
       <w:r>
         <w:t>&lt;&lt;</w:t>
       </w:r>
+      <w:proofErr w:type="spellStart"/>
       <w:r>
         <w:t>mes_y_anio_de_liberacion</w:t>
       </w:r>
+      <w:proofErr w:type="spellEnd"/>
       <w:r>
         <w:t xml:space="preserve">&gt;&gt;. </w:t>
       </w:r>
@@ -9090,11 +9369,16 @@
         <w:t xml:space="preserve"> que estuvieron</w:t>
       </w:r>
       <w:r>
-        <w:t xml:space="preserve"> pre-armada</w:t>
+        <w:t xml:space="preserve"> </w:t>
+      </w:r>
+      <w:proofErr w:type="spellStart"/>
+      <w:r>
+        <w:t>pre-armada</w:t>
       </w:r>
       <w:r>
         <w:t>s</w:t>
       </w:r>
+      <w:proofErr w:type="spellEnd"/>
       <w:r>
         <w:t xml:space="preserve"> la</w:t>
       </w:r>
@@ -9199,7 +9483,15 @@
         <w:ind w:firstLine="360"/>
       </w:pPr>
       <w:r>
-        <w:t>En cuanto al sistema de telemetría, la sonda emplea tecnología satelital Globalstar, basada en una constelación de satélites en órbita baja (LEO) que operan en banda L. Mediante servicios simplex de bajo consumo energético, se transmiten paquetes periódicos de información desde zonas remotas, lo que permite una comunicación confiable y con tiempos de transmisión reducidos. Este sistema resultó adecuado para plataformas autónomas y funcionó de manera exitosa durante las pruebas de 24 horas realizadas en el centro de operaciones del consorcio ASM-CICESE, donde los datos fueron recibidos de forma continua.</w:t>
+        <w:t xml:space="preserve">En cuanto al sistema de telemetría, la sonda emplea tecnología satelital </w:t>
+      </w:r>
+      <w:proofErr w:type="spellStart"/>
+      <w:r>
+        <w:t>Globalstar</w:t>
+      </w:r>
+      <w:proofErr w:type="spellEnd"/>
+      <w:r>
+        <w:t>, basada en una constelación de satélites en órbita baja (LEO) que operan en banda L. Mediante servicios simplex de bajo consumo energético, se transmiten paquetes periódicos de información desde zonas remotas, lo que permite una comunicación confiable y con tiempos de transmisión reducidos. Este sistema resultó adecuado para plataformas autónomas y funcionó de manera exitosa durante las pruebas de 24 horas realizadas en el centro de operaciones del consorcio ASM-CICESE, donde los datos fueron recibidos de forma continua.</w:t>
       </w:r>
     </w:p>
     <w:p>
@@ -9322,13 +9614,29 @@
         <w:t>obación. El derrotero o ruta de liberación de las sondas consideró</w:t>
       </w:r>
       <w:r>
-        <w:t xml:space="preserve"> el trayecto desde tierra hasta el lugar de despliegue de las &lt;&lt;numero_de_sondas&gt;&gt;</w:t>
+        <w:t xml:space="preserve"> el trayecto desde tierra hasta el lugar de despliegue de las &lt;&lt;</w:t>
+      </w:r>
+      <w:proofErr w:type="spellStart"/>
+      <w:r>
+        <w:t>numero_de_sondas</w:t>
+      </w:r>
+      <w:proofErr w:type="spellEnd"/>
+      <w:r>
+        <w:t>&gt;&gt;</w:t>
       </w:r>
       <w:r>
         <w:t xml:space="preserve"> </w:t>
       </w:r>
       <w:r>
-        <w:t>sondas oceanográficas liberadas en el &lt;&lt;mes_y_anio_de_liberacion&gt;&gt; tomando en cuenta las condiciones ambientales y la posición de despliegue. &lt;&lt;ejecucion</w:t>
+        <w:t>sondas oceanográficas liberadas en el &lt;&lt;</w:t>
+      </w:r>
+      <w:proofErr w:type="spellStart"/>
+      <w:r>
+        <w:t>mes_y_anio_de_liberacion</w:t>
+      </w:r>
+      <w:proofErr w:type="spellEnd"/>
+      <w:r>
+        <w:t>&gt;&gt; tomando en cuenta las condiciones ambientales y la posición de despliegue. &lt;&lt;ejecucion</w:t>
       </w:r>
       <w:r>
         <w:t>_de_la_campania_parrafo1&gt;&gt;.</w:t>
@@ -9582,7 +9890,6 @@
         <w:rPr>
           <w:szCs w:val="22"/>
         </w:rPr>
-        <w:lastRenderedPageBreak/>
         <w:t>Antes de poner la sonda en el agua, se hicieron las pruebas de conexión bluetooth in situ para asegurar el correcto funcionamiento de la sonda oceanográfica.</w:t>
       </w:r>
     </w:p>
@@ -9712,7 +10019,15 @@
         <w:t xml:space="preserve">de las sondas oceanográficas </w:t>
       </w:r>
       <w:r>
-        <w:t>se muestran en la &lt;&lt;ref_mapa_de_despliegue&gt;&gt;</w:t>
+        <w:t>se muestran en la &lt;&lt;</w:t>
+      </w:r>
+      <w:proofErr w:type="spellStart"/>
+      <w:r>
+        <w:t>ref_mapa_de_despliegue</w:t>
+      </w:r>
+      <w:proofErr w:type="spellEnd"/>
+      <w:r>
+        <w:t>&gt;&gt;</w:t>
       </w:r>
       <w:r>
         <w:t xml:space="preserve">, </w:t>
@@ -9766,13 +10081,21 @@
         <w:pStyle w:val="Figura"/>
       </w:pPr>
       <w:r>
-        <w:t>&lt;&lt;fig_</w:t>
+        <w:t>&lt;&lt;</w:t>
+      </w:r>
+      <w:proofErr w:type="spellStart"/>
+      <w:r>
+        <w:t>fig_</w:t>
       </w:r>
       <w:r>
         <w:t>mapa</w:t>
       </w:r>
       <w:r>
-        <w:t>_de_despliegue&gt;&gt;</w:t>
+        <w:t>_de_despliegue</w:t>
+      </w:r>
+      <w:proofErr w:type="spellEnd"/>
+      <w:r>
+        <w:t>&gt;&gt;</w:t>
       </w:r>
     </w:p>
     <w:p>
@@ -9786,10 +10109,21 @@
         <w:rPr>
           <w:rFonts w:cs="Arial"/>
         </w:rPr>
-        <w:t>&lt;&lt;ref_</w:t>
-      </w:r>
-      <w:r>
-        <w:t xml:space="preserve">ejecucion_de_la_campania&gt;&gt; </w:t>
+        <w:t>&lt;&lt;</w:t>
+      </w:r>
+      <w:proofErr w:type="spellStart"/>
+      <w:r>
+        <w:rPr>
+          <w:rFonts w:cs="Arial"/>
+        </w:rPr>
+        <w:t>ref_</w:t>
+      </w:r>
+      <w:r>
+        <w:t>ejecucion_de_la_campania</w:t>
+      </w:r>
+      <w:proofErr w:type="spellEnd"/>
+      <w:r>
+        <w:t xml:space="preserve">&gt;&gt; </w:t>
       </w:r>
       <w:r>
         <w:t xml:space="preserve">se presentan las evidencias fotográficas del despliegue de las </w:t>
@@ -9808,11 +10142,16 @@
         <w:pStyle w:val="Figura"/>
       </w:pPr>
       <w:r>
-        <w:t>&lt;&lt;fig_ejecucion_</w:t>
+        <w:t>&lt;&lt;</w:t>
+      </w:r>
+      <w:proofErr w:type="spellStart"/>
+      <w:r>
+        <w:t>fig_ejecucion_</w:t>
       </w:r>
       <w:r>
         <w:t>de_la_campania</w:t>
       </w:r>
+      <w:proofErr w:type="spellEnd"/>
       <w:r>
         <w:t>&gt;&gt;</w:t>
       </w:r>
@@ -9885,7 +10224,6 @@
       <w:bookmarkStart w:id="87" w:name="_Toc215827128"/>
       <w:bookmarkStart w:id="88" w:name="_Toc230346470"/>
       <w:r>
-        <w:lastRenderedPageBreak/>
         <w:t xml:space="preserve">Tabla </w:t>
       </w:r>
       <w:fldSimple w:instr=" SEQ Tabla \* ARABIC ">
@@ -10277,7 +10615,27 @@
                 <w:sz w:val="20"/>
                 <w:szCs w:val="20"/>
               </w:rPr>
-              <w:t>&lt;&lt;tabla_plan&gt;&gt;</w:t>
+              <w:t>&lt;&lt;</w:t>
+            </w:r>
+            <w:proofErr w:type="spellStart"/>
+            <w:r>
+              <w:rPr>
+                <w:rFonts w:cs="Microsoft Sans Serif"/>
+                <w:vanish/>
+                <w:sz w:val="20"/>
+                <w:szCs w:val="20"/>
+              </w:rPr>
+              <w:t>tabla_plan</w:t>
+            </w:r>
+            <w:proofErr w:type="spellEnd"/>
+            <w:r>
+              <w:rPr>
+                <w:rFonts w:cs="Microsoft Sans Serif"/>
+                <w:vanish/>
+                <w:sz w:val="20"/>
+                <w:szCs w:val="20"/>
+              </w:rPr>
+              <w:t>&gt;&gt;</w:t>
             </w:r>
           </w:p>
         </w:tc>
@@ -10307,14 +10665,7 @@
           </w:tcPr>
           <w:p>
             <w:pPr>
-              <w:keepNext/>
-              <w:keepLines/>
-              <w:spacing w:line="240" w:lineRule="auto"/>
-              <w:jc w:val="center"/>
-              <w:rPr>
-                <w:sz w:val="20"/>
-                <w:szCs w:val="22"/>
-              </w:rPr>
+              <w:pStyle w:val="Carcentrado"/>
             </w:pPr>
           </w:p>
         </w:tc>
@@ -10326,14 +10677,7 @@
           </w:tcPr>
           <w:p>
             <w:pPr>
-              <w:keepNext/>
-              <w:keepLines/>
-              <w:spacing w:line="240" w:lineRule="auto"/>
-              <w:jc w:val="center"/>
-              <w:rPr>
-                <w:sz w:val="20"/>
-                <w:szCs w:val="22"/>
-              </w:rPr>
+              <w:pStyle w:val="Carcentrado"/>
             </w:pPr>
           </w:p>
         </w:tc>
@@ -10349,6 +10693,7 @@
       <w:bookmarkStart w:id="91" w:name="_Ref224230599"/>
       <w:bookmarkStart w:id="92" w:name="_Toc230346484"/>
       <w:r>
+        <w:lastRenderedPageBreak/>
         <w:t>INFORMACIÓN DEL DESPLIEGUE DE LAS SONDAS OCEANOGRÁFICAS</w:t>
       </w:r>
       <w:bookmarkEnd w:id="89"/>
@@ -10890,7 +11235,23 @@
                 <w:vanish/>
                 <w:szCs w:val="20"/>
               </w:rPr>
-              <w:t>&lt;&lt;tabla_maniobra&gt;&gt;</w:t>
+              <w:t>&lt;&lt;</w:t>
+            </w:r>
+            <w:proofErr w:type="spellStart"/>
+            <w:r>
+              <w:rPr>
+                <w:vanish/>
+                <w:szCs w:val="20"/>
+              </w:rPr>
+              <w:t>tabla_maniobra</w:t>
+            </w:r>
+            <w:proofErr w:type="spellEnd"/>
+            <w:r>
+              <w:rPr>
+                <w:vanish/>
+                <w:szCs w:val="20"/>
+              </w:rPr>
+              <w:t>&gt;&gt;</w:t>
             </w:r>
           </w:p>
         </w:tc>
@@ -10919,13 +11280,7 @@
           </w:tcPr>
           <w:p>
             <w:pPr>
-              <w:spacing w:line="240" w:lineRule="auto"/>
-              <w:jc w:val="center"/>
-              <w:rPr>
-                <w:rFonts w:cs="Microsoft Sans Serif"/>
-                <w:sz w:val="20"/>
-                <w:szCs w:val="20"/>
-              </w:rPr>
+              <w:pStyle w:val="Carcentrado"/>
             </w:pPr>
           </w:p>
         </w:tc>
@@ -10937,13 +11292,7 @@
           </w:tcPr>
           <w:p>
             <w:pPr>
-              <w:spacing w:line="240" w:lineRule="auto"/>
-              <w:jc w:val="center"/>
-              <w:rPr>
-                <w:rFonts w:cs="Microsoft Sans Serif"/>
-                <w:sz w:val="20"/>
-                <w:szCs w:val="20"/>
-              </w:rPr>
+              <w:pStyle w:val="Carcentrado"/>
             </w:pPr>
           </w:p>
         </w:tc>
@@ -11244,6 +11593,7 @@
               </w:rPr>
               <w:t>&lt;&lt;</w:t>
             </w:r>
+            <w:proofErr w:type="spellStart"/>
             <w:r>
               <w:rPr>
                 <w:rFonts w:cs="Microsoft Sans Serif"/>
@@ -11252,6 +11602,7 @@
               </w:rPr>
               <w:t>tabla_equipos</w:t>
             </w:r>
+            <w:proofErr w:type="spellEnd"/>
             <w:r>
               <w:rPr>
                 <w:rFonts w:cs="Microsoft Sans Serif"/>
@@ -11377,9 +11728,11 @@
       <w:r>
         <w:t>&lt;&lt;</w:t>
       </w:r>
+      <w:proofErr w:type="spellStart"/>
       <w:r>
         <w:t>ref_esquema_de_sonda</w:t>
       </w:r>
+      <w:proofErr w:type="spellEnd"/>
       <w:r>
         <w:t xml:space="preserve">&gt;&gt; </w:t>
       </w:r>
@@ -11398,13 +11751,21 @@
       </w:pPr>
       <w:bookmarkStart w:id="105" w:name="_Ref224117752"/>
       <w:r>
-        <w:t>&lt;&lt;fig_</w:t>
+        <w:t>&lt;&lt;</w:t>
+      </w:r>
+      <w:proofErr w:type="spellStart"/>
+      <w:r>
+        <w:t>fig_</w:t>
       </w:r>
       <w:r>
         <w:t>esquema</w:t>
       </w:r>
       <w:r>
-        <w:t>_de_sonda&gt;&gt;</w:t>
+        <w:t>_de_sonda</w:t>
+      </w:r>
+      <w:proofErr w:type="spellEnd"/>
+      <w:r>
+        <w:t>&gt;&gt;</w:t>
       </w:r>
       <w:bookmarkEnd w:id="105"/>
     </w:p>
@@ -11907,7 +12268,14 @@
         <w:rPr>
           <w:rFonts w:cs="Arial"/>
         </w:rPr>
-        <w:t>&lt;&lt;ref_pruebas_</w:t>
+        <w:t>&lt;&lt;</w:t>
+      </w:r>
+      <w:proofErr w:type="spellStart"/>
+      <w:r>
+        <w:rPr>
+          <w:rFonts w:cs="Arial"/>
+        </w:rPr>
+        <w:t>ref_pruebas_</w:t>
       </w:r>
       <w:r>
         <w:rPr>
@@ -11915,6 +12283,7 @@
         </w:rPr>
         <w:t>baterias</w:t>
       </w:r>
+      <w:proofErr w:type="spellEnd"/>
       <w:r>
         <w:rPr>
           <w:rFonts w:cs="Arial"/>
@@ -11943,11 +12312,19 @@
         <w:rPr>
           <w:rFonts w:cs="Arial"/>
         </w:rPr>
-        <w:t>&lt;&lt;ref_</w:t>
+        <w:t>&lt;&lt;</w:t>
+      </w:r>
+      <w:proofErr w:type="spellStart"/>
+      <w:r>
+        <w:rPr>
+          <w:rFonts w:cs="Arial"/>
+        </w:rPr>
+        <w:t>ref_</w:t>
       </w:r>
       <w:r>
         <w:t>ubicacion_durante_pruebas</w:t>
       </w:r>
+      <w:proofErr w:type="spellEnd"/>
       <w:r>
         <w:rPr>
           <w:rFonts w:cs="Arial"/>
@@ -12013,12 +12390,14 @@
       <w:r>
         <w:t>&lt;&lt;</w:t>
       </w:r>
+      <w:proofErr w:type="spellStart"/>
       <w:r>
         <w:t>fi</w:t>
       </w:r>
       <w:r>
         <w:t>g_ubicacion_durante_pruebas</w:t>
       </w:r>
+      <w:proofErr w:type="spellEnd"/>
       <w:r>
         <w:t>&gt;&gt;</w:t>
       </w:r>
@@ -12162,7 +12541,35 @@
         <w:rPr>
           <w:szCs w:val="22"/>
         </w:rPr>
-        <w:t xml:space="preserve">En este reporte se describen los trabajos realizados dentro del Contrato No. 658225821 “Servicio de Medición y Análisis Metoceánicos del Golfo de México” celebrado entre PEMEX Exploración y Extracción y el consorcio All Solutions de México S. A. de C. V. (ASM) y el Centro de Investigación Científica y de Educación Superior de Ensenada (CICESE), relacionados con el concepto </w:t>
+        <w:t xml:space="preserve">En este reporte se describen los trabajos realizados dentro del Contrato No. 658225821 “Servicio de Medición y Análisis Metoceánicos del Golfo de México” celebrado entre PEMEX Exploración y Extracción y el consorcio </w:t>
+      </w:r>
+      <w:proofErr w:type="spellStart"/>
+      <w:r>
+        <w:rPr>
+          <w:szCs w:val="22"/>
+        </w:rPr>
+        <w:t>All</w:t>
+      </w:r>
+      <w:proofErr w:type="spellEnd"/>
+      <w:r>
+        <w:rPr>
+          <w:szCs w:val="22"/>
+        </w:rPr>
+        <w:t xml:space="preserve"> </w:t>
+      </w:r>
+      <w:proofErr w:type="spellStart"/>
+      <w:r>
+        <w:rPr>
+          <w:szCs w:val="22"/>
+        </w:rPr>
+        <w:t>Solutions</w:t>
+      </w:r>
+      <w:proofErr w:type="spellEnd"/>
+      <w:r>
+        <w:rPr>
+          <w:szCs w:val="22"/>
+        </w:rPr>
+        <w:t xml:space="preserve"> de México S. A. de C. V. (ASM) y el Centro de Investigación Científica y de Educación Superior de Ensenada (CICESE), relacionados con el concepto </w:t>
       </w:r>
       <w:bookmarkEnd w:id="123"/>
       <w:r>
@@ -12195,6 +12602,7 @@
         </w:rPr>
         <w:t>&lt;&lt;</w:t>
       </w:r>
+      <w:proofErr w:type="spellStart"/>
       <w:r>
         <w:rPr>
           <w:b/>
@@ -12203,6 +12611,7 @@
         </w:rPr>
         <w:t>orden_de_servicio</w:t>
       </w:r>
+      <w:proofErr w:type="spellEnd"/>
       <w:r>
         <w:rPr>
           <w:b/>
@@ -12286,7 +12695,15 @@
         </w:rPr>
       </w:pPr>
       <w:r>
-        <w:t>Se desplegaron exitosamente &lt;&lt;numero_de_sondas&gt;&gt; sondas oceanográficas en las localizaciones solicitadas por PEMEX.</w:t>
+        <w:t>Se desplegaron exitosamente &lt;&lt;</w:t>
+      </w:r>
+      <w:proofErr w:type="spellStart"/>
+      <w:r>
+        <w:t>numero_de_sondas</w:t>
+      </w:r>
+      <w:proofErr w:type="spellEnd"/>
+      <w:r>
+        <w:t>&gt;&gt; sondas oceanográficas en las localizaciones solicitadas por PEMEX.</w:t>
       </w:r>
     </w:p>
     <w:p>
@@ -12905,23 +13322,47 @@
             <w:pPr>
               <w:jc w:val="center"/>
               <w:rPr>
+                <w:rStyle w:val="Hipervnculo"/>
+                <w:rFonts w:ascii="Arial" w:hAnsi="Arial"/>
+                <w:color w:val="0000FF"/>
+              </w:rPr>
+            </w:pPr>
+            <w:r>
+              <w:rPr>
+                <w:rStyle w:val="Hipervnculo"/>
                 <w:rFonts w:ascii="Arial" w:hAnsi="Arial" w:cs="Arial"/>
                 <w:color w:val="0000FF"/>
               </w:rPr>
-            </w:pPr>
-            <w:r>
               <w:fldChar w:fldCharType="begin"/>
             </w:r>
             <w:r>
+              <w:rPr>
+                <w:rStyle w:val="Hipervnculo"/>
+                <w:rFonts w:ascii="Arial" w:hAnsi="Arial" w:cs="Arial"/>
+                <w:color w:val="0000FF"/>
+              </w:rPr>
               <w:instrText xml:space="preserve"> HYPERLINK "mailto:dnajera@cicese.mx" </w:instrText>
             </w:r>
             <w:r>
+              <w:rPr>
+                <w:rStyle w:val="Hipervnculo"/>
+                <w:rFonts w:ascii="Arial" w:hAnsi="Arial" w:cs="Arial"/>
+                <w:color w:val="0000FF"/>
+              </w:rPr>
+            </w:r>
+            <w:r>
+              <w:rPr>
+                <w:rStyle w:val="Hipervnculo"/>
+                <w:rFonts w:ascii="Arial" w:hAnsi="Arial" w:cs="Arial"/>
+                <w:color w:val="0000FF"/>
+              </w:rPr>
               <w:fldChar w:fldCharType="separate"/>
             </w:r>
             <w:r>
               <w:rPr>
                 <w:rStyle w:val="Hipervnculo"/>
                 <w:rFonts w:ascii="Arial" w:hAnsi="Arial" w:cs="Arial"/>
+                <w:color w:val="0000FF"/>
               </w:rPr>
               <w:t>dnajera@cicese.mx</w:t>
             </w:r>
@@ -12929,6 +13370,7 @@
               <w:rPr>
                 <w:rStyle w:val="Hipervnculo"/>
                 <w:rFonts w:ascii="Arial" w:hAnsi="Arial" w:cs="Arial"/>
+                <w:color w:val="0000FF"/>
               </w:rPr>
               <w:fldChar w:fldCharType="end"/>
             </w:r>
@@ -13194,7 +13636,11 @@
         <w:pStyle w:val="Figura"/>
       </w:pPr>
       <w:r>
-        <w:t>&lt;&lt;fig_pruebas_</w:t>
+        <w:t>&lt;&lt;</w:t>
+      </w:r>
+      <w:proofErr w:type="spellStart"/>
+      <w:r>
+        <w:t>fig_pruebas_</w:t>
       </w:r>
       <w:r>
         <w:t>de</w:t>
@@ -13203,7 +13649,11 @@
         <w:t>_</w:t>
       </w:r>
       <w:r>
-        <w:t>transmision&gt;&gt;</w:t>
+        <w:t>transmision</w:t>
+      </w:r>
+      <w:proofErr w:type="spellEnd"/>
+      <w:r>
+        <w:t>&gt;&gt;</w:t>
       </w:r>
     </w:p>
     <w:p>
@@ -13279,7 +13729,43 @@
           <w:rFonts w:ascii="Microsoft Sans Serif" w:hAnsi="Microsoft Sans Serif" w:cs="Microsoft Sans Serif"/>
           <w:vertAlign w:val="baseline"/>
         </w:rPr>
-        <w:t xml:space="preserve"> estampa de tiempo en formato YYYY-MM-DD-THH:mm:ss.sssz.</w:t>
+        <w:t xml:space="preserve"> estampa de tiempo en formato </w:t>
+      </w:r>
+      <w:proofErr w:type="spellStart"/>
+      <w:r>
+        <w:rPr>
+          <w:rStyle w:val="Caracteresdenotaalpie"/>
+          <w:rFonts w:ascii="Microsoft Sans Serif" w:hAnsi="Microsoft Sans Serif" w:cs="Microsoft Sans Serif"/>
+          <w:vertAlign w:val="baseline"/>
+        </w:rPr>
+        <w:t>YYYY-MM-DD-THH:</w:t>
+      </w:r>
+      <w:proofErr w:type="gramStart"/>
+      <w:r>
+        <w:rPr>
+          <w:rStyle w:val="Caracteresdenotaalpie"/>
+          <w:rFonts w:ascii="Microsoft Sans Serif" w:hAnsi="Microsoft Sans Serif" w:cs="Microsoft Sans Serif"/>
+          <w:vertAlign w:val="baseline"/>
+        </w:rPr>
+        <w:t>mm:ss</w:t>
+      </w:r>
+      <w:proofErr w:type="gramEnd"/>
+      <w:r>
+        <w:rPr>
+          <w:rStyle w:val="Caracteresdenotaalpie"/>
+          <w:rFonts w:ascii="Microsoft Sans Serif" w:hAnsi="Microsoft Sans Serif" w:cs="Microsoft Sans Serif"/>
+          <w:vertAlign w:val="baseline"/>
+        </w:rPr>
+        <w:t>.sssz</w:t>
+      </w:r>
+      <w:proofErr w:type="spellEnd"/>
+      <w:r>
+        <w:rPr>
+          <w:rStyle w:val="Caracteresdenotaalpie"/>
+          <w:rFonts w:ascii="Microsoft Sans Serif" w:hAnsi="Microsoft Sans Serif" w:cs="Microsoft Sans Serif"/>
+          <w:vertAlign w:val="baseline"/>
+        </w:rPr>
+        <w:t>.</w:t>
       </w:r>
     </w:p>
     <w:p>
@@ -13420,13 +13906,23 @@
           <w:vertAlign w:val="baseline"/>
         </w:rPr>
       </w:pPr>
+      <w:proofErr w:type="spellStart"/>
       <w:r>
         <w:rPr>
           <w:rStyle w:val="Caracteresdenotaalpie"/>
           <w:rFonts w:ascii="Microsoft Sans Serif" w:hAnsi="Microsoft Sans Serif" w:cs="Microsoft Sans Serif"/>
           <w:vertAlign w:val="baseline"/>
         </w:rPr>
-        <w:t>Direction:</w:t>
+        <w:t>Direction</w:t>
+      </w:r>
+      <w:proofErr w:type="spellEnd"/>
+      <w:r>
+        <w:rPr>
+          <w:rStyle w:val="Caracteresdenotaalpie"/>
+          <w:rFonts w:ascii="Microsoft Sans Serif" w:hAnsi="Microsoft Sans Serif" w:cs="Microsoft Sans Serif"/>
+          <w:vertAlign w:val="baseline"/>
+        </w:rPr>
+        <w:t>:</w:t>
       </w:r>
       <w:r>
         <w:rPr>
@@ -13451,6 +13947,7 @@
           <w:vertAlign w:val="baseline"/>
         </w:rPr>
       </w:pPr>
+      <w:proofErr w:type="spellStart"/>
       <w:r>
         <w:rPr>
           <w:rStyle w:val="Caracteresdenotaalpie"/>
@@ -13459,6 +13956,7 @@
         </w:rPr>
         <w:t>Direction_gen</w:t>
       </w:r>
+      <w:proofErr w:type="spellEnd"/>
       <w:r>
         <w:rPr>
           <w:rStyle w:val="Caracteresdenotaalpie"/>
@@ -13521,6 +14019,7 @@
           <w:vertAlign w:val="baseline"/>
         </w:rPr>
       </w:pPr>
+      <w:proofErr w:type="spellStart"/>
       <w:r>
         <w:rPr>
           <w:rStyle w:val="Caracteresdenotaalpie"/>
@@ -13529,6 +14028,7 @@
         </w:rPr>
         <w:t>Temp_s</w:t>
       </w:r>
+      <w:proofErr w:type="spellEnd"/>
       <w:r>
         <w:rPr>
           <w:rStyle w:val="Caracteresdenotaalpie"/>
@@ -13552,6 +14052,7 @@
           <w:vertAlign w:val="baseline"/>
         </w:rPr>
       </w:pPr>
+      <w:proofErr w:type="spellStart"/>
       <w:r>
         <w:rPr>
           <w:rStyle w:val="Caracteresdenotaalpie"/>
@@ -13560,6 +14061,7 @@
         </w:rPr>
         <w:t>Acc_x</w:t>
       </w:r>
+      <w:proofErr w:type="spellEnd"/>
       <w:r>
         <w:rPr>
           <w:rStyle w:val="Caracteresdenotaalpie"/>
@@ -13598,6 +14100,7 @@
           <w:vertAlign w:val="baseline"/>
         </w:rPr>
       </w:pPr>
+      <w:proofErr w:type="spellStart"/>
       <w:r>
         <w:rPr>
           <w:rStyle w:val="Caracteresdenotaalpie"/>
@@ -13606,6 +14109,7 @@
         </w:rPr>
         <w:t>Acc_y</w:t>
       </w:r>
+      <w:proofErr w:type="spellEnd"/>
       <w:r>
         <w:rPr>
           <w:rStyle w:val="Caracteresdenotaalpie"/>
@@ -13644,6 +14148,7 @@
           <w:vertAlign w:val="baseline"/>
         </w:rPr>
       </w:pPr>
+      <w:proofErr w:type="spellStart"/>
       <w:r>
         <w:rPr>
           <w:rStyle w:val="Caracteresdenotaalpie"/>
@@ -13652,6 +14157,7 @@
         </w:rPr>
         <w:t>Acc_z</w:t>
       </w:r>
+      <w:proofErr w:type="spellEnd"/>
       <w:r>
         <w:rPr>
           <w:rStyle w:val="Caracteresdenotaalpie"/>
@@ -13852,11 +14358,16 @@
         <w:pStyle w:val="Figura"/>
       </w:pPr>
       <w:r>
-        <w:t>&lt;&lt;fig_anexo_</w:t>
+        <w:t>&lt;&lt;</w:t>
+      </w:r>
+      <w:proofErr w:type="spellStart"/>
+      <w:r>
+        <w:t>fig_anexo_</w:t>
       </w:r>
       <w:r>
         <w:t>fotografico</w:t>
       </w:r>
+      <w:proofErr w:type="spellEnd"/>
       <w:r>
         <w:t>&gt;&gt;</w:t>
       </w:r>
@@ -14918,7 +15429,6 @@
                 <w:docPartUnique/>
               </w:docPartObj>
             </w:sdtPr>
-            <w:sdtEndPr/>
             <w:sdtContent>
               <w:p>
                 <w:pPr>
@@ -15410,7 +15920,6 @@
         <w:docPartUnique/>
       </w:docPartObj>
     </w:sdtPr>
-    <w:sdtEndPr/>
     <w:sdtContent>
       <w:p>
         <w:pPr>

</xml_diff>